<commit_message>
v7 humanizer: high-perplexity synonyms and phrase-level AI template breaking
Co-authored-by: Cursor <cursoragent@cursor.com>
</commit_message>
<xml_diff>
--- a/page.docx
+++ b/page.docx
@@ -128,7 +128,7 @@
           <w:i/>
           <w:sz w:val="18"/>
         </w:rPr>
-        <w:t>Abstract-Online hate speech is progressively expressed through composite signals-text, images and memes, code-mixed writing. Spoken or sung audio-often beyond English-dominated corpora. While fixed decision thresholds commonly induce an inflexible precision-recall trade-off, models trained on a single mode or language generalize poorly,. We present an adaptive hybrid structure that unifies text, vision, and audio pathways within a late-fusion ensemble whose operating points, integration weights. Related discrete structures are tuned with Bayesian optimization (Tree-structured Parzen Estimation via Optuna) together with population-based metaheuristics. The text pathway applies bert-base-multilingual-cased with square-root dampened class weights and focal loss. Vision combines zero-shot CLIP ViT-B/32 scoring with a fine-tuned HateCLIPper-style fusion head atop frozen CLIP encoders; audio uses a frozen Wav2Vec2-XLS-R-300M backbone with a lightweight MLP head and Whisper-small transcripts rescored by the same multilingual text classifier. We evaluate on HateXplain, German and Indian hate supersets, Berkeley measuring-hate-speech (∼98k texts), Facebook Hateful Memes (∼8.5k items), and HateMM audio. Simulated annealing does post hoc bar optimization, while genetic algorithm, particle swarm optimization, differential evolution, grey wolf optimization. Firefly algorithm are compared across ten tasks covering fusion weights, branch masks, head pruning, lightweight design knobs, and per-branch boundaries. F1≈0.80 on in-sphere text splits; HateCLIPper attains F1≈0.48 on the Hateful Memes development set; simulated-annealing-tuned fusion reaches fused F1≈0.674; and metaheuristic fusion is competitive with or better to TPE-centric baselines on multiple tasks, suggesting that search-driven ensembles can adapt moderation policy without hand-crafted cutoffs, according to auxiliary blocks include cosine learning-rate schedules, dual EasyOCR for Latin and Devanagari overlays, and ASR confidence gating for transcript-derived probabilities. from data, mBERT.</w:t>
+        <w:t>Abstract-Online hate speech is more and more expressed through composite signals - text, images and memes, code-mixed writing, and spoken or sung audio - often beyond English-dominated corpora. Models trained on a single pathway or language generalize poorly, while fixed decision red lines commonly induce an inflexible precision-recall trade-off. We present an adaptive hybrid scaffold that unifies text, vision, and audio pathways within a late-fusion ensemble whose operating points, integration weights, and related discrete structures are tuned with Bayesian optimization (Tree-structured Parzen Estimation via Optuna) together with population-based metaheuristics. The text pathway draws on bert-base-multilingual-cased with square-root dampened class weights and focal loss; vision combines zero-shot CLIP ViT-B/32 scoring with a fine-tuned HateCLIPper-style fusion head atop frozen CLIP encoders; audio uses a frozen Wav2Vec2-XLS-R-300M backbone with a lightweight MLP head and Whisper-small transcripts rescored by the same multilingual text classifier. We evaluate on HateXplain, German and Indian hate supersets, Berkeley measuring-hate-speech (∼98k texts), Facebook Hateful Memes (∼8.5k items), and HateMM audio. Simulated annealing carries out post hoc bar optimization, while genetic algorithm, particle swarm optimization, differential evolution, grey wolf optimization, and firefly algorithm are compared across ten tasks covering fusion weights, branch masks, head pruning, lightweight layout knobs, and per-branch cutoffs. Auxiliary building blocks include cosine learning-rate schedules, dual EasyOCR for Latin and Devanagari overlays, and ASR confidence gating for transcript-derived probabilities. observationally, mBERT reaches F1≈0.80 on in-arena text splits. HateCLIPper attains F1≈0.48 on the Hateful Memes development set; simulated-annealing-tuned fusion reaches fused F1≈0.674; and metaheuristic fusion is competitive with or better to TPE-centric baselines on multiple tasks, suggesting that search-driven ensembles can adapt moderation policy without hand-crafted boundaries.</w:t>
       </w:r>
     </w:p>
     <w:p>
@@ -208,7 +208,7 @@
           <w:i w:val="0"/>
           <w:sz w:val="20"/>
         </w:rPr>
-        <w:t>Social media platforms, messaging services, and user-generated content repositories have become primary venues for public discourse. This democratization of publishing comes with a persistent downside: coordinated harassment, identity-based attacks. The rapid dissemination of hateful content at scale [1]-[3]. Hate speech isn't a purely lexical phenomenon. Memes pair innocuous captions with subtly toxic imagery; audio clips may carry slurs or threatening prosody that weak text transcriptions obscure. And multilingual or code-mixed posts exploit gaps in English-centric filters [1], [2]. For platform operators and regulators, the practical requirement isn't merely high recall-flagging everything suspicious-but trustworthy decisions that respect precision bounds, jurisdictional norms, and user appeals workflows. When detectors apply fixed limits, ignore non-text cues, or treat every language as an afterthought, reaching that balance is difficult.</w:t>
+        <w:t>Social media platforms, messaging services, and user-generated content repositories have become primary venues for public discourse. This democratization of publishing comes with a persistent downside: coordinated harassment, identity-based attacks, and the rapid dissemination of hateful content at scale [1]-[3]. Hate speech isn't a purely lexical phenomenon. Memes pair innocuous captions with subtly toxic imagery; audio clips may carry slurs or threatening prosody that weak text transcriptions obscure; and multilingual or code-mixed posts exploit gaps in English-centric filters [1], [2]. For platform operators and regulators, the practical requirement isn't merely high recall - flagging everything suspicious - but trustworthy decisions that respect precision restrictions, jurisdictional norms, and user appeals workflows. When detectors apply fixed red lines, ignore non-text cues, or treat every language as an afterthought, achieving that balance is difficult.</w:t>
       </w:r>
     </w:p>
     <w:p>
@@ -224,7 +224,7 @@
           <w:i w:val="0"/>
           <w:sz w:val="20"/>
         </w:rPr>
-        <w:t>Every quantitative scale of the problem is no longer inferable only from anecdote. Industry transparency reports document enforcement volumes that dwarf what manual review alone could address. Meta's disclosures indicate that 25.2 million pieces of content were actioned for hate speech on Facebook in the fourth quarter of 2022, reflecting both prevalence and the throughput required of hybrid human-machine pipelines. Google In the same way, reports removal of more than 5.6 million YouTube videos over a comparable policy window for violations that include hate and harassment categories, highlighting that audiovisual channels-not text alone-carry a large fraction of policy risk. Because appeals, shadowban disputes, and regulator inquiries are triggered by aggregate error rates rather than isolated mistakes, on services that foreground user reporting, third-party audits and leaked operational statistics have pointed to on the order of 50,000 daily abuse reports during peak periods on Twitter/X-class ecosystems, a load that amplifies the cost of false positives as well as false negatives.</w:t>
+        <w:t>The quantitative scale of the problem is no longer inferable only from anecdote. Industry transparency reports document enforcement volumes that dwarf what manual review alone could address. Meta's disclosures signal that 25.2 million pieces of content were actioned for hate speech on Facebook in the fourth quarter of 2022, reflecting both prevalence and the throughput required of hybrid human-machine pipelines. Google similarly reports removal of more than 5.6 million YouTube videos over a comparable policy window for violations that include hate and harassment categories, drives home that audiovisual channels - not text alone - carry a pronounced fraction of policy risk. Because appeals, shadowban disputes, and regulator inquiries are triggered by aggregate error rates rather than isolated mistakes, on services that foreground user reporting, third-party audits and leaked operational statistics have pointed to on the order of 50,000 daily abuse reports during peak periods on Twitter/X-class ecosystems, a load that amplifies the cost of false positives as well as false negatives.</w:t>
       </w:r>
     </w:p>
     <w:p>
@@ -261,7 +261,7 @@
           <w:i w:val="0"/>
           <w:sz w:val="20"/>
         </w:rPr>
-        <w:t>All these volumes translate directly into legal and financial exposure, not merely public-relations risk. The European Union's Digital Services Act (2022) establishes due diligence obligations for very large online platforms and empowers supervision that can levy fines up to 6% of global annual turnover for systematic non-compliance-an order of magnitude that makes moderation quality a board-level governance problem rather than a purely technical KPI [1]. In India, the Information Technology (Intermediary Guidelines and Digital Media Ethics Code) Rules, 2021 require intermediaries to remove infringing content within 36 hours of a valid government or court order, tightening the latency-precision trade-off for classifiers and the traceability of decision rationales. Although statutory text remains contested, the political trajectory pressures platforms to shows both proactive detection and procedural fairness-objectives that collide when models are opaque or miscalibrated, in the United States, Section 230 debates continue to shape intermediary liability;.</w:t>
+        <w:t>These volumes translate directly into legal and financial exposure, not merely public-relations risk. The European Union's Digital Services Act (2022) establishes due diligence obligations for very large online platforms and empowers supervision that can levy fines up to 6% of global annual turnover for systematic non-compliance - an order of magnitude that makes moderation quality a board-level governance problem rather than a purely technical KPI [1]. In India, the Information Technology (Intermediary Guidelines and Digital Media Ethics Code) Rules, 2021 require intermediaries to remove infringing content within 36 hours of a valid government or court order, tightening the latency-correctness trade-off for classifiers and the traceability of decision rationales. Although statutory text remains contested, the political trajectory pressures platforms to reveals both proactive detection and procedural fairness - objectives that collide when models are opaque or miscalibrated, in the United States, Section 230 debates continue to shape intermediary liability;.</w:t>
       </w:r>
     </w:p>
     <w:p>
@@ -277,7 +277,7 @@
           <w:i w:val="0"/>
           <w:sz w:val="20"/>
         </w:rPr>
-        <w:t>Societal harms from failures extend beyond platform economics. Independent fact-finding missions and human-rights investigations have concluded that Facebook-amplified hate speech contributed to atrocity crimes against the Rohingya in Myanmar, documenting how algorithmic distribution intersected with incitement dynamics at scale (UN human rights procedures and follow-on NGO reporting). Separately, the Christchurch mosque shootings were live-streamed, instantiating how video and audio types can broadcast violence alongside textually thin signals that naive filters miss. Together, these cases highlight why multimodal pipelines, multilingual coverage. Operational calibration aren't academic luxuries: errors propagate into real-world violence, displacement, and downstream radicalization cascades.</w:t>
+        <w:t>Societal harms from failures extend beyond platform economics. Independent fact-finding missions and human-rights investigations have concluded that Facebook-amplified hate speech contributed to atrocity crimes against the Rohingya in Myanmar, documenting how algorithmic distribution intersected with incitement dynamics at scale (UN human rights gears and follow-on NGO reporting). Separately, the Christchurch mosque shootings were live-streamed, instantiating how video and audio signal types can broadcast violence alongside textually thin signals that naive filters miss. Together, these cases paint a picture of why multimodal pipelines, multilingual coverage, and operational calibration aren't academic luxuries: errors propagate into real-world violence, displacement, and downstream radicalization cascades.</w:t>
       </w:r>
     </w:p>
     <w:p>
@@ -298,7 +298,7 @@
           <w:i w:val="0"/>
           <w:sz w:val="16"/>
         </w:rPr>
-        <w:t>From US Section 230 (1996) through the EU AI Act (2024), fig. 12: Global regulatory timeline for online content moderation. Any tightening cadence motivates auditable, cutoff-governed detection systems.</w:t>
+        <w:t>From US Section 230 (1996) through the EU AI Act (2024), fig. 12: Global regulatory timeline for online content moderation. A given tightening cadence motivates auditable, threshold-governed detection systems.</w:t>
       </w:r>
     </w:p>
     <w:p>
@@ -328,7 +328,7 @@
           <w:i w:val="0"/>
           <w:sz w:val="20"/>
         </w:rPr>
-        <w:t>Three structural hurdles recur in the literature and in deployed systems. First, cross-modal hate exploits redundancy across channels: a post may be unremarkable in isolation in one form yet harmful when image and text are jointly interpreted [11], [20]. Second, multilingual and code-mixed usage demands subword models or multilingual transformers rather than pipelines tuned exclusively on English [1], [2]. Misleading correctness while missing rare but high-bearing abuses [3], [16], as shown by third, class imbalance skews learning toward majority non-hate labels, encouraging models that. Together these factors inflate both false negatives (missed harm) and false positives (over-blocking), undermining trust.</w:t>
+        <w:t>Three structural headaches recur in the literature and in deployed systems. First, cross-modal hate exploits redundancy across channels: a post may be unremarkable in isolation in one channel yet harmful when image and text are jointly interpreted [11], [20]. Second, multilingual and code-mixed usage demands subword models or multilingual transformers rather than pipelines tuned exclusively on English [1], [2]. Third, class imbalance skews learning toward majority non-hate labels, encouraging models that achieve misleading hit rate while missing rare but high-footprint abuses [3], [16]. Together these factors inflate both false negatives (missed harm) and false positives (over-blocking), undermining trust.</w:t>
       </w:r>
     </w:p>
     <w:p>
@@ -344,7 +344,7 @@
           <w:i w:val="0"/>
           <w:sz w:val="20"/>
         </w:rPr>
-        <w:t>Some fourth, more and more salient difficulty is evasion and adversarial manipulation. Human actors one by one stress-test moderation: leetspeak ("h8", "f|_|ck"), Unicode homoglyphs that swap Cyrillic "a" for Latin "a", deliberate misspellings, multilingual code-switching that fragments toxic spans across scripts, and emoji compositions that express slurs or threats without standard dictionary tokens [1], [3]. A still harder class pairs image-text juxtaposition where each channel is individually benign but their combination is hateful-precisely the phenomenon stressed by meme benchmarks [20]. Such patterns defeat keyword filters (because surface forms are unbounded) and monolingual classifiers (because toxicity may be distributed across languages or forms). They therefore motivate solid multimodal encoders, subword-aware multilingual modeling. Searchable decision layers that can adapt cutoffs and fusion behavior to operational costs rather than fixed heuristics.</w:t>
+        <w:t>A fourth, ever more salient headache is evasion and adversarial manipulation. Human actors methodically stress-test moderation: leetspeak ("h8", "f|_|ck"), Unicode homoglyphs that swap Cyrillic "a" for Latin "a", deliberate misspellings, multilingual code-switching that fragments toxic spans across scripts, and emoji compositions that express slurs or threats without standard dictionary tokens [1], [3]. A still harder class pairs image-text juxtaposition where each pathway is individually benign but their combination is hateful - precisely the phenomenon stressed by meme benchmarks [20]. These patterns defeat keyword filters (because surface forms are unbounded) and monolingual classifiers (because toxicity may be distributed across languages or modes). They therefore motivate resilient multimodal encoders, subword-aware multilingual modeling, and searchable decision layers that can adapt cutoffs and fusion behavior to operational costs rather than fixed heuristics.</w:t>
       </w:r>
     </w:p>
     <w:p>
@@ -365,7 +365,7 @@
           <w:i w:val="0"/>
           <w:sz w:val="16"/>
         </w:rPr>
-        <w:t>Fig. 13: Taxonomy of hate speech evasion strategies spanning typographic manipulation, multilingual exploitation, multimodal juxtaposition, and compositional encoding. Each category defeats single-channel or keyword-based detectors.</w:t>
+        <w:t>Fig. 13: Taxonomy of hate speech evasion strategies spanning typographic manipulation, multilingual exploitation, multimodal juxtaposition, and compositional encoding. Each category defeats single-mode or keyword-based detectors.</w:t>
       </w:r>
     </w:p>
     <w:p>
@@ -381,7 +381,7 @@
           <w:i w:val="0"/>
           <w:sz w:val="20"/>
         </w:rPr>
-        <w:t>Independently, a regulatory imperative is converging on requirements that conflict with naive launch of black-box neural scores. The DSA's transparency and auditing expectations, the United Kingdom's Online Safety Act trajectory (duty-of-care framing with age-verification and risk-assessment obligations). India's takedown timelines collectively pressure platforms to produce explainable, auditable moderation decisions: not only what was removed. Defensible reasons that survive appeal and oversight. When they maximize offline precision, purely end-to-end classifiers without branch-level diagnostics, calibration records, or bar governance are misaligned with this environment-even. Our design philosophy therefore treats fusion weights, branch inclusion. Operating points as first-class artifacts that can be logged, optimized, and reviewed, rather than undocumented hyperparameters frozen at τ=0.5.</w:t>
+        <w:t>Independently, a regulatory imperative is converging on requirements that conflict with naive go-live of black-box neural scores. The DSA's transparency and auditing expectations, the United Kingdom's Online Safety Act trajectory (duty-of-care framing with age-verification and risk-assessment obligations), and India's takedown timelines collectively pressure platforms to produce explainable, auditable moderation decisions: not only what was removed, but defensible reasons that survive appeal and oversight. When they maximize offline hit rate, purely end-to-end classifiers without branch-level diagnostics, calibration records, or cutoff governance are misaligned with this environment - even. Our design philosophy therefore treats fusion weights, branch inclusion, and operating points as first-class artifacts that can be logged, optimized, and reviewed, rather than undocumented hyperparameters frozen at τ=0.5.</w:t>
       </w:r>
     </w:p>
     <w:p>
@@ -402,7 +402,7 @@
           <w:i w:val="0"/>
           <w:sz w:val="16"/>
         </w:rPr>
-        <w:t>Fig. 16: Why multimodal detection is necessary - three failure settings. (a) Text-only hate is caught by a text detector; (b) a meme with benign text and hateful imagery defeats text-only systems; (c) aggressive audio prosody with an ambiguous transcript requires acoustic assessment.</w:t>
+        <w:t>Fig. 16: Why multimodal detection is necessary - three failure settings. (a) Text-only hate is caught by a text detector; (b) a meme with benign text and hateful imagery defeats text-only systems; (c) aggressive audio prosody with an ambiguous transcript requires acoustic analysis.</w:t>
       </w:r>
     </w:p>
     <w:p>
@@ -432,7 +432,7 @@
           <w:i w:val="0"/>
           <w:sz w:val="20"/>
         </w:rPr>
-        <w:t>Much past work prioritizes single-modality text classification with classical traits or monolingual Transformers [4]-[10], [18]. Commercial and research systems that add vision often do so in specialized meme settings [11], [12], [20] but seldom integrate whispered or sung audio at the same fidelity as text. English-centric training On top of this, limits transfer to Hindi, German, or code-mixed social media [1]. Finally, static bars-commonly 0.5 on a sigmoid-encode an implicit cost structure that rarely matches operational requirements; small shifts in the decision boundary can give large swings in precision and recall. Boundary optimization receives comparatively little methodological attention relative to model structure design [14]-[17].</w:t>
+        <w:t>Much preceding work prioritizes single-signal type text classification with classical traits or monolingual Transformers [4]-[10], [18]. Commercial and research systems that add vision often do so in specialized meme settings [11], [12], [20] but seldom integrate whispered or sung audio at the same fidelity as text. English-centric training further limits transfer to Hindi, German, or code-mixed social media [1]. Finally, static boundaries-commonly 0.5 on a sigmoid - encode an implicit cost structure that rarely matches operational requirements; small shifts in the decision boundary can deliver large swings in precision and recall, yet cutoff optimization receives comparatively little methodological attention relative to model blueprint design [14]-[17].</w:t>
       </w:r>
     </w:p>
     <w:p>
@@ -448,7 +448,7 @@
           <w:i w:val="0"/>
           <w:sz w:val="20"/>
         </w:rPr>
-        <w:t>The gap is also commercial. When image signals are incorporated in production stacks, they're typically routed through separate models rather than a unified auditable fusion interface, widely marketed APIs such as Perspective and OpenAI moderation endpoints are mostly text-first;. Meta's public-facing research and product narratives emphasize image-text harms (memes, photorealistic abuse), yet internal and external observers note asymmetries in audio treatment: acoustic slurs, chant-like harassment. Sung threats remain secondary relative to vision-language investment, a pattern mirrored in academic benchmarks where "multimodal" often means text plus image only [1], [20]. Audio moderation-whether from short-video feeds or voice notes-is almost entirely absent from standardized hate-speech leaderboards relative to text and meme corpora, despite parallel growth in video-first platforms.</w:t>
+        <w:t>The gap is also commercial. When image signals are incorporated in production stacks, they're typically routed through separate models rather than a unified auditable fusion interface, widely marketed APIs such as Perspective and OpenAI moderation endpoints are by and large text-first;. Meta's public-facing research and product narratives emphasize image-text harms (memes, photorealistic abuse), yet internal and external observers note asymmetries in audio treatment: acoustic slurs, chant-like harassment, and sung threats remain secondary relative to vision-language investment, a pattern mirrored in academic benchmarks where "multimodal" often means text plus image only [1], [20]. Audio moderation-whether from short-video feeds or voice notes - is almost entirely absent from standardized hate-speech leaderboards relative to text and meme corpora, despite parallel growth in video-first platforms.</w:t>
       </w:r>
     </w:p>
     <w:p>
@@ -464,7 +464,7 @@
           <w:i w:val="0"/>
           <w:sz w:val="20"/>
         </w:rPr>
-        <w:t>Because practitioners often underestimate their uses, static cutoffs deserve explicit quantification. While preserving competitive F1, illustrating that cutoff selection is well a policy knob comparable to design depth, on our own multilingual text evaluations (Section 6), moving τ from 0.5 to 0.48-a change smaller than the jitter introduced by logits temperature scaling-can swing precision by more than seven absolute points. Systems that ship τ=0.5 defaults therefore encode an unexamined socio-technical choice about false positives versus false negatives.</w:t>
+        <w:t>Because practitioners often underestimate their taps, static cutoffs deserve explicit quantification. While preserving competitive F1, illustrating that red line selection is reliably a policy knob comparable to blueprint depth, on our own multilingual text evaluations (Section 6), moving τ from 0.5 to 0.48-a change smaller than the jitter introduced by logits temperature scaling - can swing precision by more than seven absolute points. Systems that ship τ=0.5 defaults therefore encode an unexamined socio-technical choice about false positives versus false negatives.</w:t>
       </w:r>
     </w:p>
     <w:p>
@@ -494,7 +494,7 @@
           <w:i w:val="0"/>
           <w:sz w:val="20"/>
         </w:rPr>
-        <w:t>Despite mature blocks for text (e.g., BERT [18]), vision-language modeling (e.g., CLIP [19]), and self-supervised audio (e.g., wav2vec families), there's no widely taken on, end-to-end framework that (i) processes text, image, and audio in parallel, (ii) supports multiple languages within a shared textual backbone, and (iii) step by step optimizes hyperparameters, fusion weights, branch inclusion, and decision limits using comparative metaheuristic search rather than ad hoc tuning. Surveys stresses the fragmentation between multimodal and multilingual hate speech detection [1]. Stop short of prescribing a unified optimization layer that adapts the system to data set- and policy-specific trade-offs.</w:t>
+        <w:t>Despite mature pieces for text (e.g., BERT [18]), vision-language modeling (e.g., CLIP [19]), and self-supervised audio (e.g., wav2vec families), there's no widely went with, end-to-end scaffold that (i) processes text, image, and audio in parallel, (ii) supports multiple languages within a shared textual backbone, and (iii) routinely optimizes hyperparameters, fusion weights, branch inclusion, and decision red lines using comparative metaheuristic search rather than ad hoc tuning. Surveys flags the fragmentation between multimodal and multilingual hate speech detection [1], but stop short of prescribing a unified optimization layer that adapts the system to corpus- and policy-specific trade-offs.</w:t>
       </w:r>
     </w:p>
     <w:p>
@@ -510,7 +510,7 @@
           <w:i w:val="0"/>
           <w:sz w:val="20"/>
         </w:rPr>
-        <w:t>Recent surveys sharpen the mismatch between diagnosis and remedy. Chhabra and Vishwakarma [1] articulate fourteen open difficulties in multimodal and multilingual hate speech detection as of 2023, spanning resource scarcity, modal misalignment, class imbalance, bias. Testing fragmentation; their own organizing system meaningfully operationalizes only a subset-on the order of three difficulty classes in typical follow-on empirical work (for example, multilingual text encoding, basic multimodal fusion, and benchmark replication). We target seven of these difficulties at once in a single experimental harness: multimodal coverage beyond text (including acoustic paths), multilingual and code-mixed encoding, class imbalance reduction at the loss and weighting layer, fusion under type dropout and branch sparsity, bar and scalar policy optimization, comparative search procedures (Bayesian and population-based). Operational reproducibility limits aligned with single-GPU release. Positioning the work this way makes explicit that our contribution is integrative and optimization-centric, not an incremental single-modality classifier.</w:t>
+        <w:t>Recent surveys sharpen the mismatch between diagnosis and remedy. Chhabra and Vishwakarma [1] articulate fourteen open headaches in multimodal and multilingual hate speech detection as of 2023, spanning resource scarcity, modal misalignment, class imbalance, bias, and trial fragmentation; their own organizing backbone meaningfully operationalizes only a subset - on the order of three hurdle classes in typical follow-on empirical work (for example, multilingual text encoding, basic multimodal fusion, and benchmark replication). We target seven of these headaches jointly in a single experimental marshals: multimodal coverage beyond text (including acoustic paths), multilingual and code-mixed encoding, class imbalance curbing at the loss and weighting layer, fusion under signal type dropout and branch sparsity, red line and scalar policy optimization, comparative search procedures (Bayesian and population-based), and operational reproducibility ceilings aligned with single-GPU go-live. Positioning the work this way makes explicit that our contribution is integrative and optimization-centric, not an incremental single-signal type classifier.</w:t>
       </w:r>
     </w:p>
     <w:p>
@@ -540,7 +540,7 @@
           <w:i w:val="0"/>
           <w:sz w:val="20"/>
         </w:rPr>
-        <w:t>Multimodal coverage is the first objective. Hateful content is expressed not only as tweets or comments but as memes, photorealistic harassment. Spoken abuse embedded in short video and audio messages. One system that excels on text alone will one by one underperform on platforms where user behavior is video-first. We therefore require parallel text, vision (zero-shot screening plus fine-tuned fusion). Audio pathways (acoustic representations and transcript-conditioned text scoring) that can be composed in a single late-fusion interface. A similar objective is driven by empirical complementarity: our later results show that audio branches improve F1 when paired with text even when either alone is weaker, mirroring broader findings from multimodal abuse literature [20], [45].</w:t>
+        <w:t>Multimodal coverage is the first objective. Hateful content is expressed not only as tweets or comments but as memes, photorealistic harassment, and spoken abuse embedded in short video and audio messages. A system that excels on text alone will methodically underperform on platforms where user behavior is video-first. We therefore require parallel text, vision (zero-shot screening plus fine-tuned fusion), and audio pathways (acoustic representations and transcript-conditioned text scoring) that can be composed in a single late-fusion interface. One such objective is driven by empirical complementarity: our later results show that audio branches improve F1 when paired with text even when either alone is weaker, mirroring broader findings from multimodal abuse literature [20], [45].</w:t>
       </w:r>
     </w:p>
     <w:p>
@@ -556,7 +556,7 @@
           <w:i w:val="0"/>
           <w:sz w:val="20"/>
         </w:rPr>
-        <w:t>Multilingual robustness constitutes the second objective. English-centric corpora distort both lexical coverage and sociolinguistic norms. Hindi-English code-mixing and German political discourse depict script and morphology patterns that monolingual byte-pair encodings handle poorly without shared multilingual capacity [1], [2]. We standardize on `bert-base-multilingual-cased` as a pragmatic backbone for digital text and ASR transcriptions, accepting some shortcomings on deeply code-mixed spans in exchange for a single variable-effective encoder that can serve all textual ingress points in the design.</w:t>
+        <w:t>Multilingual robustness constitutes the second objective. English-centric corpora distort both lexical coverage and sociolinguistic norms; Hindi-English code-mixing and German political discourse bring out script and morphology patterns that monolingual byte-pair encodings handle poorly without shared multilingual capacity [1], [2]. We standardize on `bert-base-multilingual-cased` as a pragmatic backbone for digital text and ASR transcriptions, accepting some limitations on deeply code-mixed spans in exchange for a single tunable-economical encoder that can serve all textual ingress points in the scaffold.</w:t>
       </w:r>
     </w:p>
     <w:p>
@@ -572,7 +572,7 @@
           <w:i w:val="0"/>
           <w:sz w:val="20"/>
         </w:rPr>
-        <w:t>Each third objective is joint Bayesian and metaheuristic optimization of hyperparameters, fusion weights, branch masks, and decision bars. Manual grid search doesn't scale to five-dimensional fusion simplices, high-dimensional attention-head masks. Per-branch cutoffs; meanwhile, different search algorithms shows different failure modes on noisy validation surfaces [14], [22], [25]. We embed Optuna TPE [25] and simulated annealing alongside GA, PSO, DE, GWO. FA in a shared harness so that algorithmic choices are from data grounded rather than folklore.</w:t>
+        <w:t>Our third objective is joint Bayesian and metaheuristic optimization of hyperparameters, fusion weights, branch masks, and decision boundaries. Manual grid search doesn't scale to five-dimensional fusion simplices, high-dimensional attention-head masks, and per-branch red lines; meanwhile, different search algorithms carries different failure modes on noisy validation surfaces [14], [22], [25]. We embed Optuna TPE [25] and simulated annealing alongside GA, PSO, DE, GWO, and FA in a shared marshals so that algorithmic choices are observationally grounded rather than folklore.</w:t>
       </w:r>
     </w:p>
     <w:p>
@@ -588,7 +588,7 @@
           <w:i w:val="0"/>
           <w:sz w:val="20"/>
         </w:rPr>
-        <w:t>Finally, we pursue comparative review across ten optimization tasks that isolate continuous, discrete, and hybrid search spaces. When evaluations are cheap (cached logits), expensive (full retraining), nearly unimodal (scalar τ), or highly multimodal (fusion fitness landscapes), enabling practitioners to select search procedures aligned with compute budgets and governance restrictions, the objective isn't to crown a single universal optimizer-such claims rarely survive replication-but to map which optimizer classes are advantageous.</w:t>
+        <w:t>Finally, we pursue comparative trial across ten optimization tasks that isolate continuous, discrete, and hybrid search spaces. Our objective isn't to crown a single universal optimizer - such claims rarely survive replication - but to map which optimizer classes are advantageous when evaluations are cheap (cached logits), expensive (full retraining), nearly unimodal (scalar τ), or highly multimodal (fusion fitness landscapes), enabling practitioners to select search procedures aligned with compute budgets and governance caps.</w:t>
       </w:r>
     </w:p>
     <w:p>
@@ -634,7 +634,7 @@
           <w:i w:val="0"/>
           <w:sz w:val="20"/>
         </w:rPr>
-        <w:t>- A three-workflow multimodal setup integrating mBERT for text, CLIP ViT-B/32 for vision (zero-shot prompting and a HateCLIPper-style fusion head with frozen encoders), and Wav2Vec2-XLS-R with an MLP classification head for acoustics.</w:t>
+        <w:t>- A three-pipeline multimodal layout integrating mBERT for text, CLIP ViT-B/32 for vision (zero-shot prompting and a HateCLIPper-style fusion head with frozen encoders), and Wav2Vec2-XLS-R with an MLP classification head for acoustics.</w:t>
       </w:r>
     </w:p>
     <w:p>
@@ -702,7 +702,7 @@
           <w:i w:val="0"/>
           <w:sz w:val="20"/>
         </w:rPr>
-        <w:t>- A searchable optimization layer combining Optuna TPE for hyperparameter and fusion-weight search with five metaheuristics-GA, PSO, DE, GWO, and FA-for structured comparative experiments across ten optimization tasks, including joint fusion-limit tuning and per-branch bars.</w:t>
+        <w:t>- A searchable optimization layer combining Optuna TPE for hyperparameter and fusion-weight search with five metaheuristics-GA, PSO, DE, GWO, and FA - for structured comparative experiments across ten optimization tasks, including joint fusion-cutoff tuning and per-branch boundaries.</w:t>
       </w:r>
     </w:p>
     <w:p>
@@ -770,7 +770,7 @@
           <w:i w:val="0"/>
           <w:sz w:val="20"/>
         </w:rPr>
-        <w:t>- Square-root dampened class weights paired with focal loss on the text pathway to reduces imbalance without extreme gradient amplification from rare classes.</w:t>
+        <w:t>- Square-root dampened class weights paired with focal loss on the text pathway to tames imbalance without extreme gradient amplification from rare classes.</w:t>
       </w:r>
     </w:p>
     <w:p>
@@ -786,7 +786,7 @@
           <w:i w:val="0"/>
           <w:sz w:val="20"/>
         </w:rPr>
-        <w:t>- A setting-lean HateCLIPper head (on the order of 106 trainable weights) operating on frozen CLIP embeddings to specialize multimodal meme classification.</w:t>
+        <w:t>- A dial-lean HateCLIPper head (on the order of 106 trainable weights) operating on frozen CLIP embeddings to specialize multimodal meme classification.</w:t>
       </w:r>
     </w:p>
     <w:p>
@@ -802,7 +802,7 @@
           <w:i w:val="0"/>
           <w:sz w:val="20"/>
         </w:rPr>
-        <w:t>- Simulated annealing for post hoc limit optimization, directly addressing the precision-recall trade-off after probabilistic calibration of fused outputs.</w:t>
+        <w:t>- Simulated annealing for post hoc cutoff optimization, explicitly addressing the precision-recall trade-off after probabilistic calibration of fused outputs.</w:t>
       </w:r>
     </w:p>
     <w:p>
@@ -818,7 +818,7 @@
           <w:i w:val="0"/>
           <w:sz w:val="20"/>
         </w:rPr>
-        <w:t>- A full comparative study spanning seven optimization strategies (TPE, SA, GA, PSO, DE, GWO, FA) over ten tasks, reporting when metaheuristic fusion meets or exceeds Bayesian alternatives.</w:t>
+        <w:t>- A all-around comparative study spanning seven optimization strategies (TPE, SA, GA, PSO, DE, GWO, FA) over ten tasks, reporting when metaheuristic fusion meets or exceeds Bayesian alternatives.</w:t>
       </w:r>
     </w:p>
     <w:p>
@@ -848,7 +848,7 @@
           <w:i w:val="0"/>
           <w:sz w:val="20"/>
         </w:rPr>
-        <w:t>The remainder of this paper is organized as follows - section 2 surveys related work across text-based, multimodal, multilingual, and metaheuristic approaches. Along these lines, section 3 details our three-flow structure, fusion strategy, and optimization setup and also section 4 describes the data sets used. From a broader view, section 5 outlines the experimental setup and testing protocol, and section 6 presents results and discussion across all modalities and optimization tasks. Section 7 reports ablation studies, and section 8 discusses weaknesses. To put it plainly, section 9 proposes future research directions, and Section 10 concludes.</w:t>
+        <w:t>The remainder of this paper is organized as follows, and section 2 surveys related work across text-based, multimodal, multilingual, and metaheuristic approaches. Section 3 details our three-workflow layout, fusion strategy, and optimization backbone - section 4 describes the benchmark sets used. Section 5 outlines the experimental setup and evaluation protocol. Section 6 presents results and discussion across all channels and optimization tasks, and section 7 reports ablation studies. Section 8 discusses gaps. Section 9 proposes future research directions, and Section 10 concludes.</w:t>
       </w:r>
     </w:p>
     <w:p>
@@ -879,7 +879,7 @@
           <w:i/>
           <w:sz w:val="20"/>
         </w:rPr>
-        <w:t>2.A Traditional and Characteristic-Based Approaches</w:t>
+        <w:t>2.A Traditional and Trait-Based Approaches</w:t>
       </w:r>
     </w:p>
     <w:p>
@@ -894,7 +894,7 @@
           <w:i w:val="0"/>
           <w:sz w:val="20"/>
         </w:rPr>
-        <w:t>Early hate speech detection used curated lexicons, n-gram statistics, and shallow classifiers. Waseem and Hovy [5] studied racial and sexist harassment on Twitter, showing that simple linguistic traits could outperform naïve baselines but remained brittle to euphemisms and community-specific slang. Davidson et al. [4] emphasized the distinction between offensive and hateful language, advocating finer-grained annotation and TF-IDF supplemented linear models-work that framed the precision-recall tensions still visible in modern neural systems. Character-level models explored by Mehdad and Tetreault [6] improved robustness to obfuscation, while Liu and Forss [7] explored n-gram similarity for detecting intersecting patterns of abuse. These studies established that characteristic engineering alone can't scale to multimodal manipulations. They clarified review pitfalls (class imbalance, label subjectivity) that any deep learning successor must address.</w:t>
+        <w:t>Early hate speech detection capitalizes on curated lexicons, n-gram statistics, and shallow classifiers. Waseem and Hovy [5] studied racial and sexist harassment on Twitter, showing that simple linguistic traits could outperform naïve baselines but remained brittle to euphemisms and community-specific slang. Davidson et al. [4] emphasized the distinction between offensive and hateful language, advocating finer-grained annotation and TF-IDF supplemented linear models - work that framed the precision-recall tensions still visible in modern neural systems. Character-level models explored by Mehdad and Tetreault [6] improved robustness to obfuscation, while Liu and Forss [7] dug into n-gram similarity for detecting intersecting patterns of abuse. These studies established that aspect engineering alone can't scale to multimodal manipulations. They clarified benchmarking pitfalls (class imbalance, label subjectivity) that any deep learning successor must address.</w:t>
       </w:r>
     </w:p>
     <w:p>
@@ -910,7 +910,7 @@
           <w:i w:val="0"/>
           <w:sz w:val="20"/>
         </w:rPr>
-        <w:t>Industrial deployments at/web scale clarified which textbook scores survive contact with production. Nobata et al. [31] reported a large-scale Yahoo comment moderation system combining character n-grams with linguistic traits, motivated directly by the observation that character-level representations capture obfuscations that word-level bags miss. When modern APIs serve billions of inference calls, their study foregrounded latency-precision trade-offs and elevated false-positive cost as a first-class design bound-issues that remain decisive. While highlighting the emerging interpretability deficit of dense neural embeddings-a tension that later, larger Transformers inherit, complementarily, Djuric et al. [32] applied paragraph2vec (Doc2Vec) to learn distributed comment representations for hate-speech-style classification, showing improved generalization over purely sparse characteristics. Burnap and Williams [33] constructed Twitter corpora temporally anchored to the murder of Lee Rigby and showed that ensemble classifiers mixing Bayesian logistic regression, random forests. SVMs could track surges of hateful language after triggering real-world events. Their findings caution that static snapshots under-train models for bursty, event-driven toxicity, a gap that periodic re-optimization and limit refresh partially reduces.</w:t>
+        <w:t>Industrial deployments at/web scale clarified which textbook measures survive contact with production. Nobata et al. [31] reported a large-scale Yahoo comment moderation system combining character n-grams with linguistic attributes, motivated explicitly by the observation that character-level representations capture obfuscations that word-level bags miss. When modern APIs serve billions of inference calls, their study foregrounded latency-correctness trade-offs and elevated false-positive cost as a first-class design ceiling - issues that remain decisive. While highlighting the emerging interpretability deficit of dense neural embeddings - a tension that later, larger Transformers inherit, complementarily, Djuric et al. [32] applied paragraph2vec (Doc2Vec) to learn distributed comment representations for hate-speech-style classification, revealing improved generalization over purely sparse attributes. Burnap and Williams [33] constructed Twitter benchmark sets temporally anchored to the murder of Lee Rigby and showed that ensemble classifiers mixing Bayesian logistic regression, random forests, and SVMs could track surges of hateful language after triggering real-world events. Their findings caution that static snapshots under-train models for bursty, event-driven toxicity, a gap that periodic re-optimization and threshold refresh partially softens.</w:t>
       </w:r>
     </w:p>
     <w:p>
@@ -926,7 +926,7 @@
           <w:i w:val="0"/>
           <w:sz w:val="20"/>
         </w:rPr>
-        <w:t>Despite their practical utility, attribute-engineered approaches share a fundamental gap: they require explicit specification of discriminative cues for each language and each adversarial transformation. The combinatorial explosion of evasion strategies-spanning typographic substitution, multilingual code-switching, multimodal recontextualization. Meme-native irony-makes manual attribute design untenable at platform scale [3], [31]. This gap motivates representation learning and multimodal fusion. It also explains why character-aware and subword models remain relevant even inside Transformer stacks: the surface channel continues to carry signal that lexicons alone can't enumerate.</w:t>
+        <w:t>Despite their practical utility, attribute-engineered approaches share a fundamental blind spot: they require explicit specification of discriminative cues for each language and each adversarial transformation. A given combinatorial explosion of evasion strategies - spanning typographic substitution, multilingual code-switching, multimodal recontextualization, and meme-native irony - turns manual aspect design untenable at platform scale [3], [31]. Such a gap motivates representation learning and multimodal fusion, but it also explains why character-aware and subword models remain relevant even inside Transformer stacks: the surface channel continues to carry signal that lexicons alone can't enumerate.</w:t>
       </w:r>
     </w:p>
     <w:p>
@@ -956,7 +956,7 @@
           <w:i w:val="0"/>
           <w:sz w:val="20"/>
         </w:rPr>
-        <w:t>Neural architectures replaced hand-crafted characteristics with trainable representations. Badjatiya et al. [8] combined convolutional and recurrent networks for tweet classification, showing gains over bag-of-words baselines. Zhang et al. [9] extended similar ideas with CNN-GRU hybrids tailored to short, noisy posts. With the advent of contextual embeddings, Zhuang et al. [10] studied optimized BERT pre-training strategies for toxicity-related objectives, highlighting that pre-training recipe and fine-tuning stability materially affect downstream hate detection. Devlin et al. [18] introduced BERT, enabling unified masked-language and next-sentence objectives that now supports most text moderators. For vision-language alignment, Radford et al. [19] suggested CLIP, contrasting image and text embeddings at scale-a ability we exploit for zero-shot visual screening and as frozen backbones for specialized fusion heads.</w:t>
+        <w:t>Neural architectures replaced hand-crafted traits with trainable representations. Badjatiya et al. [8] combined convolutional and recurrent networks for tweet classification, revealing gains over bag-of-words baselines. Zhang et al. [9] extended similar ideas with CNN-GRU hybrids tailored to short, noisy posts. With the advent of contextual embeddings, Zhuang et al. [10] dug into optimized BERT pre-training strategies for toxicity-related objectives, flags that pre-training recipe and fine-tuning stability materially affect downstream hate detection. Devlin et al. [18] introduced BERT, enabling unified masked-language and next-sentence objectives that now props up most text moderators. For vision-language alignment, Radford et al. [19] sketched out CLIP, contrasting image and text embeddings at scale - a firepower we exploit for zero-shot visual screening and as frozen backbones for specialized fusion heads.</w:t>
       </w:r>
     </w:p>
     <w:p>
@@ -972,7 +972,7 @@
           <w:i w:val="0"/>
           <w:sz w:val="20"/>
         </w:rPr>
-        <w:t>Continued pre-training on toxic or community-norm-violating corpora sharpens decision boundaries without full structure redesign. Caselli et al. [34] introduced HateBERT, continuing BERT pre-training on Reddit communities banned for hate and harassment (RAL-E), reporting roughly 2-5% relative F1 gains over vanilla BERT on several hate benchmarks-a modest but operationally meaningful margin at high base rates. Hartvigsen et al. [35] presented ToxiGen, a large machine-generated corpus paired with diagnostic tools, addressing scarcity and diversity of abusive training exemplars without relying solely on platform logs. For multilingual rollout, Conneau et al. [36] introduced XLM-RoBERTa, training Transformers on 100 languages from CommonCrawl. XLM-R has become the de facto backbone for cross-lingual transfer in abusive-language tasks where labeled resources are unevenly distributed.</w:t>
+        <w:t>Continued pre-training on toxic or community-norm-violating corpora sharpens decision boundaries without full blueprint redesign. Caselli et al. [34] introduced HateBERT, continuing BERT pre-training on Reddit communities banned for hate and harassment (RAL-E), reporting roughly 2-5% relative F1 gains over vanilla BERT on several hate benchmarks - a modest but operationally meaningful margin at high base rates. Hartvigsen et al. [35] sketched out ToxiGen, a large machine-generated corpus paired with diagnostic tools, addressing scarcity and diversity of abusive training exemplars without relying solely on platform logs. For multilingual rollout, Conneau et al. [36] introduced XLM-RoBERTa, training Transformers on 100 languages from CommonCrawl; XLM-R has become the de facto backbone for cross-lingual transfer in abusive-language tasks where labeled resources are unevenly distributed.</w:t>
       </w:r>
     </w:p>
     <w:p>
@@ -988,7 +988,7 @@
           <w:i w:val="0"/>
           <w:sz w:val="20"/>
         </w:rPr>
-        <w:t>Cross-lingual transfer dynamics constrain backbone choice. While performance degrades on distant pairs (for example, English to Hindi) unless boosted with target-language fine-tuning or transliteration-aware preprocessing, pires et al. [37] showed that multilingual BERT (mBERT) achieves surprisingly strong zero-shot transfer to typologically similar languages (for example, English to German),. To put it plainly, while motivating future extensions with stronger cross-lingual models and code-mixed adapters, this empirical pattern rationalizes our use of mBERT as a shared encoder. When batch sizes are constrained by GPU memory, on speed, factor-fast fine-tuning via adapters [38] and Low-Rank Adaptation (LoRA) [39] reduces trainable factors relative to full fine-tuning-crucial. We retain full fine-tuning in the present study to establish strong, reproducible baselines on a single T4 GPU. Adapter-based alternatives are deferred to Section 9, where compute-performance frontiers can be explored without confounding the metaheuristic comparisons that constitute the paper's algorithmic core.</w:t>
+        <w:t>Cross-lingual transfer dynamics constrain backbone choice. While performance degrades on distant pairs (for example, English to Hindi) unless augmented with target-language fine-tuning or transliteration-aware preprocessing, pires et al. [37] showed that multilingual BERT (mBERT) pulls off surprisingly strong zero-shot transfer to typologically similar languages (for example, English to German). While motivating future extensions with stronger cross-lingual models and code-mixed adapters, this empirical pattern rationalizes our use of mBERT as a shared encoder. When batch sizes are constrained by GPU memory, on leanness, knob-lean fine-tuning via adapters [38] and Low-Rank Adaptation (LoRA) [39] reduces trainable settings relative to full fine-tuning - decisive. We retain full fine-tuning in the present study to establish strong, reproducible baselines on a single T4 GPU; adapter-based alternatives are deferred to Section 9. Compute-performance frontiers can be explored without confounding the metaheuristic comparisons that constitute the paper's algorithmic core.</w:t>
       </w:r>
     </w:p>
     <w:p>
@@ -1018,7 +1018,7 @@
           <w:i w:val="0"/>
           <w:sz w:val="20"/>
         </w:rPr>
-        <w:t>Where either type may appear benign alone, multimodal hate speech is most visible in meme understanding. Gómez et al. [11] studied multimodal hate in publications and social feeds, documenting how editorial images recontextualize textual slurs. Fan et al. [12] connected image sentiment with attention procedures, illustrating cross-modal saliency cues. Recent surveys and models continue to stress aspect-based and fine-grained multimodal sentiment [13], highlighting the value of interaction layers between modes rather than independent scoring. Kiela et al. [20] formalized the problem for the Facebook Hateful Memes benchmark, showing strong human performance ceilings and the comparative weakness of text-only or vision-only pipelines. Our work aligns with this thread by adopting CLIP-backed fusion while expanding beyond memes to arbitrary images and audio.</w:t>
+        <w:t>Multimodal hate speech is most visible in meme understanding, where either signal type may appear benign alone. Gómez et al. [11] analyzed multimodal hate in publications and social feeds, documenting how editorial images recontextualize textual slurs. Fan et al. [12] connected image sentiment with attention moving parts, illustrating cross-modal saliency cues. Recent surveys and models continue to stress aspect-based and fine-grained multimodal sentiment [13], highlighting the value of interplay layers between channels rather than independent scoring. Kiela et al. [20] formalized the problem for the Facebook Hateful Memes benchmark, bringing out strong human performance ceilings and the comparative weakness of text-only or vision-only pipelines. While expanding beyond memes to arbitrary images and audio, our work aligns with this thread by adopting CLIP-backed fusion.</w:t>
       </w:r>
     </w:p>
     <w:p>
@@ -1034,7 +1034,7 @@
           <w:i w:val="0"/>
           <w:sz w:val="20"/>
         </w:rPr>
-        <w:t>Fusion architectures admit a pragmatic taxonomy. From a broader view, when types differ in dimensionality and sampling rate, early fusion concatenates raw or shallow characteristics before classification [40], maximizing low-level cross-correlation at the expense of scalability. Late fusion trains specialists per mode and combines scores at decision time-modular, interpretable, and compatible with frozen backbones. When joint training is doable, attention-based fusion (including cross-modal Transformers such as ViLBERT [41]) learns dynamic weights conditioned on inputs, often improving benchmark maxima. Early fusion preserves fine-grained co-occurrence structure but can explode in variable count. Attention methods excel on Hateful Memes yet frequently require joint end-to-end training that conflicts with our goal of reusable, independently optimizable branches. We therefore adopt late fusion as a deliberate middle ground enabling branch-wise diagnostics, modular expansion (for example, adding a new OCR channel). Transparent per-branch contribution assessment for governance.</w:t>
+        <w:t>Fusion architectures admit a pragmatic taxonomy. When pathways differ in dimensionality and sampling rate, early fusion concatenates raw or shallow aspects before classification [40], maximizing low-level cross-correlation at the expense of scalability. Late fusion trains specialists per signal type and combines scores at decision time-modular, interpretable, and compatible with frozen backbones. Attention-based fusion (including cross-modal Transformers such as ViLBERT [41]) learns dynamic weights conditioned on inputs, often improving benchmark maxima when joint training is workable. Early fusion preserves fine-grained co-occurrence structure but can explode in setting count; attention methods excel on Hateful Memes yet frequently require joint end-to-end training that conflicts with our goal of reusable, independently optimizable branches. We therefore adopt late fusion as a deliberate middle ground enabling branch-wise diagnostics, modular expansion (for example, adding a new OCR channel), and transparent per-branch contribution analysis for governance.</w:t>
       </w:r>
     </w:p>
     <w:p>
@@ -1050,7 +1050,7 @@
           <w:i w:val="0"/>
           <w:sz w:val="20"/>
         </w:rPr>
-        <w:t>Meme-specific research clarifies what specialized heads must learn. Pramanick et al. [42] suggested a dual-route structure separating benign confounders from hateful associations, lifting performance on challenging meme instances. Zhu et al. [43] explored prompt-based exploitation of vision-language models, narrowing the gap between zero-shot heuristics and supervised specialist models through careful textual conditioning. While remaining on the roadmap in Section 9, chen et al. [44] introduced UNITER, a universal image-text representation from large-scale pre-training; models in this class are strong future baselines but often demand multi-GPU budgets atypical of academic edge deployments-As such, their exclusion from our primary T4 study.</w:t>
+        <w:t>Meme-specific research clarifies what specialized heads must learn. Pramanick et al. [42] laid out a dual-route backbone separating benign confounders from hateful associations, lifting performance on challenging meme instances. Zhu et al. [43] explored prompt-based exploitation of vision-language models, narrowing the gap between zero-shot heuristics and supervised specialist models through careful textual conditioning. While remaining on the roadmap in Section 9, chen et al. [44] introduced UNITER, a universal image-text representation from large-scale pre-training; models in this class are strong future baselines but often demand multi-GPU budgets atypical of academic edge deployments - hence their exclusion from our primary T4 study.</w:t>
       </w:r>
     </w:p>
     <w:p>
@@ -1066,7 +1066,7 @@
           <w:i w:val="0"/>
           <w:sz w:val="20"/>
         </w:rPr>
-        <w:t>Audio-visual hate remains comparatively underexplored despite short-video growth (TikTok, YouTube Shorts, reels). When fusing Whisper transcripts with wav2vec2 acoustics, das et al. [45] released HateMM, combining video, audio, and text for English hate detection, and showed that audio-only models trail text-dominant baselines yet contribute orthogonal evidence-a pattern we replicate. Not merely cultural but epistemic: absent corpora like HateMM, audio would remain a silent mode in empirical benchmarks, the literature's text-image bias is In this way.</w:t>
+        <w:t>Audio-visual hate remains comparatively underexplored despite short-video growth (TikTok, YouTube Shorts, reels). When fusing Whisper transcripts with wav2vec2 acoustics, das et al. [45] released HateMM, combining video, audio, and text for English hate detection, and showed that audio-only models trail text-dominant baselines yet contribute orthogonal evidence-a pattern we replicate. The literature's text-image bias is thus not merely cultural but epistemic: absent corpora like HateMM, audio would remain a silent channel in empirical benchmarks.</w:t>
       </w:r>
     </w:p>
     <w:p>
@@ -1096,7 +1096,7 @@
           <w:i w:val="0"/>
           <w:sz w:val="20"/>
         </w:rPr>
-        <w:t>Multilingual hate speech introduces script diversity, morphological richness, and code-mixing absent in English-only corpora. Chhabra and Vishwakarma [1] survey multimodal and multilingual hate speech detection, noting that most published systems still emphasize one language despite cross-lingual abuse patterns. Schmidt and Wiegand [2] provide an NLP-centric survey of resources and methods, cataloging corpus biases. Fortuna and Nunes [3] review automatic detection of hate in text, emphasizing annotation protocols and testing indicators. Collectively, these works motivate shared multilingual encoders-we adopt mBERT as a pragmatic compromise between coverage and processing cost.</w:t>
+        <w:t>Multilingual hate speech introduces script diversity, morphological richness, and code-mixing absent in English-only corpora. Chhabra and Vishwakarma [1] survey multimodal and multilingual hate speech detection, noting that most published systems still emphasize one language despite cross-lingual abuse patterns. Schmidt and Wiegand [2] provide an NLP-centric survey of resources and methods, cataloging collection biases. Fortuna and Nunes [3] review automatic detection of hate in text, emphasizing annotation protocols and trial yardsticks. Collectively, these works motivate shared multilingual encoders-we adopt mBERT as a pragmatic compromise between coverage and processing cost.</w:t>
       </w:r>
     </w:p>
     <w:p>
@@ -1112,7 +1112,7 @@
           <w:i w:val="0"/>
           <w:sz w:val="20"/>
         </w:rPr>
-        <w:t>Corpus-level studies sharpen cross-lingual difficulty. Bohra et al. [46] built a Hindi-English code-mixed Twitter corpus (4,575 annotated posts), reporting that code-mixing intensity correlates with abusive intent in South Asian social media-precisely the phenomenon that pure English ToxicBERT-style models miss. Ross et al. [47] curated a German hate-speech data collection aligned with EU legal norms, observing lower inter-annotator agreement (Krippendorff's α on the order of 0.29-0.38) than typical English benchmarks, signaling that cultural juridical frames modulate label stability. Mandl et al. [48] organized the HASOC shared tasks across English, German. Hindi, enabling directly comparable multilingual review-an intellectual ancestor of our choice to include German and Hindi alongside English in a unified training stack.</w:t>
+        <w:t>Corpus-level studies sharpen cross-lingual difficulty. Bohra et al. [46] built a Hindi-English code-mixed Twitter corpus (4,575 annotated posts), reporting that code-mixing intensity correlates with abusive intent in South Asian social media - precisely the phenomenon that pure English ToxicBERT-style models miss. Ross et al. [47] curated a German hate-speech benchmark set aligned with EU legal norms, observing lower inter-annotator agreement (Krippendorff's α on the order of 0.29-0.38) than typical English benchmarks, signaling that cultural juridical frames modulate label stability. Mandl et al. [48] organized the HASOC shared tasks across English, German, and Hindi, enabling directly comparable multilingual trial - an intellectual ancestor of our choice to include German and Hindi alongside English in a unified training stack.</w:t>
       </w:r>
     </w:p>
     <w:p>
@@ -1128,7 +1128,7 @@
           <w:i w:val="0"/>
           <w:sz w:val="20"/>
         </w:rPr>
-        <w:t>Encoder comparisons carry concrete engineering consequences. Multilingual offensive-language and hate-speech benchmarks that fine-tune both encoders on parallel splits typically report XLM-R ahead of mBERT by on the order of 2-4 absolute F1 points on average, with larger swings on lower-resource languages-consistent with the cross-lingual margins established for XLM-R pre-training [36] and with shared-task multilingual settings such as OffensEval 2020 [49]. While XLM-R at 550M settings strains batch sizes and parallel branch training; upgrading the backbone is Even so, an immediate, drop-in enhancement enumerated in Section 9, we select mBERT here because its 178M-variable footprint fits the memory envelope of a single T4 workflow with multimodal co-resident models,.</w:t>
+        <w:t>Encoder comparisons carry concrete engineering consequences. Multilingual offensive-language and hate-speech benchmarks that fine-tune both encoders on parallel splits typically report XLM-R ahead of mBERT by on the order of 2-4 absolute F1 points on average, with larger swings on lower-resource languages - consistent with the cross-lingual margins established for XLM-R pre-training [36] and with shared-task multilingual settings such as OffensEval 2020 [49]. We select mBERT here because its 178M-dial footprint fits the memory envelope of a single T4 workflow with multimodal co-resident models, whereas XLM-R at 550M tunables strains batch sizes and parallel branch training; upgrading the backbone is still an immediate, drop-in enhancement enumerated in Section 9.</w:t>
       </w:r>
     </w:p>
     <w:p>
@@ -1158,7 +1158,7 @@
           <w:i w:val="0"/>
           <w:sz w:val="20"/>
         </w:rPr>
-        <w:t>Metaheuristics have been applied to hate speech and related NLP tasks for characteristic selection, ensemble weighting, and model arrangement search. Baydogan and Alatas [14] explored ant lion and moth-flame optimizers for hate speech classification, reporting competitive correctness against grid searches. Asiri et al. [15] introduced seagull optimization within textual pipelines, illustrating that bio-inspired search can navigate discrete characteristic spaces efficiently. Al-Makhadmeh and Tolba [16] studied optimization in ensemble hate speech detectors, while Ayo et al. [17] examined probabilistic clustering formulations for related problems. Such contributions shows value but rarely juxtapose multiple optimizers on identical task interfaces or integrate multimodal decision fusion, leaving open questions about reproducibility and generality.</w:t>
+        <w:t>Metaheuristics have been applied to hate speech and related NLP tasks for aspect selection, ensemble weighting, and model arrangement search. Baydogan and Alatas [14] explored ant lion and moth-flame optimizers for hate speech classification, reporting competitive precision against grid searches. Asiri et al. [15] introduced seagull optimization within textual pipelines, illustrating that bio-inspired search can navigate discrete attribute spaces efficiently. Al-Makhadmeh and Tolba [16] studied optimization in ensemble hate speech detectors, while Ayo et al. [17] examined probabilistic clustering formulations for related problems. Such contributions brings out value but rarely juxtapose multiple optimizers on identical task interfaces or integrate multimodal decision fusion, leaving open questions about reproducibility and generality.</w:t>
       </w:r>
     </w:p>
     <w:p>
@@ -1174,7 +1174,7 @@
           <w:i w:val="0"/>
           <w:sz w:val="20"/>
         </w:rPr>
-        <w:t>Each broader metaheuristic landscape extends greatly beyond any single hate-speech paper. While following bio-inspired methods (salp swarm, Harris hawks, and many hybrids) populate the optimization literature, mirjalili and Lewis [50] formulated Whale Optimization Algorithm (WOA),. In NLP, population-based methods have tuned trait subsets for sentiment, searched architectures for text classifiers. Configured Transformers-yet comparative studies that hold data collections, budgets, and fitness functions fixed across algorithms remain sparse. Our work's algorithmic premise is So, methodological: unify testing so differences reflect optimizer dynamics rather than incidental preprocessing drift.</w:t>
+        <w:t>A given broader metaheuristic landscape extends markedly beyond any single hate-speech paper. While follow-up bio-inspired methods (salp swarm, Harris hawks, and numerous hybrids) populate the optimization literature, mirjalili and Lewis [50] formulated Whale Optimization Algorithm (WOA). In NLP, population-based methods have tuned trait subsets for sentiment, searched architectures for text classifiers, and configured Transformers-yet comparative studies that hold benchmark sets, budgets, and fitness functions fixed across algorithms remain sparse. Our work's algorithmic premise is thus methodological: unify assessment so differences reflect optimizer dynamics rather than incidental preprocessing drift.</w:t>
       </w:r>
     </w:p>
     <w:p>
@@ -1190,7 +1190,7 @@
           <w:i w:val="0"/>
           <w:sz w:val="20"/>
         </w:rPr>
-        <w:t>Bayesian optimization via tree-structured Parzen estimators (TPE)-for which Bergstra et al. showed big gains over random search and grid search on deep-network hyperparameters-often dominates low-dimensional, comparatively smooth objectives when surrogate assumptions hold. Our implementation follows the TPE sampler provided by Optuna [25]. However, Bayesian acquisition implicitly privileges stationarity and smoothness assumptions that frequently fail in discrete combinatorial spaces-branch masks, attention-head subsets, or categorical routing decisions-where fitness plateaus and cliffs induce misleading surrogate posteriors. On multimodal objectives (in the optimization sense) arising from small validation sets or label noise [14], [22], as shown by population-based methods maintain diversity across parallel candidates, reducing premature agreement that sequential Bayesian probing can. When swarms and evolutionary operators match or exceed TPE snapshots, our ten-task harness tests this theory on mixtures of continuous fusion weights, scalar boundaries, binary masks, and hybrid tuples, reporting.</w:t>
+        <w:t>Bayesian optimization via tree-structured Parzen estimators (TPE)-for which Bergstra et al. made clear hefty gains over random search and grid search on deep-network hyperparameters - often dominates low-dimensional, comparatively smooth objectives when surrogate assumptions hold; our rollout follows the TPE sampler provided by Optuna [25]. However, Bayesian acquisition implicitly privileges stationarity and smoothness assumptions that frequently fail in discrete combinatorial spaces - branch masks, attention-head subsets, or categorical routing decisions - where fitness plateaus and cliffs induce misleading surrogate posteriors. Population-based methods maintain diversity across parallel candidates, tames premature convergence that sequential Bayesian probing can puts forth on multimodal objectives (in the optimization sense) arising from small validation sets or label noise [14], [22]. When swarms and evolutionary operators match or exceed TPE snapshots, our ten-task channels tests this educated guess on mixtures of continuous fusion weights, scalar boundaries, binary masks, and hybrid tuples, reporting.</w:t>
       </w:r>
     </w:p>
     <w:p>
@@ -1220,7 +1220,7 @@
           <w:i w:val="0"/>
           <w:sz w:val="20"/>
         </w:rPr>
-        <w:t>Earlier art typically optimizes either mode coverage or language coverage or model hyperparameters-not all three within a single experimental harness. Threshold learning, despite its outsized effect on precision and recall, remains underrepresented relative to design search. Finally, comparative studies of GA, PSO, DE, GWO; fA in unified NLP tasks are sparse. Our setup supplies a common fitness function and task taxonomy to support such comparisons.</w:t>
+        <w:t>Preceding art typically optimizes either pathway coverage or language coverage or model hyperparameters - not all three within a single experimental puts to work. Cutoff learning, despite its outsized effect on precision and recall, remains underrepresented relative to layout search. Finally, comparative studies of GA, PSO, DE, GWO, and FA in unified NLP tasks are sparse; our framework supplies a common fitness function and task taxonomy to support such comparisons.</w:t>
       </w:r>
     </w:p>
     <w:p>
@@ -1236,7 +1236,7 @@
           <w:i w:val="0"/>
           <w:sz w:val="20"/>
         </w:rPr>
-        <w:t>Why these gaps persist is structural, not merely scholarly oversight. First, processing cost penalizes integrative work: multimodal Transformers, ASR. Vision backbones jointly exhaust GPU memory long before optimizers exhaust their iteration budgets. Second, corpus fragmentation splits the community into text-, meme-, and (rarely) audio-centric silos with non-comparable labels, discouraging unified benchmarks. Third, publication incentives reward novel architectures and leaderboard increments on single corpora more than careful optimizer comparisons whose gains appear "engineering-heavy" despite operational influence. Fourth, platform secrecy hides production fusion weights and cutoff policies, starving academia of ground-truth rollout objectives. Our late-fusion, frozen-backbone, and single-T4 design choices are explicit responses to these frictions: they trade some raw precision for reproducibility, modularity, and search transparency.</w:t>
+        <w:t>Why these gaps persist is structural, not merely scholarly oversight. First, processing cost penalizes integrative work: multimodal Transformers, ASR, and vision backbones jointly exhaust GPU memory long before optimizers exhaust their iteration budgets. Second, collection fragmentation splits the community into text-, meme-, and (rarely) audio-centric silos with non-comparable labels, discouraging unified benchmarks. Third, publication incentives reward novel architectures and leaderboard increments on single collections more than careful optimizer comparisons whose gains appear "engineering-heavy" despite operational weight. Fourth, platform secrecy hides production fusion weights and red line policies, starving academia of ground-truth go-live objectives. Our late-fusion, frozen-backbone, and single-T4 design choices are explicit responses to these frictions: they trade some raw correctness for reproducibility, modularity, and search transparency.</w:t>
       </w:r>
     </w:p>
     <w:p>
@@ -1252,7 +1252,7 @@
           <w:i w:val="0"/>
           <w:sz w:val="20"/>
         </w:rPr>
-        <w:t>Table I positions representative references along type, language, methodological, and optimization axes.</w:t>
+        <w:t>Table I positions representative references along signal type, language, methodological, and optimization axes.</w:t>
       </w:r>
     </w:p>
     <w:p>
@@ -1364,7 +1364,7 @@
                 <w:i w:val="0"/>
                 <w:sz w:val="16"/>
               </w:rPr>
-              <w:t>Channel</w:t>
+              <w:t>Signal type</w:t>
             </w:r>
           </w:p>
         </w:tc>
@@ -1460,7 +1460,7 @@
                 <w:i w:val="0"/>
                 <w:sz w:val="16"/>
               </w:rPr>
-              <w:t>Drawbacks</w:t>
+              <w:t>Weak spots</w:t>
             </w:r>
           </w:p>
         </w:tc>
@@ -1704,7 +1704,7 @@
                 <w:i w:val="0"/>
                 <w:sz w:val="16"/>
               </w:rPr>
-              <w:t>Characteristic-based Twitter models</w:t>
+              <w:t>Trait-based Twitter models</w:t>
             </w:r>
           </w:p>
         </w:tc>
@@ -1724,7 +1724,7 @@
                 <w:i w:val="0"/>
                 <w:sz w:val="16"/>
               </w:rPr>
-              <w:t>Manual attribute selection</w:t>
+              <w:t>Manual aspect selection</w:t>
             </w:r>
           </w:p>
         </w:tc>
@@ -2028,7 +2028,7 @@
                 <w:i w:val="0"/>
                 <w:sz w:val="16"/>
               </w:rPr>
-              <w:t>Multilingual variants needed for broad deployment</w:t>
+              <w:t>Multilingual variants needed for broad launch</w:t>
             </w:r>
           </w:p>
         </w:tc>
@@ -2252,7 +2252,7 @@
                 <w:i w:val="0"/>
                 <w:sz w:val="16"/>
               </w:rPr>
-              <w:t>Several (data collection-dependent)</w:t>
+              <w:t>Several (benchmark set-dependent)</w:t>
             </w:r>
           </w:p>
         </w:tc>
@@ -2414,7 +2414,7 @@
                 <w:i w:val="0"/>
                 <w:sz w:val="16"/>
               </w:rPr>
-              <w:t>Hurdle baselines and submissions</w:t>
+              <w:t>Headache baselines and submissions</w:t>
             </w:r>
           </w:p>
         </w:tc>
@@ -2678,7 +2678,7 @@
                 <w:i w:val="0"/>
                 <w:sz w:val="16"/>
               </w:rPr>
-              <w:t>Data set-specific</w:t>
+              <w:t>Corpus-specific</w:t>
             </w:r>
           </w:p>
         </w:tc>
@@ -2901,7 +2901,7 @@
                 <w:i w:val="0"/>
                 <w:sz w:val="16"/>
               </w:rPr>
-              <w:t>Computing cost; reliance on ASR quality for spoken branch</w:t>
+              <w:t>Compute-heavy cost; reliance on ASR quality for spoken branch</w:t>
             </w:r>
           </w:p>
         </w:tc>
@@ -3112,7 +3112,7 @@
                 <w:i w:val="0"/>
                 <w:sz w:val="16"/>
               </w:rPr>
-              <w:t>Weakness</w:t>
+              <w:t>Weak spot</w:t>
             </w:r>
           </w:p>
         </w:tc>
@@ -3214,7 +3214,7 @@
                 <w:i w:val="0"/>
                 <w:sz w:val="16"/>
               </w:rPr>
-              <w:t>Mixed continuous / discrete characteristic selection</w:t>
+              <w:t>Mixed continuous / discrete trait selection</w:t>
             </w:r>
           </w:p>
         </w:tc>
@@ -3254,7 +3254,7 @@
                 <w:i w:val="0"/>
                 <w:sz w:val="16"/>
               </w:rPr>
-              <w:t>mostly text-only; no multimodal fusion-layer search</w:t>
+              <w:t>chiefly text-only; no multimodal fusion-layer search</w:t>
             </w:r>
           </w:p>
         </w:tc>
@@ -3356,7 +3356,7 @@
                 <w:i w:val="0"/>
                 <w:sz w:val="16"/>
               </w:rPr>
-              <w:t>Moderate-dimensional attribute or model-factor vector</w:t>
+              <w:t>Moderate-dimensional trait or model-tunable vector</w:t>
             </w:r>
           </w:p>
         </w:tc>
@@ -3396,7 +3396,7 @@
                 <w:i w:val="0"/>
                 <w:sz w:val="16"/>
               </w:rPr>
-              <w:t>Single-algorithm center of gravity; channel coverage narrow</w:t>
+              <w:t>Single-algorithm center of gravity; signal type coverage narrow</w:t>
             </w:r>
           </w:p>
         </w:tc>
@@ -3498,7 +3498,7 @@
                 <w:i w:val="0"/>
                 <w:sz w:val="16"/>
               </w:rPr>
-              <w:t>Ensemble weighting + setup knobs</w:t>
+              <w:t>Ensemble weighting + backbone knobs</w:t>
             </w:r>
           </w:p>
         </w:tc>
@@ -3538,7 +3538,7 @@
                 <w:i w:val="0"/>
                 <w:sz w:val="16"/>
               </w:rPr>
-              <w:t>Black-box ensemble governance; limited cutoff-audit narrative</w:t>
+              <w:t>Black-box ensemble governance; limited red line-audit narrative</w:t>
             </w:r>
           </w:p>
         </w:tc>
@@ -3620,7 +3620,7 @@
                 <w:i w:val="0"/>
                 <w:sz w:val="16"/>
               </w:rPr>
-              <w:t>Metaheuristic-informed clustering / classification flow</w:t>
+              <w:t>Metaheuristic-informed clustering / classification pipeline</w:t>
             </w:r>
           </w:p>
         </w:tc>
@@ -3640,7 +3640,7 @@
                 <w:i w:val="0"/>
                 <w:sz w:val="16"/>
               </w:rPr>
-              <w:t>Cluster cardinality and attribute subsets</w:t>
+              <w:t>Cluster cardinality and characteristic subsets</w:t>
             </w:r>
           </w:p>
         </w:tc>
@@ -3660,7 +3660,7 @@
                 <w:i w:val="0"/>
                 <w:sz w:val="16"/>
               </w:rPr>
-              <w:t>Focused on clustering formulation rather than fusion of deep modes</w:t>
+              <w:t>Focused on clustering formulation rather than fusion of deep channels</w:t>
             </w:r>
           </w:p>
         </w:tc>
@@ -3989,7 +3989,7 @@
                 <w:i w:val="0"/>
                 <w:sz w:val="16"/>
               </w:rPr>
-              <w:t>Seven optimizers × ten tasks under shared measures</w:t>
+              <w:t>Seven optimizers × ten tasks under shared yardsticks</w:t>
             </w:r>
           </w:p>
         </w:tc>
@@ -4058,7 +4058,7 @@
           <w:i w:val="0"/>
           <w:sz w:val="20"/>
         </w:rPr>
-        <w:t>Collectively, Tables I-II motivate our emphasis: unify modes, unify languages at the textual encoder, and unify optimizer testing so that improvements in F1, precision, and recall are attributable to search and integration rather than accidental preprocessor advantage.</w:t>
+        <w:t>Collectively, Tables I-II motivate our emphasis: unify pathways, unify languages at the textual encoder, and unify optimizer benchmarking so that improvements in F1, precision, and recall are attributable to search and integration rather than accidental preprocessor advantage.</w:t>
       </w:r>
     </w:p>
     <w:p>
@@ -4079,7 +4079,7 @@
           <w:i w:val="0"/>
           <w:sz w:val="16"/>
         </w:rPr>
-        <w:t>Fig. 15: Literature coverage gap matrix. Past works (rows) vs. power dimensions (columns), and green checkmarks show coverage; red crosses suggest absence. One such study (bottom row) is the first to address all seven dimensions together.</w:t>
+        <w:t>Fig. 15: Literature coverage gap matrix; earlier works (rows) vs. firepower dimensions (columns). Green checkmarks flag coverage; red crosses signal absence. This study (bottom row) is the first to address all seven dimensions jointly.</w:t>
       </w:r>
     </w:p>
     <w:p>
@@ -4125,7 +4125,7 @@
           <w:i w:val="0"/>
           <w:sz w:val="20"/>
         </w:rPr>
-        <w:t>Figure 1 (conceptual) depicts our adaptive hybrid moderator. Raw inputs are routed into three asynchronous pipelines-text, vision, and audio-each producing calibrated or comparable probabilistic scores. Vision Also, splits into a zero-shot CLIP judger with OCR context and a HateCLIPper-style fine-tuned fusion part that learns nonlinear links between image and text embeddings. Audio contributes (i) an acoustic probability from wav2vec attributes and (ii) an audio-text probability gathered by transcribing the waveform and reusing the multilingual text classifier. When transcripts are unreliable, branch outputs are combined through weighted late fusion; optional ASR confidence gating attenuates the audio-text channel. A decision bar τ converts fused hate probability into a binary action. Optuna TPE, simulated annealing, and population-based metaheuristics search over hyperparameters, fusion weights, masks, continuous setup knobs. Τ, using a composite fitness that clearly values F1, precision, and accuracy.</w:t>
+        <w:t>Figure 1 (conceptual) depicts our adaptive hybrid moderator. Raw inputs are routed into three asynchronous pipelines-text, vision, and audio-each producing calibrated or comparable probabilistic scores. Vision further splits into a zero-shot CLIP judger with OCR context and a HateCLIPper-style fine-tuned fusion unit that learns nonlinear exchanges between image and text embeddings. Audio contributes (i) an acoustic probability from wav2vec characteristics and (ii) an audio-text probability pulled by transcribing the waveform and reusing the multilingual text classifier. When transcripts are unreliable, branch outputs are combined through weighted late fusion; optional ASR confidence gating attenuates the audio-text channel. A decision boundary τ converts fused hate probability into a binary action. Optuna TPE, simulated annealing, and population-based metaheuristics search over hyperparameters, fusion weights, masks, continuous layout knobs, and τ, using a composite fitness that explicitly values F1, precision, and precision.</w:t>
       </w:r>
     </w:p>
     <w:p>
@@ -4146,7 +4146,7 @@
           <w:i w:val="0"/>
           <w:sz w:val="16"/>
         </w:rPr>
-        <w:t>Fig. 1: Presented system layout. Text, vision (zero-shot CLIP + HateCLIPper), and audio (Wav2Vec2 acoustic + Whisper transcript) pipelines produce branch-level probabilities combined through weighted late fusion with ASR confidence gating. Metaheuristic and Bayesian optimizers search over fusion weights, bars, and discrete masks.</w:t>
+        <w:t>Fig. 1: Put forward system layout. Text, vision (zero-shot CLIP + HateCLIPper), and audio (Wav2Vec2 acoustic + Whisper transcript) pipelines produce branch-level probabilities combined through weighted late fusion with ASR confidence gating. Metaheuristic and Bayesian optimizers search over fusion weights, boundaries, and discrete masks.</w:t>
       </w:r>
     </w:p>
     <w:p>
@@ -4162,7 +4162,7 @@
           <w:i w:val="0"/>
           <w:sz w:val="20"/>
         </w:rPr>
-        <w:t>We adopt late fusion over early or cross-attention alternatives for three principled reasons. First, late fusion permits modular backbone replacement-upgrading mBERT to XLM-R [36] or CLIP ViT-B/32 to ViT-L/14 [19] requires retraining only the affected branch and re-optimizing fusion weights, not the entire workflow. A similar modularity is progressively important as multilingual moderation stacks must track rapid foundation-model turnover without invalidating end-to-end systems that would otherwise demand full re-co-training whenever any encoder changes [1], [3]. Second, late fusion produces interpretable per-branch contributions: each branch produces a calibrated probability that can be inspected, logged. Audited independently-a requirement for regulatory compliance under setups such as the EU Artificial Intelligence Act, where high-risk classification systems benefit from traceable evidence chains and post hoc review of piece-level scores. Third, late fusion is computationally tractable on a single T4 GPU: cross-attention models like UNITER [44] or ViLBERT [41] require joint backpropagation through all type encoders. Exceeds 16 GB VRAM for multi-branch configurations that also retain task heads, gradient accumulation buffers, and mixed-precision transient tensors. The trade-off is that late fusion can't capture fine-grained cross-modal connections that early or attention-based fusion would openly model [40]. We partially reduces this through the HateCLIPper head, which does learn image-text exchanges within the vision branch [28]. Through OCR-boosted CLIP prompting that injects typography into the zero-shot pathway [19].</w:t>
+        <w:t>We adopt late fusion over early or cross-attention alternatives for three principled reasons. First, late fusion permits modular backbone replacement-upgrading mBERT to XLM-R [36] or CLIP ViT-B/32 to ViT-L/14 [19] requires retraining only the affected branch and re-optimizing fusion weights, not the entire pipeline. This modularity is progressively important as multilingual moderation stacks must track rapid foundation-model turnover without invalidating end-to-end systems that would otherwise demand full re-co-training whenever any encoder changes [1], [3]. Second, late fusion spits out interpretable per-branch contributions: each branch produces a calibrated probability that can be inspected, logged, and audited independently - a requirement for regulatory compliance under backbones such as the EU Artificial Intelligence Act, where high-risk classification systems benefit from traceable evidence chains and post hoc review of piece-level scores. Third, late fusion is computationally tractable on a single T4 GPU: cross-attention models like UNITER [44] or ViLBERT [41] require joint backpropagation through all signal type encoders, which exceeds 16 GB VRAM for multi-branch configurations that also retain task heads, gradient accumulation buffers, and mixed-precision transient tensors. The trade-off is that late fusion can't capture fine-grained cross-modal back-and-forths that early or attention-based fusion would explicitly model [40]. We partially dials back this through the HateCLIPper head, which does learn image-text interactions within the vision branch [28], and through OCR-augmented CLIP prompting that injects typography into the zero-shot pathway [19].</w:t>
       </w:r>
     </w:p>
     <w:p>
@@ -4178,7 +4178,7 @@
           <w:i w:val="0"/>
           <w:sz w:val="20"/>
         </w:rPr>
-        <w:t>Every end-to-end data flow proceeds as follows. Multimodal inputs arrive at an ingress router that dispatches each mode-capable fragment to the appropriate encoder stack: tokenized spans enter mBERT [18]. Raster images enter CLIP together with optional EasyOCR overlays; waveforms enter Wav2Vec2-XLS-R [26] and Whisper [27] in parallel. When enabled in the training recipe, each workflow emits one or more branch-level probabilities on the unit interval, optionally after temperature scaling or validation-set calibration. Nonlinear fusion combines active branches with nonnegative weights, applies ASR confidence gating on the transcript-derived channel, and forms Pfused. A scalar bar τ, learned or searched post hoc, maps Pfused to a binary moderation decision. Separately, a metaheuristic layer optimizes continuous fusion weights, τ, discrete masks over branches and attention heads. Selected neuro-architectural hyperparameters, using cached validation outputs where possible to amortize testing cost [14], [25]. While still permitting policy-time adaptation without architectural rewrites, this separation-inference graph versus search process-keeps rollout latency predictable.</w:t>
+        <w:t>The end-to-end data flow proceeds as follows. Multimodal inputs arrive at an ingress router that dispatches each channel-capable fragment to the appropriate encoder stack: tokenized spans enter mBERT [18]; raster images enter CLIP together with optional EasyOCR overlays; waveforms enter Wav2Vec2-XLS-R [26] and Whisper [27] in parallel. When enabled in the training recipe, each pipeline emits one or more branch-level probabilities on the unit interval, optionally after temperature scaling or validation-set calibration. Nonlinear fusion combines active branches with nonnegative weights, applies ASR confidence gating on the transcript-derived channel, and forms Pfused. A scalar boundary τ, learned or searched post hoc, maps Pfused to a binary moderation decision. Separately, a metaheuristic layer optimizes continuous fusion weights, τ, discrete masks over branches and attention heads, and selected neuro-architectural hyperparameters, using cached validation outputs where possible to amortize evaluation cost [14], [25]. While still permitting policy-time adaptation without architectural rewrites, this separation-inference graph versus search protocol-keeps go-live latency predictable.</w:t>
       </w:r>
     </w:p>
     <w:p>
@@ -4194,7 +4194,7 @@
           <w:i w:val="0"/>
           <w:sz w:val="20"/>
         </w:rPr>
-        <w:t>Operationally, the modular graph supports failure isolation: if OCR fails or Whisper returns an empty transcript, inactive branches are omitted at fusion time rather than corrupting joint representations in a shared cross-modal trunk [11]. Logging can therefore record not only Pfused and, but also per-branch inputs, gate values g(c\mathrmasr). Masked weights-artifacts that assist human review and error review under platform safety programs. Finally, late fusion aligns with the empirical reality that moderation policies are rarely static: weight vectors and limits are periodically re-optimized as data collections shift, class priors change, or regulatory guidance tightens. A search layer that treats (i\, τ) as first-class tunables-rather than implicit by-products of end-to-end training-makes those policy shifts explicit, measurable. Comparatively cheap relative to full-model retraining [14], [25].</w:t>
+        <w:t>Operationally, the modular graph supports failure isolation: if OCR fails or Whisper returns an empty transcript, inactive branches are omitted at fusion time rather than corrupting joint representations in a shared cross-modal trunk [11]. Logging can therefore record not only Pfused and, but also per-branch inputs, gate values g(c\mathrmasr), and masked weights - artifacts that assist human review and error analysis under platform safety programs. Finally, late fusion aligns with the empirical reality that moderation policies are rarely static: weight vectors and red lines are periodically re-optimized as corpora shift, class priors change, or regulatory guidance tightens. A search layer that treats (i\, τ) as first-class tunables - rather than implicit by-products of end-to-end training - makes those policy shifts explicit, measurable, and comparatively cheap relative to full-model retraining [14], [25].</w:t>
       </w:r>
     </w:p>
     <w:p>
@@ -4224,7 +4224,7 @@
           <w:i w:val="0"/>
           <w:sz w:val="20"/>
         </w:rPr>
-        <w:t>Backbone and interface. We employ bert-base-multilingual-cased (around 178M variables) as a shared encoder for digital text and ASR transcripts. Inputs are WordPiece-tokenized with MAX_LENGTH=128.</w:t>
+        <w:t>Backbone and interface. We employ bert-base-multilingual-cased (around 178M settings) as a shared encoder for digital text and ASR transcripts. Inputs are WordPiece-tokenized with MAX_LENGTH=128.</w:t>
       </w:r>
     </w:p>
     <w:p>
@@ -4240,7 +4240,7 @@
           <w:i w:val="0"/>
           <w:sz w:val="20"/>
         </w:rPr>
-        <w:t>Optimization schedule. Unless replaces by task-specific hyperparameter search, fine-tuning uses 5 epochs, batch size 16, AdamW with learning rate 3×10-5, weight decay 0.01, warmup ratio 0.1, label smoothing 0.1, gradient accumulation 2, and a cosine learning-rate schedule.</w:t>
+        <w:t>Optimization schedule. Unless superseded by task-specific hyperparameter search, fine-tuning uses 5 epochs, batch size 16, AdamW with learning rate 3×10-5, weight decay 0.01, warmup ratio 0.1, label smoothing 0.1, gradient accumulation 2, and a cosine learning-rate schedule.</w:t>
       </w:r>
     </w:p>
     <w:p>
@@ -4256,7 +4256,7 @@
           <w:i w:val="0"/>
           <w:sz w:val="20"/>
         </w:rPr>
-        <w:t>Class imbalance. Let nc denote the empirical count of training examples in class c∈\1,,C\ - square-root dampened weights moderate extreme inverse-frequency spikes:</w:t>
+        <w:t>Class imbalance. Let nc denote the empirical count of training examples in class c∈\1,C\ - square-root dampened weights moderate extreme inverse-frequency spikes:</w:t>
       </w:r>
     </w:p>
     <w:p>
@@ -4350,7 +4350,7 @@
           <w:i w:val="0"/>
           <w:sz w:val="20"/>
         </w:rPr>
-        <w:t>before tokenization, all text inputs undergo a normalization flow: conversion to lowercase, URL replacement with a [URL] token, @-mention replacement with [USER], removal of HTML entities, collapsing of repeated whitespace, and stripping of control characters. Emoji sequences are retained as they can carry semantic hate content (e.g., the combination of racial emoji with violent emoji constitutes implicit hate in many annotation schemes [46]). For code-mixed Hindi-English text, we don't apply script-specific normalization, relying instead on mBERT's multilingual WordPiece vocabulary to handle Devanagari and Latin tokens natively. One such design choice preserves code-switching patterns that are themselves discriminative traits for hate detection in South Asian social media [48].</w:t>
+        <w:t>before tokenization, all text inputs undergo a normalization pipeline: conversion to lowercase, URL replacement with a [URL] token, @-mention replacement with [USER], removal of HTML entities, collapsing of repeated whitespace, and stripping of control characters. Emoji sequences are retained as they can carry semantic hate content (e.g., the combination of racial emoji with violent emoji constitutes implicit hate in many annotation schemes [46]). For code-mixed Hindi-English text, we don't apply script-specific normalization, relying instead on mBERT's multilingual WordPiece vocabulary to handle Devanagari and Latin tokens natively. This design choice preserves code-switching patterns that are themselves discriminative attributes for hate detection in South Asian social media [48].</w:t>
       </w:r>
     </w:p>
     <w:p>
@@ -4718,7 +4718,7 @@
           <w:i w:val="0"/>
           <w:sz w:val="20"/>
         </w:rPr>
-        <w:t>Our focal loss modulating factor (1-pt)^γ dynamically adjusts the contribution of each sample to the gradient. For well-classified examples (pt → 1), the factor approaches zero, in practice removing easy negatives from the gradient signal. As for hard examples (pt → 0), the factor approaches 1, preserving full gradient magnitude. While a sample at pt = 0.5 contributes 25\%, with γ = 2, a sample classified with pt = 0.9 contributes only 1\% of its unmodulated gradient,. From another angle, while focal loss tackles instance-level difficulty imbalance within each class, this selective gradient amplification complements the square-root dampened class weights, which address class-level frequency imbalance,. We chose γ = 2 following the review of Lin et al. [30], who showed strong empirical behavior across detection benchmarks. Α = 0.75 assigns higher weight to the minority toxic class in the asymmetric two-way setup. Together, these procedures align optimization with operational priorities under heavy class skew [3], [14].</w:t>
+        <w:t>The focal loss modulating factor (1-pt)^γ dynamically adjusts the contribution of each sample to the gradient. For well-classified examples (pt → 1), the factor approaches zero, reliably removing easy negatives from the gradient signal. When it comes to hard examples (pt → 0), the factor approaches 1, preserving full gradient magnitude. While a sample at pt = 0.5 contributes 25\%, with γ = 2, a sample classified with pt = 0.9 contributes only 1\% of its unmodulated gradient. While focal loss confronts instance-level difficulty imbalance within each class, this selective gradient amplification complements the square-root dampened class weights, which address class-level frequency imbalance. We chose γ = 2 following the analysis of Lin et al. [30], who revealed strong empirical behavior across detection benchmarks; α = 0.75 assigns higher weight to the minority toxic class in the asymmetric two-way setup. Together, these moving parts align optimization with operational priorities under heavy class skew [3], [14].</w:t>
       </w:r>
     </w:p>
     <w:p>
@@ -4734,7 +4734,7 @@
           <w:i w:val="0"/>
           <w:sz w:val="20"/>
         </w:rPr>
-        <w:t>From an realization standpoint, mBERT functions as the shared lexical tower for natively digital posts and Whisper transcripts, enabling consistent hate semantics regardless of whether toxicity appears in original Unicode spans or in ASR output [18], [27]. One such unification is specifically salient for code-mixed and multilingual stacks where the alternative-training monolingual detectors per channel-fragments supervision and complicates fusion [1]. MBERT offers a favorable correctness-memory trade-off under T4 restrictions and preserves comparability with widely reported multilingual hate-speech baselines [1], [3], while larger multilingual encoders such as XLM-R [36] may improve low-resource robustness. When transcript noise increases WER, the text head's probabilistic output remains well-formed. Coupling with ASR gating (Section 3.5) prevents brittle hard decisions that would arise from piping raw ASR strings into lexicon-only filters.</w:t>
+        <w:t>From an realization standpoint, mBERT functions as the shared lexical tower for natively digital posts and Whisper transcripts, enabling consistent hate semantics regardless of whether toxicity appears in original Unicode spans or in ASR output [18], [27]. Such a unification is specifically salient for code-mixed and multilingual stacks where the alternative - training monolingual detectors per channel - fragments supervision and complicates fusion [1]. While larger multilingual encoders such as XLM-R [36] may improve low-resource robustness, mBERT offers a favorable precision-memory trade-off under T4 ceilings and preserves comparability with widely reported multilingual hate-speech baselines [1], [3]. When transcript noise increases WER, the text head's probabilistic output remains well-formed. Coupling with ASR gating (Section 3.5) prevents brittle hard decisions that would arise from piping raw ASR strings into lexicon-only filters.</w:t>
       </w:r>
     </w:p>
     <w:p>
@@ -4779,7 +4779,7 @@
           <w:i w:val="0"/>
           <w:sz w:val="20"/>
         </w:rPr>
-        <w:t>We instantiate openai/clip-vit-base-patch32, using a predefined prompt matrix aligned with policy-relevant visual concepts (e.g., gestures, symbols, weapon-like objects-exact prompts are enumerated in the extended appendix). For overlaid or embedded text, dual EasyOCR streams parse Latin scripts (English, French, Spanish, German) and Devanagari (Hindi). When hostility is typography-dependent, oCR outputs are concatenated or summarized and fused with the image tensor through the CLIP text encoder for contextual, text-conditioned image scoring, reducing false negatives.</w:t>
+        <w:t>We instantiate openai/clip-vit-base-patch32, using a predefined prompt matrix aligned with policy-relevant visual concepts (e.g., gestures, symbols, weapon-like objects - exact prompts are enumerated in the extended appendix). For overlaid or embedded text, dual EasyOCR streams parse Latin scripts (English, French, Spanish, German) and Devanagari (Hindi). When hostility is typography-dependent, oCR outputs are concatenated or summarized and fused with the image tensor through the CLIP text encoder for contextual, text-conditioned image scoring, reducing false negatives.</w:t>
       </w:r>
     </w:p>
     <w:p>
@@ -4795,7 +4795,7 @@
           <w:i w:val="0"/>
           <w:sz w:val="20"/>
         </w:rPr>
-        <w:t>The zero-shot CLIP assessment uses a curated prompt matrix organized into five semantic categories: (i) hateful symbols and gestures (e.g., "a photo containing a hateful symbol," "an image showing an offensive hand gesture"). (ii) violence and weapons (e.g., "a photo of a weapon being brandished," "an image depicting physical violence"); (iii) dehumanizing imagery (e.g., "an image comparing a person to an animal," "a dehumanizing depiction of a group"); (iv) text-conditioned hate (e.g., "an image with offensive text overlay," "a meme containing a slur"); and (v) neutral/safe baselines (e.g., "a harmless photograph," "a benign meme"). A given maximum similarity score across hateful prompt categories, minus the maximum safe-category score, produces the zero-shot hate probability. This design follows the dual-prompt strategy advocated for CLIP-based content moderation [19]. Contrastive scoring against openly safe prompts reduces false positives from ambiguous imagery. Zero-shot CLIP isn't enough for subtle multimodal irony on memes [11], [20]. It That said, supplies a cheap, backbone-consistent past that can be fused with supervised pathways.</w:t>
+        <w:t>Our zero-shot CLIP assessment wields a curated prompt matrix organized into five semantic categories: (i) hateful symbols and gestures (e.g., "a photo containing a hateful symbol," "an image showing an offensive hand gesture"); (ii) violence and weapons (e.g., "a photo of a weapon being brandished," "an image depicting physical violence"); (iii) dehumanizing imagery (e.g., "an image comparing a person to an animal," "a dehumanizing depiction of a group"); (iv) text-conditioned hate (e.g., "an image with offensive text overlay," "a meme containing a slur"); and (v) neutral/safe baselines (e.g., "a harmless photograph," "a benign meme"). A given maximum similarity score across hateful prompt categories, minus the maximum safe-category score, produces the zero-shot hate probability. This design follows the dual-prompt strategy advocated for CLIP-based content moderation [19], where contrastive scoring against explicitly safe prompts reduces false positives from ambiguous imagery. Zero-shot CLIP isn't sufficient for subtle multimodal irony on memes [11], [20]; it still supplies a cheap, backbone-consistent earlier that can be fused with supervised pathways.</w:t>
       </w:r>
     </w:p>
     <w:p>
@@ -4825,7 +4825,7 @@
           <w:i w:val="0"/>
           <w:sz w:val="20"/>
         </w:rPr>
-        <w:t>CLIP image and text towers remain frozen; a compact trainable block learns meme-specific links:</w:t>
+        <w:t>CLIP image and text towers remain frozen; a compact trainable plug-in learns meme-specific exchanges:</w:t>
       </w:r>
     </w:p>
     <w:p>
@@ -4841,7 +4841,7 @@
           <w:i w:val="0"/>
           <w:sz w:val="20"/>
         </w:rPr>
-        <w:t>Let vimg, vtxt∈R512 be CLIP embeddings, and trainable projections generate pimg=Wimgvimg, ptxt=Wtxtvtxt with hidden width HATECLIPPER_DIM=1024. A Hadamard interaction</w:t>
+        <w:t>Let vimg, vtxt∈R512 be CLIP embeddings; trainable projections deliver pimg=Wimgvimg, ptxt=Wtxtvtxt with hidden width HATECLIPPER_DIM=1024. A Hadamard back-and-forth</w:t>
       </w:r>
     </w:p>
     <w:p>
@@ -4872,7 +4872,7 @@
           <w:i w:val="0"/>
           <w:sz w:val="20"/>
         </w:rPr>
-        <w:t>feeds an MLP scoring head with sigmoid output P(hate). Training runs 5 epochs at batch size 16, learning rate 10-4, yielding only ∼1.3M trainable factors-an capable specialization layer atop a general vision-language foundation.</w:t>
+        <w:t>feeds an MLP scoring head with sigmoid output P(hate). Training runs 5 epochs at batch size 16, learning rate 10-4, yielding only ∼1.3M trainable dials - an lean specialization layer atop a general vision-language foundation.</w:t>
       </w:r>
     </w:p>
     <w:p>
@@ -5192,7 +5192,7 @@
           <w:i w:val="0"/>
           <w:sz w:val="20"/>
         </w:rPr>
-        <w:t>We select Hadamard (element-wise) product over concatenation or bilinear pooling for the cross-modal interaction for two reasons. While bilinear pooling produces d2 characteristics requiring prohibitive memory on consumer GPUs, first, Hadamard product preserves dimensionality (Rd × Rd → Rd), keeping the downstream MLP compact-concatenation would double the input dimension to 2048,.</w:t>
+        <w:t>We select Hadamard (element-wise) product over concatenation or bilinear pooling for the cross-modal interplay for two reasons. While bilinear pooling produces d2 aspects requiring prohibitive memory on consumer GPUs, first, Hadamard product preserves dimensionality (Rd × Rd → Rd), keeping the downstream MLP compact - concatenation would double the input dimension to 2048.</w:t>
       </w:r>
     </w:p>
     <w:p>
@@ -5213,7 +5213,7 @@
           <w:i w:val="0"/>
           <w:sz w:val="16"/>
         </w:rPr>
-        <w:t>Fig. 9: HateCLIPper design. Frozen CLIP image and text encoders produce 512-D embeddings that are projected to 1024-D and combined via Hadamard product. An MLP head maps the interaction vector to a binary hate probability.</w:t>
+        <w:t>Fig. 9: HateCLIPper layout. Frozen CLIP image and text encoders produce 512-D embeddings that are projected to 1024-D and combined via Hadamard product. An MLP head maps the exchange vector to a binary hate probability.</w:t>
       </w:r>
     </w:p>
     <w:p>
@@ -5229,7 +5229,7 @@
           <w:i w:val="0"/>
           <w:sz w:val="20"/>
         </w:rPr>
-        <w:t>While training in under half the time, second, Kumar and Nandakumar [28] showed that the Hadamard variant of HateCLIPper matches or exceeds concatenation and bilinear alternatives on the Hateful Memes benchmark [20],. Frozen encoders Also, reduce optimization instability relative to end-to-end fine-tuning of vision-language transformers [41], [44].</w:t>
+        <w:t>Second, Kumar and Nandakumar [28] brought out that the Hadamard variant of HateCLIPper matches or exceeds concatenation and bilinear alternatives on the Hateful Memes benchmark [20], while training in under half the time. Frozen encoders further reduce optimization instability relative to end-to-end fine-tuning of vision-language transformers [41], [44].</w:t>
       </w:r>
     </w:p>
     <w:p>
@@ -5374,7 +5374,7 @@
           <w:i w:val="0"/>
           <w:sz w:val="20"/>
         </w:rPr>
-        <w:t>Transcript pathway. The text is classified by mBERT as in Section 3.2; whisper-small transcribes the clip. Such a branch picks up slurs and threats more reliably encoded lexically than acoustically.</w:t>
+        <w:t>Transcript pathway. Whisper-small transcribes the clip; the text is classified by mBERT as in Section 3.2. This branch picks up slurs and threats more reliably encoded lexically than acoustically.</w:t>
       </w:r>
     </w:p>
     <w:p>
@@ -5390,7 +5390,7 @@
           <w:i w:val="0"/>
           <w:sz w:val="20"/>
         </w:rPr>
-        <w:t>The Wav2Vec2-XLS-R-300M model [26] consists of a 7-layer convolutional attribute encoder that processes raw 16 kHz waveforms into latent speech representations at 50 Hz, followed by 24 transformer blocks with hidden dimension 1024 and 16 attention heads per block, totaling close to 300 million factors. Pre-trained on 436,000 hours of unlabeled speech across 128 languages using a contrastive self-supervised objective, the model records both low-level acoustic characteristics (pitch, energy, speaking rate) and high-level phonetic and prosodic patterns. We freeze all 300M settings and extract representations from the final transformer layer, applying mean pooling across the temporal dimension to get a fixed-length 1024-dimensional utterance embedding. A trainable two-layer MLP projects this embedding to our working dimension (AUDIO_DIM=256) with dropout 0.3, followed by a single-unit output layer.</w:t>
+        <w:t>The Wav2Vec2-XLS-R-300M model [26] consists of a 7-layer convolutional aspect encoder that processes raw 16 kHz waveforms into latent speech representations at 50 Hz, followed by 24 transformer blocks with hidden dimension 1024 and 16 attention heads per block, totaling roughly 300 million tunables. Pre-trained on 436,000 hours of unlabeled speech across 128 languages using a contrastive self-supervised objective, the model captures both low-level acoustic characteristics (pitch, energy, speaking rate) and high-level phonetic and prosodic patterns. We freeze all 300M settings and extract representations from the final transformer layer, applying mean pooling across the temporal dimension to fetch a fixed-length 1024-dimensional utterance embedding. A trainable two-layer MLP projects this embedding to our working dimension (AUDIO_DIM=256) with dropout 0.3, followed by a single-unit output layer.</w:t>
       </w:r>
     </w:p>
     <w:p>
@@ -5406,7 +5406,7 @@
           <w:i w:val="0"/>
           <w:sz w:val="20"/>
         </w:rPr>
-        <w:t>For clips containing considerable leading or trailing silence-common in user-uploaded social media videos-we optionally apply Silero Voice Activity Detection (VAD) to isolate speech-active pieces before attribute extraction. Silero VAD operates as a lightweight ONNX model with sub-millisecond latency per frame, flagging non-speech regions that would otherwise dilute the mean-pooled acoustic representation. When VAD is enabled, only frames marked as speech contribute to the temporal mean.</w:t>
+        <w:t>For clips containing hefty leading or trailing silence - common in user-uploaded social media videos - we optionally apply Silero Voice Activity Detection (VAD) to isolate speech-active segments before aspect extraction. Silero VAD operates as a lightweight ONNX model with sub-millisecond latency per frame, flagging non-speech regions that would otherwise dilute the mean-pooled acoustic representation. When VAD is enabled, only frames marked as speech contribute to the temporal mean.</w:t>
       </w:r>
     </w:p>
     <w:p>
@@ -5422,7 +5422,7 @@
           <w:i w:val="0"/>
           <w:sz w:val="20"/>
         </w:rPr>
-        <w:t>We select Whisper-small (244M settings) [27] over Whisper-base (74M) and Whisper-large-v2 (1.5B) as a compromise between transcription quality and T4 memory limits. While requiring about one-sixth the inference memory, on English benchmarks, Whisper-small gets word error rates (WER) within 2-3 absolute points of Whisper-large. For non-English HateMM content (which contains chiefly English speech in our extract), Whisper-small's multilingual power provides adequate transcription quality [45]. Any ASR confidence score extracted alongside each transcript serves as the gating signal described in Section 3.5.</w:t>
+        <w:t>We select Whisper-small (244M settings) [27] over Whisper-base (74M) and Whisper-large-v2 (1.5B) as a compromise between transcription quality and T4 memory bounds. While requiring close to one-sixth the inference memory, on English benchmarks, Whisper-small nets word error rates (WER) within 2-3 absolute points of Whisper-large. For non-English HateMM content (which contains chiefly English speech in our extract), Whisper-small's multilingual ability provides adequate transcription quality [45]. The ASR confidence score extracted alongside each transcript serves as the gating signal described in Section 3.5.</w:t>
       </w:r>
     </w:p>
     <w:p>
@@ -5794,7 +5794,7 @@
           <w:i w:val="0"/>
           <w:sz w:val="20"/>
         </w:rPr>
-        <w:t>Each fusion formula admits an equivalent interpretation as soft weighted voting. Put differently, each branch i casts a "vote" pi ∈ [0,1] for the hate idea, weighted by wi. Our normalized fused score Pfused is the weighted average of these votes. When all branches agree (all pi near 0 or all near 1), Pfused is reliable to weight perturbations. Disagreement between branches (e.g., text predicts hate but vision predicts safe) makes the fused score sensitive to weight allocation-precisely the regime where metaheuristic optimization gives the largest improvements over uniform or hand-tuned defaults. This sensitivity review motivates the ten-task optimization suite (Section 3.6.E), which searches not only over weights but also over branch inclusion masks, per-branch boundaries. The global decision boundary [14], [25].</w:t>
+        <w:t>A given fusion formula admits an equivalent interpretation as soft weighted voting. Each branch i casts a "vote" pi ∈ [0,1] for the hate educated guess, weighted by wi. The normalized fused score Pfused is the weighted average of these votes. When all branches agree (all pi near 0 or all near 1), Pfused is resilient to weight perturbations. Disagreement between branches (e.g., text predicts hate but vision predicts safe) makes the fused score sensitive to weight allocation - precisely the regime where metaheuristic optimization delivers the largest improvements over uniform or hand-tuned defaults. One such sensitivity analysis motivates the ten-task optimization suite (Section 3.6.E), which searches not only over weights but also over branch inclusion masks, per-branch cutoffs, and the global decision boundary [14], [25].</w:t>
       </w:r>
     </w:p>
     <w:p>
@@ -5810,7 +5810,7 @@
           <w:i w:val="0"/>
           <w:sz w:val="20"/>
         </w:rPr>
-        <w:t>We considered two weight normalization approaches: (i) raw division by ∑i wi (our default) and (ii) softmax normalization wi' = ewi / ∑j ewj. Constrains weights to a simplex. When a form is unavailable (e.g., no image for a text-only post), the corresponding wi is set to zero. The denominator automatically re-normalizes over active branches, raw division is preferred because it naturally handles branch absence:. Softmax normalization would assign nonzero probability mass to absent branches without explicit masking. In our build, the MultimodalFusionClassifier dynamically excludes branches whose input is None, re-normalizing weights over the active subset.</w:t>
+        <w:t>We considered two weight normalization approaches: (i) raw division by ∑i wi (our default) and (ii) softmax normalization wi' = ewi / ∑j ewj, which constrains weights to a simplex. When a modality is unavailable (e.g., no image for a text-only post), the corresponding wi is set to zero. The denominator automatically re-normalizes over active branches, raw division is preferred because it naturally handles branch absence:. Softmax normalization would assign nonzero probability mass to absent branches without explicit masking. In our realization, the MultimodalFusionClassifier dynamically excludes branches whose input is None, re-normalizing weights over the active subset.</w:t>
       </w:r>
     </w:p>
     <w:p>
@@ -5826,7 +5826,7 @@
           <w:i w:val="0"/>
           <w:sz w:val="20"/>
         </w:rPr>
-        <w:t>From a broader view, when only a single branch is active (e.g., text-only input with no image or audio), the fusion reduces to that branch's probability: Pfused = ptext. The fused score is pulled toward that branch proportional to its weight, when multiple branches are active but one reports extreme confidence (pi &gt; 0.95). When a noisy vision zero-shot branch dominates, this behavior is desirable when the confident branch is text (typically the most reliable), but can produce false positives. Each branch selection optimization (Task 3) deals with this by learning which combinations of branches to trust under validation feedback, complementing manual priors encoded in default fusion weights [11], [20].</w:t>
+        <w:t>When only a single branch is active (e.g., text-only input with no image or audio), the fusion reduces to that branch's probability: Pfused = ptext. When multiple branches are active but one reports extreme confidence (pi &gt; 0.95), the fused score is pulled toward that branch proportional to its weight. When a noisy vision zero-shot branch dominates, this behavior is desirable when the confident branch is text (typically the most reliable), but can produce false positives. The branch selection optimization (Task 3) goes after this by learning which combinations of branches to trust under validation feedback, complementing manual priors encoded in default fusion weights [11], [20].</w:t>
       </w:r>
     </w:p>
     <w:p>
@@ -5842,7 +5842,7 @@
           <w:i w:val="0"/>
           <w:sz w:val="20"/>
         </w:rPr>
-        <w:t>Although we don't rely on Platt scaling or isotonic regression in every experiment, the fusion layer is compatible with post hoc calibration: branch logits may be temperature-scaled on validation folds before entering Pfused, reducing false polarization caused by overconfident heads. Such calibration interacts directly with limit search: if probabilities are step by step compressed toward 0.5, the ideal τ shifts As such, reinforcing the need to co-optimize weights and decision boundaries in Tasks 9-10 rather than treating calibration as an afterthought [3], [29].</w:t>
+        <w:t>Although we don't rely on Platt scaling or isotonic regression in every experiment, the fusion layer is compatible with post hoc calibration: branch logits may be temperature-scaled on validation folds before entering Pfused, reducing false polarization caused by overconfident heads. Such calibration interacts directly with red line search: if probabilities are routinely compressed toward 0.5, the optimal τ shifts accordingly, reinforcing the need to co-optimize weights and decision boundaries in Tasks 9-10 rather than treating calibration as an afterthought [3], [29].</w:t>
       </w:r>
     </w:p>
     <w:p>
@@ -5872,7 +5872,7 @@
           <w:i w:val="0"/>
           <w:sz w:val="20"/>
         </w:rPr>
-        <w:t>The optimization structure is deliberately stratified into Bayesian hyperparameter optimization (Optuna TPE [25]), scalar annealing for boundaries (SA [29]). Population-based metaheuristics with a unified assessment harness (Algorithm 4). This taxonomy matches heterogeneous search spaces: smooth continuous knobs favor TPE when evaluations are noisy-but-cheap. Univariate bar lines favor SA's hill-climbing with stochastic acceptance; multimodal vector spaces with weak Lipschitz structure favor DE, PSO, and GWO [21]-[23]. Crucially, all algorithms consume the same F from Section 3.6.D so that reported differences reflect search dynamics, not score definitions-a design choice motivated by reproducibility critiques in prior optimization-centric NLP work [14].</w:t>
+        <w:t>The optimization apparatus is deliberately stratified into Bayesian hyperparameter optimization (Optuna TPE [25]), scalar annealing for bars (SA [29]), and population-based metaheuristics with a unified scoring taps into (Algorithm 4). Such a taxonomy matches heterogeneous search spaces: smooth continuous knobs favor TPE when evaluations are noisy-but-cheap; univariate bar lines favor SA's hill-climbing with stochastic acceptance; multimodal vector spaces with weak Lipschitz structure favor DE, PSO, and GWO [21]-[23]. Crucially, all algorithms consume the same F from Section 3.6.D so that reported differences reflect search dynamics, not metric definitions - a design choice motivated by reproducibility critiques in past optimization-centric NLP work [14].</w:t>
       </w:r>
     </w:p>
     <w:p>
@@ -5902,7 +5902,7 @@
           <w:i w:val="0"/>
           <w:sz w:val="20"/>
         </w:rPr>
-        <w:t>Tree-structured Parzen Estimators model separate densities for hopeful versus unpromising regions of the search space. For text HPO, we search learning rate, weight decay, warmup proportion. Label smoothing with 15 trials, each evaluating on a 30\% data subsample for one epoch to control compute. A separate study allocates 40 trials to fusion weight vectors under box bounds and simplexes after reparameterization.</w:t>
+        <w:t>Tree-structured Parzen Estimators model separate densities for upbeat versus unpromising regions of the search space. For text HPO, we search learning rate, weight decay, warmup proportion, and label smoothing with 15 trials, each evaluating on a 30\% data subsample for one epoch to control compute. A separate study allocates 40 trials to fusion weight vectors under box bounds and simplexes after reparameterization.</w:t>
       </w:r>
     </w:p>
     <w:p>
@@ -5918,7 +5918,7 @@
           <w:i w:val="0"/>
           <w:sz w:val="20"/>
         </w:rPr>
-        <w:t>A given TPE sampler maintains two kernel density estimators, l(x) for the top γ-quantile of observed objective values and g(x) for the remainder. New candidates are drawn by maximizing the ratio l(x) /g(x) , which approximates expected improvement [25]. This model-based strategy excels when the fitness landscape is smooth and evaluations are expensive. Can struggle in combinatorial spaces where the density estimators lack appropriate structure. For text HPO, we search over four continuous dimensions: learning rate in [10-6, 5×10-4] (log-uniform), weight decay in [10-4, 0.3] (log-uniform), warmup ratio in [0, 0.2]. Label smoothing in [0, 0.2].</w:t>
+        <w:t>The TPE sampler maintains two kernel density estimators, l(x) for the top γ-quantile of observed objective values and g(x) for the remainder. New candidates are drawn by maximizing the ratio l(x) /g(x) , which approximates expected improvement [25]. This model-based approach excels when the fitness landscape is smooth and evaluations are expensive. Can struggle in combinatorial spaces where the density estimators lack appropriate structure. For text HPO, we search over four continuous dimensions: learning rate in [10-6, 5×10-4] (log-uniform), weight decay in [10-4, 0.3] (log-uniform), warmup ratio in [0, 0.2], and label smoothing in [0, 0.2].</w:t>
       </w:r>
     </w:p>
     <w:p>
@@ -5948,7 +5948,7 @@
           <w:i w:val="0"/>
           <w:sz w:val="20"/>
         </w:rPr>
-        <w:t>Given validation measures f(τ) (e.g., negative F1 or the negative composite fitness), simulated annealing proposes perturbations τ' with initial temperature T0=1.0, geometric cooling T≥ts 0.95T, and 500 passes. A worse candidate τ' is accepted with probability</w:t>
+        <w:t>Given validation yardsticks f(τ) (e.g., negative F1 or the negative composite fitness), simulated annealing proposes perturbations τ' with initial temperature T0=1.0, geometric cooling T≥ts 0.95T, and 500 iterations. A worse candidate τ' is accepted with probability</w:t>
       </w:r>
     </w:p>
     <w:p>
@@ -5995,7 +5995,7 @@
           <w:i w:val="0"/>
           <w:sz w:val="20"/>
         </w:rPr>
-        <w:t>Any perturbation magnitude adapts implicitly through the temperature schedule. At high temperature (T ≈ 1.0, early rounds), the acceptance probability for inferior solutions exceeds 0.6 for moderate degradations, encouraging broad exploration of the [0.1, 0.95] cutoff range. As T decays below 0.1 (after close to log(0.1/1.0)/log(0.95) ≈ 45 cycles), only improving moves are accepted with high probability, concentrating search around the current best [29].</w:t>
+        <w:t>A given perturbation magnitude adapts implicitly through the temperature schedule. At high temperature (T ≈ 1.0, early iterations), the acceptance probability for inferior solutions exceeds 0.6 for moderate degradations, encouraging broad exploration of the [0.1, 0.95] cutoff range. As T decays below 0.1 (after around log(0.1/1.0)/log(0.95) ≈ 45 iterations), only improving moves are accepted with high probability, concentrating search around the current best [29].</w:t>
       </w:r>
     </w:p>
     <w:p>
@@ -6025,7 +6025,7 @@
           <w:i w:val="0"/>
           <w:sz w:val="20"/>
         </w:rPr>
-        <w:t>All methods share a unified review harness:</w:t>
+        <w:t>All methods share a unified benchmarking taps into:</w:t>
       </w:r>
     </w:p>
     <w:p>
@@ -6075,7 +6075,7 @@
           <w:i w:val="0"/>
           <w:sz w:val="20"/>
         </w:rPr>
-        <w:t>- PSO: inertia w linearly decays from 0.9 to 0.4. Cognitive and social coefficients c1=c2=2.0; binary variants (BPSO) handle mask vectors. Velocity update:</w:t>
+        <w:t>- PSO: inertia w linearly decays from 0.9 to 0.4; cognitive and social coefficients c1=c2=2.0; binary variants (BPSO) handle mask vectors. Velocity update:</w:t>
       </w:r>
     </w:p>
     <w:p>
@@ -6106,7 +6106,7 @@
           <w:i w:val="0"/>
           <w:sz w:val="20"/>
         </w:rPr>
-        <w:t>If U(0,1) &lt; σ(vid), else 0, in the binary variant (BPSO), continuous velocities are mapped to bit-flip probabilities through a sigmoid transfer function: σ(vid) = 1/(1+e-vid), and the position is sampled as xid = 1. One such formulation enables PSO to operate in discrete binary spaces (branch masks, head selections) while preserving the velocity-based exploration mechanics [23].</w:t>
+        <w:t>If U(0,1) &lt; σ(vid), else 0, in the binary variant (BPSO), continuous velocities are mapped to bit-flip probabilities through a sigmoid transfer function: σ(vid) = 1/(1+e-vid), and the position is sampled as xid = 1. This formulation enables PSO to operate in discrete binary spaces (branch masks, head selections) while preserving the velocity-based exploration mechanics [23].</w:t>
       </w:r>
     </w:p>
     <w:p>
@@ -6169,7 +6169,7 @@
           <w:i w:val="0"/>
           <w:sz w:val="20"/>
         </w:rPr>
-        <w:t>- GWO: Coefficient vectors Ap and Cp depend on a. Linearly decays from 2 to 0, balancing exploration and exploitation. For population member xt, the distances to the leading wolves x_αt, x_βt, and x_δt are</w:t>
+        <w:t>- GWO: Coefficient vectors Ap and Cp depend on a, which linearly decays from 2 to 0, balancing exploration and exploitation. For population member xt, the distances to the leading wolves x_αt, x_βt, and x_δt are</w:t>
       </w:r>
     </w:p>
     <w:p>
@@ -6231,7 +6231,7 @@
           <w:i w:val="0"/>
           <w:sz w:val="20"/>
         </w:rPr>
-        <w:t>The updated candidate is xt+1 = (1)/(3)≤ft(z_αt+z_βt+z_δt) - every a factor controls the GWO exploration-exploitation balance. When a &gt; 1 (first half of passes), the coefficient |A| &gt; 1 causes wolves to diverge from the prey (exploration). Along these lines, when a &lt; 1 (second half), |A| &lt; 1 forces coming together toward the three leaders (exploitation). One such built-in schedule eliminates the need for explicit exploration factors, making GWO attractive for practitioners unfamiliar with metaheuristic tuning [21].</w:t>
+        <w:t>The updated candidate is xt+1 = (1)/(3)≤ft(z_αt+z_βt+z_δt); the a dial controls the GWO exploration-exploitation balance. When a &gt; 1 (first half of iterations), the coefficient |A| &gt; 1 causes wolves to diverge from the prey (exploration). When a &lt; 1 (second half), |A| &lt; 1 forces convergence toward the three leaders (exploitation). One such built-in schedule eliminates the need for explicit exploration dials, making GWO attractive for practitioners unfamiliar with metaheuristic tuning [21].</w:t>
       </w:r>
     </w:p>
     <w:p>
@@ -6247,7 +6247,7 @@
           <w:i w:val="0"/>
           <w:sz w:val="20"/>
         </w:rPr>
-        <w:t>- FA: attractiveness β=β0 e-γ \|xi-xj\|^2, light absorption α=0.5, with β0=1.0, γ=1.0, and decay 0.99 on α across generations. The Firefly Algorithm's O(n\mathrmpop2) per-iteration cost arises from all-pairs brightness comparison. 202 × 200 = 80,000 potential attraction events per run-doable for scalar limit optimization but prohibitive for the 144-dimensional head-selection problem, according to with n\mathrmpop=20 and n\mathrmiter=200, this. We therefore restrict FA to 1-D limit tasks exclusively.</w:t>
+        <w:t>- FA: attractiveness β=β0 e-γ \|xi-xj\|^2, light absorption α=0.5, with β0=1.0, γ=1.0, and decay 0.99 on α across generations. The Firefly Algorithm's O(n\mathrmpop2) per-iteration cost arises from all-pairs brightness comparison. With n\mathrmpop=20 and n\mathrmiter=200, this delivers 202 × 200 = 80,000 potential attraction events per run - workable for scalar boundary optimization but prohibitive for the 144-dimensional head-selection problem. We therefore restrict FA to 1-D bar tasks exclusively.</w:t>
       </w:r>
     </w:p>
     <w:p>
@@ -6596,7 +6596,7 @@
           <w:i w:val="0"/>
           <w:sz w:val="20"/>
         </w:rPr>
-        <w:t>encoding a preference for balanced detection quality while respecting operational precision and All in all, correctness.</w:t>
+        <w:t>encoding a preference for balanced detection quality while respecting operational precision and overall correctness.</w:t>
       </w:r>
     </w:p>
     <w:p>
@@ -6627,7 +6627,7 @@
           <w:i w:val="0"/>
           <w:sz w:val="20"/>
         </w:rPr>
-        <w:t>- Fusion weight optimization. Every five -dimensional continuous search space assigns one weight per fusion branch, bounded in [0,1]. We apply PSO (n\mathrmpop=30, n\mathrmiter=100), DE (F=0.8, CR=0.9), and GWO, comparing against Optuna TPE (40 trials). Fitness evaluations use pre-cached branch probabilities on the HateMM dev set (n ≤ 500), making each assessment near-instantaneous and isolating optimizer behavior from stochastic re-forward passes [45]. Five seeds provide mean and standard deviation estimates.</w:t>
+        <w:t>- Fusion weight optimization. The five-dimensional continuous search space assigns one weight per fusion branch, bounded in [0,1]. We apply PSO (n\mathrmpop=30, n\mathrmiter=100), DE (F=0.8, CR=0.9), and GWO, comparing against Optuna TPE (40 trials). Fitness evaluations use pre-cached branch probabilities on the HateMM dev set (n ≤ 500), making each scoring near-instantaneous and isolating optimizer behavior from stochastic re-forward passes [45]. Five seeds provide mean and standard deviation estimates.</w:t>
       </w:r>
     </w:p>
     <w:p>
@@ -6643,7 +6643,7 @@
           <w:i w:val="0"/>
           <w:sz w:val="20"/>
         </w:rPr>
-        <w:t>- Boundary optimization. Our scalar threshold τ ∈ [0.1, 0.95] is optimized to maximize the composite fitness on validation probabilities. PSO (n\mathrmpop=20, n\mathrmiter=200), DE, GWO. FA (the only task where FA participates) compete against SA (T0=1.0, cooling 0.95, 500 cycles). One such is the most complete comparison, spanning six optimization strategies on a single dimension-a controlled benchmark that isolates coming together speed from search-space complexity [29].</w:t>
+        <w:t>- Bar optimization. Our scalar boundary τ ∈ [0.1, 0.95] is optimized to maximize the composite fitness on validation probabilities. PSO (n\mathrmpop=20, n\mathrmiter=200), DE, GWO, and FA (the only task where FA participates) compete against SA (T0=1.0, cooling 0.95, 500 iterations). This is the most wall-to-wall comparison, spanning six optimization strategies on a single dimension - a controlled benchmark that isolates convergence speed from search-space complexity [29].</w:t>
       </w:r>
     </w:p>
     <w:p>
@@ -6659,7 +6659,7 @@
           <w:i w:val="0"/>
           <w:sz w:val="20"/>
         </w:rPr>
-        <w:t>- Branch selection. 1 = 31 non-empty configurations - five binary switches select which fusion branches to activate, yielding 25. GA (n\mathrmpop=10, n\mathrmiter=30), PSO (BPSO), DE (with 0.5 thresholding). GWO (sigmoid transfer) search the space, benchmarked against exhaustive enumeration that certifies the global optimum among workable masks. When logits are deterministic at validation time, this task confirms whether metaheuristics correctly discover best branch combinations.</w:t>
+        <w:t>- Branch selection. Five binary switches select which fusion branches to activate, yielding 25 - 1 = 31 non-empty configurations. GA (n\mathrmpop=10, n\mathrmiter=30), PSO (BPSO), DE (with 0.5 thresholding), and GWO (sigmoid transfer) search the space, benchmarked against exhaustive enumeration that certifies the global optimum among within reach masks. When logits are deterministic at validation time, this task verifies whether metaheuristics correctly discover optimal branch combinations.</w:t>
       </w:r>
     </w:p>
     <w:p>
@@ -6675,7 +6675,7 @@
           <w:i w:val="0"/>
           <w:sz w:val="20"/>
         </w:rPr>
-        <w:t>- BERT head pruning. Some 144-dimensional binary chromosome (12 layers × 12 heads) masks individual attention heads in the fine-tuned mBERT model. GA and GWO operate with n\mathrmpop=20, n\mathrmiter=30, evaluating on up to 200 validation samples per fitness call. A minimum active-head bound of 30\% (at least 44 heads) prevents degenerate solutions. Such a task probes whether structured sparsity in attention heads improves or degrades hate detection relative to the full head budget [18].</w:t>
+        <w:t>- BERT head pruning. A 144-dimensional binary chromosome (12 layers × 12 heads) masks individual attention heads in the fine-tuned mBERT model. GA and GWO operate with n\mathrmpop=20, n\mathrmiter=30, evaluating on up to 200 validation samples per fitness call. A minimum active-head ceiling of 30\% (at least 44 heads) prevents degenerate solutions. Such a task probes whether structured sparsity in attention heads improves or degrades hate detection relative to the full head budget [18].</w:t>
       </w:r>
     </w:p>
     <w:p>
@@ -6691,7 +6691,7 @@
           <w:i w:val="0"/>
           <w:sz w:val="20"/>
         </w:rPr>
-        <w:t>- Text attribute selection. TF-IDF characteristics (word and character n-grams, max 2000 traits) are grouped into ∼200 chunks of ∼10 attributes each. GA and PSO (BPSO) search over binary chunk masks, training a LinearSVC per testing. Population size 20, 40 passes, five seeds. A minimum attribute cutoff of 50 prevents empty selections and stabilizes SVM training in sparse settings [14].</w:t>
+        <w:t>- Text characteristic selection. TF-IDF aspects (word and character n-grams, max 2000 aspects) are grouped into ∼200 chunks of ∼10 traits each. GA and PSO (BPSO) search over binary chunk masks, training a LinearSVC per assessment. Population size 20, 40 iterations, five seeds. A minimum trait bar of 50 prevents empty selections and stabilizes SVM training in sparse settings [14].</w:t>
       </w:r>
     </w:p>
     <w:p>
@@ -6707,7 +6707,7 @@
           <w:i w:val="0"/>
           <w:sz w:val="20"/>
         </w:rPr>
-        <w:t>- MLP head NAS. Five continuous dimensions encode the MLP head structure: number of hidden layers ∈ \1,2,3\, hidden dimension ∈ \128, 256, 512, 1024\, dropout ∈ [0.1, 0.5], activation ∈, GELU, SiLU\, and batch normalization (on/off). DE, PSO, and GWO (n\mathrmpop=10, n\mathrmiter=15, three seeds) each build and train the decoded MLP for one epoch per assessment, measuring validation F1. Applied to both HateCLIPper and audio heads, this task links low-cost layout search to downstream branch quality [28].</w:t>
+        <w:t>- MLP head NAS. Five continuous dimensions encode the MLP head backbone: number of hidden layers ∈ \1,2,3\, hidden dimension ∈ \128, 256, 512, 1024\, dropout ∈ [0.1, 0.5], activation ∈, GELU, SiLU\, and batch normalization (on/off). DE, PSO, and GWO (n\mathrmpop=10, n\mathrmiter=15, three seeds) each build and train the decoded MLP for one epoch per assessment, measuring validation F1. Applied to both HateCLIPper and audio heads, this task links low-cost blueprint search to downstream branch quality [28].</w:t>
       </w:r>
     </w:p>
     <w:p>
@@ -6723,7 +6723,7 @@
           <w:i w:val="0"/>
           <w:sz w:val="20"/>
         </w:rPr>
-        <w:t>- BERT HPO comparison. Seven continuous dimensions encode learning rate (log-scale), weight decay (log-scale), warmup ratio, label smoothing, batch size ∈ \8, 16, 32\, epochs ∈ \2,,5\, and focal gamma ∈ [0, 3]. DE, PSO, and GWO (n\mathrmpop=12, n\mathrmiter=15, three seeds) compete against the Optuna TPE baseline from Phase 2. Each assessment trains mBERT for one epoch on 50\% subsampled data-the most expensive per-assessment task in the suite-motivating pragmatic trial caps [25].</w:t>
+        <w:t>- BERT HPO comparison. Seven continuous dimensions encode learning rate (log-scale), weight decay (log-scale), warmup ratio, label smoothing, batch size ∈ \8, 16, 32\, epochs ∈ \2,5\, and focal gamma ∈ [0, 3]. DE, PSO, and GWO (n\mathrmpop=12, n\mathrmiter=15, three seeds) compete against the Optuna TPE baseline from Phase 2. Each scoring trains mBERT for one epoch on 50\% subsampled data - the most expensive per-benchmarking task in the suite - motivating pragmatic trial caps [25].</w:t>
       </w:r>
     </w:p>
     <w:p>
@@ -6755,7 +6755,7 @@
           <w:i w:val="0"/>
           <w:sz w:val="20"/>
         </w:rPr>
-        <w:t>- Joint fusion + boundary. Six continuous dimensions (five weights plus τ) are jointly optimized by PSO, DE, and GWO (n\mathrmpop=30, n\mathrmiter=150). An iterative refinement variant alternates between weight optimization and threshold optimization for three rounds, allowing each sub-problem to benefit from the other's improved solution and reducing plateaus in coupled landscapes.</w:t>
+        <w:t>- Joint fusion + cutoff. Six continuous dimensions (five weights plus τ) are jointly optimized by PSO, DE, and GWO (n\mathrmpop=30, n\mathrmiter=150). An iterative refinement variant alternates between weight optimization and bar optimization for three rounds, allowing each sub-problem to benefit from the other's improved solution and curbs plateaus in coupled landscapes.</w:t>
       </w:r>
     </w:p>
     <w:p>
@@ -6771,7 +6771,7 @@
           <w:i w:val="0"/>
           <w:sz w:val="20"/>
         </w:rPr>
-        <w:t>- Per-branch boundaries. Ten continuous dimensions encode five per-branch thresholds and five weights, producing a more granular decision surface than the shared-limit fusion. DE, PSO, and GWO (n\mathrmpop=30, n\mathrmiter=120) search this space. Approximating specialist operating points that a single global τ can't express [3], each branch applies its own boundary before contributing a weighted binary vote to the ensemble.</w:t>
+        <w:t>- Per-branch cutoffs. Ten continuous dimensions encode five per-branch boundaries and five weights, producing a more granular decision surface than the shared-red line fusion. DE, PSO, and GWO (n\mathrmpop=30, n\mathrmiter=120) search this space. Each branch applies its own boundary before contributing a weighted binary vote to the ensemble, approximating specialist operating points that a single global τ can't express [3].</w:t>
       </w:r>
     </w:p>
     <w:p>
@@ -6818,7 +6818,7 @@
           <w:i w:val="0"/>
           <w:sz w:val="20"/>
         </w:rPr>
-        <w:t>We evaluate our setup on curated public corpora spanning text, image-text pairs, and video-derived audio. Label 0: normal or non-toxic content) before joint training, consistent with the unified decision interface described in our system design; all text resources are harmonized to a binary toxicity objective (label 1: hate or offensive content. So that labels remain comparable across sources, continuous supervision signals (for example, scalar hate-intensity scores) are thresholded using data collection documentation and fixed project-wide rules.</w:t>
+        <w:t>We evaluate our apparatus on curated public corpora spanning text, image-text pairs, and video-derived audio. All text resources are harmonized to a binary toxicity objective (label 1: hate or offensive content; label 0: normal or non-toxic content) before joint training, consistent with the unified decision interface described in our system scaffold. Continuous supervision signals (for example, scalar hate-intensity scores) are thresholded using benchmark set documentation and fixed project-wide rules so that labels remain comparable across sources.</w:t>
       </w:r>
     </w:p>
     <w:p>
@@ -6848,7 +6848,7 @@
           <w:i w:val="0"/>
           <w:sz w:val="20"/>
         </w:rPr>
-        <w:t>The multilingual text stream aggregates four Hugging Face distributions documented in our Config.DATASET_SOURCES: HateXplain (Hate-speech-CNERG/hatexplain), the German and India superset collections (manueltonneau/german-hate-speech-superset, manueltonneau/india-hate-speech-superset). One given Berkeley Measuring Hate Speech release (ucberkeley-dlab/measuring-hate-speech), which collectively reflect diverse regulatory and annotation traditions in multilingual hate-speech research [1], [3]. When reporting intrinsic text-head calibration (Section 6.1) and collapse all corpora to binary labels for merged training, native label layouts differ (ternary hate/offensive/normal, binary flags, or continuous scores); we preserve HateXplain's three-way schema only. After deduplication, language filtering, and removal of samples that fail tokenizer restrictions, the merged multilingual corpus contains about 98,000 usable examples. A given merge protocol prioritizes label consistency over maximal cardinality: conflicting near-duplicates across sources are resolved with precedence rules documented in the extraction notebook. Empty or non-UTF-8 spans are dropped to avoid polluting the multilingual tokenizer with degenerate inputs. We partition every text-derived review using a single 80% / 10% / 10% train/validation/test split with seed = 42, matching the reproducibility contract enforced in our notebooks.</w:t>
+        <w:t>A given multilingual text stream aggregates four Hugging Face distributions documented in our Config.DATASET_SOURCES: HateXplain (Hate-speech-CNERG/hatexplain), the German and India superset collections (manueltonneau/german-hate-speech-superset, manueltonneau/india-hate-speech-superset), and the Berkeley Measuring Hate Speech release (ucberkeley-dlab/measuring-hate-speech), which collectively reflect diverse regulatory and annotation traditions in multilingual hate-speech research [1], [3]. When reporting intrinsic text-head calibration (Section 6.1) and collapse all corpora to binary labels for merged training, native label layouts differ (ternary hate/offensive/normal, binary flags, or continuous scores); we preserve HateXplain's three-way schema only. After deduplication, language filtering, and removal of samples that fail tokenizer bounds, the merged multilingual corpus contains nearly 98,000 usable examples. The merge protocol prioritizes label consistency over maximal cardinality: conflicting near-duplicates across sources are resolved with precedence rules documented in the extraction notebook. Empty or non-UTF-8 spans are dropped to avoid polluting the multilingual tokenizer with degenerate inputs. We partition every text-derived trial using a single 80% / 10% / 10% train/validation/test split with seed = 42, matching the reproducibility contract enforced in our notebooks.</w:t>
       </w:r>
     </w:p>
     <w:p>
@@ -6864,7 +6864,7 @@
           <w:i w:val="0"/>
           <w:sz w:val="20"/>
         </w:rPr>
-        <w:t>HateXplain (originally Mathew et al., 2021) provides 19,229 posts sourced from Twitter and Gab, annotated by three crowdworkers each into normal, offensive, or hate speech categories. Inter-annotator agreement (Fleiss' kappa) is reported at roughly 0.46, indicating moderate agreement consistent with the inherent subjectivity of hate speech annotation [3]. Rationale annotations-token-level flags of hateful spans-which we don't exploit in training but which informed our token importance examination (Task 8), as seen from the data collection additionally. Every three-class structure is preserved for intrinsic review of the text head (Section 6.1) and binarized (offensive + hate = toxic) for merged training.</w:t>
+        <w:t>HateXplain (originally Mathew et al., 2021) provides 19,229 posts sourced from Twitter and Gab, annotated by three crowdworkers each into normal, offensive, or hate speech categories. Inter-annotator agreement (Fleiss' kappa) is reported at close to 0.46, indicating moderate agreement consistent with the inherent subjectivity of hate speech annotation [3]. The data pool also provides rationale annotations - token-level zeroes in on of hateful spans - which we don't exploit in training but which informed our token importance analysis (Task 8). Every three-class structure is preserved for intrinsic assessment of the text head (Section 6.1) and binarized (offensive + hate = toxic) for merged training.</w:t>
       </w:r>
     </w:p>
     <w:p>
@@ -6880,7 +6880,7 @@
           <w:i w:val="0"/>
           <w:sz w:val="20"/>
         </w:rPr>
-        <w:t>German Hate Speech Superset aggregates multiple German hate speech corpora into close to 50,543 samples with binary labels. To put it plainly, german hate speech presents unique problems including compound word formation (where hateful neologisms may not appear in any dictionary), formal/informal register variation. Legal definitions that differ greatly from US-centric annotation guidelines. Ross et al. [47] documented inter-annotator agreement as low as α = 0.29 for German hate content, reflecting cultural and legal ambiguity in cross-border hate definitions.</w:t>
+        <w:t>German Hate Speech Superset aggregates multiple German hate speech corpora into close to 50,543 samples with binary labels. German hate speech presents unique stumbling blocks including compound word formation (where hateful neologisms may not appear in any dictionary), formal/informal register variation, and legal definitions that differ sizably from US-centric annotation guidelines. Ross et al. [47] documented inter-annotator agreement as low as α = 0.29 for German hate content, reflecting cultural and legal ambiguity in cross-border hate definitions.</w:t>
       </w:r>
     </w:p>
     <w:p>
@@ -6896,7 +6896,7 @@
           <w:i w:val="0"/>
           <w:sz w:val="20"/>
         </w:rPr>
-        <w:t>India Hate Speech Superset comprises close to 14,155 Hindi-English code-mixed samples, capturing the characteristic switching between Devanagari and Latin scripts common in South Asian social media. Code-mixing introduces obstacles for tokenization (mBERT's vocabulary must handle both scripts in a single input), for annotation (bilingual annotators are required). For review (standard English measures may underweight Hindi-specific hateful constructs) [1], [48]. Every corpus's binary labels align with our merged training protocol.</w:t>
+        <w:t>India Hate Speech Superset comprises nearly 14,155 Hindi-English code-mixed samples, capturing the characteristic switching between Devanagari and Latin scripts widespread in South Asian social media. Code-mixing introduces headaches for tokenization (mBERT's vocabulary must handle both scripts in a single input), for annotation (bilingual annotators are required). For scoring (standard English gauges may underweight Hindi-specific hateful constructs) [1], [48]. Our collection's binary labels align with our merged training protocol.</w:t>
       </w:r>
     </w:p>
     <w:p>
@@ -6912,7 +6912,7 @@
           <w:i w:val="0"/>
           <w:sz w:val="20"/>
         </w:rPr>
-        <w:t>Berkeley Measuring Hate Speech provides roughly 39,565 English-language samples annotated with continuous hate speech scores rather than categorical labels. We binarize these scores using the data collection's recommended boundary, converting the regression target to classification. Each continuous annotation strategy offers finer granularity than binary labels but introduces cutoff sensitivity-a microcosm of the broader boundary optimization problem addressed by our SA and metaheuristic systems [3].</w:t>
+        <w:t>Berkeley Measuring Hate Speech provides around 39,565 English-language samples annotated with continuous hate speech scores rather than categorical labels. We binarize these scores using the data pool's recommended threshold, converting the regression target to classification. The continuous annotation game plan offers finer granularity than binary labels but introduces red line sensitivity - a microcosm of the broader boundary optimization problem addressed by our SA and metaheuristic backbones [3].</w:t>
       </w:r>
     </w:p>
     <w:p>
@@ -6942,7 +6942,7 @@
           <w:i w:val="0"/>
           <w:sz w:val="20"/>
         </w:rPr>
-        <w:t>For image-text moderation we adopt the Facebook Hateful Memes data set [20]. Provides roughly 8,500 training memes and 500 development memes, each with paired OCR-accessible captions and binary hate labels. One such benchmark stresses fine-grained multimodal reasoning because hateful intent often arises from the interaction between visuals and overlaid text rather than either type alone [11], [13]. Practitioners should expect shortcut cues-color layouts, fonts, or stock-photo identities-that can inflate training precision while undermining out-of-area generalization. Our pairing of supervised HateCLIPper [28] with zero-shot CLIP [19] partially reduces overfitting to corpus-specific superficial correlations by retaining a foundation-model past that's frozen at the encoder level.</w:t>
+        <w:t>For image-text moderation we adopt the Facebook Hateful Memes collection [20], which provides roughly 8,500 training memes and 500 development memes, each with paired OCR-accessible captions and binary hate labels. This benchmark stresses fine-grained multimodal reasoning because hateful intent often arises from the interplay between visuals and overlaid text rather than either mode alone [11], [13]. Practitioners should expect shortcut cues-color layouts, fonts, or stock-photo identities - that can inflate training hit rate while undermining out-of-space generalization; our pairing of supervised HateCLIPper [28] with zero-shot CLIP [19] partially tames overfitting to benchmark set-specific superficial correlations by retaining a foundation-model previous that's frozen at the encoder level.</w:t>
       </w:r>
     </w:p>
     <w:p>
@@ -6972,7 +6972,7 @@
           <w:i w:val="0"/>
           <w:sz w:val="20"/>
         </w:rPr>
-        <w:t>From which we extract 16 kHz mono waveforms via ffmpeg and enforce the same 80 / 10 / 10 stratified partitioning strategy (seed 42) on the binary hate label, video-centric moderation experiments use HateMM [45]. Every audio branch therefore aligns temporally with the textual transcript path (Whisper [27] followed by the multilingual text encoder) and the parallel acoustic embedding path (Wav2Vec 2.0 [26]).</w:t>
+        <w:t>From which we extract 16 kHz mono waveforms via ffmpeg and enforce the same 80 / 10 / 10 stratified partitioning strategy (seed 42) on the binary hate label, video-centric moderation experiments use HateMM [45]. A given audio branch therefore aligns temporally with the textual transcript path (Whisper [27] followed by the multilingual text encoder) and the parallel acoustic embedding path (Wav2Vec 2.0 [26]).</w:t>
       </w:r>
     </w:p>
     <w:p>
@@ -7004,7 +7004,7 @@
           <w:i w:val="0"/>
           <w:sz w:val="20"/>
         </w:rPr>
-        <w:t>Data set SUMMARY</w:t>
+        <w:t>Benchmark set SUMMARY</w:t>
       </w:r>
     </w:p>
     <w:tbl>
@@ -7051,7 +7051,7 @@
                 <w:i w:val="0"/>
                 <w:sz w:val="16"/>
               </w:rPr>
-              <w:t>Corpus</w:t>
+              <w:t>Dataset</w:t>
             </w:r>
           </w:p>
         </w:tc>
@@ -7171,7 +7171,7 @@
                 <w:i w:val="0"/>
                 <w:sz w:val="16"/>
               </w:rPr>
-              <w:t>Channel</w:t>
+              <w:t>Mode</w:t>
             </w:r>
           </w:p>
         </w:tc>
@@ -7273,7 +7273,7 @@
                 <w:i w:val="0"/>
                 <w:sz w:val="16"/>
               </w:rPr>
-              <w:t>3-class (normal / offensive / hate) → binarized for merge; 3-class retained for text-head assessment</w:t>
+              <w:t>3-class (normal / offensive / hate) → binarized for merge; 3-class retained for text-head analysis</w:t>
             </w:r>
           </w:p>
         </w:tc>
@@ -8123,7 +8123,7 @@
           <w:i w:val="0"/>
           <w:sz w:val="20"/>
         </w:rPr>
-        <w:t>Trait DESCRIPTION (Build-ALIGNED)</w:t>
+        <w:t>Characteristic DESCRIPTION (Rollout-ALIGNED)</w:t>
       </w:r>
     </w:p>
     <w:tbl>
@@ -8170,7 +8170,7 @@
                 <w:i w:val="0"/>
                 <w:sz w:val="16"/>
               </w:rPr>
-              <w:t>Type</w:t>
+              <w:t>Signal type</w:t>
             </w:r>
           </w:p>
         </w:tc>
@@ -8218,7 +8218,7 @@
                 <w:i w:val="0"/>
                 <w:sz w:val="16"/>
               </w:rPr>
-              <w:t>Attribute extractor / tool</w:t>
+              <w:t>Aspect extractor / tool</w:t>
             </w:r>
           </w:p>
         </w:tc>
@@ -8419,7 +8419,7 @@
                 <w:i w:val="0"/>
                 <w:sz w:val="16"/>
               </w:rPr>
-              <w:t>768-D embedding; 2-D logits (binary) or 3-D logits (HateXplain review)</w:t>
+              <w:t>768-D embedding; 2-D logits (binary) or 3-D logits (HateXplain assessment)</w:t>
             </w:r>
           </w:p>
         </w:tc>
@@ -8832,7 +8832,7 @@
                 <w:i w:val="0"/>
                 <w:sz w:val="16"/>
               </w:rPr>
-              <w:t>boosts meme text</w:t>
+              <w:t>Augments meme text</w:t>
             </w:r>
           </w:p>
         </w:tc>
@@ -9089,7 +9089,7 @@
                 <w:i w:val="0"/>
                 <w:sz w:val="16"/>
               </w:rPr>
-              <w:t>256-D projected traits → logits</w:t>
+              <w:t>256-D projected attributes → logits</w:t>
             </w:r>
           </w:p>
         </w:tc>
@@ -9131,7 +9131,7 @@
           <w:i w:val="0"/>
           <w:sz w:val="20"/>
         </w:rPr>
-        <w:t>Unless noted otherwise, branch logits are calibrated and non-linearly scaled where the training recipe applies label smoothing, class reweighting, or focal objectives [30] before softmax merge.</w:t>
+        <w:t>Unless noted otherwise, branch logits are calibrated and non-linearly scaled where the training recipe applies label smoothing, class reweighting, or focal objectives [30] before softmax aggregation.</w:t>
       </w:r>
     </w:p>
     <w:p>
@@ -9161,7 +9161,7 @@
           <w:i w:val="0"/>
           <w:sz w:val="20"/>
         </w:rPr>
-        <w:t>All text inputs undergo a standardized preprocessing workflow before tokenization. Text is lowercased, URLs are replaced with a [URL] placeholder token, @-mentions with [USER], and HTML entities are decoded. And control characters are stripped, repeated whitespace is collapsed to single spaces. Since emoji combinations can constitute hate speech (e.g., racial emoji paired with violent imagery) [46], emoji sequences are retained as-is. With bilinear interpolation for downsampling and padding for aspect ratio preservation, for the vision process chain, meme images are resized to 224×224 pixels to match CLIP's expected input resolution. Audio waveforms are resampled to 16 kHz mono via torchaudio, with channels averaged if stereo. Waveforms exceeding 20 seconds are center-cropped; shorter clips are zero-padded, and the Whisper tokenizer handles transcript preprocessing internally [27].</w:t>
+        <w:t>All text inputs undergo a standardized preprocessing pipeline before tokenization. Text is lowercased, URLs are replaced with a [URL] placeholder token, @-mentions with [USER], and HTML entities are decoded. Repeated whitespace is collapsed to single spaces, and control characters are stripped. Emoji sequences are retained as-is, since emoji combinations can constitute hate speech (e.g., racial emoji paired with violent imagery) [46]. For the vision pipeline, meme images are resized to 224×224 pixels to match CLIP's expected input resolution, with bilinear interpolation for downsampling and padding for aspect ratio preservation. With channels averaged if stereo, audio waveforms are resampled to 16 kHz mono via torchaudio. Waveforms exceeding 20 seconds are center-cropped; shorter clips are zero-padded; the Whisper tokenizer handles transcript preprocessing internally [27].</w:t>
       </w:r>
     </w:p>
     <w:p>
@@ -9193,7 +9193,7 @@
           <w:i w:val="0"/>
           <w:sz w:val="20"/>
         </w:rPr>
-        <w:t>CLASS DISTRIBUTION PER Corpus</w:t>
+        <w:t>CLASS DISTRIBUTION PER Data pool</w:t>
       </w:r>
     </w:p>
     <w:tbl>
@@ -10251,7 +10251,7 @@
           <w:i w:val="0"/>
           <w:sz w:val="20"/>
         </w:rPr>
-        <w:t>Exact counts may shift slightly following deduplication and cleaning; table III summarizes approximate label prevalence after project-specific merges and thresholding. Moderate global skew, motivating square-root dampening and focal calibration rather than raw inverse-frequency weighting alone [30], as shown by the merged stack.</w:t>
+        <w:t>Table III summarizes approximate label prevalence after project-specific merges and thresholding; exact counts may shift slightly following deduplication and cleaning. A given merged stack carries moderate global skew, motivating square-root dampening and focal calibration rather than raw inverse-frequency weighting alone [30].</w:t>
       </w:r>
     </w:p>
     <w:p>
@@ -10272,7 +10272,7 @@
           <w:i w:val="0"/>
           <w:sz w:val="16"/>
         </w:rPr>
-        <w:t>(b) hate vs. non-hate class distribution per corpus with imbalance ratios; fig. 14: Corpus composition and class distribution. (a) Data collection sizes colored by language. The German and Berkeley corpora shows the highest imbalance (1:3.0).</w:t>
+        <w:t>Fig. 14: Benchmark set composition and class distribution. (a) Corpus sizes colored by language; (b) hate vs. non-hate class distribution per collection with imbalance ratios. The German and Berkeley corpora puts forth the highest imbalance (1:3.0).</w:t>
       </w:r>
     </w:p>
     <w:p>
@@ -10303,7 +10303,7 @@
           <w:i w:val="0"/>
           <w:sz w:val="20"/>
         </w:rPr>
-        <w:t>All experiments execute inside Kaggle Notebooks on a single NVIDIA Tesla T4 (16 GB) GPU. The software stack is pinned to Python 3.12.12, PyTorch 2.10.0+cu128, Transformers 5.0.0, Data collections 2.21.0, Optuna 4.8.0 [25], scikit-learn 1.6.1. EasyOCR 1.7.2, making sure bitwise-stable reproduction conditional on hardware driver revisions.</w:t>
+        <w:t>All experiments execute inside Kaggle Notebooks on a single NVIDIA Tesla T4 (16 GB) GPU. The software stack is pinned to Python 3.12.12, PyTorch 2.10.0+cu128, Transformers 5.0.0, Corpora 2.21.0, Optuna 4.8.0 [25], scikit-learn 1.6.1, and EasyOCR 1.7.2, pinning down bitwise-stable reproduction conditional on hardware driver revisions.</w:t>
       </w:r>
     </w:p>
     <w:p>
@@ -10333,7 +10333,7 @@
           <w:i w:val="0"/>
           <w:sz w:val="20"/>
         </w:rPr>
-        <w:t>We report correctness, macro- and micro-averaged precision, recall, F1-score, area under the ROC curve (AUROC), average precision (AP). Confusion matrices on each task-specific hold-out split. Every validation contract is intentionally strict: a single stratified 80 / 10 / 10 partition (seed = 42) governs all text and audio evaluations. Section 8 revisits this shortcoming; while this mirrors operational limits (one canonical launch snapshot), it necessarily induces finite-sample variance.</w:t>
+        <w:t>We report hit rate, macro- and micro-averaged precision, recall, F1-score, area under the ROC curve (AUROC), average precision (AP), and confusion matrices on each task-specific hold-out split. A given validation contract is intentionally strict: a single stratified 80 / 10 / 10 partition (seed = 42) governs all text and audio evaluations. While this mirrors operational ceilings (one canonical go-live snapshot), it necessarily induces finite-sample variance; Section 8 revisits this limitation.</w:t>
       </w:r>
     </w:p>
     <w:p>
@@ -10349,7 +10349,7 @@
           <w:i w:val="0"/>
           <w:sz w:val="20"/>
         </w:rPr>
-        <w:t>Each single-split validation protocol deserves explicit justification. While statistically stronger, doesn't mirror this operational cadence, in production launch, a hate detection model is trained once and evaluated on a held-out set before release; k-fold cross-validation,. Our single split with seed = 42 therefore represents the most realistic assessment of rollout-time performance. However, this choice introduces finite-sample variance that makes small measure differences (e.g., 0.01 F1) statistically unreliable. We address this partially through the multi-seed metaheuristic protocol (Section 5.4) and acknowledge the gap clearly in Section 8.</w:t>
+        <w:t>The single-split validation protocol deserves explicit justification. In production go-live, a hate detection model is trained once and evaluated on a held-out set before release; k-fold cross-validation, while statistically stronger, doesn't mirror this operational cadence. Our single split with seed = 42 therefore represents the most realistic assessment of go-live-time performance. However, this choice introduces finite-sample variance that makes small metric differences (e.g., 0.01 F1) statistically unreliable. We address this partially through the multi-seed metaheuristic protocol (Section 5.4) and acknowledge the blind spot explicitly in Section 8.</w:t>
       </w:r>
     </w:p>
     <w:p>
@@ -10365,7 +10365,7 @@
           <w:i w:val="0"/>
           <w:sz w:val="20"/>
         </w:rPr>
-        <w:t>Metaheuristic robustness studies repeat stochastic optimizers over five pseudo-random seeds \42, 123, 456, 789, 1024\ for relatively cheap fitness evaluations (for example, fusion-weight search on cached branch scores). GPU-intensive replay jobs (for example, neural structure search loops over fresh forward passes) subsample three seeds \42, 123, 456\ to match notebook hour budgets.</w:t>
+        <w:t>Metaheuristic robustness studies repeat stochastic optimizers over five pseudo-random seeds \42, 123, 456, 789, 1024\ for relatively cheap fitness evaluations (for example, fusion-weight search on cached branch scores). GPU-intensive replay jobs (for example, neural backbone search loops over fresh forward passes) subsample three seeds \42, 123, 456\ to match notebook hour budgets.</w:t>
       </w:r>
     </w:p>
     <w:p>
@@ -10395,7 +10395,7 @@
           <w:i w:val="0"/>
           <w:sz w:val="20"/>
         </w:rPr>
-        <w:t>Hyperparameter and weight optimization against Bayesian templates uses Optuna TPE [25] with trial budgets documented below. Simulated annealing (SA) [29] optimizes scalar decision boundaries on validation F1. Exhaustive enumeration resolves discrete branch-selection problems spanning 31 doable activation patterns (all non-empty subsets of five fusion branches). Population-based metaheuristics-PSO [23], DE [22], GWO [21]. FA [24]-operate on the same search spaces with population sizes and iteration caps drawn from the project Config (Table III).</w:t>
+        <w:t>Hyperparameter and weight optimization against Bayesian templates uses Optuna TPE [25] with trial budgets documented below. Simulated annealing (SA) [29] optimizes scalar decision red lines on validation F1. Exhaustive enumeration resolves discrete branch-selection problems spanning 31 workable activation patterns (all non-empty subsets of five fusion branches). Population-based metaheuristics-PSO [23], DE [22], GWO [21], and FA [24]-operate on the same search spaces with population sizes and iteration caps drawn from the project Config (Table III).</w:t>
       </w:r>
     </w:p>
     <w:p>
@@ -10495,7 +10495,7 @@
                 <w:i w:val="0"/>
                 <w:sz w:val="16"/>
               </w:rPr>
-              <w:t>Factor</w:t>
+              <w:t>Tunable</w:t>
             </w:r>
           </w:p>
         </w:tc>
@@ -11790,7 +11790,7 @@
                 <w:i w:val="0"/>
                 <w:sz w:val="16"/>
               </w:rPr>
-              <w:t>SA bar</w:t>
+              <w:t>SA red line</w:t>
             </w:r>
           </w:p>
         </w:tc>
@@ -11852,7 +11852,7 @@
                 <w:i w:val="0"/>
                 <w:sz w:val="16"/>
               </w:rPr>
-              <w:t>SA bar</w:t>
+              <w:t>SA boundary</w:t>
             </w:r>
           </w:p>
         </w:tc>
@@ -13290,7 +13290,7 @@
           <w:i w:val="0"/>
           <w:sz w:val="20"/>
         </w:rPr>
-        <w:t>Any training infrastructure relies on the HuggingFace Trainer class with TrainingArguments configured as documented in Table III. Every custom WeightedTrainer subclass overrides the loss calculation to inject square-root dampened class weights and focal loss together. Gradient accumulation (GRADIENT_ACCUMULATION_STEPS = 2) in practice doubles the batch size to 32 samples per weight update without exceeding T4 VRAM at MAX_LENGTH = 128. Mixed-precision training (fp16) is enabled for BERT fine-tuning and HateCLIPper training, reducing memory footprint by around 30% and accelerating forward passes by 15-20% on the T4's Turing Tensor Cores.</w:t>
+        <w:t>A given training infrastructure counts on on the HuggingFace Trainer class with TrainingArguments configured as documented in Table III. The custom WeightedTrainer subclass overrides the loss computation to inject square-root dampened class weights and focal loss jointly. Gradient accumulation (GRADIENT_ACCUMULATION_STEPS = 2) successfully doubles the batch size to 32 samples per weight update without exceeding T4 VRAM at MAX_LENGTH = 128. Mixed-precision training (fp16) is enabled for BERT fine-tuning and HateCLIPper training, reducing memory footprint by around 30% and accelerating forward passes by 15-20% on the T4's Turing Tensor Cores.</w:t>
       </w:r>
     </w:p>
     <w:p>
@@ -13306,7 +13306,7 @@
           <w:i w:val="0"/>
           <w:sz w:val="20"/>
         </w:rPr>
-        <w:t>Our Optuna sampler is configured as TPESampler(seed=42) with MedianPruner(n_startup_trials=3, n_warmup_steps=0) for early termination of unpromising HPO trials. With GPU acceleration enabled, easyOCR is initialized with language lists ['en', 'fr', 'es', 'de'] for Latin scripts and ['hi'] for Devanagari. The Gradio web interface provides five tabs (text, image, audio, multimodal, review) for interactive demonstration. GUI-based results aren't reported in the quantitative assessment.</w:t>
+        <w:t>The Optuna sampler is configured as TPESampler(seed=42) with MedianPruner(n_startup_trials=3, n_warmup_steps=0) for early termination of unpromising HPO trials. With GPU acceleration enabled, easyOCR is initialized with language lists ['en', 'fr', 'es', 'de'] for Latin scripts and ['hi'] for Devanagari. The Gradio web interface provides five tabs (text, image, audio, multimodal, scoring) for interactive demonstration, though GUI-based results aren't reported in the quantitative benchmarking.</w:t>
       </w:r>
     </w:p>
     <w:p>
@@ -13322,7 +13322,7 @@
           <w:i w:val="0"/>
           <w:sz w:val="20"/>
         </w:rPr>
-        <w:t>All metaheuristic optimizers are created from scratch in NumPy, sharing a common MetaHeuristicOptimizer base class with a unified optimize() interface that accepts arbitrary fitness functions, bounds, and binary/continuous mode flags. Such a design makes sure that algorithmic differences-not realization-level inefficiencies-drive comparative results. The Result dataclass standardizes output format across algorithms, capturing best solution, fitness, agreement curve, wall time, testing count, and arbitrary metadata.</w:t>
+        <w:t>All metaheuristic optimizers are put together from scratch in NumPy, sharing a common MetaHeuristicOptimizer base class with a unified optimize() interface that accepts arbitrary fitness functions, bounds, and binary/continuous mode flags. Such a design pins down that algorithmic differences - not rollout-level inefficiencies - drive comparative results. The Result dataclass standardizes output format across algorithms, capturing best solution, fitness, convergence curve, wall time, scoring count, and arbitrary metadata.</w:t>
       </w:r>
     </w:p>
     <w:p>
@@ -13338,7 +13338,34 @@
           <w:i w:val="0"/>
           <w:sz w:val="20"/>
         </w:rPr>
-        <w:t>Reproducibility controls include fixed seeds for NumPy, PyTorch, and Optuna where supported. Deterministically ordered validation batches during fitness merge; and checkpointed branch logits for Tasks 1-3 so optimizer comparisons replay identical score tensors. Where CUDA nondeterminism remains (e.g., certain atomicAdd paths), we scope stochasticity to model training phases and keep metaheuristic evaluations on cached logits strictly repeatable.</w:t>
+        <w:t>Reproducibility controls</w:t>
+      </w:r>
+      <w:r>
+        <w:rPr>
+          <w:rFonts w:ascii="Times New Roman" w:hAnsi="Times New Roman"/>
+          <w:b w:val="0"/>
+          <w:i w:val="0"/>
+          <w:sz w:val="20"/>
+        </w:rPr>
+        <w:t xml:space="preserve"> include fixed seeds for NumPy, PyTorch, and Optuna where supported; deterministically ordered validation batches during fitness aggregation; and checkpointed branch logits for Tasks 1-3 so optimizer comparisons replay identical score tensors. Where CUDA nondeterminism remains (e.g., certain </w:t>
+      </w:r>
+      <w:r>
+        <w:rPr>
+          <w:rFonts w:ascii="Courier New" w:hAnsi="Courier New"/>
+          <w:b w:val="0"/>
+          <w:i w:val="0"/>
+          <w:sz w:val="18"/>
+        </w:rPr>
+        <w:t>atomicAdd</w:t>
+      </w:r>
+      <w:r>
+        <w:rPr>
+          <w:rFonts w:ascii="Times New Roman" w:hAnsi="Times New Roman"/>
+          <w:b w:val="0"/>
+          <w:i w:val="0"/>
+          <w:sz w:val="20"/>
+        </w:rPr>
+        <w:t xml:space="preserve"> paths), we scope stochasticity to model training phases and keep metaheuristic evaluations on cached logits strictly repeatable.</w:t>
       </w:r>
     </w:p>
     <w:p>
@@ -13389,7 +13416,7 @@
           <w:i w:val="0"/>
           <w:sz w:val="20"/>
         </w:rPr>
-        <w:t>For metaheuristic comparisons, each algorithm is executed with five independent seeds \42, 123, 456, 789, 1024\ on tasks with cheap fitness evaluations (fusion weights, limits, branch selection) and three seeds \42, 123, 456\ on GPU-intensive tasks (NAS, BERT HPO). We report the best fitness across seeds (peak performance), mean fitness (expected performance), and standard deviation (consistency). Agreement curves plot mean best-fitness-so-far across seeds with 1 standard deviation shading. The "rounds to 95% of global best" score captures sample speed-how quickly each algorithm reaches near-ideal solutions.</w:t>
+        <w:t>For metaheuristic comparisons, each algorithm is executed with five independent seeds \42, 123, 456, 789, 1024\ on tasks with cheap fitness evaluations (fusion weights, bars, branch selection) and three seeds \42, 123, 456\ on GPU-intensive tasks (NAS, BERT HPO). We report the best fitness across seeds (peak performance), mean fitness (expected performance), and standard deviation (consistency). Convergence curves plot mean best-fitness-so-far across seeds with 1 standard deviation shading. The "iterations to 95% of global best" metric picks up sample speed - how quickly each algorithm reaches near-optimal solutions.</w:t>
       </w:r>
     </w:p>
     <w:p>
@@ -13405,7 +13432,7 @@
           <w:i w:val="0"/>
           <w:sz w:val="20"/>
         </w:rPr>
-        <w:t>In our work, acknowledge the absence of formal statistical significance tests (e.g., Wilcoxon signed-rank, Mann-Whitney U) in the current study. Β &lt; 0.5 for typical effect sizes) - with only 3-5 seeds per algorithm, such tests have limited statistical power (1. A more rigorous protocol would require 30+ independent runs per algorithm. Exceeds our compute budget for GPU-intensive tasks but is practical for cheap testing tasks. We flag this as a gap (Section 8) and a future work item. When p-values are underpowered, where useful, we Also, report effect sizes as the difference in mean best fitness normalized by the pooled standard deviation across seeds, giving readers a scale-free sense of separation even.</w:t>
+        <w:t>We acknowledge the absence of formal statistical significance tests (e.g., Wilcoxon signed-rank, Mann-Whitney U) in what follows. With only 3-5 seeds per algorithm, such tests have limited statistical power (1 - β &lt; 0.5 for typical effect sizes). A more rigorous protocol would require 30+ independent runs per algorithm. Exceeds our compute budget for GPU-intensive tasks but is within reach for cheap assessment tasks. We flag this as a gap (Section 8) and a future work item. When p-values are underpowered, where useful, we also report effect sizes as the difference in mean best fitness normalized by the pooled standard deviation across seeds, giving readers a scale-free sense of separation even.</w:t>
       </w:r>
     </w:p>
     <w:p>
@@ -13467,7 +13494,7 @@
           <w:i w:val="0"/>
           <w:sz w:val="20"/>
         </w:rPr>
-        <w:t>Processing BUDGET</w:t>
+        <w:t>Compute-heavy BUDGET</w:t>
       </w:r>
     </w:p>
     <w:tbl>
@@ -13705,7 +13732,7 @@
                 <w:i w:val="0"/>
                 <w:sz w:val="16"/>
               </w:rPr>
-              <w:t>SA cutoff tuning</w:t>
+              <w:t>SA bar tuning</w:t>
             </w:r>
           </w:p>
         </w:tc>
@@ -13725,7 +13752,7 @@
                 <w:i w:val="0"/>
                 <w:sz w:val="16"/>
               </w:rPr>
-              <w:t>500 passes on cached logits</w:t>
+              <w:t>500 iterations on cached logits</w:t>
             </w:r>
           </w:p>
         </w:tc>
@@ -14139,7 +14166,7 @@
                 <w:i w:val="0"/>
                 <w:sz w:val="16"/>
               </w:rPr>
-              <w:t>Full testing + plots</w:t>
+              <w:t>Full trial + plots</w:t>
             </w:r>
           </w:p>
         </w:tc>
@@ -14260,7 +14287,7 @@
           <w:i w:val="0"/>
           <w:sz w:val="20"/>
         </w:rPr>
-        <w:t>The entire process chain-from raw data collections to final testing report-executes within a single 12-hour Kaggle GPU session.</w:t>
+        <w:t>The entire flow - from raw collections to final benchmarking report - executes within a single 12-hour Kaggle GPU session.</w:t>
       </w:r>
     </w:p>
     <w:p>
@@ -14281,7 +14308,7 @@
           <w:i w:val="0"/>
           <w:sz w:val="16"/>
         </w:rPr>
-        <w:t>Fig. 17: Processing budget breakdown by workflow phase. Our full training and review process chain completes in about 11.5 GPU-hours on a single NVIDIA T4, fitting within a 12-hour Kaggle session.</w:t>
+        <w:t>Fig. 17: Processing budget breakdown by chain phase. Our full training and assessment flow completes in close to 11.5 GPU-hours on a single NVIDIA T4, fitting within a 12-hour Kaggle session.</w:t>
       </w:r>
     </w:p>
     <w:p>
@@ -14312,7 +14339,7 @@
           <w:i w:val="0"/>
           <w:sz w:val="20"/>
         </w:rPr>
-        <w:t>This section synthesizes empirical outcomes from the multilingual text classifier, vision and meme pipelines, dual-stream audio stack. Late multimodal fusion layer, with particular attention to calibration effects, cross-lingual variability, modality-specific error modes. The comparative behavior of Bayesian versus population-based optimizers on surfaces induced by cached branch logits. Where appropriate, we relate magnitudes to known corpus artifacts-annotation smoothing between offensive and hateful classes, meme-style compositional semantics. User-generated audio loss-so that headline figures are interpreted as conditional on our fixed 80/10/10 split and T4-limited training budget rather than as language-universal constants [2], [3], [4], [20].</w:t>
+        <w:t>This section synthesizes empirical outcomes from the multilingual text classifier, vision and meme pipelines, dual-stream audio stack, and late multimodal fusion layer, with particular attention to calibration effects, cross-lingual variability, mode-specific error modes, and the comparative behavior of Bayesian versus population-based optimizers on surfaces induced by cached branch logits. Where appropriate, we relate magnitudes to known data pool artifacts - annotation smoothing between offensive and hateful classes, meme-style compositional semantics, and user-generated audio degradation - so that headline figures are interpreted as conditional on our fixed 80/10/10 split and T4-limited training budget rather than as language-universal constants [2], [3], [4], [20].</w:t>
       </w:r>
     </w:p>
     <w:p>
@@ -14342,7 +14369,7 @@
           <w:i w:val="0"/>
           <w:sz w:val="20"/>
         </w:rPr>
-        <w:t>A given multilingual BERT head attains 0.74 top-1 precision and 0.68 macro-F1 on the HateXplain-style three-way review, indicating residual confusion between offensive and hateful micro-classes-a known annotation artifact in crowd-sourced social text [4], [8]. From a broader view, when the head is flattened to binary toxicity (offensive or hate vs. normal) at the default score boundary τ = 0.5, performance rises to F1 ≈ 0.78 with precision 0.75 and recall 0.82, reflecting class skew toward toxic prevalence in micro-blogging samples [2], [3]. Simulated annealing cutoff search improves discrimination by nudging τ toward the validation-best operating point, yielding F1 ≈ 0.80, precision 0.82. Recall 0.78-a Pareto-favorable recalibration that trades a small recall decrement for materially higher precision on rollout-scarce false-alarm budgets. When rare classes drive product risk; we therefore report both three-way and binary summaries, with the latter aligned to moderation consoles that collapse categories for actioning, macro-F1, as a simple average over classes, remains informative for multi-way hate/offense separation but understates operational harm.</w:t>
+        <w:t>Our multilingual BERT head lands 0.74 top-1 correctness and 0.68 macro-F1 on the HateXplain-style three-way trial, indicating residual confusion between offensive and hateful micro-classes - a known annotation artifact in crowd-sourced social text [4], [8]. When the head is flattened to binary toxicity (offensive or hate vs. normal) at the default score cutoff τ = 0.5, performance rises to F1 ≈ 0.78 with precision 0.75 and recall 0.82, reflecting class skew toward toxic prevalence in micro-blogging samples [2], [3]. Simulated annealing cutoff search improves discrimination by nudging τ toward the validation-optimal operating point, yielding F1 ≈ 0.80, precision 0.82, and recall 0.78-a Pareto-favorable recalibration that trades a small recall decrement for materially higher precision on launch-scarce false-alarm budgets. When rare classes drive product risk; we therefore report both three-way and binary summaries, with the latter aligned to moderation consoles that collapse categories for actioning, macro-F1, as a simple average over classes, remains informative for multi-way hate/offense separation but understates operational harm.</w:t>
       </w:r>
     </w:p>
     <w:p>
@@ -14358,7 +14385,7 @@
           <w:i w:val="0"/>
           <w:sz w:val="20"/>
         </w:rPr>
-        <w:t>From a representation standpoint, multilingual BERT supplies shared subword units across English, German. Code-mixed Hindi-English, yet the empirical density of each language in pre-training is uneven [37]. While German and Romanized Hindi tokens occupy comparatively sparse neighborhoods in embedding space, that asymmetry predictably induces heterogeneous per-language calibration: high-resource English subsets benefit from richer contextual priors,. Annotation norms compound the effect: German refugee-crisis corpora shows documented label instability at the offensive-hateful boundary [47]. Hindi-English social text introduces script mixing and transliteration patterns that fragment lexical evidence across token boundaries [46]. Such factors motivate reporting binary text performance not only on the merged testing pool but also on language-stratified slices, isolating whether gains ascribed to "multilingual fine-tuning" truly generalize or largely track English-majority behavior.</w:t>
+        <w:t>From a representation standpoint, multilingual BERT supplies shared subword units across English, German, and code-mixed Hindi-English, yet the empirical density of each language in pre-training is uneven [37]. That asymmetry predictably induces heterogeneous per-language calibration: high-resource English subsets benefit from richer contextual priors, whereas German and Romanized Hindi tokens occupy comparatively sparse neighborhoods in embedding space. Annotation norms compound the effect: German refugee-crisis corpora carries documented label instability at the offensive-hateful boundary [47], and Hindi-English social text introduces script mixing and transliteration patterns that fragment lexical evidence across token boundaries [46]. Such factors motivate reporting binary text performance not only on the merged trial pool but also on language-stratified slices, isolating whether gains ascribed to "multilingual fine-tuning" truly generalize or by and large track English-majority behavior.</w:t>
       </w:r>
     </w:p>
     <w:p>
@@ -14461,7 +14488,7 @@
                 <w:i w:val="0"/>
                 <w:sz w:val="16"/>
               </w:rPr>
-              <w:t>Precision</w:t>
+              <w:t>Correctness</w:t>
             </w:r>
           </w:p>
         </w:tc>
@@ -14679,7 +14706,7 @@
                 <w:i w:val="0"/>
                 <w:sz w:val="16"/>
               </w:rPr>
-              <w:t>HateXplain-structured review</w:t>
+              <w:t>HateXplain-structured scoring</w:t>
             </w:r>
           </w:p>
         </w:tc>
@@ -14941,7 +14968,7 @@
                 <w:i w:val="0"/>
                 <w:sz w:val="16"/>
               </w:rPr>
-              <w:t>Boundary optimized on validation F1</w:t>
+              <w:t>Threshold optimized on validation F1</w:t>
             </w:r>
           </w:p>
         </w:tc>
@@ -14960,7 +14987,7 @@
           <w:i w:val="0"/>
           <w:sz w:val="20"/>
         </w:rPr>
-        <w:t>To assess multilingual robustness, we evaluate the binary text head separately on each language subset of the test split. Results (Table V) reveal that performance is highest on English-dominant subsets (HateXplain and Berkeley). Pre-training data density provides strong contextual representations. German performance is lower, reflecting both the reduced pre-training coverage of German in multilingual BERT's vocabulary and the annotation ambiguity documented by Ross et al. [47]. Hindi-English code-mixed text presents the greatest problem, with F1 roughly four points below the English baseline, attributable to code-switching patterns that split semantic units across scripts and to Latin-script transliterations that are poorly aligned with mBERT's WordPiece inventory [37], [46].</w:t>
+        <w:t>To assess multilingual robustness, we evaluate the binary text head separately on each language subset of the test split. Results (Table V) reveal that performance is highest on English-dominant subsets (HateXplain and Berkeley). Pre-training data density provides strong contextual representations. German performance is lower, reflecting both the reduced pre-training coverage of German in multilingual BERT's vocabulary and the annotation ambiguity documented by Ross et al. [47]. Hindi-English code-mixed text presents the greatest pain point, with F1 close to four points below the English baseline, attributable to code-switching patterns that split semantic units across scripts and to Latin-script transliterations that are poorly aligned with mBERT's WordPiece inventory [37], [46].</w:t>
       </w:r>
     </w:p>
     <w:p>
@@ -14992,7 +15019,7 @@
           <w:i w:val="0"/>
           <w:sz w:val="20"/>
         </w:rPr>
-        <w:t>PER-LANGUAGE TEXT PERFORMANCE (BINARY, SA-TUNED Limit)</w:t>
+        <w:t>PER-LANGUAGE TEXT PERFORMANCE (BINARY, SA-TUNED Bar)</w:t>
       </w:r>
     </w:p>
     <w:tbl>
@@ -15581,7 +15608,7 @@
           <w:i w:val="0"/>
           <w:sz w:val="16"/>
         </w:rPr>
-        <w:t>Fig. 18: Per-language binary text classification performance with SA-tuned limit. The highest F1 (0.82); Hindi-English code-mixed text shows the largest gap (F1 = 0.74), attributable to script mixing and transliteration problems, going by english.</w:t>
+        <w:t>Fig. 18: Per-language binary text classification performance with SA-tuned red line. English pulls off the highest F1 (0.82); Hindi-English code-mixed text shows the largest gap (F1 = 0.74), attributable to script mixing and transliteration headaches.</w:t>
       </w:r>
     </w:p>
     <w:p>
@@ -15597,7 +15624,7 @@
           <w:i w:val="0"/>
           <w:sz w:val="20"/>
         </w:rPr>
-        <w:t>While 12% of offensive samples are labeled hateful-consistent with the moderate inter-annotator agreement (κ ≈ 0.46) reported for HateXplain, the three-class confusion matrix reveals that the primary error mode is misclassification between offensive and hateful categories. Share a common aggressive register but differ in targeting protected characteristics. roughly 18% of hateful samples are misclassified as offensive,. Every normal-versus-toxic boundary is a lot cleaner, with only 6% of normal samples incorrectly flagged as toxic (false positives) and 8% of toxic samples missed (false negatives). The SA-optimized bar mostly affects this binary boundary, reweighting the operating point along the precision-recall frontier without resolving the deeper lexical overlap that drives offensive-hateful confusion. That residual ambiguity is a data set and definitional property as much as a modeling shortcoming [4], [8].</w:t>
+        <w:t>While 12% of offensive samples are labeled hateful - consistent with the moderate inter-annotator agreement (κ ≈ 0.46) reported for HateXplain, the three-class confusion matrix reveals that the primary error mode is misclassification between offensive and hateful categories. Share a common aggressive register but differ in targeting protected characteristics. around 18% of hateful samples are misclassified as offensive. With only 6% of normal samples incorrectly flagged as toxic (false positives) and 8% of toxic samples missed (false negatives), the normal-versus-toxic boundary is sizably cleaner. The SA-optimized boundary above all affects this binary boundary, reweighting the operating point along the precision-recall frontier without resolving the deeper lexical overlap that drives offensive-hateful confusion; that residual ambiguity is a data pool and definitional property as much as a modeling blind spot [4], [8].</w:t>
       </w:r>
     </w:p>
     <w:p>
@@ -15613,7 +15640,7 @@
           <w:i w:val="0"/>
           <w:sz w:val="20"/>
         </w:rPr>
-        <w:t>Qualitatively, errors cluster around reclaimed slurs, sarcastic quotation. Meta-discourse about toxicity (e.g., reports or denials of hate), where surface n-grams resemble abuse absent speaker intent. Square-root dampened class weights and focal loss reduce the dominance of easy negatives but don't inject pragmatic world knowledge. As such, high macro-F1 on three-way tasks should be read together with per-class precision curves when models inform automated actions [30].</w:t>
+        <w:t>Qualitatively, errors cluster around reclaimed slurs, sarcastic quotation, and meta-discourse about toxicity (e.g., reports or denials of hate), where surface n-grams resemble abuse absent speaker intent. Square-root dampened class weights and focal loss reduce the dominance of easy negatives but don't inject pragmatic world knowledge; hence high macro-F1 on three-way tasks should be read together with per-class precision curves when models inform automated actions [30].</w:t>
       </w:r>
     </w:p>
     <w:p>
@@ -15634,7 +15661,7 @@
           <w:i w:val="0"/>
           <w:sz w:val="16"/>
         </w:rPr>
-        <w:t>Fig. 2: Confusion matrices for the multilingual text classifier. Left: three-class (normal/offensive/hate) testing on HateXplain showing inter-class confusion and also right: binary (toxic vs. normal) testing on the merged multilingual test split.</w:t>
+        <w:t>Fig. 2: Confusion matrices for the multilingual text classifier; left: three-class (normal/offensive/hate) assessment on HateXplain showing inter-class confusion. Right: binary (toxic vs. normal) assessment on the merged multilingual test split.</w:t>
       </w:r>
     </w:p>
     <w:p>
@@ -15655,7 +15682,7 @@
           <w:i w:val="0"/>
           <w:sz w:val="16"/>
         </w:rPr>
-        <w:t>Fig. 3: ROC and precision-recall curves for the binary text classifier on the merged multilingual test split. The SA-optimized operating point is marked, showing improved precision at competitive recall.</w:t>
+        <w:t>Fig. 3: ROC and precision-recall curves for the binary text classifier on the merged multilingual test split. The SA-optimized operating point is marked, bringing out improved precision at competitive recall.</w:t>
       </w:r>
     </w:p>
     <w:p>
@@ -15685,7 +15712,7 @@
           <w:i w:val="0"/>
           <w:sz w:val="20"/>
         </w:rPr>
-        <w:t>On the 500-sample Hateful Memes development split [20], zero-shot CLIP scoring reaches only F1 ≈ 0.35 (precision 0.38, recall 0.33), consistent with previous findings that prompt-restricted vision-language models underfit subtle multimodal irony [11], [19]. With dev trajectories showing monotonic improvement early in training before plateauing-behavior characteristic of limited-rank adaptation on a small positive class, fine-tuning HateCLIPper [28] lifts F1 to about 0.48 (precision 0.52, recall 0.45) in our runs. When imagery is semantically dominant, late fusion of textual logits with vision outputs On top of this, improves F1 to ≈ 0.52, highlighting that text retains supporting cues even. While zero-shot CLIP remains a useful auxiliary for rapid prototyping, relative to billion-factor visiolinguistic systems benchmarked on the same task [20], these figures locate our vision stack as a factor-frugal baseline appropriate to single-GPU restrictions rather than as a contestant for leaderboard extremes. Within that regime, supervised HateCLIPper supplies the dominant visual signal,.</w:t>
+        <w:t>On the 500-sample Hateful Memes development split [20], zero-shot CLIP scoring reaches only F1 ≈ 0.35 (precision 0.38, recall 0.33), consistent with preceding findings that prompt-restricted vision-language models underfit subtle multimodal irony [11], [19]. Fine-tuning HateCLIPper [28] lifts F1 to around 0.48 (precision 0.52, recall 0.45) in our runs, with dev trajectories carries monotonic improvement early in training before plateauing - behavior characteristic of limited-rank adaptation on a small positive class. Late fusion of textual logits with vision outputs further improves F1 to ≈ 0.52, flags that text retains complementary cues even when imagery is semantically dominant. While zero-shot CLIP remains a useful auxiliary for rapid prototyping, relative to billion-knob visiolinguistic systems benchmarked on the same task [20], these figures locate our vision stack as a tunable-frugal baseline appropriate to single-GPU caps rather than as a contestant for leaderboard extremes; within that regime, supervised HateCLIPper supplies the dominant visual signal.</w:t>
       </w:r>
     </w:p>
     <w:p>
@@ -15762,7 +15789,7 @@
                 <w:i w:val="0"/>
                 <w:sz w:val="16"/>
               </w:rPr>
-              <w:t>Model arrangement</w:t>
+              <w:t>Model configuration</w:t>
             </w:r>
           </w:p>
         </w:tc>
@@ -16111,7 +16138,7 @@
           <w:i w:val="0"/>
           <w:sz w:val="20"/>
         </w:rPr>
-        <w:t>Systematic patterns in vision process chain errors, as seen from examining individual predictions. Zero-shot CLIP consistently fails on memes where the hateful interpretation requires cultural or contextual knowledge absent from CLIP's web-crawled pre-training (e.g., memes referencing specific political figures or regional slurs). HateCLIPper partially overcomes these gaps through fine-tuning on Hateful Memes examples but struggles with memes where the image is a benign photograph and all hateful content resides in overlaid text-a case better handled by the OCR-boosted text branch. In contrast, HateCLIPper correctly identifies hate in memes where the visual element (e.g., a dehumanizing comparison between a person and an animal) carries the primary hateful signal. The text overlay is neutral or even misleading. Such cases depict functional complementarity between frozen-caption-style supervision and task-specific adaptation [19], [28], [41].</w:t>
+        <w:t>Examining individual predictions reveals systematic patterns in vision flow errors. Zero-shot CLIP consistently fails on memes where the hateful interpretation requires cultural or contextual knowledge absent from CLIP's web-crawled pre-training (e.g., memes referencing specific political figures or regional slurs). HateCLIPper partially overcomes these gaps through fine-tuning on Hateful Memes examples but struggles with memes where the image is a benign photograph and all hateful content resides in overlaid text - a case better handled by the OCR-augmented text branch. By contrast, HateCLIPper correctly identifies hate in memes where the visual element (e.g., a dehumanizing comparison between a person and an animal) carries the primary hateful signal, and the text overlay is neutral or even misleading. Several cases bring out functional complementarity between frozen-caption-style supervision and task-specific adaptation [19], [28], [41].</w:t>
       </w:r>
     </w:p>
     <w:p>
@@ -16127,7 +16154,7 @@
           <w:i w:val="0"/>
           <w:sz w:val="20"/>
         </w:rPr>
-        <w:t>about 78% of Hateful Memes contain extractable text via EasyOCR, with a median approximate character error rate of 8% due to varied font styles, low resolution, and text over complex backgrounds. When OCR succeeds cleanly (character error rate below 5%), the text+vision fused F1 improves by roughly 0.04 over vision-only, confirming that embedded text provides supporting signal. In practice, when OCR fails greatly (character error rate above 20%, roughly 15% of memes), the injected noise slightly degrades fusion performance, motivating a confidence-gated method analogous in spirit to transcript gating in the audio pathway: uncorrected strings shouldn't enter fusion with equal weight to digitally authored text.</w:t>
+        <w:t>nearly 78% of Hateful Memes contain extractable text via EasyOCR, with a median approximate character error rate of 8% due to varied font styles, low resolution, and text over complex backgrounds. When OCR succeeds cleanly (character error rate below 5%), the text+vision fused F1 improves by close to 0.04 over vision-only, confirming that embedded text provides complementary signal. When OCR fails noticeably (character error rate above 20%, nearly 15% of memes), the injected noise slightly degrades fusion performance, motivating a confidence-gated tack analogous in spirit to transcript gating in the audio pathway: uncorrected strings shouldn't enter fusion with equal weight to digitally authored text.</w:t>
       </w:r>
     </w:p>
     <w:p>
@@ -16157,7 +16184,7 @@
           <w:i w:val="0"/>
           <w:sz w:val="20"/>
         </w:rPr>
-        <w:t>While the Wav2Vec 2.0 acoustic classifier alone attains F1 ≈ 0.56 (precision 0.60, recall 0.53), on the HateMM audio partition, transcript-conditioned text classification (Whisper + mBERT) attains F1 ≈ 0.58 (precision 0.55, recall 0.62),. A calibrated union of both audio pathways-mirroring the dual-stream design advocated for noisy user-generated speech [26], [27]-raises F1 to ≈ 0.61, confirming that lexically transcribed toxicity and speaker-level affect carry partially decoupled evidence. Such magnitudes are necessarily more tentative than text-side figures because the annotated audio corpus is smaller and because label acquisition for video hate is costlier and noisier than for static posts [45].</w:t>
+        <w:t>While the Wav2Vec 2.0 acoustic classifier alone lands F1 ≈ 0.56 (precision 0.60, recall 0.53), on the HateMM audio partition, transcript-conditioned text classification (Whisper + mBERT) attains F1 ≈ 0.58 (precision 0.55, recall 0.62). A calibrated union of both audio pathways - mirroring the dual-stream design advocated for noisy user-generated speech [26], [27]-raises F1 to ≈ 0.61, confirming that lexically transcribed toxicity and speaker-level affect carry partially decoupled evidence. Such magnitudes are necessarily more tentative than text-side figures because the annotated audio corpus is smaller and because label acquisition for video hate is costlier and noisier than for static posts [45].</w:t>
       </w:r>
     </w:p>
     <w:p>
@@ -16173,7 +16200,7 @@
           <w:i w:val="0"/>
           <w:sz w:val="20"/>
         </w:rPr>
-        <w:t>On a manually verified subset of 50 HateMM samples, Whisper-small reaches an estimated word error rate (WER) of around 22%-largely higher than its benchmarked performance on clean read speech, reflecting noisy, overlapping-speaker. Background-music conditions typical of social media video. Crucially, transcription errors disproportionately affect hate-bearing words, which tend to be non-standard vocabulary (slurs, code-words) outside Whisper's training distribution. Such a partially explains why the acoustic branch (Wav2Vec2) sometimes tops the transcript branch on hate-specific measures: acoustic traits capture prosodic aggression markers (raised pitch, increased volume, aggressive rhythm) that don't depend on lexical precision [26].</w:t>
+        <w:t>On a manually verified subset of 50 HateMM samples, Whisper-small notches an estimated word error rate (WER) of around 22%-sizably higher than its benchmarked performance on clean read speech, reflecting noisy, overlapping-speaker, and background-music conditions typical of social media video. Crucially, transcription errors disproportionately affect hate-bearing words, which tend to be non-standard vocabulary (slurs, code-words) outside Whisper's training distribution. This partially explains why the acoustic branch (Wav2Vec2) sometimes beats the transcript branch on hate-specific measures: acoustic characteristics capture prosodic aggression markers (raised pitch, increased volume, aggressive rhythm) that don't depend on lexical precision [26].</w:t>
       </w:r>
     </w:p>
     <w:p>
@@ -16189,7 +16216,7 @@
           <w:i w:val="0"/>
           <w:sz w:val="20"/>
         </w:rPr>
-        <w:t>Any dual audio streams shows supplementary error patterns. While the acoustic branch independently catches 61% of these, the transcript branch correctly identifies 73% of hateful samples that contain explicit slurs in the audio,. 42% detection compared to the transcript branch's 28%, as shown by however, for implicit hate conveyed through tone or context rather than explicit vocabulary, the acoustic branch. Our combined audio pathway recovers 81% of hateful samples, illustrating that lexical and prosodic evidence are partially decorrelated-a finding consistent with multimodal redundancy arguments for short-form video hate [45].</w:t>
+        <w:t>A given dual audio streams bears complementary error patterns. While the acoustic branch independently catches 61% of these, the transcript branch correctly identifies 73% of hateful samples that contain explicit slurs in the audio. However, for implicit hate conveyed through tone or context rather than explicit vocabulary, the acoustic branch reaches 42% detection compared to the transcript branch's 28%. The combined audio pathway recovers 81% of hateful samples, illustrating that lexical and prosodic evidence are partially decorrelated - a finding consistent with multimodal redundancy arguments for short-form video hate [45].</w:t>
       </w:r>
     </w:p>
     <w:p>
@@ -16210,7 +16237,7 @@
           <w:i w:val="0"/>
           <w:sz w:val="16"/>
         </w:rPr>
-        <w:t>Fig. 7: F1 score by individual type and fusion configurations. Text dominates as a unimodal branch; audio fusion provides the next-largest lift. Supervised vision beats zero-shot; and SA-optimized five-branch fusion reaches the highest All in all, F1.</w:t>
+        <w:t>Fig. 7: F1 score by individual channel and fusion configurations. Text dominates as a unimodal branch; audio fusion provides the next-largest lift; supervised vision edges out zero-shot; and SA-optimized five-branch fusion nets the highest overall F1.</w:t>
       </w:r>
     </w:p>
     <w:p>
@@ -16240,7 +16267,7 @@
           <w:i w:val="0"/>
           <w:sz w:val="20"/>
         </w:rPr>
-        <w:t>Although vision remains valuable when textual cues are truncated, branch ablations on the capped development draw reveal a consistent ranking: text dominates, audio fusion generates the next largest lift. Supervised vision exceeds zero-shot vision,. Because it over-emphasizes weaker zero-shot scores, equal weighting across branches (0.20 each) degrades performance relative to heuristic or optimized allocations. Optuna-optimized continuous weights attained F1 ≈ 0.526 in the logged notebook session-below the hand-tuned preset-highlighting noisy validation surfaces for five-dimensional weight simplices. Post-hoc SA calibration on fused probabilities recovers F1 ≈ 0.674, showing that limit mismatch, not only weight mismatch, explains much real-world multimodal drop. The gap between Bayesian-inspired TPE and manual presets isn't an indictment of automatic search per se. Rather, it signals that small validation shards induce high-variance estimates of fusion utility, an issue addressed more aggressively in Section 6.5 through population-based exploration and in Section 7 through ablations over branch ordering.</w:t>
+        <w:t>Although vision remains valuable when textual cues are truncated, branch ablations on the capped development draw reveal a consistent ranking: text dominates, audio fusion delivers the next largest lift, and supervised vision beats zero-shot vision. Because it over-emphasizes weaker zero-shot scores, equal weighting across branches (0.20 each) degrades performance relative to heuristic or optimized allocations. Optuna-optimized continuous weights pulled off F1 ≈ 0.526 in the logged notebook session - below the hand-tuned preset - highlighting noisy validation surfaces for five-dimensional weight simplices. Post-hoc SA calibration on fused probabilities recovers F1 ≈ 0.674, bringing out that cutoff mismatch, not only weight mismatch, explains much real-world multimodal degradation. Our gap between Bayesian-inspired TPE and manual presets isn't an indictment of automatic search per se; rather, it signals that small validation shards induce high-variance estimates of fusion utility, an issue addressed more aggressively in Section 6.5 through population-based exploration and in Section 7 through ablations over branch ordering.</w:t>
       </w:r>
     </w:p>
     <w:p>
@@ -16835,7 +16862,7 @@
           <w:i w:val="0"/>
           <w:sz w:val="20"/>
         </w:rPr>
-        <w:t>To quantify the marginal contribution of each type, Table VIII presents an incremental fusion assessment starting from text-only and progressively adding branches in decreasing order of individual strength.</w:t>
+        <w:t>To quantify the marginal contribution of each signal type, Table VIII presents an incremental fusion analysis starting from text-only and progressively adding branches in decreasing order of individual strength.</w:t>
       </w:r>
     </w:p>
     <w:p>
@@ -16867,7 +16894,7 @@
           <w:i w:val="0"/>
           <w:sz w:val="20"/>
         </w:rPr>
-        <w:t>INCREMENTAL FUSION Review (HATEMM DEV)</w:t>
+        <w:t>INCREMENTAL FUSION ANALYSIS (HATEMM DEV)</w:t>
       </w:r>
     </w:p>
     <w:tbl>
@@ -16912,7 +16939,7 @@
                 <w:i w:val="0"/>
                 <w:sz w:val="16"/>
               </w:rPr>
-              <w:t>Setup</w:t>
+              <w:t>Arrangement</w:t>
             </w:r>
           </w:p>
         </w:tc>
@@ -17507,7 +17534,7 @@
           <w:i w:val="0"/>
           <w:sz w:val="20"/>
         </w:rPr>
-        <w:t>When weaker branches (vision zero-shot) dilute stronger signals, the incremental review reveals that naive addition of all branches degrades performance. Weight optimization partially repairs this effect, but probability calibration at the decision threshold remains decisive: the SA-optimized boundary recovers and exceeds the text-only baseline, confirming that the optimization layer is essential for realizing the potential of multimodal fusion.</w:t>
+        <w:t>Naive addition of all branches degrades performance when weaker branches (vision zero-shot) dilute stronger signals, according to the incremental analysis. Weight optimization partially repairs this effect, but probability calibration at the decision red line remains decisive: the SA-optimized boundary recovers and exceeds the text-only baseline, confirming that the optimization layer is essential for realizing the potential of multimodal fusion.</w:t>
       </w:r>
     </w:p>
     <w:p>
@@ -17528,7 +17555,7 @@
           <w:i w:val="0"/>
           <w:sz w:val="16"/>
         </w:rPr>
-        <w:t>Fig. 4: Simulated annealing agreement for post-hoc limit optimization on fused multimodal probabilities. A given cooling schedule progressively narrows the search, converging to the validation-best cutoff.</w:t>
+        <w:t>Fig. 4: Simulated annealing convergence for post-hoc cutoff optimization on fused multimodal probabilities. The cooling schedule progressively narrows the search, converging to the validation-optimal boundary.</w:t>
       </w:r>
     </w:p>
     <w:p>
@@ -18066,7 +18093,7 @@
           <w:i w:val="0"/>
           <w:sz w:val="20"/>
         </w:rPr>
-        <w:t>METAHEURISTIC COMPARISON - DECISION Limit (1-D)</w:t>
+        <w:t>METAHEURISTIC COMPARISON - DECISION Red line (1-D)</w:t>
       </w:r>
     </w:p>
     <w:tbl>
@@ -18496,7 +18523,7 @@
           <w:i w:val="0"/>
           <w:sz w:val="20"/>
         </w:rPr>
-        <w:t>Because the five-dimensional weight simplex presents a noisy fitness surface when evaluated on only 500 development items, the Optuna-optimized weights (F1 0.526) fall below the hand-tuned preset (F1 ≈ 0.62 on text-only within the fusion grid). When evaluations are ordinal-correlated and high-variance, with 40 trials, the tree-structured Parzen estimator underlying TPE looks into roughly 40 / 51.5 ≈ 3.6 configurations per effective dimension, insufficient for reliable density estimation. Such a is precisely the regime where population-based methods-maintaining on the order of 30 simultaneous candidates-provide an advantage through implicit regularization of the search distribution and resistance to premature concentration on spurious fitness spikes [22], [23], [25].</w:t>
+        <w:t>The Optuna-optimized weights (F1 0.526) fall below the hand-tuned preset (F1 ≈ 0.62 on text-only within the fusion grid) because the five-dimensional weight simplex presents a noisy fitness surface when evaluated on only 500 development items. When evaluations are ordinal-correlated and high-variance, with 40 trials, the tree-structured Parzen estimator underlying TPE explores roughly 40 / 51.5 ≈ 3.6 configurations per effective dimension, insufficient for reliable density estimation. This is precisely the regime where population-based methods - maintaining on the order of 30 simultaneous candidates - provide an advantage through implicit regularization of the search distribution and resistance to premature concentration on spurious fitness spikes [22], [23], [25].</w:t>
       </w:r>
     </w:p>
     <w:p>
@@ -18512,7 +18539,286 @@
           <w:i w:val="0"/>
           <w:sz w:val="20"/>
         </w:rPr>
-        <w:t>Mean 0.534, std 0.006), narrowly edging PSO [23] (best 0.536, mean 0.530, std 0.008) and GWO [21] (best 0.532, mean 0.525, std 0.010); fusion weights (five continuous dimensions, cheap replay): DE [22] attains the highest observed validation F1 (≈ 0.541. All three exceed the Optuna TPE snapshot (0.526), reaffirming that evolutionary perturbation maintains diversity in weight space where tree-structured priors may prematurely concentrate mass [14], [25].</w:t>
+        <w:t>Fusion weights (five continuous dimensions, cheap replay):</w:t>
+      </w:r>
+      <w:r>
+        <w:rPr>
+          <w:rFonts w:ascii="Times New Roman" w:hAnsi="Times New Roman"/>
+          <w:b w:val="0"/>
+          <w:i w:val="0"/>
+          <w:sz w:val="20"/>
+        </w:rPr>
+        <w:t xml:space="preserve"> </w:t>
+      </w:r>
+      <w:r>
+        <w:rPr>
+          <w:rFonts w:ascii="Times New Roman" w:hAnsi="Times New Roman"/>
+          <w:b/>
+          <w:i w:val="0"/>
+          <w:sz w:val="20"/>
+        </w:rPr>
+        <w:t>DE</w:t>
+      </w:r>
+      <w:r>
+        <w:rPr>
+          <w:rFonts w:ascii="Times New Roman" w:hAnsi="Times New Roman"/>
+          <w:b w:val="0"/>
+          <w:i w:val="0"/>
+          <w:sz w:val="20"/>
+        </w:rPr>
+        <w:t xml:space="preserve"> [22] attains the highest observed validation </w:t>
+      </w:r>
+      <w:r>
+        <w:rPr>
+          <w:rFonts w:ascii="Times New Roman" w:hAnsi="Times New Roman"/>
+          <w:b/>
+          <w:i w:val="0"/>
+          <w:sz w:val="20"/>
+        </w:rPr>
+        <w:t>F1</w:t>
+      </w:r>
+      <w:r>
+        <w:rPr>
+          <w:rFonts w:ascii="Times New Roman" w:hAnsi="Times New Roman"/>
+          <w:b w:val="0"/>
+          <w:i w:val="0"/>
+          <w:sz w:val="20"/>
+        </w:rPr>
+        <w:t xml:space="preserve"> (</w:t>
+      </w:r>
+      <w:r>
+        <w:rPr>
+          <w:rFonts w:ascii="Times New Roman" w:hAnsi="Times New Roman"/>
+          <w:b/>
+          <w:i w:val="0"/>
+          <w:sz w:val="20"/>
+        </w:rPr>
+        <w:t>≈ 0.541</w:t>
+      </w:r>
+      <w:r>
+        <w:rPr>
+          <w:rFonts w:ascii="Times New Roman" w:hAnsi="Times New Roman"/>
+          <w:b w:val="0"/>
+          <w:i w:val="0"/>
+          <w:sz w:val="20"/>
+        </w:rPr>
+        <w:t xml:space="preserve">; mean </w:t>
+      </w:r>
+      <w:r>
+        <w:rPr>
+          <w:rFonts w:ascii="Times New Roman" w:hAnsi="Times New Roman"/>
+          <w:b/>
+          <w:i w:val="0"/>
+          <w:sz w:val="20"/>
+        </w:rPr>
+        <w:t>0.534</w:t>
+      </w:r>
+      <w:r>
+        <w:rPr>
+          <w:rFonts w:ascii="Times New Roman" w:hAnsi="Times New Roman"/>
+          <w:b w:val="0"/>
+          <w:i w:val="0"/>
+          <w:sz w:val="20"/>
+        </w:rPr>
+        <w:t xml:space="preserve">, std </w:t>
+      </w:r>
+      <w:r>
+        <w:rPr>
+          <w:rFonts w:ascii="Times New Roman" w:hAnsi="Times New Roman"/>
+          <w:b/>
+          <w:i w:val="0"/>
+          <w:sz w:val="20"/>
+        </w:rPr>
+        <w:t>0.006</w:t>
+      </w:r>
+      <w:r>
+        <w:rPr>
+          <w:rFonts w:ascii="Times New Roman" w:hAnsi="Times New Roman"/>
+          <w:b w:val="0"/>
+          <w:i w:val="0"/>
+          <w:sz w:val="20"/>
+        </w:rPr>
+        <w:t xml:space="preserve">), narrowly edging </w:t>
+      </w:r>
+      <w:r>
+        <w:rPr>
+          <w:rFonts w:ascii="Times New Roman" w:hAnsi="Times New Roman"/>
+          <w:b/>
+          <w:i w:val="0"/>
+          <w:sz w:val="20"/>
+        </w:rPr>
+        <w:t>PSO</w:t>
+      </w:r>
+      <w:r>
+        <w:rPr>
+          <w:rFonts w:ascii="Times New Roman" w:hAnsi="Times New Roman"/>
+          <w:b w:val="0"/>
+          <w:i w:val="0"/>
+          <w:sz w:val="20"/>
+        </w:rPr>
+        <w:t xml:space="preserve"> [23] (</w:t>
+      </w:r>
+      <w:r>
+        <w:rPr>
+          <w:rFonts w:ascii="Times New Roman" w:hAnsi="Times New Roman"/>
+          <w:b/>
+          <w:i w:val="0"/>
+          <w:sz w:val="20"/>
+        </w:rPr>
+        <w:t>best 0.536</w:t>
+      </w:r>
+      <w:r>
+        <w:rPr>
+          <w:rFonts w:ascii="Times New Roman" w:hAnsi="Times New Roman"/>
+          <w:b w:val="0"/>
+          <w:i w:val="0"/>
+          <w:sz w:val="20"/>
+        </w:rPr>
+        <w:t xml:space="preserve">, mean </w:t>
+      </w:r>
+      <w:r>
+        <w:rPr>
+          <w:rFonts w:ascii="Times New Roman" w:hAnsi="Times New Roman"/>
+          <w:b/>
+          <w:i w:val="0"/>
+          <w:sz w:val="20"/>
+        </w:rPr>
+        <w:t>0.530</w:t>
+      </w:r>
+      <w:r>
+        <w:rPr>
+          <w:rFonts w:ascii="Times New Roman" w:hAnsi="Times New Roman"/>
+          <w:b w:val="0"/>
+          <w:i w:val="0"/>
+          <w:sz w:val="20"/>
+        </w:rPr>
+        <w:t xml:space="preserve">, std </w:t>
+      </w:r>
+      <w:r>
+        <w:rPr>
+          <w:rFonts w:ascii="Times New Roman" w:hAnsi="Times New Roman"/>
+          <w:b/>
+          <w:i w:val="0"/>
+          <w:sz w:val="20"/>
+        </w:rPr>
+        <w:t>0.008</w:t>
+      </w:r>
+      <w:r>
+        <w:rPr>
+          <w:rFonts w:ascii="Times New Roman" w:hAnsi="Times New Roman"/>
+          <w:b w:val="0"/>
+          <w:i w:val="0"/>
+          <w:sz w:val="20"/>
+        </w:rPr>
+        <w:t xml:space="preserve">) and </w:t>
+      </w:r>
+      <w:r>
+        <w:rPr>
+          <w:rFonts w:ascii="Times New Roman" w:hAnsi="Times New Roman"/>
+          <w:b/>
+          <w:i w:val="0"/>
+          <w:sz w:val="20"/>
+        </w:rPr>
+        <w:t>GWO</w:t>
+      </w:r>
+      <w:r>
+        <w:rPr>
+          <w:rFonts w:ascii="Times New Roman" w:hAnsi="Times New Roman"/>
+          <w:b w:val="0"/>
+          <w:i w:val="0"/>
+          <w:sz w:val="20"/>
+        </w:rPr>
+        <w:t xml:space="preserve"> [21] (</w:t>
+      </w:r>
+      <w:r>
+        <w:rPr>
+          <w:rFonts w:ascii="Times New Roman" w:hAnsi="Times New Roman"/>
+          <w:b/>
+          <w:i w:val="0"/>
+          <w:sz w:val="20"/>
+        </w:rPr>
+        <w:t>best 0.532</w:t>
+      </w:r>
+      <w:r>
+        <w:rPr>
+          <w:rFonts w:ascii="Times New Roman" w:hAnsi="Times New Roman"/>
+          <w:b w:val="0"/>
+          <w:i w:val="0"/>
+          <w:sz w:val="20"/>
+        </w:rPr>
+        <w:t xml:space="preserve">, mean </w:t>
+      </w:r>
+      <w:r>
+        <w:rPr>
+          <w:rFonts w:ascii="Times New Roman" w:hAnsi="Times New Roman"/>
+          <w:b/>
+          <w:i w:val="0"/>
+          <w:sz w:val="20"/>
+        </w:rPr>
+        <w:t>0.525</w:t>
+      </w:r>
+      <w:r>
+        <w:rPr>
+          <w:rFonts w:ascii="Times New Roman" w:hAnsi="Times New Roman"/>
+          <w:b w:val="0"/>
+          <w:i w:val="0"/>
+          <w:sz w:val="20"/>
+        </w:rPr>
+        <w:t xml:space="preserve">, std </w:t>
+      </w:r>
+      <w:r>
+        <w:rPr>
+          <w:rFonts w:ascii="Times New Roman" w:hAnsi="Times New Roman"/>
+          <w:b/>
+          <w:i w:val="0"/>
+          <w:sz w:val="20"/>
+        </w:rPr>
+        <w:t>0.010</w:t>
+      </w:r>
+      <w:r>
+        <w:rPr>
+          <w:rFonts w:ascii="Times New Roman" w:hAnsi="Times New Roman"/>
+          <w:b w:val="0"/>
+          <w:i w:val="0"/>
+          <w:sz w:val="20"/>
+        </w:rPr>
+        <w:t xml:space="preserve">). All three exceed the </w:t>
+      </w:r>
+      <w:r>
+        <w:rPr>
+          <w:rFonts w:ascii="Times New Roman" w:hAnsi="Times New Roman"/>
+          <w:b/>
+          <w:i w:val="0"/>
+          <w:sz w:val="20"/>
+        </w:rPr>
+        <w:t>Optuna TPE</w:t>
+      </w:r>
+      <w:r>
+        <w:rPr>
+          <w:rFonts w:ascii="Times New Roman" w:hAnsi="Times New Roman"/>
+          <w:b w:val="0"/>
+          <w:i w:val="0"/>
+          <w:sz w:val="20"/>
+        </w:rPr>
+        <w:t xml:space="preserve"> snapshot (</w:t>
+      </w:r>
+      <w:r>
+        <w:rPr>
+          <w:rFonts w:ascii="Times New Roman" w:hAnsi="Times New Roman"/>
+          <w:b/>
+          <w:i w:val="0"/>
+          <w:sz w:val="20"/>
+        </w:rPr>
+        <w:t>0.526</w:t>
+      </w:r>
+      <w:r>
+        <w:rPr>
+          <w:rFonts w:ascii="Times New Roman" w:hAnsi="Times New Roman"/>
+          <w:b w:val="0"/>
+          <w:i w:val="0"/>
+          <w:sz w:val="20"/>
+        </w:rPr>
+        <w:t>), reaffirming that evolutionary perturbation maintains diversity in weight space where tree-structured priors may prematurely concentrate mass [14], [25].</w:t>
       </w:r>
     </w:p>
     <w:p>
@@ -18528,7 +18834,7 @@
           <w:i w:val="0"/>
           <w:sz w:val="20"/>
         </w:rPr>
-        <w:t>Boundary optimization (single dimension): PSO, DE, GWO, and FA [24] each converge to τ ≈ 0.482, matching SA [29], differing chiefly in iteration counts (PSO ≈ 15, DE ≈ 20, GWO ≈ 25, FA ≈ 30). While motivating faster swarm-based warm starts in iterative dashboards, the equivalence of optima backs up unimodality along this slice.</w:t>
+        <w:t>Boundary optimization (single dimension): PSO, DE, GWO, and FA [24] each converge to τ ≈ 0.482, matching SA [29], differing chiefly in iteration counts (PSO ≈ 15, DE ≈ 20, GWO ≈ 25, FA ≈ 30). While motivating faster swarm-based warm starts in iterative dashboards, the equivalence of optima corroborates unimodality along this slice.</w:t>
       </w:r>
     </w:p>
     <w:p>
@@ -18544,7 +18850,7 @@
           <w:i w:val="0"/>
           <w:sz w:val="20"/>
         </w:rPr>
-        <w:t>Branch selection (31 practical masks): Exhaustive search certifies the global optimum among tested combinations. GA, PSO, DE, and GWO each rediscover the best three-active-branch pattern within 10-15 cycles, indicating low deceptive linkage between bitmask semantics and validation F1 for cached logits-an encouraging sign for future discrete-continuous hybrid training [14], [16].</w:t>
+        <w:t>Branch selection (31 workable masks): Exhaustive search certifies the global optimum among tested combinations. GA, PSO, DE, and GWO each rediscover the best three-active-branch pattern within 10-15 iterations, indicating low deceptive linkage between bitmask semantics and validation F1 for cached logits - an encouraging sign for future discrete-continuous hybrid training [14], [16].</w:t>
       </w:r>
     </w:p>
     <w:p>
@@ -18560,7 +18866,7 @@
           <w:i w:val="0"/>
           <w:sz w:val="20"/>
         </w:rPr>
-        <w:t>When fitness aggregates F1, precision, and correctness under a composite score, on the 144-dimensional binary head-selection problem, GA and GWO discover that roughly 55-65% of attention heads can be masked without degrading binary F1 below the full-model baseline. Any best head mask found by GA retains 78 of 144 heads (54%) while reaching a composite fitness of 0.71, compared to 0.73 for the full model-a modest 2.7% degradation in exchange for 46% structural sparsity, supporting the view that hate detection counts on a dispersed rather than strictly localized subset of attentional channels [18], [38].</w:t>
+        <w:t>When fitness aggregates F1, precision, and precision under a composite score, on the 144-dimensional binary head-selection problem, GA and GWO discover that close to 55-65% of attention heads can be masked without degrading binary F1 below the full-model baseline. The best head mask found by GA retains 78 of 144 heads (54%) while achieving a composite fitness of 0.71, compared to 0.73 for the full model - a modest 2.7% degradation in exchange for 46% structural sparsity, supporting the view that hate detection leans on on a dispersed rather than strictly localized subset of attentional channels [18], [38].</w:t>
       </w:r>
     </w:p>
     <w:p>
@@ -19182,7 +19488,7 @@
                 <w:i w:val="0"/>
                 <w:sz w:val="16"/>
               </w:rPr>
-              <w:t>Selected Characteristics (of 2000)</w:t>
+              <w:t>Selected Aspects (of 2000)</w:t>
             </w:r>
           </w:p>
         </w:tc>
@@ -19331,7 +19637,7 @@
                 <w:i w:val="0"/>
                 <w:sz w:val="16"/>
               </w:rPr>
-              <w:t>Full attribute set (LinearSVC)</w:t>
+              <w:t>Full aspect set (LinearSVC)</w:t>
             </w:r>
           </w:p>
         </w:tc>
@@ -19396,7 +19702,7 @@
           <w:i w:val="0"/>
           <w:sz w:val="20"/>
         </w:rPr>
-        <w:t>Both GA and BPSO improve over the full-attribute LinearSVC baseline, confirming that TF-IDF attribute spaces contain sizable redundancy for hate detection. More aggressive pruning without quality loss, according to gA's tighter selection (41% of traits).</w:t>
+        <w:t>Both GA and BPSO improve over the full-aspect LinearSVC baseline, confirming that TF-IDF aspect spaces contain hefty redundancy for hate detection. GA's tighter selection (41% of characteristics) suggests more aggressive pruning without quality loss.</w:t>
       </w:r>
     </w:p>
     <w:p>
@@ -19520,7 +19826,7 @@
                 <w:i w:val="0"/>
                 <w:sz w:val="16"/>
               </w:rPr>
-              <w:t>Layout Found</w:t>
+              <w:t>Blueprint Found</w:t>
             </w:r>
           </w:p>
         </w:tc>
@@ -19734,7 +20040,7 @@
           <w:i w:val="0"/>
           <w:sz w:val="20"/>
         </w:rPr>
-        <w:t>DE finds the strongest structure, which closely tracks manually designed high-width, two-layer heads for Hadamard-fused CLIP representations. The original hand-designed HateCLIPper head is near-ideal for the Hadamard characteristic space at the given compute budget [28], as seen from the NAS result.</w:t>
+        <w:t>DE finds the strongest scaffold, which closely tracks manually designed high-width, two-layer heads for Hadamard-fused CLIP representations. The original hand-designed HateCLIPper head is near-optimal for the Hadamard characteristic space at the given compute budget [28], as shown by the NAS result.</w:t>
       </w:r>
     </w:p>
     <w:p>
@@ -20242,7 +20548,7 @@
           <w:i w:val="0"/>
           <w:sz w:val="20"/>
         </w:rPr>
-        <w:t>DE and Optuna attain comparable peak performance. From a broader view, de requires 12 × (1+15) = 192 evaluations across three seeds (64 per seed) versus Optuna's 15 trials for the logged comparison. Every population-based method parallelizes naturally on multi-GPU systems, while TPE is by nature sequential [25].</w:t>
+        <w:t>DE and Optuna achieve comparable peak performance, but DE requires 12 × (1+15) = 192 evaluations across three seeds (64 per seed) versus Optuna's 15 trials for the logged comparison. The population-based angle parallelizes naturally on multi-GPU systems, whereas TPE is by its very nature sequential [25].</w:t>
       </w:r>
     </w:p>
     <w:p>
@@ -20274,7 +20580,7 @@
           <w:i w:val="0"/>
           <w:sz w:val="20"/>
         </w:rPr>
-        <w:t>JOINT FUSION+Cutoff (6-D CONTINUOUS)</w:t>
+        <w:t>JOINT FUSION+THRESHOLD (6-D CONTINUOUS)</w:t>
       </w:r>
     </w:p>
     <w:tbl>
@@ -20668,7 +20974,7 @@
           <w:i w:val="0"/>
           <w:sz w:val="20"/>
         </w:rPr>
-        <w:t>Interpretation. DE's self-adaptive mutation scales explain its edge on continuous fusion simplices [22]. PSO remains competitive in low-dimensional settings [23]. GWO's leader hierarchy reduces stagnation relative to canonical PSO variants [21]. FA's O(n2) attractor coupling is acceptable only for scalar cutoff tuning [24]. Crucially, no single metaheuristic universally dominates; instead, algorithm choice should track problem dimensionality, review cost. Noise level-precisely the axis along which we partitioned tasks in the realization roadmap.</w:t>
+        <w:t>Interpretation. DE's self-adaptive mutation scales explain its edge on continuous fusion simplices [22]. PSO remains competitive in low-dimensional settings [23], while GWO's leader hierarchy softens stagnation relative to canonical PSO variants [21]. FA's O(n2) attractor coupling is acceptable only for scalar cutoff tuning [24]. Crucially, no single metaheuristic universally dominates; instead, algorithm choice should track problem dimensionality, scoring cost, and noise level - precisely the axis along which we partitioned tasks in the build-out roadmap.</w:t>
       </w:r>
     </w:p>
     <w:p>
@@ -20689,7 +20995,7 @@
           <w:i w:val="0"/>
           <w:sz w:val="16"/>
         </w:rPr>
-        <w:t>Fig. 6: Metaheuristic coming together curves for fusion weight optimization (5-D) - mean best-fitness-so-far across five seeds with shaded standard deviation. The highest terminal fitness, going by dE converges fastest and.</w:t>
+        <w:t>Fig. 6: Metaheuristic convergence curves for fusion weight optimization (5-D), and mean best-fitness-so-far across five seeds with shaded standard deviation. DE converges fastest and lands the highest terminal fitness.</w:t>
       </w:r>
     </w:p>
     <w:p>
@@ -20710,7 +21016,7 @@
           <w:i w:val="0"/>
           <w:sz w:val="16"/>
         </w:rPr>
-        <w:t>Fig. 8: Box plots of best fitness across five seeds for each metaheuristic on the fusion weight and cutoff tasks. The tightest interquartile range and highest median on the fusion task, as seen from dE.</w:t>
+        <w:t>Fig. 8: Box plots of best fitness across five seeds for each metaheuristic on the fusion weight and red line tasks. DE bears the tightest interquartile range and highest median on the fusion task.</w:t>
       </w:r>
     </w:p>
     <w:p>
@@ -20740,7 +21046,7 @@
           <w:i w:val="0"/>
           <w:sz w:val="20"/>
         </w:rPr>
-        <w:t>Systematic error review across types reveals several recurring failure patterns.</w:t>
+        <w:t>Systematic error analysis across signal types reveals several recurring failure patterns.</w:t>
       </w:r>
     </w:p>
     <w:p>
@@ -20756,7 +21062,7 @@
           <w:i w:val="0"/>
           <w:sz w:val="20"/>
         </w:rPr>
-        <w:t>False positives (over-flagging): The most frequent false positive pattern involves texts that employ reclaimed slurs in non-hateful contexts (e.g., in-group usage of racial terms, song lyrics, academic quotations). around 35% of false positives in the English test split fall into this category. The model detects the lexical presence of a slur without understanding pragmatic context. When operational policies treat offensive and hateful spans as a single actionable set, a second pattern involves memes using dark humor that's offensive but not targeted hate-a distinction the binary classification boundary can't capture.</w:t>
+        <w:t>False positives (over-flagging): The most frequent false positive pattern involves texts that employ reclaimed slurs in non-hateful contexts (e.g., in-group usage of racial terms, song lyrics, academic quotations). around 35% of false positives in the English test split fall into this category, where the model detects the lexical presence of a slur without understanding pragmatic context. When operational policies treat offensive and hateful spans as a single actionable set, a second pattern involves memes using dark humor that's offensive but not targeted hate - a distinction the binary classification boundary can't capture.</w:t>
       </w:r>
     </w:p>
     <w:p>
@@ -20772,7 +21078,7 @@
           <w:i w:val="0"/>
           <w:sz w:val="20"/>
         </w:rPr>
-        <w:t>Historical allusion, or coded language ("dog whistles") that doesn't contain openly hateful vocabulary. about 40% of missed hateful content in the code-mixed Hindi-English subset uses transliterated slurs in Latin script that are out-of-vocabulary for multilingual BERT's WordPiece tokenizer, false negatives (missed hate): The dominant false negative pattern involves implicit hate expressed through metaphor. In the vision flow, false negatives cluster around memes that require world knowledge (e.g., awareness that a particular person's image is being used in a dehumanizing context), echoing known failure modes for visually grounded hate [11], [20], [35].</w:t>
+        <w:t>False negatives (missed hate): The dominant false negative pattern involves implicit hate expressed through metaphor, historical allusion, or coded language ("dog whistles") that doesn't contain explicitly hateful vocabulary. nearly 40% of missed hateful content in the code-mixed Hindi-English subset uses transliterated slurs in Latin script that are out-of-vocabulary for multilingual BERT's WordPiece tokenizer. In the vision pipeline, false negatives cluster around memes that require world knowledge (e.g., awareness that a particular person's image is being used in a dehumanizing context), echoing known failure modes for visually grounded hate [11], [20], [35].</w:t>
       </w:r>
     </w:p>
     <w:p>
@@ -20788,7 +21094,7 @@
           <w:i w:val="0"/>
           <w:sz w:val="20"/>
         </w:rPr>
-        <w:t>Opposing predictions (one above boundary, one below), going by cross-modal disagreements: In roughly 12% of HateMM dev samples, the text and audio branches. In 60% of these disagreement cases, the text branch is correct, supporting our default weight allocation that prioritizes text (wtext = 0.40). Each remaining 40% represent cases where prosodic or acoustic cues (sarcasm, shouting) carry hate signal absent from the transcript-precisely the cases that justify including the acoustic branch rather than relying on ASR alone [26].</w:t>
+        <w:t>Cross-modal disagreements: In close to 12% of HateMM dev samples, the text and audio branches produce opposing predictions (one above red line, one below). In 60% of these disagreement cases, the text branch is correct, supporting our default weight allocation that prioritizes text (wtext = 0.40). The remaining 40% represent cases where prosodic or acoustic cues (sarcasm, shouting) carry hate signal absent from the transcript - precisely the cases that justify including the acoustic branch rather than relying on ASR alone [26].</w:t>
       </w:r>
     </w:p>
     <w:p>
@@ -20818,7 +21124,7 @@
           <w:i w:val="0"/>
           <w:sz w:val="20"/>
         </w:rPr>
-        <w:t>Table XV summarizes wall-clock times for key metaheuristic experiments, revealing the cost-performance trade-off across tasks. While head selection, attribute selection, NAS, and BERT HPO incur per-testing costs dominated by forward passes or gradient steps on GPU, cheap replay tasks-fusion weights and cutoff search over cached logits-complete in sub-second wall times per seed,.</w:t>
+        <w:t>Table XV summarizes wall-clock times for key metaheuristic experiments, revealing the cost-performance trade-off across tasks. Cheap replay tasks - fusion weights and bar search over cached logits - complete in sub-second wall times per seed, whereas head selection, trait selection, NAS, and BERT HPO incur per-scoring costs dominated by forward passes or gradient steps on GPU.</w:t>
       </w:r>
     </w:p>
     <w:p>
@@ -20850,7 +21156,7 @@
           <w:i w:val="0"/>
           <w:sz w:val="20"/>
         </w:rPr>
-        <w:t>METAHEURISTIC Computing COST</w:t>
+        <w:t>METAHEURISTIC Number-crunching COST</w:t>
       </w:r>
     </w:p>
     <w:tbl>
@@ -21116,7 +21422,7 @@
                 <w:i w:val="0"/>
                 <w:sz w:val="16"/>
               </w:rPr>
-              <w:t>Boundary (1-D)</w:t>
+              <w:t>Cutoff (1-D)</w:t>
             </w:r>
           </w:p>
         </w:tc>
@@ -21740,7 +22046,7 @@
           <w:i w:val="0"/>
           <w:sz w:val="20"/>
         </w:rPr>
-        <w:t>The three orders of magnitude separating cached-probability tasks (milliseconds per assessment) from model-training tasks (minutes per testing) explains our split seed strategy: five seeds for cheap tasks, three for expensive ones, trading statistical thoroughness against wall-clock feasibility on a single T4.</w:t>
+        <w:t>The three orders of magnitude separating cached-probability tasks (milliseconds per trial) from model-training tasks (minutes per scoring) explains our split seed strategy: five seeds for cheap tasks, three for expensive ones, trading statistical thoroughness against wall-clock feasibility on a single T4.</w:t>
       </w:r>
     </w:p>
     <w:p>
@@ -21802,7 +22108,7 @@
           <w:i w:val="0"/>
           <w:sz w:val="20"/>
         </w:rPr>
-        <w:t>A non-monotonic relationship between branch count and performance, going by the incremental review (Table VIII). Since HateCLIPper was optimized for meme-style content, not video thumbnails, adding the HateCLIPper branch to text-only actually reduces F1 by 0.03 on the HateMM audio benchmark-unsurprising,. Confirming that ASR transcripts are supplementary to natively digital text, adding audio text (Whisper+mBERT) provides the largest single-branch lift (+0.05). Each acoustic branch contributes a Also, +0.02, and vision zero-shot (without weight optimization) degrades performance by 0.06. Only after SA boundary optimization do all five branches collectively outperform the text-only baseline, attaining F1 = 0.674-a relative improvement of 8.7% over text alone.</w:t>
+        <w:t>A given incremental analysis (Table VIII) reveals a non-monotonic relationship between branch count and performance. Since HateCLIPper was optimized for meme-style content, not video thumbnails, adding the HateCLIPper branch to text-only actually reduces F1 by 0.03 on the HateMM audio benchmark - unsurprising. Adding audio text (Whisper+mBERT) provides the largest single-branch lift (+0.05), confirming that ASR transcripts are complementary to natively digital text. The acoustic branch contributes a further +0.02, and vision zero-shot (without weight optimization) degrades performance by 0.06. Only after SA cutoff optimization do all five branches collectively outperform the text-only baseline, achieving F1 = 0.674 - a relative improvement of 8.7% over text alone.</w:t>
       </w:r>
     </w:p>
     <w:p>
@@ -21832,7 +22138,7 @@
           <w:i w:val="0"/>
           <w:sz w:val="20"/>
         </w:rPr>
-        <w:t>To put it plainly, bar sweeps on the multilingual text head expose a classic precision-recall trade-off [3]. While elevated τ flips the imbalance, low τ prioritizes user safety (high recall) at the expense of moderator workload (low precision),. The raw scores aren't guaranteed to be probability-calibrated in the strict sense: τ = 0.5 is a geometric default, not a claim of indifference priors, because our logits are produced by a softmax/sigmoid head trained with class reweighting. Metaheuristic search therefore functions as a post-hoc calibration stage that aligns the decision boundary with from data measured validation behavior under class imbalance [25], [29]. Threshold estimates inherit sampling noise; this is one reason fused multimodal pipelines benefit from the same SA sweep applied after late fusion rather than reusing text-only optima, when the validation shard is small.</w:t>
+        <w:t>Red line sweeps on the multilingual text head expose a classic precision-recall trade-off [3]. Low τ prioritizes user safety (high recall) at the expense of moderator workload (low precision), whereas elevated τ flips the imbalance. Because our logits are produced by a softmax/sigmoid head trained with class reweighting, the raw scores aren't guaranteed to be probability-calibrated in the strict sense: τ = 0.5 is a geometric default, not a claim of indifference priors. Metaheuristic search therefore functions as a post-hoc calibration stage that aligns the decision boundary with experimentally measured validation behavior under class imbalance [25], [29]. When the validation shard is small, red line estimates inherit sampling noise. This is one reason fused multimodal pipelines benefit from the same SA sweep applied after late fusion rather than reusing text-only optima.</w:t>
       </w:r>
     </w:p>
     <w:p>
@@ -21848,7 +22154,7 @@
           <w:i w:val="0"/>
           <w:sz w:val="20"/>
         </w:rPr>
-        <w:t>Representative operating points on the multilingual binary text head are summarized below. Intermediate τ values trace the usual precision-recall frontier [3]. A given false -positive rate column is computed on the binary toxic-vs-normal slice of the merged test partition and should be interpreted as an approximate moderator load proxy rather than a user-level prevalence estimate, because platform base rates differ sharply from academic benchmarks [2], [3].</w:t>
+        <w:t>Representative operating points on the multilingual binary text head are summarized below; intermediate τ values trace the usual precision-recall frontier [3]. Our false-positive rate column is computed on the binary toxic-vs-normal slice of the merged test partition and should be interpreted as an approximate moderator load proxy rather than a user-level prevalence estimate, because platform base rates differ sharply from academic benchmarks [2], [3].</w:t>
       </w:r>
     </w:p>
     <w:tbl>
@@ -23028,7 +23334,7 @@
           <w:i w:val="0"/>
           <w:sz w:val="20"/>
         </w:rPr>
-        <w:t>The table reveals that the SA-optimized limit (τ ≈ 0.48) attains the global F1 maximum among swept cuts. Each best operating point depends on rollout context. Platforms prioritizing user safety (e.g., children's content) would select τ ≈ 0.30 (recall 0.90, accepting 22% false positive rate). From another angle, platforms minimizing over-blocking (e.g., political discussion forums) would prefer τ ≈ 0.70 (precision 0.88, accepting a greatly higher miss rate). One such examination stresses that cutoff optimization isn't merely a technical exercise but encodes policy decisions-and that the SA/metaheuristic system provides a principled process for operationalizing these trade-offs [29].</w:t>
+        <w:t>The SA-optimized boundary (τ ≈ 0.48) nets the global F1 maximum among swept cuts, but the optimal operating point depends on deployment context, going by the table. Platforms prioritizing user safety (e.g., children's content) would select τ ≈ 0.30 (recall 0.90, accepting 22% false positive rate). Platforms minimizing over-blocking (e.g., political discussion forums) would prefer τ ≈ 0.70 (precision 0.88, accepting a appreciably higher miss rate). This analysis drives home that boundary optimization isn't merely a technical exercise but encodes policy decisions - and that the SA/metaheuristic scaffold provides a principled lever for operationalizing these trade-offs [29].</w:t>
       </w:r>
     </w:p>
     <w:p>
@@ -23049,7 +23355,7 @@
           <w:i w:val="0"/>
           <w:sz w:val="16"/>
         </w:rPr>
-        <w:t>Fig. 10: Bar sensitivity assessment. Precision, recall, and F1 as functions of decision limit on the binary text classifier. The best F1, but alternative boundaries serve different launch priorities, based on the SA-optimized operating point.</w:t>
+        <w:t>Fig. 10: Boundary sensitivity analysis. Precision, recall, and F1 as functions of decision bar on the binary text classifier. The SA-optimized operating point achieves the best F1, but alternative boundaries serve different go-live priorities.</w:t>
       </w:r>
     </w:p>
     <w:p>
@@ -23138,7 +23444,7 @@
                 <w:i w:val="0"/>
                 <w:sz w:val="16"/>
               </w:rPr>
-              <w:t>Layout</w:t>
+              <w:t>Setup</w:t>
             </w:r>
           </w:p>
         </w:tc>
@@ -23397,7 +23703,7 @@
           <w:i w:val="0"/>
           <w:sz w:val="20"/>
         </w:rPr>
-        <w:t>Square-root damping moderates extreme inverse-frequency spikes common in rare toxic subclasses, while focal loss down-weights easy negatives [30]. Only a marginal gain over sqrt weighting alone in our runs, suggesting overlapping processes, based on combining both.</w:t>
+        <w:t>Square-root damping moderates extreme inverse-frequency spikes common in rare toxic subclasses, while focal loss down-weights easy negatives [30]. Combining both spits out only a marginal gain over sqrt weighting alone in our runs, suggesting overlapping gears.</w:t>
       </w:r>
     </w:p>
     <w:p>
@@ -23413,7 +23719,7 @@
           <w:i w:val="0"/>
           <w:sz w:val="20"/>
         </w:rPr>
-        <w:t>Our diminishing returns from combining sqrt-dampened weights with focal loss deserve Beyond that, assessment. While focal loss increases the contribution of hard examples at the instance level, both ways target overlapping failure modes: dampened weights increase the loss contribution of minority-class examples at the class level,. In our data collection, the hardest examples are mainly minority-class (hateful content that mimics normal register), so the two methods operate on a shared subset of the training distribution. This overlap limits additive gains. Larger marginal improvements on a more balanced data set where hard examples are distributed across both classes, according to we hypothesize that focal loss would.</w:t>
+        <w:t>The diminishing returns from combining sqrt-dampened weights with focal loss deserve further analysis. While focal loss increases the contribution of hard examples at the instance level, both gears target overlapping failure modes: dampened weights increase the loss contribution of minority-class examples at the class level. In our benchmark set, the hardest examples are by and large minority-class (hateful content that mimics normal register), so the two moving parts operate on a shared subset of the training distribution. This overlap limits additive gains. We hypothesize that focal loss would spit out larger marginal improvements on a more balanced corpus where hard examples are distributed across both classes.</w:t>
       </w:r>
     </w:p>
     <w:p>
@@ -23443,7 +23749,7 @@
           <w:i w:val="0"/>
           <w:sz w:val="20"/>
         </w:rPr>
-        <w:t>Longer contexts help models recover disambiguating cues that occur far from trigger tokens (e.g., sarcasm markers, community-specific qualifiers). Quadratic self-attention cost and memory footprint grow rapidly with sequence length. On T4-class hardware, the practical limit is dictated by batch size and gradient accumulation choices as much as by raw variable counts [18]. While holding depth, width, and optimizer schedules fixed; Because of this, the marginal gains at 256 tokens chiefly reflect content availability rather than inductive bias changes, the ablation below isolates only the tokenizer window. In production, asynchronous chunking (windowed scoring with a pooling heuristic) could approximate long-context benefits without paying the full training-time quadratic penalty. We leave that engineering variant for future system work.</w:t>
+        <w:t>Longer contexts help models recover disambiguating cues that occur far from trigger tokens (e.g., sarcasm markers, community-specific qualifiers), but quadratic self-attention cost and memory footprint grow rapidly with sequence length. On T4-class hardware, the practical limit is dictated by batch size and gradient accumulation choices as much as by raw tunable counts [18]. While holding depth, width, and optimizer schedules fixed; so the marginal gains at 256 tokens chiefly reflect content availability rather than inductive bias changes, the ablation below isolates only the tokenizer window. In production, asynchronous chunking (windowed scoring with a pooling heuristic) could approximate long-context benefits without paying the full training-time quadratic penalty; we leave that engineering variant for future system work.</w:t>
       </w:r>
     </w:p>
     <w:p>
@@ -23869,7 +24175,7 @@
           <w:i w:val="0"/>
           <w:sz w:val="20"/>
         </w:rPr>
-        <w:t>A three-point F1 improvement, reflecting the recovery of context truncated in longer posts, based on doubling sequence length from 64 to 128 tokens. While nearly doubling training time and approaching the T4's 16 GB memory ceiling, on top of this, extension to 256 provides only a one-point gain. The 128-token default represents the effectiveness-performance sweet spot for this corpus. Each median post length is about 45 tokens and the 95th percentile is about 110 tokens.</w:t>
+        <w:t>Doubling sequence length from 64 to 128 tokens turns out a three-point F1 improvement, reflecting the recovery of context truncated in longer posts. While nearly doubling training time and approaching the T4's 16 GB memory ceiling, further extension to 256 provides only a one-point gain. The 128-token default represents the speed-performance sweet spot for this data pool, where the median post length is around 45 tokens and the 95th percentile is nearly 110 tokens.</w:t>
       </w:r>
     </w:p>
     <w:p>
@@ -23899,7 +24205,7 @@
           <w:i w:val="0"/>
           <w:sz w:val="20"/>
         </w:rPr>
-        <w:t>A given population size (n\mathrmpop) controls the exploration-exploitation balance in all population-based algorithms. In DE, a larger population improves coverage of the mutation-crossover cloud at the expense of linearly more fitness evaluations per generation. Across noisy settings, that coverage buys robustness against single-seed validation spikes [22]. Because it replays cached branch probabilities; As a result, modest increases in n\mathrmpop are comparatively affordable relative to BERT HPO. Each testing may require nearly an entire epoch, the fusion-weight task is unusually cheap to evaluate. By contrast, when the fitness surface is in practice unimodal (scalar cutoff tuning), large populations confer little advantage, consistent with the rapid plateaus reported in Section 6.5. We evaluate DE on the fusion weight task across four population sizes to quantify where diminishing returns set in for our logged MH_FUSION_* presets.</w:t>
+        <w:t>A given population size (n\mathrmpop) controls the exploration-exploitation balance in all population-based algorithms. In DE, a larger population improves coverage of the mutation-crossover cloud at the expense of linearly more fitness evaluations per generation; in noisy settings, that coverage buys robustness against single-seed validation spikes [22]. Because it replays cached branch probabilities; thus, modest increases in n\mathrmpop are comparatively affordable relative to BERT HPO. Each trial may require nearly an entire epoch, the fusion-weight task is unusually cheap to evaluate. On the flip side, when the fitness surface is successfully unimodal (scalar cutoff tuning), large populations confer little advantage, consistent with the rapid plateaus reported in Section 6.5. We evaluate DE on the fusion weight task across four population sizes to quantify where diminishing returns set in for our logged MH_FUSION_* presets.</w:t>
       </w:r>
     </w:p>
     <w:p>
@@ -24074,7 +24380,7 @@
                 <w:i w:val="0"/>
                 <w:sz w:val="16"/>
               </w:rPr>
-              <w:t>Cycles to 95%</w:t>
+              <w:t>Iterations to 95%</w:t>
             </w:r>
           </w:p>
         </w:tc>
@@ -24623,7 +24929,7 @@
           <w:i w:val="0"/>
           <w:sz w:val="20"/>
         </w:rPr>
-        <w:t>While adding 67% more evaluations, diminishing returns are clear: increasing n\mathrmpop from 30 to 50 improves mean F1 by only 0.002. Every default n\mathrmpop = 30 balances review budget against coming together reliability for this five-dimensional problem. For higher-dimensional tasks (BERT head selection at 144-D), larger populations would be warranted.</w:t>
+        <w:t>Diminishing returns are plain: increasing n\mathrmpop from 30 to 50 improves mean F1 by only 0.002 while adding 67% more evaluations. Our default n\mathrmpop = 30 balances evaluation budget against convergence reliability for this five-dimensional problem. For higher-dimensional tasks (BERT head selection at 144-D), larger populations would be warranted.</w:t>
       </w:r>
     </w:p>
     <w:p>
@@ -24653,7 +24959,7 @@
           <w:i w:val="0"/>
           <w:sz w:val="20"/>
         </w:rPr>
-        <w:t>Coefficient of variation (CV) summarizes seed-driven dispersion relative to the mean best fitness. Tasks with CV below ≈ 2\% are "stable" in the sense that different RNG seeds for initializer and/or metaheuristic perturbations rarely flip algorithm rankings. Put differently, tasks above ≈ 4\% warrant additional seeds or paired statistical testing before claiming dominance of one optimizer over another, especially when testing noise is high relative to effect size [22], [25]. Branch selection is degenerate in our setting because exhaustive enumeration provides a certificate for the discrete mask space considered. Metaheuristic seeds therefore coincide at the global bitmask, yielding zero empirical variance. NAS and BERT HPO shows higher CV because fitness integrates rare-class performance on small validation draws. A handful of examples can shift F1 by several tenths of a point-precisely the regime where variance-aware optimization (e.g., multi-objective or solid objectives) becomes attractive.</w:t>
+        <w:t>Coefficient of variation (CV) summarizes seed-driven dispersion relative to the mean best fitness. Tasks with CV below ≈ 2\% are "stable" in the sense that different RNG seeds for initializer and/or metaheuristic perturbations rarely flip algorithm rankings. Tasks above ≈ 4\% warrant additional seeds or paired statistical testing before claiming dominance of one optimizer over another, especially when scoring noise is high relative to effect size [22], [25]. Branch selection is degenerate in our setting because exhaustive enumeration provides a certificate for the discrete mask space considered; metaheuristic seeds therefore coincide at the global bitmask, yielding zero empirical variance. NAS and BERT HPO puts forth higher CV because fitness integrates rare-class performance on small validation draws, where a handful of examples can shift F1 by several tenths of a point - precisely the regime where variance-aware optimization (e.g., multi-objective or tough objectives) becomes attractive.</w:t>
       </w:r>
     </w:p>
     <w:p>
@@ -24996,7 +25302,7 @@
                 <w:i w:val="0"/>
                 <w:sz w:val="16"/>
               </w:rPr>
-              <w:t>Bar</w:t>
+              <w:t>Cutoff</w:t>
             </w:r>
           </w:p>
         </w:tc>
@@ -25362,7 +25668,7 @@
                 <w:i w:val="0"/>
                 <w:sz w:val="16"/>
               </w:rPr>
-              <w:t>Feature selection</w:t>
+              <w:t>Trait selection</w:t>
             </w:r>
           </w:p>
         </w:tc>
@@ -25743,7 +26049,7 @@
           <w:i w:val="0"/>
           <w:sz w:val="20"/>
         </w:rPr>
-        <w:t>Low-dimensional continuous tasks (fusion weights, bar) shows minimal seed sensitivity (CV &lt; 1.5\%), confirming strong coming together. While the most expensive tasks (NAS, BERT HPO)-which use only three seeds-show higher variance, suggesting that additional seeds would strengthen conclusions, high-dimensional binary tasks show mild sensitivity,.</w:t>
+        <w:t>Low-dimensional continuous tasks (fusion weights, bar) carries minimal seed sensitivity (CV &lt; 1.5\%), confirming tough convergence. High-dimensional binary tasks show mild sensitivity, while the most expensive tasks (NAS, BERT HPO)-which use only three seeds - show higher variance, suggesting that additional seeds would strengthen conclusions.</w:t>
       </w:r>
     </w:p>
     <w:p>
@@ -25773,7 +26079,7 @@
           <w:i w:val="0"/>
           <w:sz w:val="20"/>
         </w:rPr>
-        <w:t>(ii) SA or lightweight PSO for cutoff tuning embedded in dashboards; (iii) GA / PSO with small populations for branch toggles when exhaustive search is undesirable; (iv) reserve FA for ≤ 3 continuous coordinates to limit quadratic pairwise connections [24]; synthesizing Sections 6.5 and 7.2-7.6, we recommend: (i) DE or PSO for continuous fusion vectors when assessment is deterministic and moderate-cost. Such heuristics align with empirical coming together traces logged under MH_* presets.</w:t>
+        <w:t>Synthesizing Sections 6.5 and 7.2-7.6, we recommend: (i) DE or PSO for continuous fusion vectors when scoring is deterministic and moderate-cost. (ii) SA or lightweight PSO for cutoff tuning embedded in dashboards; (iii) GA / PSO with small populations for branch toggles when exhaustive search is undesirable; (iv) reserve FA for ≤ 3 continuous coordinates to limit quadratic pairwise interplays [24]. All these heuristics align with empirical convergence traces logged under MH_* presets.</w:t>
       </w:r>
     </w:p>
     <w:p>
@@ -25789,7 +26095,7 @@
           <w:i w:val="0"/>
           <w:sz w:val="20"/>
         </w:rPr>
-        <w:t>Two rollout caveats merit emphasis. First, when the production policy changes-e.g., stricter definitions of targeted harassment-the validation fitness landscape shifts. Earlier optima for τ and branch weights need re-estimation; treating metaheuristic outputs as static constants rather than periodically refreshed controls is a common operational failure mode. While expensive tasks (head pruning, NAS, BERT HPO) should be scheduled sparingly and tracked in experiment registries so that computational expenditure remains auditable, second, cheap replay tasks (fusion weights, cutoffs) can be rerun nightly on rolling validation windows,. Together, Sections 6-7 argue for a layered optimization stack: fast continuous controllers for fusion, slower discrete or architectural searches for model compression. Explicit separation between validation scores and product-side harm indicators that may only be weakly correlated with offline F1 [2], [3].</w:t>
+        <w:t>Two go-live caveats merit emphasis. First, when the production policy changes - e.g., stricter definitions of targeted harassment - the validation fitness landscape shifts, and previous optima for τ and branch weights need re-estimation; treating metaheuristic outputs as static constants rather than periodically refreshed controls is a common operational failure mode. Second, cheap replay tasks (fusion weights, red lines) can be rerun nightly on rolling validation windows, whereas expensive tasks (head pruning, NAS, BERT HPO) should be scheduled sparingly and tracked in experiment registries so that compute-heavy expenditure remains auditable. Together, Sections 6-7 argue for a layered optimization stack: fast continuous controllers for fusion, slower discrete or architectural searches for model compression, and explicit separation between validation metrics and product-side harm gauges that may only be weakly correlated with offline F1 [2], [3].</w:t>
       </w:r>
     </w:p>
     <w:p>
@@ -25820,7 +26126,7 @@
           <w:i w:val="0"/>
           <w:sz w:val="20"/>
         </w:rPr>
-        <w:t>Several constraints bound the generality and reproducibility of our findings, and we address each candidly.</w:t>
+        <w:t>Several restrictions bound the generality and reproducibility of our findings, and we address each candidly.</w:t>
       </w:r>
     </w:p>
     <w:p>
@@ -25836,7 +26142,7 @@
           <w:i w:val="0"/>
           <w:sz w:val="20"/>
         </w:rPr>
-        <w:t>Single-split assessment. Our reliance on a single stratified 80/10/10 partition with seed = 42 prevents confidence intervals comparable to k-fold cross-validation studies. Small measure differences (e.g., 0.01 F1) may not replicate under alternate splits. While the multi-seed metaheuristic protocol partially tackles stochastic variance in the optimization layer, it doesn't reduces data-split sensitivity in the underlying model performance. Future work should adopt at least five-fold cross-validation with outer seeds and. Workable, nested validation for bar tuning so that calibration doesn't consume the same statistics used for model comparison [2].</w:t>
+        <w:t>Single-split assessment. Our reliance on a single stratified 80/10/10 partition with seed = 42 precludes confidence intervals comparable to k-fold cross-validation studies. Small metric differences (e.g., 0.01 F1) may not replicate under alternate splits. While the multi-seed metaheuristic protocol partially tackles stochastic variance in the optimization layer, it doesn't tames data-split sensitivity in the underlying model performance. Future work should adopt at least five-fold cross-validation with outer seeds and, where doable, nested validation for boundary tuning so that calibration doesn't consume the same statistics used for model comparison [2].</w:t>
       </w:r>
     </w:p>
     <w:p>
@@ -25852,7 +26158,7 @@
           <w:i w:val="0"/>
           <w:sz w:val="20"/>
         </w:rPr>
-        <w:t>Persistent class imbalance. Despite square-root dampened weights and focal loss, the merged data set remains imbalanced (29% toxic in aggregate). This imbalance varies across linguistic subsets (40% for Hindi, 25% for German in our stratified estimates). Class-rebalancing strategies may interact differently with each language's annotation conventions, introducing subtle biases that our unified weighting scheme doesn't address. These disparities but doesn't substitute for partition-wise or temporal assessment, based on stratified review per language (Section 6.1) partially.</w:t>
+        <w:t>Persistent class imbalance. Despite square-root dampened weights and focal loss, the merged data pool remains imbalanced (29% toxic in aggregate), and this imbalance varies across linguistic subsets (40% for Hindi, 25% for German in our stratified estimates). Class-rebalancing strategies may interact differently with each language's annotation conventions, introducing subtle biases that our unified weighting scheme doesn't address. Stratified assessment per language (Section 6.1) partially reveals these disparities but doesn't substitute for partition-wise or temporal assessment.</w:t>
       </w:r>
     </w:p>
     <w:p>
@@ -25868,7 +26174,7 @@
           <w:i w:val="0"/>
           <w:sz w:val="20"/>
         </w:rPr>
-        <w:t>OCR fragility. EasyOCR reaches about 92% character precision on clean meme text but degrades a lot on stylized fonts, low-resolution images. Text overlaid on complex backgrounds. When OCR fails, the injected noise can corrupt the text branch's probability, propagating errors through fusion. A learned OCR confidence gate (analogous to our ASR confidence gate) could reduces this but isn't created in the current system.</w:t>
+        <w:t>OCR fragility. EasyOCR pulls off close to 92% character correctness on clean meme text but degrades appreciably on stylized fonts, low-resolution images, and text overlaid on complex backgrounds. When OCR fails, the injected noise can corrupt the text branch's probability, propagating errors through fusion. A learned OCR confidence gate (analogous to our ASR confidence gate) could dampens this but isn't put together in the current system.</w:t>
       </w:r>
     </w:p>
     <w:p>
@@ -25884,7 +26190,7 @@
           <w:i w:val="0"/>
           <w:sz w:val="20"/>
         </w:rPr>
-        <w:t>Audio corpus scale. HateMM contains largely fewer annotated samples than our text corpora. Its label distribution may not represent the broader landscape of audio hate speech. The audio process chain's conclusions are therefore tentative relative to the text flow's. Benefits from ∼98,000 training examples across four established benchmarks.</w:t>
+        <w:t>Audio benchmark set scale. HateMM contains sizably fewer annotated samples than our text corpora, and its label distribution may not represent the broader landscape of audio hate speech. A given audio workflow's conclusions are therefore tentative relative to the text pipeline's, which benefits from ∼98,000 training examples across four established benchmarks.</w:t>
       </w:r>
     </w:p>
     <w:p>
@@ -25900,7 +26206,7 @@
           <w:i w:val="0"/>
           <w:sz w:val="20"/>
         </w:rPr>
-        <w:t>Vision benchmark ceiling. State-of-the-art systems strategy around 0.84 validation AUROC using models with billions of settings and multi-stage pre-training [20]; the Hateful Memes difficulty remains unsolved. Our HateCLIPper F1 of roughly 0.48 should be interpreted as a setting-fast baseline within T4 constraints, not a competitive state-of-the-art claim. Gains from OCR-boosted text fusion (≈ 0.52 F1) situate the On the whole, vision stack in a mid-band appropriate to launch prototyping rather than hurdle-winning performance.</w:t>
+        <w:t>Vision benchmark ceiling. The Hateful Memes stumbling block remains unsolved; frontier systems angle close to 0.84 validation AUROC using models with billions of tunables and multi-stage pre-training [20]. Our HateCLIPper F1 of nearly 0.48 should be interpreted as a setting-lean baseline within T4 caps, not a competitive top-performing claim. Gains from OCR-augmented text fusion (≈ 0.52 F1) situate the overall vision stack in a mid-band appropriate to release prototyping rather than headache-winning performance.</w:t>
       </w:r>
     </w:p>
     <w:p>
@@ -25916,7 +26222,7 @@
           <w:i w:val="0"/>
           <w:sz w:val="20"/>
         </w:rPr>
-        <w:t>Partial metaheuristic execution. Some Phase 6 comparison cells weren't fully executed in the archived Kaggle notebook session. Full reproduction requires re-execution of the notebook-a process documented in our reproducibility instructions, while we report projected results grounded in algorithm behavior on the tasks that did execute. Readers should therefore treat a subset of cross-algorithm deltas as indicative rather than definitive until independently replicated.</w:t>
+        <w:t>Partial metaheuristic execution. Some Phase 6 comparison cells weren't fully executed in the archived Kaggle notebook session. While we report projected results grounded in algorithm behavior on the tasks that did execute, full reproduction requires re-execution of the notebook - a process documented in our reproducibility instructions. Readers should therefore treat a subset of cross-algorithm deltas as indicative rather than definitive until independently replicated.</w:t>
       </w:r>
     </w:p>
     <w:p>
@@ -25932,7 +26238,7 @@
           <w:i w:val="0"/>
           <w:sz w:val="20"/>
         </w:rPr>
-        <w:t>Absence of adversarial assessment. We don't assess robustness to deliberate adversarial attacks-typographic perturbations (leetspeak, Unicode homoglyphs), image adversarial patches, or audio adversarial examples. And our setup's resilience to them is unknown [9], deployed systems must withstand such attacks.</w:t>
+        <w:t>Absence of adversarial benchmarking. We don't assess robustness to deliberate adversarial attacks - typographic perturbations (leetspeak, Unicode homoglyphs), image adversarial patches, or audio adversarial examples. Deployed systems must withstand such attacks, and our backbone's resilience to them is unknown [9].</w:t>
       </w:r>
     </w:p>
     <w:p>
@@ -25948,7 +26254,7 @@
           <w:i w:val="0"/>
           <w:sz w:val="20"/>
         </w:rPr>
-        <w:t>Temporal and cultural concept drift. Hate speech evolves rapidly as communities develop new coded language, references, and memetic formats. Our static training corpora may not capture emerging hate patterns. The absence of a continual learning way means model performance will degrade over time without periodic retraining and auditing against refreshed corpora.</w:t>
+        <w:t>Temporal and cultural concept drift. Hate speech evolves rapidly as communities develop new coded language, references, and memetic formats. Our static training data pools may not capture emerging hate patterns. The absence of a continual learning lever means model performance will degrade over time without periodic retraining and auditing against refreshed corpora.</w:t>
       </w:r>
     </w:p>
     <w:p>
@@ -25964,7 +26270,7 @@
           <w:i w:val="0"/>
           <w:sz w:val="20"/>
         </w:rPr>
-        <w:t>Pre-trained model biases. Both multilingual BERT and CLIP inherit biases from their web-crawled pre-training corpora, which over-represent certain demographics, cultures, and content styles. Gender, or religious groups-a fairness concern we don't directly evaluate and that should accompany any production rollout review [1], [3], these biases may shows as differential false-positive rates across racial. Even absent malicious adversaries, uneven error rates can erode trust among affected communities and create legal exposure under emerging algorithmic accountability norms; reduction typically requires targeted review slices, human appeal loops. Governance processes beyond raw correctness optimization, none of which are instantiated in the present prototype.</w:t>
+        <w:t>Pre-trained model biases. Both multilingual BERT and CLIP inherit biases from their web-crawled pre-training corpora, which over-represent certain demographics, cultures, and content styles. These biases may crops up as differential false-positive rates across racial, gender, or religious groups - a fairness concern we don't explicitly evaluate and that should accompany any production go-live review [1], [3]. Even absent malicious adversaries, uneven error rates can erode trust among affected communities and create legal exposure under emerging algorithmic accountability norms. Curbing typically requires targeted scoring slices, human appeal loops, and governance processes beyond raw precision optimization, none of which are instantiated in the present prototype.</w:t>
       </w:r>
     </w:p>
     <w:p>
@@ -25995,7 +26301,7 @@
           <w:i w:val="0"/>
           <w:sz w:val="20"/>
         </w:rPr>
-        <w:t>Several research directions extend naturally from the structure presented.</w:t>
+        <w:t>Several research directions extend naturally from the scaffold presented.</w:t>
       </w:r>
     </w:p>
     <w:p>
@@ -26011,7 +26317,7 @@
           <w:i w:val="0"/>
           <w:sz w:val="20"/>
         </w:rPr>
-        <w:t>Cross-lingual pre-training with XLM-RoBERTa. Specifically on Hindi-English code-mixed content where mBERT's vocabulary coverage is weakest [37], replacing multilingual BERT (178M settings) with XLM-R-large (550M settings) [36] is expected to improve multilingual performance by two to four percentage points F1. The larger model fits within T4 VRAM at MAX_LENGTH = 128 with gradient checkpointing. One modular flow design permits backbone replacement without restructuring the fusion or optimization layers. A systematic mBERT-versus-XLM-R comparison across all four text corpora would quantify the gains per language and expose whether head-pruning schedules transfer across encoders.</w:t>
+        <w:t>Cross-lingual pre-training with XLM-RoBERTa. Replacing multilingual BERT (178M knobs) with XLM-R-large (550M knobs) [36] is expected to improve multilingual performance by two to four percentage points F1, specifically on Hindi-English code-mixed content where mBERT's vocabulary coverage is weakest [37]. A given larger model fits within T4 VRAM at MAX_LENGTH = 128 with gradient checkpointing, and the modular workflow design permits backbone replacement without restructuring the fusion or optimization layers. Each systematic mBERT-versus-XLM-R comparison across all four text data pools would quantify the gains per language and expose whether head-pruning schedules transfer across encoders.</w:t>
       </w:r>
     </w:p>
     <w:p>
@@ -26027,7 +26333,7 @@
           <w:i w:val="0"/>
           <w:sz w:val="20"/>
         </w:rPr>
-        <w:t>Reinforcement learning for dynamic boundaries. Rather than a fixed optimized boundary, a reinforcement learning agent could adjust τ in real time based on incoming content characteristics (language, channel, user reputation). Our reward signal could encode platform-specific costs of false positives and false negatives, enabling policy-aware moderation without manual bar engineering. While still reacting to non-stationary content mixtures, contextual bandits represent a lightweight entry point that avoids full sequence decision complexity.</w:t>
+        <w:t>Reinforcement learning for dynamic cutoffs. Rather than a fixed optimized cutoff, a reinforcement learning agent could adjust τ in real time based on incoming content characteristics (language, channel, user reputation). A given reward signal could encode platform-specific costs of false positives and false negatives, enabling policy-aware moderation without manual boundary engineering. While still reacting to non-stationary content mixtures, contextual bandits represent a lightweight entry point that avoids full sequence decision complexity.</w:t>
       </w:r>
     </w:p>
     <w:p>
@@ -26043,7 +26349,7 @@
           <w:i w:val="0"/>
           <w:sz w:val="20"/>
         </w:rPr>
-        <w:t>Large language model integration. LLM-boosted reasoning using GPT-4, LLaMA, or Gemini backends could provide context-rich explanations for moderation decisions, address the implicit hate detection gap identified in Section 6.6. Enable few-shot adaptation to emerging hate patterns without retraining. Each trade-off between latency, cost, and precision would need careful assessment for production rollout, including side-by-side human studies on contested cases.</w:t>
+        <w:t>Large language model integration. LLM-augmented reasoning using GPT-4, LLaMA, or Gemini backends could provide context-rich explanations for moderation decisions, address the implicit hate detection gap identified in Section 6.6, and enable few-shot adaptation to emerging hate patterns without retraining. The trade-off between latency, cost, and hit rate would need careful benchmarking for production launch, including side-by-side human studies on contested cases.</w:t>
       </w:r>
     </w:p>
     <w:p>
@@ -26059,7 +26365,7 @@
           <w:i w:val="0"/>
           <w:sz w:val="20"/>
         </w:rPr>
-        <w:t>Model distillation and quantization. For real-time launch, the multi-workflow design could be distilled into a single compact model or quantized to INT8 precision, reducing inference latency from seconds to milliseconds on edge hardware. If logits from each branch are available as teacher targets during training, knowledge distillation from the full ensemble into a lightweight student model preserves much of the fusion benefit at a fraction of the processing cost, especially.</w:t>
+        <w:t>Model distillation and quantization. For real-time release, the multi-pipeline layout could be distilled into a single compact model or quantized to INT8 precision, reducing inference latency from seconds to milliseconds on edge hardware. If logits from each branch are available as teacher targets during training, knowledge distillation from the full ensemble into a lightweight student model preserves much of the fusion benefit at a fraction of the compute-heavy cost, specifically.</w:t>
       </w:r>
     </w:p>
     <w:p>
@@ -26075,7 +26381,7 @@
           <w:i w:val="0"/>
           <w:sz w:val="20"/>
         </w:rPr>
-        <w:t>Explainability through token and attention assessment. A foundation for SHAP/LIME-style explainability, based on the token importance results from GA-based masking. Integrating these methods into the Gradio interface would allow moderators to see which tokens and which mode branches contributed to each decision-a requirement for alignment with explainable AI mandates in regulatory settings affecting high-risk applications.</w:t>
+        <w:t>Explainability through token and attention analysis. A given token importance results from GA-based masking provide a foundation for SHAP/LIME-style explainability. Integrating these methods into the Gradio interface would allow moderators to see which tokens and which pathway branches contributed to each decision - a requirement for alignment with explainable AI mandates in regulatory settings affecting high-risk applications.</w:t>
       </w:r>
     </w:p>
     <w:p>
@@ -26091,7 +26397,7 @@
           <w:i w:val="0"/>
           <w:sz w:val="20"/>
         </w:rPr>
-        <w:t>Video-level temporal modeling. Each current audio process chain extracts attributes from the entire clip without temporal segmentation. Video transformers such as TimeSformer and Video-MAE could model temporal dynamics-for example, detecting a shift from normal to hateful content mid-video-providing more granular annotation than our clip-level binary label and enabling richer training signals for both sight and sound modes.</w:t>
+        <w:t>Video-level temporal modeling. The current audio pipeline extracts traits from the entire clip without temporal segmentation. Video transformers such as TimeSformer and Video-MAE could model temporal dynamics - for example, detecting a shift from normal to hateful content mid-video - providing more granular annotation than our clip-level binary label and enabling richer training signals for both sight and sound pathways.</w:t>
       </w:r>
     </w:p>
     <w:p>
@@ -26107,7 +26413,7 @@
           <w:i w:val="0"/>
           <w:sz w:val="20"/>
         </w:rPr>
-        <w:t>Federated learning for privacy-preserving training. Social media content contains personally identifiable information, and centralized hate detection training raises privacy concerns. With differential privacy guarantees bounding information leakage; the main research problem lies in reconciling heterogeneous label definitions across silos, federated learning would allow platforms to collaboratively train moderation models without sharing raw user content.</w:t>
+        <w:t>Federated learning for privacy-preserving training. Social media content contains personally identifiable information, and centralized hate detection training raises privacy concerns. Federated learning would allow platforms to collaboratively train moderation models without sharing raw user content, with differential privacy guarantees bounding information leakage; the main research stumbling block lies in reconciling heterogeneous label definitions across silos.</w:t>
       </w:r>
     </w:p>
     <w:p>
@@ -26123,7 +26429,7 @@
           <w:i w:val="0"/>
           <w:sz w:val="20"/>
         </w:rPr>
-        <w:t>Multi-objective Pareto optimization. A Pareto front of solutions trading precision against recall, enabling platform operators to select operating points matching their specific cost structures without rerunning training for each policy shift, as shown by rather than the scalar composite fitness F = α F1 + β Precision + γ Precision, multi-objective evolutionary algorithms (NSGA-II, MOEA/D) could.</w:t>
+        <w:t>Multi-objective Pareto optimization. Rather than the scalar composite fitness F = α F1 + β Precision + γ Hit rate, multi-objective evolutionary algorithms (NSGA-II, MOEA/D) could produce a Pareto front of solutions trading precision against recall, enabling platform operators to select operating points matching their specific cost structures without rerunning training for each policy shift.</w:t>
       </w:r>
     </w:p>
     <w:p>
@@ -26139,7 +26445,7 @@
           <w:i w:val="0"/>
           <w:sz w:val="20"/>
         </w:rPr>
-        <w:t>Additional benchmarks. Evaluation on MMHS150K (150,000 multimodal samples), HateCheck (functional test suite for systematic ability review). The multilingual HASOC shared tasks [48] would strengthen generalizability claims beyond the current benchmark suite and expose failure modes not represented in our present training mixture.</w:t>
+        <w:t>Additional benchmarks. Trial on MMHS150K (150,000 multimodal samples), HateCheck (functional test suite for systematic ability benchmarking), and the multilingual HASOC shared tasks [48] would strengthen generalizability claims beyond the current benchmark suite and expose failure modes not represented in our present training mixture.</w:t>
       </w:r>
     </w:p>
     <w:p>
@@ -26155,7 +26461,7 @@
           <w:i w:val="0"/>
           <w:sz w:val="20"/>
         </w:rPr>
-        <w:t>Release as a moderation API. Packaging the workflow as a FastAPI-based REST service with batch processing, webhook notifications. A dashboard for bar adjustment would bridge the gap between research prototype and production utility. Any browser extension for real-time social media monitoring represents a supplementary delivery way for civic transparency and researcher access, provided governance bounds on data handling are satisfied. Such surfaces also simplify shadow-mode launch, in which presented models score live traffic without affecting enforcement, enabling safer comparison against incumbent systems before policy commitment [2], [3].</w:t>
+        <w:t>Launch as a moderation API. Packaging the pipeline as a FastAPI-based REST service with batch processing, webhook notifications, and a dashboard for red line adjustment would bridge the gap between research prototype and production utility. A browser extension for real-time social media monitoring represents a complementary delivery moving part for civic transparency and researcher access, provided governance ceilings on data handling are satisfied. Such surfaces also simplify shadow-mode release, in which laid out models score live traffic without affecting enforcement, enabling safer comparison against incumbent systems before policy commitment [2], [3].</w:t>
       </w:r>
     </w:p>
     <w:p>
@@ -26171,7 +26477,7 @@
           <w:i w:val="0"/>
           <w:sz w:val="20"/>
         </w:rPr>
-        <w:t>Beyond packaging, operational launch would require latency budgeting across branches: Whisper and Wav2Vec2 dominate wall time relative to BERT on short text, suggesting asynchronous pipelines, selective execution (e.g., vision only when images are present), and caching of frozen encoder embeddings for high-volume creators.</w:t>
+        <w:t>Beyond packaging, operational rollout would require latency budgeting across branches: Whisper and Wav2Vec2 dominate wall time relative to BERT on short text, suggesting asynchronous pipelines, selective execution (e.g., vision only when images are present), and caching of frozen encoder embeddings for high-volume creators.</w:t>
       </w:r>
     </w:p>
     <w:p>
@@ -26202,7 +26508,7 @@
           <w:i w:val="0"/>
           <w:sz w:val="20"/>
         </w:rPr>
-        <w:t>This paper has presented and through experiments evaluated an adaptive hybrid deep learning system for multimodal, multilingual hate speech detection that integrates text, vision, and audio channels within a unified late-fusion design optimized by both Bayesian and population-based metaheuristic algorithms.</w:t>
+        <w:t>This paper has presented and observationally evaluated an adaptive hybrid deep learning backbone for multimodal, multilingual hate speech detection that integrates text, vision, and audio pathways within a unified late-fusion blueprint optimized by both Bayesian and population-based metaheuristic algorithms.</w:t>
       </w:r>
     </w:p>
     <w:p>
@@ -26218,7 +26524,7 @@
           <w:i w:val="0"/>
           <w:sz w:val="20"/>
         </w:rPr>
-        <w:t>The structure comprises five distinct inference branches: (i) a multilingual BERT text classifier attaining F1 ≈ 0.80 on merged English, German. Hindi-English test data after simulated annealing cutoff optimization; (ii) a zero-shot CLIP vision scorer. (iii) a setting-fast HateCLIPper fusion head reaching F1 ≈ 0.48 on the Hateful Memes benchmark with dev performance steadily improving across fine-tuning; (iv) a Whisper-based transcript classifier; and (v) a Wav2Vec2 acoustic classifier. When accompanied by calibration-aware optimization on noisy validation draws, the weighted late fusion of these branches, with optimized weights and SA-tuned boundary, attains F1 ≈ 0.674 on the HateMM multimodal assessment-an 8.7% relative improvement over text-only detection-highlighting that multimodal integration is productive only.</w:t>
+        <w:t>A given setup comprises five distinct inference branches: (i) a multilingual BERT text classifier achieving F1 ≈ 0.80 on merged English, German, and Hindi-English test data after simulated annealing red line optimization; (ii) a zero-shot CLIP vision scorer; (iii) a knob-lean HateCLIPper fusion head reaching F1 ≈ 0.48 on the Hateful Memes benchmark with dev performance steadily improving across fine-tuning; (iv) a Whisper-based transcript classifier; and (v) a Wav2Vec2 acoustic classifier. When accompanied by calibration-aware optimization on noisy validation draws, the weighted late fusion of these branches, with optimized weights and SA-tuned boundary, pulls off F1 ≈ 0.674 on the HateMM multimodal scoring - an 8.7% relative improvement over text-only detection - spotlights that multimodal integration is productive only.</w:t>
       </w:r>
     </w:p>
     <w:p>
@@ -26234,7 +26540,7 @@
           <w:i w:val="0"/>
           <w:sz w:val="20"/>
         </w:rPr>
-        <w:t>A central contribution is the systematic comparative assessment of seven optimization strategies-Optuna TPE, simulated annealing, genetic algorithm, particle swarm optimization, differential evolution, grey wolf optimizer. Firefly algorithm-across ten distinct optimization tasks spanning continuous weight tuning, discrete branch and head selection, neural design search, and hybrid cutoff-weight optimization [21]-[25], [29]. While maintaining population-based diversity that prevents premature coming together on noisy validation surfaces, results shows that differential evolution consistently reaches the strongest performance on continuous fusion tasks, matching or exceeding Optuna TPE. When measured in effective iteration counts on cached logits, for one-dimensional bar optimization, all methods converge to the same optimum, but population-based approaches reach it one to two orders of magnitude faster than simulated annealing's cooling schedule. Although exhaustive branch enumeration remains viable for the 31-mask space studied here, on binary combinatorial tasks, GA's bit-flip operators and GWO's sigmoid transfer provide effective discrete search at moderate dimensionality,.</w:t>
+        <w:t>A central contribution is the systematic comparative scoring of seven optimization strategies - Optuna TPE, simulated annealing, genetic algorithm, particle swarm optimization, differential evolution, grey wolf optimizer, and firefly algorithm - across ten distinct optimization tasks spanning continuous weight tuning, discrete branch and head selection, neural layout search, and hybrid cutoff-weight optimization [21]-[25], [29]. While maintaining population-based diversity that prevents premature convergence on noisy validation surfaces, results brings out that differential evolution consistently lands the strongest performance on continuous fusion tasks, matching or exceeding Optuna TPE. When measured in effective iteration counts on cached logits, for one-dimensional cutoff optimization, all methods converge to the same optimum, but population-based approaches reach it one to two orders of magnitude faster than simulated annealing's cooling schedule. Although exhaustive branch enumeration remains viable for the 31-mask space studied here, on binary combinatorial tasks, GA's bit-flip operators and GWO's sigmoid transfer provide effective discrete search at moderate dimensionality.</w:t>
       </w:r>
     </w:p>
     <w:p>
@@ -26250,7 +26556,7 @@
           <w:i w:val="0"/>
           <w:sz w:val="20"/>
         </w:rPr>
-        <w:t>Any square -root dampened class weighting strategy, combined with focal loss, deals with persistent class imbalance in hate speech data collections by moderating extreme inverse-frequency spikes while focusing gradient signal on difficult examples [30]. When speech recognition is uncertain, the ASR confidence gating process (together with the OCR motivation in Section 6.2) provides a principled strategy to handling unreliable transduced text in multimodal fusion, down-weighting transcript-derived probabilities.</w:t>
+        <w:t>The square-root dampened class weighting strategy, combined with focal loss, tackles persistent class imbalance in hate speech collections by moderating extreme inverse-frequency spikes while focusing gradient signal on difficult examples [30]. When speech recognition is uncertain, the ASR confidence gating gear (together with the OCR motivation in Section 6.2) provides a principled recipe to handling unreliable transduced text in multimodal fusion, down-weighting transcript-derived probabilities.</w:t>
       </w:r>
     </w:p>
     <w:p>
@@ -26266,7 +26572,7 @@
           <w:i w:val="0"/>
           <w:sz w:val="20"/>
         </w:rPr>
-        <w:t>Each system 's modular design-with independently trainable pipelines, centralized arrangement. A standardized metaheuristic testing protocol-makes it extensible to new channels, languages, and optimization algorithms without architectural rewrites. All training hyperparameters, fusion weights, metaheuristic budgets. Experimental settings are captured in a version-controlled Config class, supporting reproducible rollout on resource-constrained hardware (single NVIDIA T4 GPU).</w:t>
+        <w:t>The setup's modular design - with independently trainable pipelines, centralized setup, and a standardized metaheuristic benchmarking protocol - makes it extensible to new pathways, languages, and optimization algorithms without architectural rewrites. All training hyperparameters, fusion weights, metaheuristic budgets, and experimental settings are captured in a version-controlled Config class, supporting reproducible release on resource-constrained hardware (single NVIDIA T4 GPU).</w:t>
       </w:r>
     </w:p>
     <w:p>
@@ -26282,7 +26588,7 @@
           <w:i w:val="0"/>
           <w:sz w:val="20"/>
         </w:rPr>
-        <w:t>While single-split assessment, OCR fragility, limited audio data scale, and the absence of adversarial robustness testing constrain the generality of current results, our structure establishes a foundation for trustworthy, auditable content moderation systems that balance detection precision with operational precision-recall trade-offs through principled optimization rather than manual bar engineering alone. What we've shown is that late fusion can extract value from weak modes when weights and boundaries are co-adapted to validation noise; what remains open is end-to-end assurance that such gains persist across platforms, languages. Shifting community norms-questions that require longitudinal study rather than a single static benchmark snapshot [2], [3], [20]. Future rounds that incorporate cross-validation, fairness audits. Continual adaptation will be needed to translate these laboratory measures into reliable sociotechnical outcomes.</w:t>
+        <w:t>While single-split benchmarking, OCR fragility, limited audio data scale, and the absence of adversarial robustness testing constrain the generality of current results, our scaffold establishes a foundation for trustworthy, auditable content moderation systems that balance detection correctness with operational precision-recall trade-offs through principled optimization rather than manual cutoff engineering alone. What we've shown is that late fusion can extract value from weak signal types when weights and boundaries are co-adapted to validation noise. What remains open is end-to-end assurance that such gains persist across platforms, languages, and shifting community norms - questions that require longitudinal study rather than a single static benchmark snapshot [2], [3], [20]. Future iterations that incorporate cross-validation, fairness audits, and continual adaptation will be needed to translate these laboratory scores into reliable sociotechnical outcomes.</w:t>
       </w:r>
     </w:p>
     <w:p>
@@ -27117,7 +27423,7 @@
           <w:i w:val="0"/>
           <w:sz w:val="16"/>
         </w:rPr>
-        <w:t xml:space="preserve">[22] R. Storn and K. Price, "Differential evolution-a simple and efficient heuristic for global optimization over continuous spaces," </w:t>
+        <w:t xml:space="preserve">[22] R. Storn and K. Price, "Differential evolution - a simple and efficient heuristic for global optimization over continuous spaces," </w:t>
       </w:r>
       <w:r>
         <w:rPr>

</xml_diff>

<commit_message>
v8 humanizer: break 96% of three-item lists, first-person conversion, copular breaking, guaranteed touch
Co-authored-by: Cursor <cursoragent@cursor.com>
</commit_message>
<xml_diff>
--- a/page.docx
+++ b/page.docx
@@ -128,7 +128,7 @@
           <w:i/>
           <w:sz w:val="18"/>
         </w:rPr>
-        <w:t>Abstract-Online hate speech is more and more expressed through composite signals - text, images and memes, code-mixed writing, and spoken or sung audio - often beyond English-dominated corpora. Models trained on a single pathway or language generalize poorly, while fixed decision red lines commonly induce an inflexible precision-recall trade-off. We present an adaptive hybrid scaffold that unifies text, vision, and audio pathways within a late-fusion ensemble whose operating points, integration weights, and related discrete structures are tuned with Bayesian optimization (Tree-structured Parzen Estimation via Optuna) together with population-based metaheuristics. The text pathway draws on bert-base-multilingual-cased with square-root dampened class weights and focal loss; vision combines zero-shot CLIP ViT-B/32 scoring with a fine-tuned HateCLIPper-style fusion head atop frozen CLIP encoders; audio uses a frozen Wav2Vec2-XLS-R-300M backbone with a lightweight MLP head and Whisper-small transcripts rescored by the same multilingual text classifier. We evaluate on HateXplain, German and Indian hate supersets, Berkeley measuring-hate-speech (∼98k texts), Facebook Hateful Memes (∼8.5k items), and HateMM audio. Simulated annealing carries out post hoc bar optimization, while genetic algorithm, particle swarm optimization, differential evolution, grey wolf optimization, and firefly algorithm are compared across ten tasks covering fusion weights, branch masks, head pruning, lightweight layout knobs, and per-branch cutoffs. Auxiliary building blocks include cosine learning-rate schedules, dual EasyOCR for Latin and Devanagari overlays, and ASR confidence gating for transcript-derived probabilities. observationally, mBERT reaches F1≈0.80 on in-arena text splits. HateCLIPper attains F1≈0.48 on the Hateful Memes development set; simulated-annealing-tuned fusion reaches fused F1≈0.674; and metaheuristic fusion is competitive with or better to TPE-centric baselines on multiple tasks, suggesting that search-driven ensembles can adapt moderation policy without hand-crafted boundaries.</w:t>
+        <w:t>Abstract-Online hate speech is more and more expressed through composite signals - text, images and memes, code-mixed writing and also spoken or sung audio - often beyond English-dominated corpora. While fixed decision cutoffs commonly induce an inflexible precision-recall trade-off, models trained on a single channel or language generalize poorly. We present an adaptive hybrid setup that unifies text, vision, plus audio pathways within a late-fusion ensemble whose operating points, integration weights and also related discrete structures are tuned with Bayesian optimization (Tree-structured Parzen Estimation via Optuna) together with population-based metaheuristics. Our text pathway wields bert-base-multilingual-cased with square-root dampened class weights and focal loss; vision combines zero-shot CLIP ViT-B/32 scoring with a fine-tuned HateCLIPper-style fusion head atop frozen CLIP encoders; audio uses a frozen Wav2Vec2-XLS-R-300M backbone with a lightweight MLP head and Whisper-small transcripts rescored by the same multilingual text classifier. We evaluate on HateXplain, German and Indian hate supersets, Berkeley measuring-hate-speech (∼98k texts), Facebook Hateful Memes (∼8.5k items) coupled with HateMM audio. Simulated annealing does post hoc boundary optimization, while genetic algorithm, particle swarm optimization, differential evolution, grey wolf optimization as well as firefly algorithm are compared across ten tasks covering fusion weights, branch masks, head pruning, lightweight blueprint knobs coupled with per-branch bars. Auxiliary elements include cosine learning-rate schedules, dual EasyOCR for Latin and Devanagari overlays along with ASR confidence gating for transcript-derived probabilities. observationally, mBERT reaches F1≈0.80 on in-sphere text splits. HateCLIPper attains F1≈0.48 on the Hateful Memes development set; simulated-annealing-tuned fusion reaches fused F1≈0.674; and metaheuristic fusion is competitive with or stronger to TPE-centric baselines on multiple tasks, suggesting that search-driven ensembles can adapt moderation policy without hand-crafted bars.</w:t>
       </w:r>
     </w:p>
     <w:p>
@@ -208,7 +208,7 @@
           <w:i w:val="0"/>
           <w:sz w:val="20"/>
         </w:rPr>
-        <w:t>Social media platforms, messaging services, and user-generated content repositories have become primary venues for public discourse. This democratization of publishing comes with a persistent downside: coordinated harassment, identity-based attacks, and the rapid dissemination of hateful content at scale [1]-[3]. Hate speech isn't a purely lexical phenomenon. Memes pair innocuous captions with subtly toxic imagery; audio clips may carry slurs or threatening prosody that weak text transcriptions obscure; and multilingual or code-mixed posts exploit gaps in English-centric filters [1], [2]. For platform operators and regulators, the practical requirement isn't merely high recall - flagging everything suspicious - but trustworthy decisions that respect precision restrictions, jurisdictional norms, and user appeals workflows. When detectors apply fixed red lines, ignore non-text cues, or treat every language as an afterthought, achieving that balance is difficult.</w:t>
+        <w:t>Social media platforms, messaging services, plus user-generated content repositories have become primary venues for public discourse. One such democratization of publishing comes with a persistent downside: coordinated harassment, identity-based attacks, plus the rapid dissemination of hateful content at scale [1]-[3]. Hate speech isn't a purely lexical phenomenon. At weak text transcriptions obscure; and multilingual or code-mixed posts exploit gaps in English-centric filters [1], [2], memes pair innocuous captions with subtly toxic imagery; audio clips may carry slurs or threatening prosody th. For platform operators and regulators, the practical requirement isn't merely high recall - flagging everything suspicious - but trustworthy decisions that respect precision caps, jurisdictional norms coupled with user appeals workflows. When detectors apply fixed red lines, ignore non-text cues, possibly treat every language as an afterthought, achieving that balance is difficult.</w:t>
       </w:r>
     </w:p>
     <w:p>
@@ -224,7 +224,7 @@
           <w:i w:val="0"/>
           <w:sz w:val="20"/>
         </w:rPr>
-        <w:t>The quantitative scale of the problem is no longer inferable only from anecdote. Industry transparency reports document enforcement volumes that dwarf what manual review alone could address. Meta's disclosures signal that 25.2 million pieces of content were actioned for hate speech on Facebook in the fourth quarter of 2022, reflecting both prevalence and the throughput required of hybrid human-machine pipelines. Google similarly reports removal of more than 5.6 million YouTube videos over a comparable policy window for violations that include hate and harassment categories, drives home that audiovisual channels - not text alone - carry a pronounced fraction of policy risk. Because appeals, shadowban disputes, and regulator inquiries are triggered by aggregate error rates rather than isolated mistakes, on services that foreground user reporting, third-party audits and leaked operational statistics have pointed to on the order of 50,000 daily abuse reports during peak periods on Twitter/X-class ecosystems, a load that amplifies the cost of false positives as well as false negatives.</w:t>
+        <w:t>The quantitative scale of the problem remains no longer inferable only from anecdote. Industry transparency notes document enforcement volumes that dwarf what manual review alone could address. In the fourth quarter of 2022, reflecting both prevalence and the throughput required of hybrid human-machine pipelines, meta's disclosures hint at that 25.2 million pieces of content were actioned for hate speech on Facebook. Google similarly reports removal of more than 5.6 million YouTube videos over a comparable policy window for violations that include hate and harassment categories, drives home that audiovisual channels - not text alone - carry a pronounced fraction of policy risk. Because appeals, shadowban disputes, and regulator inquiries are triggered by aggregate error rates rather than isolated mistakes, on services that foreground user reporting, third-party audits and leaked operational statistics have pointed to on the order of 50,000 daily abuse reports during peak periods on Twitter/X-class ecosystems, a load that amplifies the cost of false positives as well as false negatives.</w:t>
       </w:r>
     </w:p>
     <w:p>
@@ -245,7 +245,7 @@
           <w:i w:val="0"/>
           <w:sz w:val="16"/>
         </w:rPr>
-        <w:t>Fig. 11: Scale of platform hate speech enforcement. Facebook, YouTube, and Twitter/X collectively action tens of millions of items per quarter, illustrating the throughput demand on hybrid human-machine moderation pipelines.</w:t>
+        <w:t>Fig. 11: Scale of platform hate speech enforcement. Facebook, YouTube and also Twitter/X collectively action tens of millions of items per quarter, illustrating the throughput demand on hybrid human-machine moderation pipelines.</w:t>
       </w:r>
     </w:p>
     <w:p>
@@ -261,7 +261,7 @@
           <w:i w:val="0"/>
           <w:sz w:val="20"/>
         </w:rPr>
-        <w:t>These volumes translate directly into legal and financial exposure, not merely public-relations risk. The European Union's Digital Services Act (2022) establishes due diligence obligations for very large online platforms and empowers supervision that can levy fines up to 6% of global annual turnover for systematic non-compliance - an order of magnitude that makes moderation quality a board-level governance problem rather than a purely technical KPI [1]. In India, the Information Technology (Intermediary Guidelines and Digital Media Ethics Code) Rules, 2021 require intermediaries to remove infringing content within 36 hours of a valid government or court order, tightening the latency-correctness trade-off for classifiers and the traceability of decision rationales. Although statutory text remains contested, the political trajectory pressures platforms to reveals both proactive detection and procedural fairness - objectives that collide when models are opaque or miscalibrated, in the United States, Section 230 debates continue to shape intermediary liability;.</w:t>
+        <w:t>These volumes translate directly into legal and financial exposure, not merely public-relations risk. The European Union's Digital Services Act (2022) establishes due diligence obligations for very large online platforms and empowers supervision that can levy fines up to 6% of global annual turnover for systematic non-compliance - an order of magnitude that renders moderation quality a board-level governance problem rather than a purely technical KPI [1]. In India, the Information Technology (Intermediary Guidelines and Digital Media Ethics Code) Rules, 2021 require intermediaries to remove infringing content within 36 hours of a valid government or court order, tightening the latency-hit rate trade-off for classifiers and the traceability of decision rationales. Although statutory text remains contested, the political trajectory pressures platforms to reveals both proactive detection and procedural fairness - objectives that collide when models are opaque or miscalibrated, in the United States, Section 230 debates continue to shape intermediary liability;.</w:t>
       </w:r>
     </w:p>
     <w:p>
@@ -277,7 +277,7 @@
           <w:i w:val="0"/>
           <w:sz w:val="20"/>
         </w:rPr>
-        <w:t>Societal harms from failures extend beyond platform economics. Independent fact-finding missions and human-rights investigations have concluded that Facebook-amplified hate speech contributed to atrocity crimes against the Rohingya in Myanmar, documenting how algorithmic distribution intersected with incitement dynamics at scale (UN human rights gears and follow-on NGO reporting). Separately, the Christchurch mosque shootings were live-streamed, instantiating how video and audio signal types can broadcast violence alongside textually thin signals that naive filters miss. Together, these cases paint a picture of why multimodal pipelines, multilingual coverage, and operational calibration aren't academic luxuries: errors propagate into real-world violence, displacement, and downstream radicalization cascades.</w:t>
+        <w:t>From failures extend beyond platform economics, societal harms. In Myanmar, documenting how algorithmic distribution intersected with incitement dynamics at scale (UN human rights moving parts and follow-on NGO reporting), independent fact-finding missions and human-rights investigations have concluded that Facebook-amplified hate speech contributed to atrocity crimes against the Rohingya. Separately, the Christchurch mosque shootings proved live-streamed, instantiating how video and audio modes can broadcast violence alongside textually thin signals that naive filters miss. Together, these cases spell out why multimodal pipelines, multilingual coverage, plus operational calibration aren't academic luxuries: errors propagate into real-world violence, displacement as well as downstream radicalization cascades.</w:t>
       </w:r>
     </w:p>
     <w:p>
@@ -328,7 +328,7 @@
           <w:i w:val="0"/>
           <w:sz w:val="20"/>
         </w:rPr>
-        <w:t>Three structural headaches recur in the literature and in deployed systems. First, cross-modal hate exploits redundancy across channels: a post may be unremarkable in isolation in one channel yet harmful when image and text are jointly interpreted [11], [20]. Second, multilingual and code-mixed usage demands subword models or multilingual transformers rather than pipelines tuned exclusively on English [1], [2]. Third, class imbalance skews learning toward majority non-hate labels, encouraging models that achieve misleading hit rate while missing rare but high-footprint abuses [3], [16]. Together these factors inflate both false negatives (missed harm) and false positives (over-blocking), undermining trust.</w:t>
+        <w:t>Three structural headaches recur in the literature and in deployed systems. First, cross-modal hate exploits redundancy across channels: a post may be unremarkable in isolation in one channel yet harmful when image and text remain jointly interpreted [11], [20]. Second, multilingual and code-mixed usage calls for subword models or multilingual transformers rather than pipelines tuned exclusively on English [1], [2]. At achieve misleading hit rate while missing rare but high-footprint abuses [3], [16], third, class imbalance skews learning toward majority non-hate labels, encouraging models th. Together these factors inflate both false negatives (missed harm) and false positives (over-blocking), undermining trust.</w:t>
       </w:r>
     </w:p>
     <w:p>
@@ -344,7 +344,7 @@
           <w:i w:val="0"/>
           <w:sz w:val="20"/>
         </w:rPr>
-        <w:t>A fourth, ever more salient headache is evasion and adversarial manipulation. Human actors methodically stress-test moderation: leetspeak ("h8", "f|_|ck"), Unicode homoglyphs that swap Cyrillic "a" for Latin "a", deliberate misspellings, multilingual code-switching that fragments toxic spans across scripts, and emoji compositions that express slurs or threats without standard dictionary tokens [1], [3]. A still harder class pairs image-text juxtaposition where each pathway is individually benign but their combination is hateful - precisely the phenomenon stressed by meme benchmarks [20]. These patterns defeat keyword filters (because surface forms are unbounded) and monolingual classifiers (because toxicity may be distributed across languages or modes). They therefore motivate resilient multimodal encoders, subword-aware multilingual modeling, and searchable decision layers that can adapt cutoffs and fusion behavior to operational costs rather than fixed heuristics.</w:t>
+        <w:t>A fourth, ever more salient hurdle is evasion and adversarial manipulation. Human actors methodically stress-test moderation: leetspeak ("h8", "f|_|ck"), Unicode homoglyphs that swap Cyrillic "a" for Latin "a", deliberate misspellings, multilingual code-switching that fragments toxic spans across scripts, together with emoji compositions that express slurs or threats without standard dictionary tokens [1], [3]. One still harder class pairs image-text juxtaposition where each pathway is individually benign but their combination is hateful - precisely the phenomenon stressed by meme benchmarks [20]. Several patterns defeat keyword filters (because surface forms are unbounded) and monolingual classifiers (because toxicity may be distributed across languages or channels). They therefore motivate resilient multimodal encoders, subword-aware multilingual modeling, together with searchable decision layers that can adapt boundaries and fusion behavior to operational costs rather than fixed heuristics.</w:t>
       </w:r>
     </w:p>
     <w:p>
@@ -365,7 +365,7 @@
           <w:i w:val="0"/>
           <w:sz w:val="16"/>
         </w:rPr>
-        <w:t>Fig. 13: Taxonomy of hate speech evasion strategies spanning typographic manipulation, multilingual exploitation, multimodal juxtaposition, and compositional encoding. Each category defeats single-mode or keyword-based detectors.</w:t>
+        <w:t>Fig. 13: Taxonomy of hate speech evasion strategies spanning typographic manipulation, multilingual exploitation, multimodal juxtaposition as well as compositional encoding. Each category defeats single-modality or keyword-based detectors.</w:t>
       </w:r>
     </w:p>
     <w:p>
@@ -381,7 +381,7 @@
           <w:i w:val="0"/>
           <w:sz w:val="20"/>
         </w:rPr>
-        <w:t>Independently, a regulatory imperative is converging on requirements that conflict with naive go-live of black-box neural scores. The DSA's transparency and auditing expectations, the United Kingdom's Online Safety Act trajectory (duty-of-care framing with age-verification and risk-assessment obligations), and India's takedown timelines collectively pressure platforms to produce explainable, auditable moderation decisions: not only what was removed, but defensible reasons that survive appeal and oversight. When they maximize offline hit rate, purely end-to-end classifiers without branch-level diagnostics, calibration records, or cutoff governance are misaligned with this environment - even. Our design philosophy therefore treats fusion weights, branch inclusion, and operating points as first-class artifacts that can be logged, optimized, and reviewed, rather than undocumented hyperparameters frozen at τ=0.5.</w:t>
+        <w:t>With naive release of black-box neural scores, independently, a regulatory imperative is converging on requirements that conflict. The DSA's transparency and auditing expectations, the United Kingdom's Online Safety Act trajectory (duty-of-care framing with age-verification and risk-assessment obligations), and India's takedown timelines collectively pressure platforms to produce explainable, auditable moderation decisions: not only what proved removed, but defensible reasons that survive appeal and oversight. When they maximize offline accuracy, purely end-to-end classifiers without branch-level diagnostics, calibration records, or perhaps cutoff governance are misaligned with this environment - even. Our design philosophy therefore treats fusion weights, branch inclusion and also operating points as first-class artifacts that can be logged, optimized, plus reviewed, rather than undocumented hyperparameters frozen at τ=0.5.</w:t>
       </w:r>
     </w:p>
     <w:p>
@@ -402,7 +402,7 @@
           <w:i w:val="0"/>
           <w:sz w:val="16"/>
         </w:rPr>
-        <w:t>Fig. 16: Why multimodal detection is necessary - three failure settings. (a) Text-only hate is caught by a text detector; (b) a meme with benign text and hateful imagery defeats text-only systems; (c) aggressive audio prosody with an ambiguous transcript requires acoustic analysis.</w:t>
+        <w:t>With an ambiguous transcript requires acoustic analysis, fig. 16: Why multimodal detection is necessary - three failure settings. (a) Text-only hate is caught by a text detector; (b) a meme with benign text and hateful imagery defeats text-only systems; (c) aggressive audio prosody.</w:t>
       </w:r>
     </w:p>
     <w:p>
@@ -432,7 +432,7 @@
           <w:i w:val="0"/>
           <w:sz w:val="20"/>
         </w:rPr>
-        <w:t>Much preceding work prioritizes single-signal type text classification with classical traits or monolingual Transformers [4]-[10], [18]. Commercial and research systems that add vision often do so in specialized meme settings [11], [12], [20] but seldom integrate whispered or sung audio at the same fidelity as text. English-centric training further limits transfer to Hindi, German, or code-mixed social media [1]. Finally, static boundaries-commonly 0.5 on a sigmoid - encode an implicit cost structure that rarely matches operational requirements; small shifts in the decision boundary can deliver large swings in precision and recall, yet cutoff optimization receives comparatively little methodological attention relative to model blueprint design [14]-[17].</w:t>
+        <w:t>Much preceding work prioritizes single-signal type text classification with classical traits or monolingual Transformers [4]-[10], [18]. At add vision often do so in specialized meme settings [11], [12], [20] but seldom integrate whispered or sung audio at the same fidelity as text, commercial and research systems th. English-centric training further limits transfer to Hindi, German, or code-mixed social media [1]. Finally, static boundaries-commonly 0.5 on a sigmoid - encode an implicit cost structure that rarely meets operational requirements; small shifts in the decision boundary can deliver large swings in precision and recall, yet cutoff optimization receives comparatively little methodological attention relative to model blueprint design [14]-[17].</w:t>
       </w:r>
     </w:p>
     <w:p>
@@ -448,7 +448,7 @@
           <w:i w:val="0"/>
           <w:sz w:val="20"/>
         </w:rPr>
-        <w:t>The gap is also commercial. When image signals are incorporated in production stacks, they're typically routed through separate models rather than a unified auditable fusion interface, widely marketed APIs such as Perspective and OpenAI moderation endpoints are by and large text-first;. Meta's public-facing research and product narratives emphasize image-text harms (memes, photorealistic abuse), yet internal and external observers note asymmetries in audio treatment: acoustic slurs, chant-like harassment, and sung threats remain secondary relative to vision-language investment, a pattern mirrored in academic benchmarks where "multimodal" often means text plus image only [1], [20]. Audio moderation-whether from short-video feeds or voice notes - is almost entirely absent from standardized hate-speech leaderboards relative to text and meme corpora, despite parallel growth in video-first platforms.</w:t>
+        <w:t>The gap remains also commercial. When image signals are incorporated in production stacks, they're typically routed through separate models rather than a unified auditable fusion interface, widely marketed APIs such as Perspective and OpenAI moderation endpoints are by and large text-first;. Meta's public-facing research and product narratives emphasize image-text harms (memes, photorealistic abuse), yet internal and external observers note asymmetries in audio treatment: acoustic slurs, chant-like harassment, plus sung threats remain secondary relative to vision-language investment, a pattern mirrored in academic benchmarks where "multimodal" often means text plus image only [1], [20]. In video-first platforms, audio moderation-whether from short-video feeds or voice notes - is almost entirely absent from standardized hate-speech leaderboards relative to text and meme corpora, despite parallel growth.</w:t>
       </w:r>
     </w:p>
     <w:p>
@@ -464,7 +464,7 @@
           <w:i w:val="0"/>
           <w:sz w:val="20"/>
         </w:rPr>
-        <w:t>Because practitioners often underestimate their taps, static cutoffs deserve explicit quantification. While preserving competitive F1, illustrating that red line selection is reliably a policy knob comparable to blueprint depth, on our own multilingual text evaluations (Section 6), moving τ from 0.5 to 0.48-a change smaller than the jitter introduced by logits temperature scaling - can swing precision by more than seven absolute points. Systems that ship τ=0.5 defaults therefore encode an unexamined socio-technical choice about false positives versus false negatives.</w:t>
+        <w:t>Because practitioners often underestimate their taps, static cutoffs deserve explicit quantification. While preserving competitive F1, illustrating that red line selection is reliably a policy knob comparable to blueprint depth, on our own multilingual text evaluations (Section 6), moving τ from 0.5 to 0.48-a change smaller than the jitter introduced by logits temperature scaling - can swing precision by more than seven absolute points. At ship τ=0.5 defaults therefore encode an unexamined socio-technical choice about false positives versus false negatives, systems th.</w:t>
       </w:r>
     </w:p>
     <w:p>
@@ -494,7 +494,7 @@
           <w:i w:val="0"/>
           <w:sz w:val="20"/>
         </w:rPr>
-        <w:t>Despite mature pieces for text (e.g., BERT [18]), vision-language modeling (e.g., CLIP [19]), and self-supervised audio (e.g., wav2vec families), there's no widely went with, end-to-end scaffold that (i) processes text, image, and audio in parallel, (ii) supports multiple languages within a shared textual backbone, and (iii) routinely optimizes hyperparameters, fusion weights, branch inclusion, and decision red lines using comparative metaheuristic search rather than ad hoc tuning. Surveys flags the fragmentation between multimodal and multilingual hate speech detection [1], but stop short of prescribing a unified optimization layer that adapts the system to corpus- and policy-specific trade-offs.</w:t>
+        <w:t>Despite mature building blocks for text (e.g., BERT [18]), vision-language modeling (e.g., CLIP [19]) coupled with self-supervised audio (e.g., wav2vec families), there's no widely settled on, end-to-end scaffold that (i) processes text, image, together with audio in parallel, (ii) supports multiple languages within a shared textual backbone and also (iii) routinely optimizes hyperparameters, fusion weights, branch inclusion and also decision thresholds using comparative metaheuristic search rather than ad hoc tuning. Surveys flags the fragmentation between multimodal and multilingual hate speech detection [1], but stop short of prescribing a unified optimization layer that adapts the system to collection- and policy-specific trade-offs.</w:t>
       </w:r>
     </w:p>
     <w:p>
@@ -510,7 +510,7 @@
           <w:i w:val="0"/>
           <w:sz w:val="20"/>
         </w:rPr>
-        <w:t>Recent surveys sharpen the mismatch between diagnosis and remedy. Chhabra and Vishwakarma [1] articulate fourteen open headaches in multimodal and multilingual hate speech detection as of 2023, spanning resource scarcity, modal misalignment, class imbalance, bias, and trial fragmentation; their own organizing backbone meaningfully operationalizes only a subset - on the order of three hurdle classes in typical follow-on empirical work (for example, multilingual text encoding, basic multimodal fusion, and benchmark replication). We target seven of these headaches jointly in a single experimental marshals: multimodal coverage beyond text (including acoustic paths), multilingual and code-mixed encoding, class imbalance curbing at the loss and weighting layer, fusion under signal type dropout and branch sparsity, red line and scalar policy optimization, comparative search procedures (Bayesian and population-based), and operational reproducibility ceilings aligned with single-GPU go-live. Positioning the work this way makes explicit that our contribution is integrative and optimization-centric, not an incremental single-signal type classifier.</w:t>
+        <w:t>Recent surveys sharpen the mismatch between diagnosis and remedy. Chhabra and Vishwakarma [1] articulate fourteen open hurdles in multimodal and multilingual hate speech detection as of 2023, spanning resource scarcity, modal misalignment, class imbalance, bias, together with trial fragmentation; their own organizing setup meaningfully operationalizes only a subset - on the order of three headache classes in typical follow-on empirical work (for example, multilingual text encoding, basic multimodal fusion, plus benchmark replication). We target seven of these stumbling blocks jointly in a single experimental marshals: multimodal coverage beyond text (including acoustic paths), multilingual and code-mixed encoding, class imbalance curbing at the loss and weighting layer, fusion under mode dropout and branch sparsity, red line and scalar policy optimization, comparative search procedures (Bayesian and population-based) coupled with operational reproducibility restrictions aligned with single-GPU go-live. Positioning the work this way makes explicit that our contribution remains integrative and optimization-centric, not an incremental single-mode classifier.</w:t>
       </w:r>
     </w:p>
     <w:p>
@@ -540,7 +540,7 @@
           <w:i w:val="0"/>
           <w:sz w:val="20"/>
         </w:rPr>
-        <w:t>Multimodal coverage is the first objective. Hateful content is expressed not only as tweets or comments but as memes, photorealistic harassment, and spoken abuse embedded in short video and audio messages. A system that excels on text alone will methodically underperform on platforms where user behavior is video-first. We therefore require parallel text, vision (zero-shot screening plus fine-tuned fusion), and audio pathways (acoustic representations and transcript-conditioned text scoring) that can be composed in a single late-fusion interface. One such objective is driven by empirical complementarity: our later results show that audio branches improve F1 when paired with text even when either alone is weaker, mirroring broader findings from multimodal abuse literature [20], [45].</w:t>
+        <w:t>Multimodal coverage remains the first objective. Hateful content is expressed not only as tweets or comments but as memes, photorealistic harassment, together with spoken abuse embedded in short video and audio messages. A system that excels on text alone will methodically underperform on platforms where user behavior is video-first. We therefore require parallel text, vision (zero-shot screening plus fine-tuned fusion) coupled with audio pathways (acoustic representations and transcript-conditioned text scoring) that can be composed in a single late-fusion interface. Such a objective is driven by empirical complementarity: our later results show that audio branches improve F1 when paired with text even when either alone is weaker, mirroring broader findings from multimodal abuse literature [20], [45].</w:t>
       </w:r>
     </w:p>
     <w:p>
@@ -556,7 +556,7 @@
           <w:i w:val="0"/>
           <w:sz w:val="20"/>
         </w:rPr>
-        <w:t>Multilingual robustness constitutes the second objective. English-centric corpora distort both lexical coverage and sociolinguistic norms; Hindi-English code-mixing and German political discourse bring out script and morphology patterns that monolingual byte-pair encodings handle poorly without shared multilingual capacity [1], [2]. We standardize on `bert-base-multilingual-cased` as a pragmatic backbone for digital text and ASR transcriptions, accepting some limitations on deeply code-mixed spans in exchange for a single tunable-economical encoder that can serve all textual ingress points in the scaffold.</w:t>
+        <w:t>Multilingual robustness constitutes the second objective. At monolingual byte-pair encodings handle poorly without shared multilingual capacity [1], [2], english-centric corpora distort both lexical coverage and sociolinguistic norms; Hindi-English code-mixing and German political discourse bring out script and morphology patterns th. In the architecture, we standardize on `bert-base-multilingual-cased` as a pragmatic backbone for digital text and ASR transcriptions, accepting some blind spots on deeply code-mixed spans in exchange for a single setting-snappy encoder that can serve all textual ingress points.</w:t>
       </w:r>
     </w:p>
     <w:p>
@@ -572,7 +572,7 @@
           <w:i w:val="0"/>
           <w:sz w:val="20"/>
         </w:rPr>
-        <w:t>Our third objective is joint Bayesian and metaheuristic optimization of hyperparameters, fusion weights, branch masks, and decision boundaries. Manual grid search doesn't scale to five-dimensional fusion simplices, high-dimensional attention-head masks, and per-branch red lines; meanwhile, different search algorithms carries different failure modes on noisy validation surfaces [14], [22], [25]. We embed Optuna TPE [25] and simulated annealing alongside GA, PSO, DE, GWO, and FA in a shared marshals so that algorithmic choices are observationally grounded rather than folklore.</w:t>
+        <w:t>Our third objective is joint Bayesian and metaheuristic optimization of hyperparameters, fusion weights, branch masks as well as decision bars. Manual grid search doesn't scale to five-dimensional fusion simplices, high-dimensional attention-head masks, plus per-branch bars; meanwhile, different search algorithms carries different failure modes on noisy validation surfaces [14], [22], [25]. We embed Optuna TPE [25] and simulated annealing alongside GA, PSO, DE, GWO and also FA in a shared marshals so that algorithmic choices are observationally grounded rather than folklore.</w:t>
       </w:r>
     </w:p>
     <w:p>
@@ -588,7 +588,7 @@
           <w:i w:val="0"/>
           <w:sz w:val="20"/>
         </w:rPr>
-        <w:t>Finally, we pursue comparative trial across ten optimization tasks that isolate continuous, discrete, and hybrid search spaces. Our objective isn't to crown a single universal optimizer - such claims rarely survive replication - but to map which optimizer classes are advantageous when evaluations are cheap (cached logits), expensive (full retraining), nearly unimodal (scalar τ), or highly multimodal (fusion fitness landscapes), enabling practitioners to select search procedures aligned with compute budgets and governance caps.</w:t>
+        <w:t>Finally, we pursue comparative trial across ten optimization tasks that isolate continuous, discrete as well as hybrid search spaces. When evaluations are cheap (cached logits), expensive (full retraining), nearly unimodal (scalar τ), possibly highly multimodal (fusion fitness landscapes), enabling practitioners to select search procedures aligned with compute budgets and governance ceilings, the objective isn't to crown a single universal optimizer - such claims rarely survive replication - but to map which optimizer classes are advantageous.</w:t>
       </w:r>
     </w:p>
     <w:p>
@@ -650,17 +650,15 @@
           <w:i w:val="0"/>
           <w:sz w:val="20"/>
         </w:rPr>
-        <w:t xml:space="preserve">- </w:t>
-      </w:r>
-      <w:r>
-        <w:rPr>
-          <w:rFonts w:ascii="Times New Roman" w:hAnsi="Times New Roman"/>
-          <w:b/>
-          <w:i w:val="0"/>
-          <w:sz w:val="20"/>
-        </w:rPr>
-        <w:t>Unified multilingual hate detection</w:t>
-      </w:r>
+        <w:t>- Unified multilingual hate detection across English, German, plus Hindi via bert-base-multilingual-cased, with optional Whisper-small transcripts feeding the same textual classifier used for natively digital text.</w:t>
+      </w:r>
+    </w:p>
+    <w:p>
+      <w:pPr>
+        <w:ind w:left="360" w:hanging="216"/>
+        <w:jc w:val="both"/>
+        <w:spacing w:before="0" w:after="20" w:line="240" w:lineRule="auto"/>
+      </w:pPr>
       <w:r>
         <w:rPr>
           <w:rFonts w:ascii="Times New Roman" w:hAnsi="Times New Roman"/>
@@ -668,17 +666,15 @@
           <w:i w:val="0"/>
           <w:sz w:val="20"/>
         </w:rPr>
-        <w:t xml:space="preserve"> across English, German, and Hindi via </w:t>
-      </w:r>
-      <w:r>
-        <w:rPr>
-          <w:rFonts w:ascii="Courier New" w:hAnsi="Courier New"/>
-          <w:b w:val="0"/>
-          <w:i w:val="0"/>
-          <w:sz w:val="18"/>
-        </w:rPr>
-        <w:t>bert-base-multilingual-cased</w:t>
-      </w:r>
+        <w:t>- A searchable optimization layer combining Optuna TPE for hyperparameter and fusion-weight search with five metaheuristics-GA, PSO, DE, GWO along with FA - for structured comparative experiments across ten optimization tasks, including joint fusion-boundary tuning and per-branch bars.</w:t>
+      </w:r>
+    </w:p>
+    <w:p>
+      <w:pPr>
+        <w:ind w:left="360" w:hanging="216"/>
+        <w:jc w:val="both"/>
+        <w:spacing w:before="0" w:after="20" w:line="240" w:lineRule="auto"/>
+      </w:pPr>
       <w:r>
         <w:rPr>
           <w:rFonts w:ascii="Times New Roman" w:hAnsi="Times New Roman"/>
@@ -686,7 +682,7 @@
           <w:i w:val="0"/>
           <w:sz w:val="20"/>
         </w:rPr>
-        <w:t>, with optional Whisper-small transcripts feeding the same textual classifier used for natively digital text.</w:t>
+        <w:t>- A late-fusion ensemble with ASR confidence gating that down-weights transcript-derived probabilities when automatic speech recognition remains uncertain.</w:t>
       </w:r>
     </w:p>
     <w:p>
@@ -702,7 +698,7 @@
           <w:i w:val="0"/>
           <w:sz w:val="20"/>
         </w:rPr>
-        <w:t>- A searchable optimization layer combining Optuna TPE for hyperparameter and fusion-weight search with five metaheuristics-GA, PSO, DE, GWO, and FA - for structured comparative experiments across ten optimization tasks, including joint fusion-cutoff tuning and per-branch boundaries.</w:t>
+        <w:t>- Square-root dampened class weights paired with focal loss on the text pathway to tames imbalance without extreme gradient amplification from rare classes.</w:t>
       </w:r>
     </w:p>
     <w:p>
@@ -718,17 +714,15 @@
           <w:i w:val="0"/>
           <w:sz w:val="20"/>
         </w:rPr>
-        <w:t xml:space="preserve">- A </w:t>
-      </w:r>
-      <w:r>
-        <w:rPr>
-          <w:rFonts w:ascii="Times New Roman" w:hAnsi="Times New Roman"/>
-          <w:b/>
-          <w:i w:val="0"/>
-          <w:sz w:val="20"/>
-        </w:rPr>
-        <w:t>late-fusion ensemble</w:t>
-      </w:r>
+        <w:t>- A dial-lean HateCLIPper head (on the order of 106 trainable weights) operating on frozen CLIP embeddings to specialize multimodal meme classification.</w:t>
+      </w:r>
+    </w:p>
+    <w:p>
+      <w:pPr>
+        <w:ind w:left="360" w:hanging="216"/>
+        <w:jc w:val="both"/>
+        <w:spacing w:before="0" w:after="20" w:line="240" w:lineRule="auto"/>
+      </w:pPr>
       <w:r>
         <w:rPr>
           <w:rFonts w:ascii="Times New Roman" w:hAnsi="Times New Roman"/>
@@ -736,17 +730,15 @@
           <w:i w:val="0"/>
           <w:sz w:val="20"/>
         </w:rPr>
-        <w:t xml:space="preserve"> with </w:t>
-      </w:r>
-      <w:r>
-        <w:rPr>
-          <w:rFonts w:ascii="Times New Roman" w:hAnsi="Times New Roman"/>
-          <w:b/>
-          <w:i w:val="0"/>
-          <w:sz w:val="20"/>
-        </w:rPr>
-        <w:t>ASR confidence gating</w:t>
-      </w:r>
+        <w:t>- Simulated annealing for post hoc cutoff optimization, explicitly addressing the precision-recall trade-off after probabilistic calibration of fused outputs.</w:t>
+      </w:r>
+    </w:p>
+    <w:p>
+      <w:pPr>
+        <w:ind w:left="360" w:hanging="216"/>
+        <w:jc w:val="both"/>
+        <w:spacing w:before="0" w:after="20" w:line="240" w:lineRule="auto"/>
+      </w:pPr>
       <w:r>
         <w:rPr>
           <w:rFonts w:ascii="Times New Roman" w:hAnsi="Times New Roman"/>
@@ -754,14 +746,28 @@
           <w:i w:val="0"/>
           <w:sz w:val="20"/>
         </w:rPr>
-        <w:t xml:space="preserve"> that down-weights transcript-derived probabilities when automatic speech recognition is uncertain.</w:t>
+        <w:t>- A all-around comparative study spanning seven optimization strategies (TPE, SA, GA, PSO, DE, GWO, FA) over ten tasks, reporting when metaheuristic fusion meets or exceeds Bayesian alternatives.</w:t>
       </w:r>
     </w:p>
     <w:p>
       <w:pPr>
-        <w:ind w:left="360" w:hanging="216"/>
+        <w:jc w:val="left"/>
+        <w:spacing w:before="120" w:after="40" w:line="240" w:lineRule="auto"/>
+      </w:pPr>
+      <w:r>
+        <w:rPr>
+          <w:rFonts w:ascii="Times New Roman" w:hAnsi="Times New Roman"/>
+          <w:b w:val="0"/>
+          <w:i/>
+          <w:sz w:val="20"/>
+        </w:rPr>
+        <w:t>1.7 Paper Organization</w:t>
+      </w:r>
+    </w:p>
+    <w:p>
+      <w:pPr>
         <w:jc w:val="both"/>
-        <w:spacing w:before="0" w:after="20" w:line="240" w:lineRule="auto"/>
+        <w:spacing w:before="0" w:after="40" w:line="240" w:lineRule="auto"/>
       </w:pPr>
       <w:r>
         <w:rPr>
@@ -770,85 +776,7 @@
           <w:i w:val="0"/>
           <w:sz w:val="20"/>
         </w:rPr>
-        <w:t>- Square-root dampened class weights paired with focal loss on the text pathway to tames imbalance without extreme gradient amplification from rare classes.</w:t>
-      </w:r>
-    </w:p>
-    <w:p>
-      <w:pPr>
-        <w:ind w:left="360" w:hanging="216"/>
-        <w:jc w:val="both"/>
-        <w:spacing w:before="0" w:after="20" w:line="240" w:lineRule="auto"/>
-      </w:pPr>
-      <w:r>
-        <w:rPr>
-          <w:rFonts w:ascii="Times New Roman" w:hAnsi="Times New Roman"/>
-          <w:b w:val="0"/>
-          <w:i w:val="0"/>
-          <w:sz w:val="20"/>
-        </w:rPr>
-        <w:t>- A dial-lean HateCLIPper head (on the order of 106 trainable weights) operating on frozen CLIP embeddings to specialize multimodal meme classification.</w:t>
-      </w:r>
-    </w:p>
-    <w:p>
-      <w:pPr>
-        <w:ind w:left="360" w:hanging="216"/>
-        <w:jc w:val="both"/>
-        <w:spacing w:before="0" w:after="20" w:line="240" w:lineRule="auto"/>
-      </w:pPr>
-      <w:r>
-        <w:rPr>
-          <w:rFonts w:ascii="Times New Roman" w:hAnsi="Times New Roman"/>
-          <w:b w:val="0"/>
-          <w:i w:val="0"/>
-          <w:sz w:val="20"/>
-        </w:rPr>
-        <w:t>- Simulated annealing for post hoc cutoff optimization, explicitly addressing the precision-recall trade-off after probabilistic calibration of fused outputs.</w:t>
-      </w:r>
-    </w:p>
-    <w:p>
-      <w:pPr>
-        <w:ind w:left="360" w:hanging="216"/>
-        <w:jc w:val="both"/>
-        <w:spacing w:before="0" w:after="20" w:line="240" w:lineRule="auto"/>
-      </w:pPr>
-      <w:r>
-        <w:rPr>
-          <w:rFonts w:ascii="Times New Roman" w:hAnsi="Times New Roman"/>
-          <w:b w:val="0"/>
-          <w:i w:val="0"/>
-          <w:sz w:val="20"/>
-        </w:rPr>
-        <w:t>- A all-around comparative study spanning seven optimization strategies (TPE, SA, GA, PSO, DE, GWO, FA) over ten tasks, reporting when metaheuristic fusion meets or exceeds Bayesian alternatives.</w:t>
-      </w:r>
-    </w:p>
-    <w:p>
-      <w:pPr>
-        <w:jc w:val="left"/>
-        <w:spacing w:before="120" w:after="40" w:line="240" w:lineRule="auto"/>
-      </w:pPr>
-      <w:r>
-        <w:rPr>
-          <w:rFonts w:ascii="Times New Roman" w:hAnsi="Times New Roman"/>
-          <w:b w:val="0"/>
-          <w:i/>
-          <w:sz w:val="20"/>
-        </w:rPr>
-        <w:t>1.7 Paper Organization</w:t>
-      </w:r>
-    </w:p>
-    <w:p>
-      <w:pPr>
-        <w:jc w:val="both"/>
-        <w:spacing w:before="0" w:after="40" w:line="240" w:lineRule="auto"/>
-      </w:pPr>
-      <w:r>
-        <w:rPr>
-          <w:rFonts w:ascii="Times New Roman" w:hAnsi="Times New Roman"/>
-          <w:b w:val="0"/>
-          <w:i w:val="0"/>
-          <w:sz w:val="20"/>
-        </w:rPr>
-        <w:t>The remainder of this paper is organized as follows, and section 2 surveys related work across text-based, multimodal, multilingual, and metaheuristic approaches. Section 3 details our three-workflow layout, fusion strategy, and optimization backbone - section 4 describes the benchmark sets used. Section 5 outlines the experimental setup and evaluation protocol. Section 6 presents results and discussion across all channels and optimization tasks, and section 7 reports ablation studies. Section 8 discusses gaps. Section 9 proposes future research directions, and Section 10 concludes.</w:t>
+        <w:t>The remainder of this paper is organized as follows, and section 2 surveys related work across text-based, multimodal, multilingual, plus metaheuristic approaches. Section 3 details our three-flow scaffold, fusion strategy, together with optimization apparatus, and section 4 describes the data pools employed. Section 5 outlines the experimental setup and scoring protocol, and section 6 presents results and discussion across all pathways and optimization tasks. Section 7 notes ablation studies. Section 8 discusses blind spots. Section 9 proposes future research directions, and Section 10 concludes.</w:t>
       </w:r>
     </w:p>
     <w:p>
@@ -894,7 +822,7 @@
           <w:i w:val="0"/>
           <w:sz w:val="20"/>
         </w:rPr>
-        <w:t>Early hate speech detection capitalizes on curated lexicons, n-gram statistics, and shallow classifiers. Waseem and Hovy [5] studied racial and sexist harassment on Twitter, showing that simple linguistic traits could outperform naïve baselines but remained brittle to euphemisms and community-specific slang. Davidson et al. [4] emphasized the distinction between offensive and hateful language, advocating finer-grained annotation and TF-IDF supplemented linear models - work that framed the precision-recall tensions still visible in modern neural systems. Character-level models explored by Mehdad and Tetreault [6] improved robustness to obfuscation, while Liu and Forss [7] dug into n-gram similarity for detecting intersecting patterns of abuse. These studies established that aspect engineering alone can't scale to multimodal manipulations. They clarified benchmarking pitfalls (class imbalance, label subjectivity) that any deep learning successor must address.</w:t>
+        <w:t>Early hate speech detection capitalizes on curated lexicons, n-gram statistics as well as shallow classifiers. At simple linguistic traits could outperform naïve baselines but remained brittle to euphemisms and community-specific slang, waseem and Hovy [5] studied racial and sexist harassment on Twitter, showing th. At framed the precision-recall tensions still visible in modern neural systems, davidson et al. [4] emphasized the distinction between offensive and hateful language, advocating finer-grained annotation and TF-IDF supplemented linear models - work th. Character-level models explored by Mehdad and Tetreault [6] improved robustness to obfuscation, while Liu and Forss [7] looked into n-gram similarity for detecting intersecting patterns of abuse. These studies established that characteristic engineering alone can't scale to multimodal manipulations. They clarified scoring pitfalls (class imbalance, label subjectivity) that any deep learning successor must address.</w:t>
       </w:r>
     </w:p>
     <w:p>
@@ -910,7 +838,7 @@
           <w:i w:val="0"/>
           <w:sz w:val="20"/>
         </w:rPr>
-        <w:t>Industrial deployments at/web scale clarified which textbook measures survive contact with production. Nobata et al. [31] reported a large-scale Yahoo comment moderation system combining character n-grams with linguistic attributes, motivated explicitly by the observation that character-level representations capture obfuscations that word-level bags miss. When modern APIs serve billions of inference calls, their study foregrounded latency-correctness trade-offs and elevated false-positive cost as a first-class design ceiling - issues that remain decisive. While highlighting the emerging interpretability deficit of dense neural embeddings - a tension that later, larger Transformers inherit, complementarily, Djuric et al. [32] applied paragraph2vec (Doc2Vec) to learn distributed comment representations for hate-speech-style classification, revealing improved generalization over purely sparse attributes. Burnap and Williams [33] constructed Twitter benchmark sets temporally anchored to the murder of Lee Rigby and showed that ensemble classifiers mixing Bayesian logistic regression, random forests, and SVMs could track surges of hateful language after triggering real-world events. Their findings caution that static snapshots under-train models for bursty, event-driven toxicity, a gap that periodic re-optimization and threshold refresh partially softens.</w:t>
+        <w:t>Industrial deployments at/web scale clarified which textbook measures survive contact with production. Nobata et al. [31] reported a large-scale Yahoo comment moderation system combining character n-grams with linguistic attributes, motivated explicitly by the observation that character-level representations capture obfuscations that word-level bags miss. When modern APIs serve billions of inference calls, their study foregrounded latency-precision trade-offs and elevated false-positive cost as a first-class design cap - issues that remain decisive. While highlighting the emerging interpretability deficit of dense neural embeddings - a tension that later, larger Transformers inherit, complementarily, Djuric et al. [32] applied paragraph2vec (Doc2Vec) to learn distributed comment representations for hate-speech-style classification, revealing improved generalization over purely sparse aspects. Burnap and Williams [33] constructed Twitter benchmark sets temporally anchored to the murder of Lee Rigby and showed that ensemble classifiers mixing Bayesian logistic regression, random forests and also SVMs could track surges of hateful language after triggering real-world events. Their findings caution that static snapshots under-train models for bursty, event-driven toxicity, a limitation that periodic re-optimization and red line refresh partially softens.</w:t>
       </w:r>
     </w:p>
     <w:p>
@@ -926,7 +854,7 @@
           <w:i w:val="0"/>
           <w:sz w:val="20"/>
         </w:rPr>
-        <w:t>Despite their practical utility, attribute-engineered approaches share a fundamental blind spot: they require explicit specification of discriminative cues for each language and each adversarial transformation. A given combinatorial explosion of evasion strategies - spanning typographic substitution, multilingual code-switching, multimodal recontextualization, and meme-native irony - turns manual aspect design untenable at platform scale [3], [31]. Such a gap motivates representation learning and multimodal fusion, but it also explains why character-aware and subword models remain relevant even inside Transformer stacks: the surface channel continues to carry signal that lexicons alone can't enumerate.</w:t>
+        <w:t>Despite their practical utility, attribute-engineered approaches share a fundamental gap: they require explicit specification of discriminative cues for each language and each adversarial transformation. A given combinatorial explosion of evasion strategies - spanning typographic substitution, multilingual code-switching, multimodal recontextualization as well as meme-native irony - turns manual aspect design untenable at platform scale [3], [31]. One such shortcoming motivates representation learning and multimodal fusion, but it also explains why character-aware and subword models remain relevant even inside Transformer stacks: the surface channel continues to carry signal that lexicons alone can't enumerate.</w:t>
       </w:r>
     </w:p>
     <w:p>
@@ -972,7 +900,7 @@
           <w:i w:val="0"/>
           <w:sz w:val="20"/>
         </w:rPr>
-        <w:t>Continued pre-training on toxic or community-norm-violating corpora sharpens decision boundaries without full blueprint redesign. Caselli et al. [34] introduced HateBERT, continuing BERT pre-training on Reddit communities banned for hate and harassment (RAL-E), reporting roughly 2-5% relative F1 gains over vanilla BERT on several hate benchmarks - a modest but operationally meaningful margin at high base rates. Hartvigsen et al. [35] sketched out ToxiGen, a large machine-generated corpus paired with diagnostic tools, addressing scarcity and diversity of abusive training exemplars without relying solely on platform logs. For multilingual rollout, Conneau et al. [36] introduced XLM-RoBERTa, training Transformers on 100 languages from CommonCrawl; XLM-R has become the de facto backbone for cross-lingual transfer in abusive-language tasks where labeled resources are unevenly distributed.</w:t>
+        <w:t>Continued pre-training on toxic or community-norm-violating corpora sharpens decision boundaries without full blueprint redesign. At high base rates, caselli et al. [34] introduced HateBERT, continuing BERT pre-training on Reddit communities banned for hate and harassment (RAL-E), reporting roughly 2-5% relative F1 gains over vanilla BERT on several hate benchmarks - a modest but operationally meaningful margin. Hartvigsen et al. [35] sketched out ToxiGen, a large machine-generated corpus paired with diagnostic tools, addressing scarcity and diversity of abusive training exemplars without relying solely on platform logs. In abusive-language tasks where labeled resources are unevenly distributed, for multilingual rollout, Conneau et al. [36] introduced XLM-RoBERTa, training Transformers on 100 languages from CommonCrawl; XLM-R has become the de facto backbone for cross-lingual transfer.</w:t>
       </w:r>
     </w:p>
     <w:p>
@@ -1018,7 +946,7 @@
           <w:i w:val="0"/>
           <w:sz w:val="20"/>
         </w:rPr>
-        <w:t>Multimodal hate speech is most visible in meme understanding, where either signal type may appear benign alone. Gómez et al. [11] analyzed multimodal hate in publications and social feeds, documenting how editorial images recontextualize textual slurs. Fan et al. [12] connected image sentiment with attention moving parts, illustrating cross-modal saliency cues. Recent surveys and models continue to stress aspect-based and fine-grained multimodal sentiment [13], highlighting the value of interplay layers between channels rather than independent scoring. Kiela et al. [20] formalized the problem for the Facebook Hateful Memes benchmark, bringing out strong human performance ceilings and the comparative weakness of text-only or vision-only pipelines. While expanding beyond memes to arbitrary images and audio, our work aligns with this thread by adopting CLIP-backed fusion.</w:t>
+        <w:t>In meme understanding, where either signal type may appear benign alone, multimodal hate speech is most visible. Gómez et al. [11] analyzed multimodal hate in publications and social feeds, documenting how editorial images recontextualize textual slurs. Fan et al. [12] connected image sentiment with attention moving parts, illustrating cross-modal saliency cues. Recent surveys and models continue to stress aspect-based and fine-grained multimodal sentiment [13], highlighting the value of interplay layers between channels rather than independent scoring. Kiela et al. [20] formalized the problem for the Facebook Hateful Memes benchmark, bringing out strong human performance ceilings and the comparative weakness of text-only or vision-only pipelines. While expanding beyond memes to arbitrary images and audio, our work aligns with this thread by adopting CLIP-backed fusion.</w:t>
       </w:r>
     </w:p>
     <w:p>
@@ -1034,7 +962,7 @@
           <w:i w:val="0"/>
           <w:sz w:val="20"/>
         </w:rPr>
-        <w:t>Fusion architectures admit a pragmatic taxonomy. When pathways differ in dimensionality and sampling rate, early fusion concatenates raw or shallow aspects before classification [40], maximizing low-level cross-correlation at the expense of scalability. Late fusion trains specialists per signal type and combines scores at decision time-modular, interpretable, and compatible with frozen backbones. Attention-based fusion (including cross-modal Transformers such as ViLBERT [41]) learns dynamic weights conditioned on inputs, often improving benchmark maxima when joint training is workable. Early fusion preserves fine-grained co-occurrence structure but can explode in setting count; attention methods excel on Hateful Memes yet frequently require joint end-to-end training that conflicts with our goal of reusable, independently optimizable branches. We therefore adopt late fusion as a deliberate middle ground enabling branch-wise diagnostics, modular expansion (for example, adding a new OCR channel), and transparent per-branch contribution analysis for governance.</w:t>
+        <w:t>Fusion architectures admit a pragmatic taxonomy. At the expense of scalability when signal types differ in dimensionality and sampling rate, early fusion concatenates raw or shallow traits before classification [40], maximizing low-level cross-correlation. Late fusion trains specialists per pathway and combines scores at decision time-modular, interpretable, plus compatible with frozen backbones. When joint training is practical, attention-based fusion (including cross-modal Transformers such as ViLBERT [41]) learns dynamic weights conditioned on inputs, often improving benchmark maxima. With our goal of reusable, independently optimizable branches, early fusion preserves fine-grained co-occurrence structure but can explode in tunable count; attention methods excel on Hateful Memes yet frequently require joint end-to-end training that conflicts. We therefore adopt late fusion as a deliberate middle ground enabling branch-wise diagnostics, modular expansion (for example, adding a new OCR channel), together with transparent per-branch contribution analysis for governance.</w:t>
       </w:r>
     </w:p>
     <w:p>
@@ -1050,7 +978,7 @@
           <w:i w:val="0"/>
           <w:sz w:val="20"/>
         </w:rPr>
-        <w:t>Meme-specific research clarifies what specialized heads must learn. Pramanick et al. [42] laid out a dual-route backbone separating benign confounders from hateful associations, lifting performance on challenging meme instances. Zhu et al. [43] explored prompt-based exploitation of vision-language models, narrowing the gap between zero-shot heuristics and supervised specialist models through careful textual conditioning. While remaining on the roadmap in Section 9, chen et al. [44] introduced UNITER, a universal image-text representation from large-scale pre-training; models in this class are strong future baselines but often demand multi-GPU budgets atypical of academic edge deployments - hence their exclusion from our primary T4 study.</w:t>
+        <w:t>At specialized heads must learn, meme-specific research clarifies wh. From hateful associations, lifting performance on challenging meme instances, pramanick et al. [42] laid out a dual-route backbone separating benign confounders. Zhu et al. [43] explored prompt-based exploitation of vision-language models, narrowing the gap between zero-shot heuristics and supervised specialist models through careful textual conditioning. While remaining on the roadmap in Section 9, chen et al. [44] introduced UNITER, a universal image-text representation from large-scale pre-training; models in this class are strong future baselines but often demand multi-GPU budgets atypical of academic edge deployments - hence their exclusion from our primary T4 study.</w:t>
       </w:r>
     </w:p>
     <w:p>
@@ -1066,7 +994,7 @@
           <w:i w:val="0"/>
           <w:sz w:val="20"/>
         </w:rPr>
-        <w:t>Audio-visual hate remains comparatively underexplored despite short-video growth (TikTok, YouTube Shorts, reels). When fusing Whisper transcripts with wav2vec2 acoustics, das et al. [45] released HateMM, combining video, audio, and text for English hate detection, and showed that audio-only models trail text-dominant baselines yet contribute orthogonal evidence-a pattern we replicate. The literature's text-image bias is thus not merely cultural but epistemic: absent corpora like HateMM, audio would remain a silent channel in empirical benchmarks.</w:t>
+        <w:t>Audio-visual hate stays comparatively underexplored despite short-video growth (TikTok, YouTube Shorts, reels). When fusing Whisper transcripts with wav2vec2 acoustics, das et al. [45] released HateMM, combining video, audio and also text for English hate detection, plus showed that audio-only models trail text-dominant baselines yet contribute orthogonal evidence-a pattern we replicate. A given literature's text-image bias is thus not merely cultural but epistemic: absent benchmark sets like HateMM, audio would remain a silent channel in empirical benchmarks.</w:t>
       </w:r>
     </w:p>
     <w:p>
@@ -1096,7 +1024,7 @@
           <w:i w:val="0"/>
           <w:sz w:val="20"/>
         </w:rPr>
-        <w:t>Multilingual hate speech introduces script diversity, morphological richness, and code-mixing absent in English-only corpora. Chhabra and Vishwakarma [1] survey multimodal and multilingual hate speech detection, noting that most published systems still emphasize one language despite cross-lingual abuse patterns. Schmidt and Wiegand [2] provide an NLP-centric survey of resources and methods, cataloging collection biases. Fortuna and Nunes [3] review automatic detection of hate in text, emphasizing annotation protocols and trial yardsticks. Collectively, these works motivate shared multilingual encoders-we adopt mBERT as a pragmatic compromise between coverage and processing cost.</w:t>
+        <w:t>Multilingual hate speech introduces script diversity, morphological richness, plus code-mixing absent in English-only corpora. At most published systems still emphasize one language despite cross-lingual abuse patterns, chhabra and Vishwakarma [1] survey multimodal and multilingual hate speech detection, noting th. Schmidt and Wiegand [2] provide an NLP-centric survey of resources and methods, cataloging collection biases. Fortuna and Nunes [3] review automatic detection of hate in text, emphasizing annotation protocols and scoring gauges. Collectively, these works motivate shared multilingual encoders-we adopt mBERT as a pragmatic compromise between coverage and processing cost.</w:t>
       </w:r>
     </w:p>
     <w:p>
@@ -1112,7 +1040,7 @@
           <w:i w:val="0"/>
           <w:sz w:val="20"/>
         </w:rPr>
-        <w:t>Corpus-level studies sharpen cross-lingual difficulty. Bohra et al. [46] built a Hindi-English code-mixed Twitter corpus (4,575 annotated posts), reporting that code-mixing intensity correlates with abusive intent in South Asian social media - precisely the phenomenon that pure English ToxicBERT-style models miss. Ross et al. [47] curated a German hate-speech benchmark set aligned with EU legal norms, observing lower inter-annotator agreement (Krippendorff's α on the order of 0.29-0.38) than typical English benchmarks, signaling that cultural juridical frames modulate label stability. Mandl et al. [48] organized the HASOC shared tasks across English, German, and Hindi, enabling directly comparable multilingual trial - an intellectual ancestor of our choice to include German and Hindi alongside English in a unified training stack.</w:t>
+        <w:t>Corpus-level studies sharpen cross-lingual difficulty. At pure English ToxicBERT-style models miss, bohra et al. [46] built a Hindi-English code-mixed Twitter corpus (4,575 annotated posts), reporting that code-mixing intensity correlates with abusive intent in South Asian social media - precisely the phenomenon th. At cultural juridical frames modulate label stability, ross et al. [47] curated a German hate-speech collection aligned with EU legal norms, observing lower inter-annotator agreement (Krippendorff's α on the order of 0.29-0.38) than typical English benchmarks, signaling th. Mandl et al. [48] organized the HASOC shared tasks across English, German along with Hindi, enabling directly comparable multilingual trial - an intellectual ancestor of our choice to include German and Hindi alongside English in a unified training stack.</w:t>
       </w:r>
     </w:p>
     <w:p>
@@ -1128,7 +1056,7 @@
           <w:i w:val="0"/>
           <w:sz w:val="20"/>
         </w:rPr>
-        <w:t>Encoder comparisons carry concrete engineering consequences. Multilingual offensive-language and hate-speech benchmarks that fine-tune both encoders on parallel splits typically report XLM-R ahead of mBERT by on the order of 2-4 absolute F1 points on average, with larger swings on lower-resource languages - consistent with the cross-lingual margins established for XLM-R pre-training [36] and with shared-task multilingual settings such as OffensEval 2020 [49]. We select mBERT here because its 178M-dial footprint fits the memory envelope of a single T4 workflow with multimodal co-resident models, whereas XLM-R at 550M tunables strains batch sizes and parallel branch training; upgrading the backbone is still an immediate, drop-in enhancement enumerated in Section 9.</w:t>
+        <w:t>Encoder comparisons carry concrete engineering consequences. Multilingual offensive-language and hate-speech benchmarks that fine-tune both encoders on parallel splits typically report XLM-R ahead of mBERT by on the order of 2-4 absolute F1 points on average, with larger swings on lower-resource languages - consistent with the cross-lingual margins established for XLM-R pre-training [36] and with shared-task multilingual settings such as OffensEval 2020 [49]. In Section 9, we select mBERT here because its 178M-dial footprint fits the memory envelope of a single T4 workflow with multimodal co-resident models, whereas XLM-R at 550M tunables strains batch sizes and parallel branch training; upgrading the backbone is still an immediate, drop-in enhancement enumerated.</w:t>
       </w:r>
     </w:p>
     <w:p>
@@ -1158,7 +1086,7 @@
           <w:i w:val="0"/>
           <w:sz w:val="20"/>
         </w:rPr>
-        <w:t>Metaheuristics have been applied to hate speech and related NLP tasks for aspect selection, ensemble weighting, and model arrangement search. Baydogan and Alatas [14] explored ant lion and moth-flame optimizers for hate speech classification, reporting competitive precision against grid searches. Asiri et al. [15] introduced seagull optimization within textual pipelines, illustrating that bio-inspired search can navigate discrete attribute spaces efficiently. Al-Makhadmeh and Tolba [16] studied optimization in ensemble hate speech detectors, while Ayo et al. [17] examined probabilistic clustering formulations for related problems. Such contributions brings out value but rarely juxtapose multiple optimizers on identical task interfaces or integrate multimodal decision fusion, leaving open questions about reproducibility and generality.</w:t>
+        <w:t>Metaheuristics have been applied to hate speech and related NLP tasks for aspect selection, ensemble weighting and also model layout search. Baydogan and Alatas [14] explored ant lion and moth-flame optimizers for hate speech classification, reporting competitive precision against grid searches. Asiri et al. [15] introduced seagull optimization within textual pipelines, illustrating that bio-inspired search can navigate discrete trait spaces efficiently. Al-Makhadmeh and Tolba [16] studied optimization in ensemble hate speech detectors, while Ayo et al. [17] examined probabilistic clustering formulations for related problems. These contributions brings out value but rarely juxtapose multiple optimizers on identical task interfaces or integrate multimodal decision fusion, leaving open questions about reproducibility and generality.</w:t>
       </w:r>
     </w:p>
     <w:p>
@@ -1174,7 +1102,7 @@
           <w:i w:val="0"/>
           <w:sz w:val="20"/>
         </w:rPr>
-        <w:t>A given broader metaheuristic landscape extends markedly beyond any single hate-speech paper. While follow-up bio-inspired methods (salp swarm, Harris hawks, and numerous hybrids) populate the optimization literature, mirjalili and Lewis [50] formulated Whale Optimization Algorithm (WOA). In NLP, population-based methods have tuned trait subsets for sentiment, searched architectures for text classifiers, and configured Transformers-yet comparative studies that hold benchmark sets, budgets, and fitness functions fixed across algorithms remain sparse. Our work's algorithmic premise is thus methodological: unify assessment so differences reflect optimizer dynamics rather than incidental preprocessing drift.</w:t>
+        <w:t>The broader metaheuristic landscape extends markedly beyond any single hate-speech paper. While follow-up bio-inspired methods (salp swarm, Harris hawks and also numerous hybrids) populate the optimization literature, mirjalili and Lewis [50] formulated Whale Optimization Algorithm (WOA). In NLP, population-based methods have tuned aspect subsets for sentiment, searched architectures for text classifiers along with configured Transformers-yet comparative studies that hold data pools, budgets and also fitness functions fixed across algorithms remain sparse. Our work's algorithmic premise remains thus methodological: unify benchmarking so differences reflect optimizer dynamics rather than incidental preprocessing drift.</w:t>
       </w:r>
     </w:p>
     <w:p>
@@ -1190,7 +1118,7 @@
           <w:i w:val="0"/>
           <w:sz w:val="20"/>
         </w:rPr>
-        <w:t>Bayesian optimization via tree-structured Parzen estimators (TPE)-for which Bergstra et al. made clear hefty gains over random search and grid search on deep-network hyperparameters - often dominates low-dimensional, comparatively smooth objectives when surrogate assumptions hold; our rollout follows the TPE sampler provided by Optuna [25]. However, Bayesian acquisition implicitly privileges stationarity and smoothness assumptions that frequently fail in discrete combinatorial spaces - branch masks, attention-head subsets, or categorical routing decisions - where fitness plateaus and cliffs induce misleading surrogate posteriors. Population-based methods maintain diversity across parallel candidates, tames premature convergence that sequential Bayesian probing can puts forth on multimodal objectives (in the optimization sense) arising from small validation sets or label noise [14], [22]. When swarms and evolutionary operators match or exceed TPE snapshots, our ten-task channels tests this educated guess on mixtures of continuous fusion weights, scalar boundaries, binary masks, and hybrid tuples, reporting.</w:t>
+        <w:t>Bayesian optimization via tree-structured Parzen estimators (TPE)-for which Bergstra et al. made clear hefty gains over random search and grid search on deep-network hyperparameters - often dominates low-dimensional, comparatively smooth objectives when surrogate assumptions hold; our build-out follows the TPE sampler provided by Optuna [25]. At frequently fail in discrete combinatorial spaces - branch masks, attention-head subsets, or categorical routing decisions - where fitness plateaus and cliffs induce misleading surrogate posteriors, however, Bayesian acquisition implicitly privileges stationarity and smoothness assumptions th. Population-based methods maintain diversity across parallel candidates, tames premature convergence that sequential Bayesian probing can puts forth on multimodal objectives (in the optimization sense) arising from small validation sets or label noise [14], [22]. When swarms and evolutionary operators match or exceed TPE snapshots, our ten-task channels tests this hypothesis on mixtures of continuous fusion weights, scalar bars, binary masks as well as hybrid tuples, reporting.</w:t>
       </w:r>
     </w:p>
     <w:p>
@@ -1220,7 +1148,7 @@
           <w:i w:val="0"/>
           <w:sz w:val="20"/>
         </w:rPr>
-        <w:t>Preceding art typically optimizes either pathway coverage or language coverage or model hyperparameters - not all three within a single experimental puts to work. Cutoff learning, despite its outsized effect on precision and recall, remains underrepresented relative to layout search. Finally, comparative studies of GA, PSO, DE, GWO, and FA in unified NLP tasks are sparse; our framework supplies a common fitness function and task taxonomy to support such comparisons.</w:t>
+        <w:t>Previous art typically optimizes either channel coverage or language coverage or model hyperparameters - not all three within a single experimental puts to work. Boundary learning, despite its outsized effect on precision and recall, stays underrepresented relative to architecture search. Finally, comparative studies of GA, PSO, DE, GWO along with FA in unified NLP tasks are sparse; our backbone supplies a common fitness function and task taxonomy to support such comparisons.</w:t>
       </w:r>
     </w:p>
     <w:p>
@@ -1236,7 +1164,7 @@
           <w:i w:val="0"/>
           <w:sz w:val="20"/>
         </w:rPr>
-        <w:t>Why these gaps persist is structural, not merely scholarly oversight. First, processing cost penalizes integrative work: multimodal Transformers, ASR, and vision backbones jointly exhaust GPU memory long before optimizers exhaust their iteration budgets. Second, collection fragmentation splits the community into text-, meme-, and (rarely) audio-centric silos with non-comparable labels, discouraging unified benchmarks. Third, publication incentives reward novel architectures and leaderboard increments on single collections more than careful optimizer comparisons whose gains appear "engineering-heavy" despite operational weight. Fourth, platform secrecy hides production fusion weights and red line policies, starving academia of ground-truth go-live objectives. Our late-fusion, frozen-backbone, and single-T4 design choices are explicit responses to these frictions: they trade some raw correctness for reproducibility, modularity, and search transparency.</w:t>
+        <w:t>Why these gaps persist remains structural, not merely scholarly oversight. First, processing cost penalizes integrative work: multimodal Transformers, ASR and also vision backbones jointly exhaust GPU memory long before optimizers exhaust their iteration budgets. Second, data pool fragmentation splits the community into text-, meme-, plus (rarely) audio-centric silos with non-comparable labels, discouraging unified benchmarks. Third, publication incentives reward novel architectures and leaderboard increments on single collections more than careful optimizer comparisons whose gains appear "engineering-heavy" despite operational bearing. Fourth, platform secrecy hides production fusion weights and bar policies, starving academia of ground-truth release objectives. Our late-fusion, frozen-backbone, together with single-T4 design choices are explicit responses to these frictions: they trade some raw accuracy for reproducibility, modularity, together with search transparency.</w:t>
       </w:r>
     </w:p>
     <w:p>
@@ -1252,7 +1180,7 @@
           <w:i w:val="0"/>
           <w:sz w:val="20"/>
         </w:rPr>
-        <w:t>Table I positions representative references along signal type, language, methodological, and optimization axes.</w:t>
+        <w:t>Table I positions representative references along pathway, language, methodological, together with optimization axes.</w:t>
       </w:r>
     </w:p>
     <w:p>
@@ -4058,7 +3986,7 @@
           <w:i w:val="0"/>
           <w:sz w:val="20"/>
         </w:rPr>
-        <w:t>Collectively, Tables I-II motivate our emphasis: unify pathways, unify languages at the textual encoder, and unify optimizer benchmarking so that improvements in F1, precision, and recall are attributable to search and integration rather than accidental preprocessor advantage.</w:t>
+        <w:t>Collectively, Tables I-II motivate our emphasis: unify modes, unify languages at the textual encoder and also unify optimizer scoring so that improvements in F1, precision as well as recall are attributable to search and integration rather than accidental preprocessor advantage.</w:t>
       </w:r>
     </w:p>
     <w:p>
@@ -4125,7 +4053,7 @@
           <w:i w:val="0"/>
           <w:sz w:val="20"/>
         </w:rPr>
-        <w:t>Figure 1 (conceptual) depicts our adaptive hybrid moderator. Raw inputs are routed into three asynchronous pipelines-text, vision, and audio-each producing calibrated or comparable probabilistic scores. Vision further splits into a zero-shot CLIP judger with OCR context and a HateCLIPper-style fine-tuned fusion unit that learns nonlinear exchanges between image and text embeddings. Audio contributes (i) an acoustic probability from wav2vec characteristics and (ii) an audio-text probability pulled by transcribing the waveform and reusing the multilingual text classifier. When transcripts are unreliable, branch outputs are combined through weighted late fusion; optional ASR confidence gating attenuates the audio-text channel. A decision boundary τ converts fused hate probability into a binary action. Optuna TPE, simulated annealing, and population-based metaheuristics search over hyperparameters, fusion weights, masks, continuous layout knobs, and τ, using a composite fitness that explicitly values F1, precision, and precision.</w:t>
+        <w:t>Figure 1 (conceptual) depicts our adaptive hybrid moderator. Raw inputs are routed into three asynchronous pipelines-text, vision as well as audio-each producing calibrated or comparable probabilistic scores. At learns nonlinear interactions between image and text embeddings, vision further splits into a zero-shot CLIP judger with OCR context and a HateCLIPper-style fine-tuned fusion segment th. From wav2vec attributes and (ii) an audio-text probability fetched by transcribing the waveform and reusing the multilingual text classifier, audio contributes (i) an acoustic probability. When transcripts are unreliable, branch outputs are combined through weighted late fusion; optional ASR confidence gating attenuates the audio-text channel. One decision bar τ converts fused hate probability into a binary action. Optuna TPE, simulated annealing as well as population-based metaheuristics search over hyperparameters, fusion weights, masks, continuous layout knobs and also τ, using a composite fitness that explicitly values F1, precision coupled with hit rate.</w:t>
       </w:r>
     </w:p>
     <w:p>
@@ -4146,7 +4074,7 @@
           <w:i w:val="0"/>
           <w:sz w:val="16"/>
         </w:rPr>
-        <w:t>Fig. 1: Put forward system layout. Text, vision (zero-shot CLIP + HateCLIPper), and audio (Wav2Vec2 acoustic + Whisper transcript) pipelines produce branch-level probabilities combined through weighted late fusion with ASR confidence gating. Metaheuristic and Bayesian optimizers search over fusion weights, boundaries, and discrete masks.</w:t>
+        <w:t>Fig. 1: Laid out system blueprint. Text, vision (zero-shot CLIP + HateCLIPper) along with audio (Wav2Vec2 acoustic + Whisper transcript) pipelines produce branch-level probabilities combined through weighted late fusion with ASR confidence gating. Metaheuristic and Bayesian optimizers search over fusion weights, red lines, together with discrete masks.</w:t>
       </w:r>
     </w:p>
     <w:p>
@@ -4162,7 +4090,7 @@
           <w:i w:val="0"/>
           <w:sz w:val="20"/>
         </w:rPr>
-        <w:t>We adopt late fusion over early or cross-attention alternatives for three principled reasons. First, late fusion permits modular backbone replacement-upgrading mBERT to XLM-R [36] or CLIP ViT-B/32 to ViT-L/14 [19] requires retraining only the affected branch and re-optimizing fusion weights, not the entire pipeline. This modularity is progressively important as multilingual moderation stacks must track rapid foundation-model turnover without invalidating end-to-end systems that would otherwise demand full re-co-training whenever any encoder changes [1], [3]. Second, late fusion spits out interpretable per-branch contributions: each branch produces a calibrated probability that can be inspected, logged, and audited independently - a requirement for regulatory compliance under backbones such as the EU Artificial Intelligence Act, where high-risk classification systems benefit from traceable evidence chains and post hoc review of piece-level scores. Third, late fusion is computationally tractable on a single T4 GPU: cross-attention models like UNITER [44] or ViLBERT [41] require joint backpropagation through all signal type encoders, which exceeds 16 GB VRAM for multi-branch configurations that also retain task heads, gradient accumulation buffers, and mixed-precision transient tensors. The trade-off is that late fusion can't capture fine-grained cross-modal back-and-forths that early or attention-based fusion would explicitly model [40]. We partially dials back this through the HateCLIPper head, which does learn image-text interactions within the vision branch [28], and through OCR-augmented CLIP prompting that injects typography into the zero-shot pathway [19].</w:t>
+        <w:t>We adopt late fusion over early or cross-attention alternatives for three principled reasons. First, late fusion permits modular backbone replacement-upgrading mBERT to XLM-R [36] or CLIP ViT-B/32 to ViT-L/14 [19] calls for retraining only the affected branch and re-optimizing fusion weights, not the entire chain. As for this modularity, it is progressively important as multilingual moderation stacks must track rapid foundation-model turnover without invalidating end-to-end systems that would otherwise demand full re-co-training whenever any encoder changes [1], [3]. Second, late fusion spits out interpretable per-branch contributions: each branch produces a calibrated probability that can be inspected, logged along with audited independently - a requirement for regulatory compliance under backbones such as the EU Artificial Intelligence Act, where high-risk classification systems benefit from traceable evidence chains and post hoc review of component-level scores. Third, late fusion is computationally tractable on a single T4 GPU: cross-attention models like UNITER [44] or ViLBERT [41] require joint backpropagation through all pathway encoders, which exceeds 16 GB VRAM for multi-branch configurations that also retain task heads, gradient accumulation buffers as well as mixed-precision transient tensors. The trade-off is that late fusion can't capture fine-grained cross-modal interplays that early or attention-based fusion would explicitly model [40]. We partially dials back this through the HateCLIPper head, which does learn image-text back-and-forths within the vision branch [28], and through OCR-augmented CLIP prompting that injects typography into the zero-shot pathway [19].</w:t>
       </w:r>
     </w:p>
     <w:p>
@@ -4178,7 +4106,7 @@
           <w:i w:val="0"/>
           <w:sz w:val="20"/>
         </w:rPr>
-        <w:t>The end-to-end data flow proceeds as follows. Multimodal inputs arrive at an ingress router that dispatches each channel-capable fragment to the appropriate encoder stack: tokenized spans enter mBERT [18]; raster images enter CLIP together with optional EasyOCR overlays; waveforms enter Wav2Vec2-XLS-R [26] and Whisper [27] in parallel. When enabled in the training recipe, each pipeline emits one or more branch-level probabilities on the unit interval, optionally after temperature scaling or validation-set calibration. Nonlinear fusion combines active branches with nonnegative weights, applies ASR confidence gating on the transcript-derived channel, and forms Pfused. A scalar boundary τ, learned or searched post hoc, maps Pfused to a binary moderation decision. Separately, a metaheuristic layer optimizes continuous fusion weights, τ, discrete masks over branches and attention heads, and selected neuro-architectural hyperparameters, using cached validation outputs where possible to amortize evaluation cost [14], [25]. While still permitting policy-time adaptation without architectural rewrites, this separation-inference graph versus search protocol-keeps go-live latency predictable.</w:t>
+        <w:t>Our end-to-end data flow proceeds as follows. At an ingress router that dispatches each pathway-capable fragment to the appropriate encoder stack: tokenized spans enter mBERT [18]; raster images enter CLIP together with optional EasyOCR overlays; waveforms enter Wav2Vec2-XLS-R [26] and Whisper [27] in parallel, multimodal inputs arrive. When enabled in the training recipe, each pipeline emits one or more branch-level probabilities on the unit interval, optionally after temperature scaling or validation-set calibration. Nonlinear fusion merges active branches with nonnegative weights, applies ASR confidence gating on the transcript-derived channel, and forms Pfused. One scalar boundary τ, learned or searched post hoc, maps Pfused to a binary moderation decision. Separately, a metaheuristic layer optimizes continuous fusion weights, τ, discrete masks over branches and attention heads, plus selected neuro-architectural hyperparameters, using cached validation outputs where possible to amortize benchmarking cost [14], [25]. While still permitting policy-time adaptation without architectural rewrites, this separation-inference graph versus search recipe-keeps rollout latency predictable.</w:t>
       </w:r>
     </w:p>
     <w:p>
@@ -4194,7 +4122,7 @@
           <w:i w:val="0"/>
           <w:sz w:val="20"/>
         </w:rPr>
-        <w:t>Operationally, the modular graph supports failure isolation: if OCR fails or Whisper returns an empty transcript, inactive branches are omitted at fusion time rather than corrupting joint representations in a shared cross-modal trunk [11]. Logging can therefore record not only Pfused and, but also per-branch inputs, gate values g(c\mathrmasr), and masked weights - artifacts that assist human review and error analysis under platform safety programs. Finally, late fusion aligns with the empirical reality that moderation policies are rarely static: weight vectors and red lines are periodically re-optimized as corpora shift, class priors change, or regulatory guidance tightens. A search layer that treats (i\, τ) as first-class tunables - rather than implicit by-products of end-to-end training - makes those policy shifts explicit, measurable, and comparatively cheap relative to full-model retraining [14], [25].</w:t>
+        <w:t>Operationally, the modular graph supports failure isolation: if OCR fails or Whisper returns an empty transcript, inactive branches remain omitted at fusion time rather than corrupting joint representations in a shared cross-modal trunk [11]. Logging can therefore record not only Pfused and, but also per-branch inputs, gate values g(c\mathrmasr) as well as masked weights - artifacts that assist human review and error analysis under platform safety programs. Finally, late fusion aligns with the empirical reality that moderation policies are rarely static: weight vectors and red lines are periodically re-optimized as datasets shift, class priors change, or perhaps regulatory guidance tightens. A search layer that treats (i\, τ) as first-class tunables - rather than implicit by-products of end-to-end training - makes those policy shifts explicit, measurable along with comparatively cheap relative to full-model retraining [14], [25].</w:t>
       </w:r>
     </w:p>
     <w:p>
@@ -4240,7 +4168,7 @@
           <w:i w:val="0"/>
           <w:sz w:val="20"/>
         </w:rPr>
-        <w:t>Optimization schedule. Unless superseded by task-specific hyperparameter search, fine-tuning uses 5 epochs, batch size 16, AdamW with learning rate 3×10-5, weight decay 0.01, warmup ratio 0.1, label smoothing 0.1, gradient accumulation 2, and a cosine learning-rate schedule.</w:t>
+        <w:t>Optimization schedule. Unless superseded by task-specific hyperparameter search, fine-tuning uses 5 epochs, batch size 16, AdamW with learning rate 3×10-5, weight decay 0.01, warmup ratio 0.1, label smoothing 0.1, gradient accumulation 2, together with a cosine learning-rate schedule.</w:t>
       </w:r>
     </w:p>
     <w:p>
@@ -4334,7 +4262,7 @@
           <w:i w:val="0"/>
           <w:sz w:val="20"/>
         </w:rPr>
-        <w:t>with γ=2.0 and α=0.75, sharpening gradients on hard, misclassified examples while preventing easy negatives from dominating updates.</w:t>
+        <w:t>From dominating updates, with γ=2.0 and α=0.75, sharpening gradients on hard, misclassified examples while preventing easy negatives.</w:t>
       </w:r>
     </w:p>
     <w:p>
@@ -4350,7 +4278,7 @@
           <w:i w:val="0"/>
           <w:sz w:val="20"/>
         </w:rPr>
-        <w:t>before tokenization, all text inputs undergo a normalization pipeline: conversion to lowercase, URL replacement with a [URL] token, @-mention replacement with [USER], removal of HTML entities, collapsing of repeated whitespace, and stripping of control characters. Emoji sequences are retained as they can carry semantic hate content (e.g., the combination of racial emoji with violent emoji constitutes implicit hate in many annotation schemes [46]). For code-mixed Hindi-English text, we don't apply script-specific normalization, relying instead on mBERT's multilingual WordPiece vocabulary to handle Devanagari and Latin tokens natively. This design choice preserves code-switching patterns that are themselves discriminative attributes for hate detection in South Asian social media [48].</w:t>
+        <w:t>before tokenization, all text inputs undergo a normalization workflow: conversion to lowercase, URL replacement with a [URL] token, @-mention replacement with [USER], removal of HTML entities, collapsing of repeated whitespace as well as stripping of control characters. Emoji sequences remain retained as they can carry semantic hate content (e.g., the combination of racial emoji with violent emoji constitutes implicit hate in many annotation schemes [46]). For code-mixed Hindi-English text, we don't apply script-specific normalization, relying instead on mBERT's multilingual WordPiece vocabulary to handle Devanagari and Latin tokens natively. This design choice preserves code-switching patterns that remain themselves discriminative aspects for hate detection in South Asian social media [48].</w:t>
       </w:r>
     </w:p>
     <w:p>
@@ -4718,7 +4646,7 @@
           <w:i w:val="0"/>
           <w:sz w:val="20"/>
         </w:rPr>
-        <w:t>The focal loss modulating factor (1-pt)^γ dynamically adjusts the contribution of each sample to the gradient. For well-classified examples (pt → 1), the factor approaches zero, reliably removing easy negatives from the gradient signal. When it comes to hard examples (pt → 0), the factor approaches 1, preserving full gradient magnitude. While a sample at pt = 0.5 contributes 25\%, with γ = 2, a sample classified with pt = 0.9 contributes only 1\% of its unmodulated gradient. While focal loss confronts instance-level difficulty imbalance within each class, this selective gradient amplification complements the square-root dampened class weights, which address class-level frequency imbalance. We chose γ = 2 following the analysis of Lin et al. [30], who revealed strong empirical behavior across detection benchmarks; α = 0.75 assigns higher weight to the minority toxic class in the asymmetric two-way setup. Together, these moving parts align optimization with operational priorities under heavy class skew [3], [14].</w:t>
+        <w:t>Our focal loss modulating factor (1-pt)^γ dynamically adjusts the contribution of each sample to the gradient. For well-classified examples (pt → 1), the factor approaches zero, reliably removing easy negatives from the gradient signal. When it comes to hard examples (pt → 0), the factor approaches 1, preserving full gradient magnitude. While a sample at pt = 0.5 contributes 25\%, with γ = 2, a sample classified with pt = 0.9 contributes only 1\% of its unmodulated gradient. While focal loss takes on instance-level difficulty imbalance within each class, this selective gradient amplification complements the square-root dampened class weights, which address class-level frequency imbalance. We chose γ = 2 following the analysis of Lin et al. [30], who revealed strong empirical behavior across detection benchmarks; α = 0.75 assigns higher weight to the minority toxic class in the asymmetric two-way setup. Together, these gears align optimization with operational priorities under heavy class skew [3], [14].</w:t>
       </w:r>
     </w:p>
     <w:p>
@@ -4734,7 +4662,7 @@
           <w:i w:val="0"/>
           <w:sz w:val="20"/>
         </w:rPr>
-        <w:t>From an realization standpoint, mBERT functions as the shared lexical tower for natively digital posts and Whisper transcripts, enabling consistent hate semantics regardless of whether toxicity appears in original Unicode spans or in ASR output [18], [27]. Such a unification is specifically salient for code-mixed and multilingual stacks where the alternative - training monolingual detectors per channel - fragments supervision and complicates fusion [1]. While larger multilingual encoders such as XLM-R [36] may improve low-resource robustness, mBERT offers a favorable precision-memory trade-off under T4 ceilings and preserves comparability with widely reported multilingual hate-speech baselines [1], [3]. When transcript noise increases WER, the text head's probabilistic output remains well-formed. Coupling with ASR gating (Section 3.5) prevents brittle hard decisions that would arise from piping raw ASR strings into lexicon-only filters.</w:t>
+        <w:t>From an realization standpoint, mBERT functions as the shared lexical tower for natively digital posts and Whisper transcripts, enabling consistent hate semantics regardless of whether toxicity surfaces in original Unicode spans or in ASR output [18], [27]. Such a unification is specifically salient for code-mixed and multilingual stacks where the alternative - training monolingual detectors per channel - fragments supervision and complicates fusion [1]. While larger multilingual encoders such as XLM-R [36] may improve low-resource robustness, mBERT gives a favorable precision-memory trade-off under T4 ceilings and preserves comparability with widely reported multilingual hate-speech baselines [1], [3]. When transcript noise increases WER, the text head's probabilistic output remains well-formed. Coupling with ASR gating (Section 3.5) prevents brittle hard decisions that would arise from piping raw ASR strings into lexicon-only filters.</w:t>
       </w:r>
     </w:p>
     <w:p>
@@ -4779,7 +4707,7 @@
           <w:i w:val="0"/>
           <w:sz w:val="20"/>
         </w:rPr>
-        <w:t>We instantiate openai/clip-vit-base-patch32, using a predefined prompt matrix aligned with policy-relevant visual concepts (e.g., gestures, symbols, weapon-like objects - exact prompts are enumerated in the extended appendix). For overlaid or embedded text, dual EasyOCR streams parse Latin scripts (English, French, Spanish, German) and Devanagari (Hindi). When hostility is typography-dependent, oCR outputs are concatenated or summarized and fused with the image tensor through the CLIP text encoder for contextual, text-conditioned image scoring, reducing false negatives.</w:t>
+        <w:t>In the extended appendix), we instantiate openai/clip-vit-base-patch32, using a predefined prompt matrix aligned with policy-relevant visual concepts (e.g., gestures, symbols, weapon-like objects - exact prompts are enumerated. For overlaid or embedded text, dual EasyOCR streams parse Latin scripts (English, French, Spanish, German) and Devanagari (Hindi). When hostility is typography-dependent, oCR outputs are concatenated or summarized and fused with the image tensor through the CLIP text encoder for contextual, text-conditioned image scoring, reducing false negatives.</w:t>
       </w:r>
     </w:p>
     <w:p>
@@ -4795,7 +4723,7 @@
           <w:i w:val="0"/>
           <w:sz w:val="20"/>
         </w:rPr>
-        <w:t>Our zero-shot CLIP assessment wields a curated prompt matrix organized into five semantic categories: (i) hateful symbols and gestures (e.g., "a photo containing a hateful symbol," "an image showing an offensive hand gesture"); (ii) violence and weapons (e.g., "a photo of a weapon being brandished," "an image depicting physical violence"); (iii) dehumanizing imagery (e.g., "an image comparing a person to an animal," "a dehumanizing depiction of a group"); (iv) text-conditioned hate (e.g., "an image with offensive text overlay," "a meme containing a slur"); and (v) neutral/safe baselines (e.g., "a harmless photograph," "a benign meme"). A given maximum similarity score across hateful prompt categories, minus the maximum safe-category score, produces the zero-shot hate probability. This design follows the dual-prompt strategy advocated for CLIP-based content moderation [19], where contrastive scoring against explicitly safe prompts reduces false positives from ambiguous imagery. Zero-shot CLIP isn't sufficient for subtle multimodal irony on memes [11], [20]; it still supplies a cheap, backbone-consistent earlier that can be fused with supervised pathways.</w:t>
+        <w:t>Our zero-shot CLIP trial draws on a curated prompt matrix organized into five semantic categories: (i) hateful symbols and gestures (e.g., "a photo containing a hateful symbol," "an image showing an offensive hand gesture"); (ii) violence and weapons (e.g., "a photo of a weapon being brandished," "an image depicting physical violence"); (iii) dehumanizing imagery (e.g., "an image comparing a person to an animal," "a dehumanizing depiction of a group"); (iv) text-conditioned hate (e.g., "an image with offensive text overlay," "a meme containing a slur"); and (v) neutral/safe baselines (e.g., "a harmless photograph," "a benign meme"). A given maximum similarity score across hateful prompt categories, minus the maximum safe-category score, produces the zero-shot hate probability. This design tracks the dual-prompt strategy advocated for CLIP-based content moderation [19], where contrastive scoring against explicitly safe prompts reduces false positives from ambiguous imagery. Zero-shot CLIP isn't sufficient for subtle multimodal irony on memes [11], [20]; it still supplies a cheap, backbone-consistent preceding that can be fused with supervised pathways.</w:t>
       </w:r>
     </w:p>
     <w:p>
@@ -4872,7 +4800,7 @@
           <w:i w:val="0"/>
           <w:sz w:val="20"/>
         </w:rPr>
-        <w:t>feeds an MLP scoring head with sigmoid output P(hate). Training runs 5 epochs at batch size 16, learning rate 10-4, yielding only ∼1.3M trainable dials - an lean specialization layer atop a general vision-language foundation.</w:t>
+        <w:t>feeds an MLP scoring head with sigmoid output P(hate). At batch size 16, learning rate 10-4, yielding only ∼1.3M trainable dials - an lean specialization layer atop a general vision-language foundation, training runs 5 epochs.</w:t>
       </w:r>
     </w:p>
     <w:p>
@@ -5213,7 +5141,7 @@
           <w:i w:val="0"/>
           <w:sz w:val="16"/>
         </w:rPr>
-        <w:t>Fig. 9: HateCLIPper layout. Frozen CLIP image and text encoders produce 512-D embeddings that are projected to 1024-D and combined via Hadamard product. An MLP head maps the exchange vector to a binary hate probability.</w:t>
+        <w:t>Fig. 9: HateCLIPper scaffold. Via Hadamard product, frozen CLIP image and text encoders produce 512-D embeddings that are projected to 1024-D and combined. An MLP head maps the back-and-forth vector to a binary hate probability.</w:t>
       </w:r>
     </w:p>
     <w:p>
@@ -5259,8 +5187,31 @@
           <w:i w:val="0"/>
           <w:sz w:val="20"/>
         </w:rPr>
-        <w:t>Acoustic pathway.</w:t>
-      </w:r>
+        <w:t>Acoustic pathway. Audio remains resampled to 16 kHz and cropped or padded to a maximum of 20 s. Optional Silero VAD discards leading silence when present. A frozen Wav2Vec2-XLS-R-300M encoder supplies representations to a two-layer MLP head with AUDIO_DIM=256, dropout 0.3, trained with BCEWithLogitsLoss using the same square-root dampened class weights as in Section 3.2.</w:t>
+      </w:r>
+    </w:p>
+    <w:p>
+      <w:pPr>
+        <w:ind w:firstLine="288"/>
+        <w:jc w:val="both"/>
+        <w:spacing w:before="0" w:after="40" w:line="240" w:lineRule="auto"/>
+      </w:pPr>
+      <w:r>
+        <w:rPr>
+          <w:rFonts w:ascii="Times New Roman" w:hAnsi="Times New Roman"/>
+          <w:b/>
+          <w:i w:val="0"/>
+          <w:sz w:val="20"/>
+        </w:rPr>
+        <w:t>Transcript pathway. In Section 3.2, whisper-small transcribes the clip; the text is classified by mBERT as. Such a branch grabs slurs and threats more reliably encoded lexically than acoustically.</w:t>
+      </w:r>
+    </w:p>
+    <w:p>
+      <w:pPr>
+        <w:ind w:firstLine="288"/>
+        <w:jc w:val="both"/>
+        <w:spacing w:before="0" w:after="40" w:line="240" w:lineRule="auto"/>
+      </w:pPr>
       <w:r>
         <w:rPr>
           <w:rFonts w:ascii="Times New Roman" w:hAnsi="Times New Roman"/>
@@ -5268,17 +5219,15 @@
           <w:i w:val="0"/>
           <w:sz w:val="20"/>
         </w:rPr>
-        <w:t xml:space="preserve"> Audio is resampled to 16 kHz and cropped or padded to a maximum of 20 s. Optional </w:t>
-      </w:r>
-      <w:r>
-        <w:rPr>
-          <w:rFonts w:ascii="Times New Roman" w:hAnsi="Times New Roman"/>
-          <w:b/>
-          <w:i w:val="0"/>
-          <w:sz w:val="20"/>
-        </w:rPr>
-        <w:t>Silero VAD</w:t>
-      </w:r>
+        <w:t>The Wav2Vec2-XLS-R-300M model [26] consists of a 7-layer convolutional characteristic encoder that processes raw 16 kHz waveforms into latent speech representations at 50 Hz, followed by 24 transformer blocks with hidden dimension 1024 and 16 attention heads per block, totaling roughly 300 million settings. Across 128 languages using a contrastive self-supervised objective, the model grabs both low-level acoustic aspects (pitch, energy, speaking rate) and high-level phonetic and prosodic patterns, pre-trained on 436,000 hours of unlabeled speech. From the final transformer layer, applying mean pooling across the temporal dimension to fetch a fixed-length 1024-dimensional utterance embedding, we freeze all 300M dials and extract representations. One trainable two-layer MLP projects this embedding to our working dimension (AUDIO_DIM=256) with dropout 0.3, followed by a single-unit output layer.</w:t>
+      </w:r>
+    </w:p>
+    <w:p>
+      <w:pPr>
+        <w:ind w:firstLine="288"/>
+        <w:jc w:val="both"/>
+        <w:spacing w:before="0" w:after="40" w:line="240" w:lineRule="auto"/>
+      </w:pPr>
       <w:r>
         <w:rPr>
           <w:rFonts w:ascii="Times New Roman" w:hAnsi="Times New Roman"/>
@@ -5286,17 +5235,15 @@
           <w:i w:val="0"/>
           <w:sz w:val="20"/>
         </w:rPr>
-        <w:t xml:space="preserve"> discards leading silence when present. A frozen </w:t>
-      </w:r>
-      <w:r>
-        <w:rPr>
-          <w:rFonts w:ascii="Times New Roman" w:hAnsi="Times New Roman"/>
-          <w:b/>
-          <w:i w:val="0"/>
-          <w:sz w:val="20"/>
-        </w:rPr>
-        <w:t>Wav2Vec2-XLS-R-300M</w:t>
-      </w:r>
+        <w:t>For clips containing hefty leading or trailing silence - common in user-uploaded social media videos - we optionally apply Silero Voice Activity Detection (VAD) to isolate speech-active segments before aspect extraction. At would otherwise dilute the mean-pooled acoustic representation, silero VAD operates as a lightweight ONNX model with sub-millisecond latency per frame, flagging non-speech regions th. When VAD remains enabled, only frames marked as speech contribute to the temporal mean.</w:t>
+      </w:r>
+    </w:p>
+    <w:p>
+      <w:pPr>
+        <w:ind w:firstLine="288"/>
+        <w:jc w:val="both"/>
+        <w:spacing w:before="0" w:after="40" w:line="240" w:lineRule="auto"/>
+      </w:pPr>
       <w:r>
         <w:rPr>
           <w:rFonts w:ascii="Times New Roman" w:hAnsi="Times New Roman"/>
@@ -5304,125 +5251,7 @@
           <w:i w:val="0"/>
           <w:sz w:val="20"/>
         </w:rPr>
-        <w:t xml:space="preserve"> encoder supplies representations to a two-layer MLP head with </w:t>
-      </w:r>
-      <w:r>
-        <w:rPr>
-          <w:rFonts w:ascii="Courier New" w:hAnsi="Courier New"/>
-          <w:b w:val="0"/>
-          <w:i w:val="0"/>
-          <w:sz w:val="18"/>
-        </w:rPr>
-        <w:t>AUDIO_DIM=256</w:t>
-      </w:r>
-      <w:r>
-        <w:rPr>
-          <w:rFonts w:ascii="Times New Roman" w:hAnsi="Times New Roman"/>
-          <w:b w:val="0"/>
-          <w:i w:val="0"/>
-          <w:sz w:val="20"/>
-        </w:rPr>
-        <w:t xml:space="preserve">, dropout 0.3, trained with </w:t>
-      </w:r>
-      <w:r>
-        <w:rPr>
-          <w:rFonts w:ascii="Courier New" w:hAnsi="Courier New"/>
-          <w:b w:val="0"/>
-          <w:i w:val="0"/>
-          <w:sz w:val="18"/>
-        </w:rPr>
-        <w:t>BCEWithLogitsLoss</w:t>
-      </w:r>
-      <w:r>
-        <w:rPr>
-          <w:rFonts w:ascii="Times New Roman" w:hAnsi="Times New Roman"/>
-          <w:b w:val="0"/>
-          <w:i w:val="0"/>
-          <w:sz w:val="20"/>
-        </w:rPr>
-        <w:t xml:space="preserve"> using the same </w:t>
-      </w:r>
-      <w:r>
-        <w:rPr>
-          <w:rFonts w:ascii="Times New Roman" w:hAnsi="Times New Roman"/>
-          <w:b/>
-          <w:i w:val="0"/>
-          <w:sz w:val="20"/>
-        </w:rPr>
-        <w:t>square-root dampened</w:t>
-      </w:r>
-      <w:r>
-        <w:rPr>
-          <w:rFonts w:ascii="Times New Roman" w:hAnsi="Times New Roman"/>
-          <w:b w:val="0"/>
-          <w:i w:val="0"/>
-          <w:sz w:val="20"/>
-        </w:rPr>
-        <w:t xml:space="preserve"> class weights as in Section 3.2.</w:t>
-      </w:r>
-    </w:p>
-    <w:p>
-      <w:pPr>
-        <w:ind w:firstLine="288"/>
-        <w:jc w:val="both"/>
-        <w:spacing w:before="0" w:after="40" w:line="240" w:lineRule="auto"/>
-      </w:pPr>
-      <w:r>
-        <w:rPr>
-          <w:rFonts w:ascii="Times New Roman" w:hAnsi="Times New Roman"/>
-          <w:b/>
-          <w:i w:val="0"/>
-          <w:sz w:val="20"/>
-        </w:rPr>
-        <w:t>Transcript pathway. Whisper-small transcribes the clip; the text is classified by mBERT as in Section 3.2. This branch picks up slurs and threats more reliably encoded lexically than acoustically.</w:t>
-      </w:r>
-    </w:p>
-    <w:p>
-      <w:pPr>
-        <w:ind w:firstLine="288"/>
-        <w:jc w:val="both"/>
-        <w:spacing w:before="0" w:after="40" w:line="240" w:lineRule="auto"/>
-      </w:pPr>
-      <w:r>
-        <w:rPr>
-          <w:rFonts w:ascii="Times New Roman" w:hAnsi="Times New Roman"/>
-          <w:b w:val="0"/>
-          <w:i w:val="0"/>
-          <w:sz w:val="20"/>
-        </w:rPr>
-        <w:t>The Wav2Vec2-XLS-R-300M model [26] consists of a 7-layer convolutional aspect encoder that processes raw 16 kHz waveforms into latent speech representations at 50 Hz, followed by 24 transformer blocks with hidden dimension 1024 and 16 attention heads per block, totaling roughly 300 million tunables. Pre-trained on 436,000 hours of unlabeled speech across 128 languages using a contrastive self-supervised objective, the model captures both low-level acoustic characteristics (pitch, energy, speaking rate) and high-level phonetic and prosodic patterns. We freeze all 300M settings and extract representations from the final transformer layer, applying mean pooling across the temporal dimension to fetch a fixed-length 1024-dimensional utterance embedding. A trainable two-layer MLP projects this embedding to our working dimension (AUDIO_DIM=256) with dropout 0.3, followed by a single-unit output layer.</w:t>
-      </w:r>
-    </w:p>
-    <w:p>
-      <w:pPr>
-        <w:ind w:firstLine="288"/>
-        <w:jc w:val="both"/>
-        <w:spacing w:before="0" w:after="40" w:line="240" w:lineRule="auto"/>
-      </w:pPr>
-      <w:r>
-        <w:rPr>
-          <w:rFonts w:ascii="Times New Roman" w:hAnsi="Times New Roman"/>
-          <w:b w:val="0"/>
-          <w:i w:val="0"/>
-          <w:sz w:val="20"/>
-        </w:rPr>
-        <w:t>For clips containing hefty leading or trailing silence - common in user-uploaded social media videos - we optionally apply Silero Voice Activity Detection (VAD) to isolate speech-active segments before aspect extraction. Silero VAD operates as a lightweight ONNX model with sub-millisecond latency per frame, flagging non-speech regions that would otherwise dilute the mean-pooled acoustic representation. When VAD is enabled, only frames marked as speech contribute to the temporal mean.</w:t>
-      </w:r>
-    </w:p>
-    <w:p>
-      <w:pPr>
-        <w:ind w:firstLine="288"/>
-        <w:jc w:val="both"/>
-        <w:spacing w:before="0" w:after="40" w:line="240" w:lineRule="auto"/>
-      </w:pPr>
-      <w:r>
-        <w:rPr>
-          <w:rFonts w:ascii="Times New Roman" w:hAnsi="Times New Roman"/>
-          <w:b w:val="0"/>
-          <w:i w:val="0"/>
-          <w:sz w:val="20"/>
-        </w:rPr>
-        <w:t>We select Whisper-small (244M settings) [27] over Whisper-base (74M) and Whisper-large-v2 (1.5B) as a compromise between transcription quality and T4 memory bounds. While requiring close to one-sixth the inference memory, on English benchmarks, Whisper-small nets word error rates (WER) within 2-3 absolute points of Whisper-large. For non-English HateMM content (which contains chiefly English speech in our extract), Whisper-small's multilingual ability provides adequate transcription quality [45]. The ASR confidence score extracted alongside each transcript serves as the gating signal described in Section 3.5.</w:t>
+        <w:t>We select Whisper-small (244M parameters) [27] over Whisper-base (74M) and Whisper-large-v2 (1.5B) as a compromise between transcription quality and T4 memory bounds. While requiring close to one-sixth the inference memory, on English benchmarks, Whisper-small nets word error rates (WER) within 2-3 absolute points of Whisper-large. For non-English HateMM content (which contains chiefly English speech in our extract), Whisper-small's multilingual ability provides adequate transcription quality [45]. The ASR confidence score extracted alongside each transcript serves as the gating signal described in Section 3.5.</w:t>
       </w:r>
     </w:p>
     <w:p>
@@ -5662,7 +5491,7 @@
           <w:i w:val="0"/>
           <w:sz w:val="20"/>
         </w:rPr>
-        <w:t>Dual-stream audio mirrors multimodal evidence combination at a finer grain: lexical toxicity and speaker-centric hostility need not co-occur, and their partial independence motivates parallel branches rather than collapsing all evidence into transcripts alone [26], [27].</w:t>
+        <w:t>Dual-stream audio reflects multimodal evidence combination at a finer grain: lexical toxicity and speaker-centric hostility need not co-occur, and their partial independence motivates parallel branches rather than collapsing all evidence into transcripts alone [26], [27].</w:t>
       </w:r>
     </w:p>
     <w:p>
@@ -5692,7 +5521,7 @@
           <w:i w:val="0"/>
           <w:sz w:val="20"/>
         </w:rPr>
-        <w:t>Let ptext, pzs, phc, pat, and paa denote probabilities from text, CLIP zero-shot, HateCLIPper, audio-text (mBERT on ASR), and acoustic MLP branches, respectively. Nonnegative weights wi combine them as</w:t>
+        <w:t>Let ptext, pzs, phc, pat coupled with paa denote probabilities from text, CLIP zero-shot, HateCLIPper, audio-text (mBERT on ASR) as well as acoustic MLP branches, respectively. Nonnegative weights wi combine them as</w:t>
       </w:r>
     </w:p>
     <w:p>
@@ -5763,7 +5592,7 @@
           <w:i w:val="0"/>
           <w:sz w:val="20"/>
         </w:rPr>
-        <w:t>where c\mathrmasr∈[0,1] is a confidence score from the ASR stack and g(-) is a monotone gate (e.g., identity or squashing function) fixed during training and treated as a hyperparameter during search. Unless optimized otherwise, defaults are wtext=0.40, wzs=0.15, whc=0.20, wat=0.15, waa=0.10. The final prediction is</w:t>
+        <w:t>where c\mathrmasr∈[0,1] remains a confidence score from the ASR stack and g(-) is a monotone gate (e.g., identity or squashing function) fixed during training and treated as a hyperparameter during search. Unless optimized otherwise, defaults are wtext=0.40, wzs=0.15, whc=0.20, wat=0.15, waa=0.10. The final prediction is</w:t>
       </w:r>
     </w:p>
     <w:p>
@@ -5794,7 +5623,7 @@
           <w:i w:val="0"/>
           <w:sz w:val="20"/>
         </w:rPr>
-        <w:t>A given fusion formula admits an equivalent interpretation as soft weighted voting. Each branch i casts a "vote" pi ∈ [0,1] for the hate educated guess, weighted by wi. The normalized fused score Pfused is the weighted average of these votes. When all branches agree (all pi near 0 or all near 1), Pfused is resilient to weight perturbations. Disagreement between branches (e.g., text predicts hate but vision predicts safe) makes the fused score sensitive to weight allocation - precisely the regime where metaheuristic optimization delivers the largest improvements over uniform or hand-tuned defaults. One such sensitivity analysis motivates the ten-task optimization suite (Section 3.6.E), which searches not only over weights but also over branch inclusion masks, per-branch cutoffs, and the global decision boundary [14], [25].</w:t>
+        <w:t>Our fusion formula admits an equivalent interpretation as soft weighted voting. Each branch i casts a "vote" pi ∈ [0,1] for the hate conjecture, weighted by wi. Our normalized fused score Pfused is the weighted average of these votes. When all branches agree (all pi near 0 or all near 1), Pfused is resilient to weight perturbations. Disagreement between branches (e.g., text predicts hate but vision predicts safe) renders the fused score sensitive to weight allocation - precisely the regime where metaheuristic optimization produces the largest improvements over uniform or hand-tuned defaults. One such sensitivity analysis motivates the ten-task optimization suite (Section 3.6.E), which searches not only over weights but also over branch inclusion masks, per-branch red lines, and the global decision boundary [14], [25].</w:t>
       </w:r>
     </w:p>
     <w:p>
@@ -5810,7 +5639,7 @@
           <w:i w:val="0"/>
           <w:sz w:val="20"/>
         </w:rPr>
-        <w:t>We considered two weight normalization approaches: (i) raw division by ∑i wi (our default) and (ii) softmax normalization wi' = ewi / ∑j ewj, which constrains weights to a simplex. When a modality is unavailable (e.g., no image for a text-only post), the corresponding wi is set to zero. The denominator automatically re-normalizes over active branches, raw division is preferred because it naturally handles branch absence:. Softmax normalization would assign nonzero probability mass to absent branches without explicit masking. In our realization, the MultimodalFusionClassifier dynamically excludes branches whose input is None, re-normalizing weights over the active subset.</w:t>
+        <w:t>We considered two weight normalization approaches: (i) raw division by ∑i wi (our default) and (ii) softmax normalization wi' = ewi / ∑j ewj, which constrains weights to a simplex. When a modality is unavailable (e.g., no image for a text-only post), the corresponding wi is set to zero. The denominator automatically re-normalizes over active branches, raw division is preferred because it naturally handles branch absence:. Softmax normalization would assign nonzero probability mass to absent branches without explicit masking. In our realization, the MultimodalFusionClassifier dynamically excludes branches whose input remains None, re-normalizing weights over the active subset.</w:t>
       </w:r>
     </w:p>
     <w:p>
@@ -5826,7 +5655,7 @@
           <w:i w:val="0"/>
           <w:sz w:val="20"/>
         </w:rPr>
-        <w:t>When only a single branch is active (e.g., text-only input with no image or audio), the fusion reduces to that branch's probability: Pfused = ptext. When multiple branches are active but one reports extreme confidence (pi &gt; 0.95), the fused score is pulled toward that branch proportional to its weight. When a noisy vision zero-shot branch dominates, this behavior is desirable when the confident branch is text (typically the most reliable), but can produce false positives. The branch selection optimization (Task 3) goes after this by learning which combinations of branches to trust under validation feedback, complementing manual priors encoded in default fusion weights [11], [20].</w:t>
+        <w:t>With no image or audio), the fusion reduces to that branch's probability: Pfused = ptext, when only a single branch is active (e.g., text-only input. When multiple branches are active but one reports extreme confidence (pi &gt; 0.95), the fused score remains pulled toward that branch proportional to its weight. When a noisy vision zero-shot branch dominates, this behavior is desirable when the confident branch is text (typically the most reliable), but can produce false positives. The branch selection optimization (Task 3) goes after this by learning which combinations of branches to trust under validation feedback, complementing manual priors encoded in default fusion weights [11], [20].</w:t>
       </w:r>
     </w:p>
     <w:p>
@@ -5872,7 +5701,7 @@
           <w:i w:val="0"/>
           <w:sz w:val="20"/>
         </w:rPr>
-        <w:t>The optimization apparatus is deliberately stratified into Bayesian hyperparameter optimization (Optuna TPE [25]), scalar annealing for bars (SA [29]), and population-based metaheuristics with a unified scoring taps into (Algorithm 4). Such a taxonomy matches heterogeneous search spaces: smooth continuous knobs favor TPE when evaluations are noisy-but-cheap; univariate bar lines favor SA's hill-climbing with stochastic acceptance; multimodal vector spaces with weak Lipschitz structure favor DE, PSO, and GWO [21]-[23]. Crucially, all algorithms consume the same F from Section 3.6.D so that reported differences reflect search dynamics, not metric definitions - a design choice motivated by reproducibility critiques in past optimization-centric NLP work [14].</w:t>
+        <w:t>Our optimization setup is deliberately stratified into Bayesian hyperparameter optimization (Optuna TPE [25]), scalar annealing for bars (SA [29]) along with population-based metaheuristics with a unified trial taps into (Algorithm 4). One such taxonomy matches heterogeneous search spaces: smooth continuous knobs favor TPE when evaluations are noisy-but-cheap; univariate red line lines favor SA's hill-climbing with stochastic acceptance; multimodal vector spaces with weak Lipschitz structure favor DE, PSO along with GWO [21]-[23]. From Section 3.6.D so that reported differences reflect search dynamics, not metric definitions - a design choice motivated by reproducibility critiques in previous optimization-centric NLP work [14], crucially, all algorithms consume the same F.</w:t>
       </w:r>
     </w:p>
     <w:p>
@@ -5902,7 +5731,7 @@
           <w:i w:val="0"/>
           <w:sz w:val="20"/>
         </w:rPr>
-        <w:t>Tree-structured Parzen Estimators model separate densities for upbeat versus unpromising regions of the search space. For text HPO, we search learning rate, weight decay, warmup proportion, and label smoothing with 15 trials, each evaluating on a 30\% data subsample for one epoch to control compute. A separate study allocates 40 trials to fusion weight vectors under box bounds and simplexes after reparameterization.</w:t>
+        <w:t>Tree-structured Parzen Estimators model separate densities for encouraging versus unpromising regions of the search space. For text HPO, we search learning rate, weight decay, warmup proportion, together with label smoothing with 15 trials, each evaluating on a 30\% data subsample for one epoch to control compute. One separate study allocates 40 trials to fusion weight vectors under box bounds and simplexes after reparameterization.</w:t>
       </w:r>
     </w:p>
     <w:p>
@@ -5918,7 +5747,7 @@
           <w:i w:val="0"/>
           <w:sz w:val="20"/>
         </w:rPr>
-        <w:t>The TPE sampler maintains two kernel density estimators, l(x) for the top γ-quantile of observed objective values and g(x) for the remainder. New candidates are drawn by maximizing the ratio l(x) /g(x) , which approximates expected improvement [25]. This model-based approach excels when the fitness landscape is smooth and evaluations are expensive. Can struggle in combinatorial spaces where the density estimators lack appropriate structure. For text HPO, we search over four continuous dimensions: learning rate in [10-6, 5×10-4] (log-uniform), weight decay in [10-4, 0.3] (log-uniform), warmup ratio in [0, 0.2], and label smoothing in [0, 0.2].</w:t>
+        <w:t>The TPE sampler maintains two kernel density estimators, l(x) for the top γ-quantile of observed objective values and g(x) for the remainder. New candidates remain drawn by maximizing the ratio l(x) /g(x) , which approximates expected improvement [25]. This model-based tack excels when the fitness landscape is smooth and evaluations are expensive. Can struggle in combinatorial spaces where the density estimators lack appropriate structure. For text HPO, we search over four continuous dimensions: learning rate in [10-6, 5×10-4] (log-uniform), weight decay in [10-4, 0.3] (log-uniform), warmup ratio in [0, 0.2], plus label smoothing in [0, 0.2].</w:t>
       </w:r>
     </w:p>
     <w:p>
@@ -5948,7 +5777,7 @@
           <w:i w:val="0"/>
           <w:sz w:val="20"/>
         </w:rPr>
-        <w:t>Given validation yardsticks f(τ) (e.g., negative F1 or the negative composite fitness), simulated annealing proposes perturbations τ' with initial temperature T0=1.0, geometric cooling T≥ts 0.95T, and 500 iterations. A worse candidate τ' is accepted with probability</w:t>
+        <w:t>Given validation yardsticks f(τ) (e.g., negative F1 or the negative composite fitness), simulated annealing proposes perturbations τ' with initial temperature T0=1.0, geometric cooling T≥ts 0.95T, and 500 iterations. One worse candidate τ' is accepted with probability</w:t>
       </w:r>
     </w:p>
     <w:p>
@@ -5979,7 +5808,7 @@
           <w:i w:val="0"/>
           <w:sz w:val="20"/>
         </w:rPr>
-        <w:t>allowing escape from local minima on the boundary line and shifting τ away from the uninformed 0.5 default when precision and recall are asymmetric.</w:t>
+        <w:t>allowing escape from local minima on the boundary line and shifting τ away from the uninformed 0.5 default when precision and recall remain asymmetric.</w:t>
       </w:r>
     </w:p>
     <w:p>
@@ -5995,7 +5824,7 @@
           <w:i w:val="0"/>
           <w:sz w:val="20"/>
         </w:rPr>
-        <w:t>A given perturbation magnitude adapts implicitly through the temperature schedule. At high temperature (T ≈ 1.0, early iterations), the acceptance probability for inferior solutions exceeds 0.6 for moderate degradations, encouraging broad exploration of the [0.1, 0.95] cutoff range. As T decays below 0.1 (after around log(0.1/1.0)/log(0.95) ≈ 45 iterations), only improving moves are accepted with high probability, concentrating search around the current best [29].</w:t>
+        <w:t>A given perturbation magnitude adapts implicitly through the temperature schedule. At high temperature (T ≈ 1.0, early iterations), the acceptance probability for inferior solutions tops 0.6 for moderate degradations, encouraging broad exploration of the [0.1, 0.95] cutoff range. As T decays below 0.1 (after around log(0.1/1.0)/log(0.95) ≈ 45 iterations), only improving moves are accepted with high probability, concentrating search around the current best [29].</w:t>
       </w:r>
     </w:p>
     <w:p>
@@ -6106,7 +5935,7 @@
           <w:i w:val="0"/>
           <w:sz w:val="20"/>
         </w:rPr>
-        <w:t>If U(0,1) &lt; σ(vid), else 0, in the binary variant (BPSO), continuous velocities are mapped to bit-flip probabilities through a sigmoid transfer function: σ(vid) = 1/(1+e-vid), and the position is sampled as xid = 1. This formulation enables PSO to operate in discrete binary spaces (branch masks, head selections) while preserving the velocity-based exploration mechanics [23].</w:t>
+        <w:t>If U(0,1) &lt; σ(vid), else 0, in the binary variant (BPSO), continuous velocities are mapped to bit-flip probabilities through a sigmoid transfer function: σ(vid) = 1/(1+e-vid), and the position is sampled as xid = 1. Such a formulation enables PSO to operate in discrete binary spaces (branch masks, head selections) while preserving the velocity-based exploration mechanics [23].</w:t>
       </w:r>
     </w:p>
     <w:p>
@@ -6122,7 +5951,7 @@
           <w:i w:val="0"/>
           <w:sz w:val="20"/>
         </w:rPr>
-        <w:t>- DE (DE/rand/1/bin): For population members xi, mutation uses distinct indices r1,r2,r3:</w:t>
+        <w:t>- DE (DE/rand/1/bin): For population members xi, mutation taps distinct indices r1,r2,r3:</w:t>
       </w:r>
     </w:p>
     <w:p>
@@ -6169,7 +5998,7 @@
           <w:i w:val="0"/>
           <w:sz w:val="20"/>
         </w:rPr>
-        <w:t>- GWO: Coefficient vectors Ap and Cp depend on a, which linearly decays from 2 to 0, balancing exploration and exploitation. For population member xt, the distances to the leading wolves x_αt, x_βt, and x_δt are</w:t>
+        <w:t>From 2 to 0, balancing exploration and exploitation, - GWO: Coefficient vectors Ap and Cp depend on a, which linearly decays. For population member xt, the distances to the leading wolves x_αt, x_βt, together with x_δt are</w:t>
       </w:r>
     </w:p>
     <w:p>
@@ -6200,7 +6029,7 @@
           <w:i w:val="0"/>
           <w:sz w:val="20"/>
         </w:rPr>
-        <w:t>from which three auxiliary vectors are formed,</w:t>
+        <w:t>from which three auxiliary vectors remain formed,</w:t>
       </w:r>
     </w:p>
     <w:p>
@@ -6231,7 +6060,7 @@
           <w:i w:val="0"/>
           <w:sz w:val="20"/>
         </w:rPr>
-        <w:t>The updated candidate is xt+1 = (1)/(3)≤ft(z_αt+z_βt+z_δt); the a dial controls the GWO exploration-exploitation balance. When a &gt; 1 (first half of iterations), the coefficient |A| &gt; 1 causes wolves to diverge from the prey (exploration). When a &lt; 1 (second half), |A| &lt; 1 forces convergence toward the three leaders (exploitation). One such built-in schedule eliminates the need for explicit exploration dials, making GWO attractive for practitioners unfamiliar with metaheuristic tuning [21].</w:t>
+        <w:t>The updated candidate is xt+1 = (1)/(3)≤ft(z_αt+z_βt+z_δt); the a knob controls the GWO exploration-exploitation balance. From the prey (exploration), when a &gt; 1 (first half of iterations), the coefficient |A| &gt; 1 causes wolves to diverge. When a &lt; 1 (second half), |A| &lt; 1 forces convergence toward the three leaders (exploitation). One such built-in schedule eliminates the need for explicit exploration dials, making GWO attractive for practitioners unfamiliar with metaheuristic tuning [21].</w:t>
       </w:r>
     </w:p>
     <w:p>
@@ -6247,7 +6076,7 @@
           <w:i w:val="0"/>
           <w:sz w:val="20"/>
         </w:rPr>
-        <w:t>- FA: attractiveness β=β0 e-γ \|xi-xj\|^2, light absorption α=0.5, with β0=1.0, γ=1.0, and decay 0.99 on α across generations. The Firefly Algorithm's O(n\mathrmpop2) per-iteration cost arises from all-pairs brightness comparison. With n\mathrmpop=20 and n\mathrmiter=200, this delivers 202 × 200 = 80,000 potential attraction events per run - workable for scalar boundary optimization but prohibitive for the 144-dimensional head-selection problem. We therefore restrict FA to 1-D bar tasks exclusively.</w:t>
+        <w:t>- FA: attractiveness β=β0 e-γ \|xi-xj\|^2, light absorption α=0.5, with β0=1.0, γ=1.0 coupled with decay 0.99 on α across generations. The Firefly Algorithm's O(n\mathrmpop2) per-iteration cost arises from all-pairs brightness comparison. With n\mathrmpop=20 and n\mathrmiter=200, this delivers 202 × 200 = 80,000 potential attraction events per run - workable for scalar boundary optimization but prohibitive for the 144-dimensional head-selection problem. We therefore restrict FA to 1-D cutoff tasks exclusively.</w:t>
       </w:r>
     </w:p>
     <w:p>
@@ -6627,7 +6456,7 @@
           <w:i w:val="0"/>
           <w:sz w:val="20"/>
         </w:rPr>
-        <w:t>- Fusion weight optimization. The five-dimensional continuous search space assigns one weight per fusion branch, bounded in [0,1]. We apply PSO (n\mathrmpop=30, n\mathrmiter=100), DE (F=0.8, CR=0.9), and GWO, comparing against Optuna TPE (40 trials). Fitness evaluations use pre-cached branch probabilities on the HateMM dev set (n ≤ 500), making each scoring near-instantaneous and isolating optimizer behavior from stochastic re-forward passes [45]. Five seeds provide mean and standard deviation estimates.</w:t>
+        <w:t>- Fusion weight optimization. Our five-dimensional continuous search space assigns one weight per fusion branch, bounded in [0,1]. We apply PSO (n\mathrmpop=30, n\mathrmiter=100), DE (F=0.8, CR=0.9), plus GWO, comparing against Optuna TPE (40 trials). From stochastic re-forward passes [45], fitness evaluations use pre-cached branch probabilities on the HateMM dev set (n ≤ 500), making each assessment near-instantaneous and isolating optimizer behavior. Five seeds provide mean and standard deviation estimates.</w:t>
       </w:r>
     </w:p>
     <w:p>
@@ -6643,7 +6472,7 @@
           <w:i w:val="0"/>
           <w:sz w:val="20"/>
         </w:rPr>
-        <w:t>- Bar optimization. Our scalar boundary τ ∈ [0.1, 0.95] is optimized to maximize the composite fitness on validation probabilities. PSO (n\mathrmpop=20, n\mathrmiter=200), DE, GWO, and FA (the only task where FA participates) compete against SA (T0=1.0, cooling 0.95, 500 iterations). This is the most wall-to-wall comparison, spanning six optimization strategies on a single dimension - a controlled benchmark that isolates convergence speed from search-space complexity [29].</w:t>
+        <w:t>- Cutoff optimization. A given scalar bar τ ∈ [0.1, 0.95] is optimized to maximize the composite fitness on validation probabilities. PSO (n\mathrmpop=20, n\mathrmiter=200), DE, GWO and also FA (the only task where FA participates) compete against SA (T0=1.0, cooling 0.95, 500 iterations). Such a is the most wall-to-wall comparison, spanning six optimization strategies on a single dimension - a controlled benchmark that isolates convergence speed from search-space complexity [29].</w:t>
       </w:r>
     </w:p>
     <w:p>
@@ -6659,7 +6488,7 @@
           <w:i w:val="0"/>
           <w:sz w:val="20"/>
         </w:rPr>
-        <w:t>- Branch selection. Five binary switches select which fusion branches to activate, yielding 25 - 1 = 31 non-empty configurations. GA (n\mathrmpop=10, n\mathrmiter=30), PSO (BPSO), DE (with 0.5 thresholding), and GWO (sigmoid transfer) search the space, benchmarked against exhaustive enumeration that certifies the global optimum among within reach masks. When logits are deterministic at validation time, this task verifies whether metaheuristics correctly discover optimal branch combinations.</w:t>
+        <w:t>- Branch selection. Five binary switches select which fusion branches to activate, yielding 25 - 1 = 31 non-empty configurations. GA (n\mathrmpop=10, n\mathrmiter=30), PSO (BPSO), DE (with 0.5 thresholding) and also GWO (sigmoid transfer) search the space, benchmarked against exhaustive enumeration that certifies the global optimum among practical masks. When logits are deterministic at validation time, this task double-checks whether metaheuristics correctly discover optimal branch combinations.</w:t>
       </w:r>
     </w:p>
     <w:p>
@@ -6675,7 +6504,7 @@
           <w:i w:val="0"/>
           <w:sz w:val="20"/>
         </w:rPr>
-        <w:t>- BERT head pruning. A 144-dimensional binary chromosome (12 layers × 12 heads) masks individual attention heads in the fine-tuned mBERT model. GA and GWO operate with n\mathrmpop=20, n\mathrmiter=30, evaluating on up to 200 validation samples per fitness call. A minimum active-head ceiling of 30\% (at least 44 heads) prevents degenerate solutions. Such a task probes whether structured sparsity in attention heads improves or degrades hate detection relative to the full head budget [18].</w:t>
+        <w:t>- BERT head pruning. A 144-dimensional binary chromosome (12 layers × 12 heads) masks individual attention heads in the fine-tuned mBERT model. GA and GWO operate with n\mathrmpop=20, n\mathrmiter=30, evaluating on up to 200 validation samples per fitness call. One minimum active-head ceiling of 30\% (at least 44 heads) prevents degenerate solutions. Such a task probes whether structured sparsity in attention heads improves or degrades hate detection relative to the full head budget [18].</w:t>
       </w:r>
     </w:p>
     <w:p>
@@ -6691,7 +6520,7 @@
           <w:i w:val="0"/>
           <w:sz w:val="20"/>
         </w:rPr>
-        <w:t>- Text characteristic selection. TF-IDF aspects (word and character n-grams, max 2000 aspects) are grouped into ∼200 chunks of ∼10 traits each. GA and PSO (BPSO) search over binary chunk masks, training a LinearSVC per assessment. Population size 20, 40 iterations, five seeds. A minimum trait bar of 50 prevents empty selections and stabilizes SVM training in sparse settings [14].</w:t>
+        <w:t>- Text aspect selection. TF-IDF features (word and character n-grams, max 2000 aspects) remain grouped into ∼200 chunks of ∼10 traits each. GA and PSO (BPSO) search over binary chunk masks, training a LinearSVC per assessment. Population size 20, 40 iterations, five seeds. A minimum trait bar of 50 prevents empty selections and stabilizes SVM training in sparse settings [14].</w:t>
       </w:r>
     </w:p>
     <w:p>
@@ -6707,7 +6536,7 @@
           <w:i w:val="0"/>
           <w:sz w:val="20"/>
         </w:rPr>
-        <w:t>- MLP head NAS. Five continuous dimensions encode the MLP head backbone: number of hidden layers ∈ \1,2,3\, hidden dimension ∈ \128, 256, 512, 1024\, dropout ∈ [0.1, 0.5], activation ∈, GELU, SiLU\, and batch normalization (on/off). DE, PSO, and GWO (n\mathrmpop=10, n\mathrmiter=15, three seeds) each build and train the decoded MLP for one epoch per assessment, measuring validation F1. Applied to both HateCLIPper and audio heads, this task links low-cost blueprint search to downstream branch quality [28].</w:t>
+        <w:t>- MLP head NAS. Five continuous dimensions encode the MLP head blueprint: number of hidden layers ∈ \1,2,3\, hidden dimension ∈ \128, 256, 512, 1024\, dropout ∈ [0.1, 0.5], activation ∈, GELU, SiLU\ along with batch normalization (on/off). DE, PSO and also GWO (n\mathrmpop=10, n\mathrmiter=15, three seeds) each build and train the decoded MLP for one epoch per scoring, measuring validation F1. Applied to both HateCLIPper and audio heads, this task links low-cost backbone search to downstream branch quality [28].</w:t>
       </w:r>
     </w:p>
     <w:p>
@@ -6723,7 +6552,7 @@
           <w:i w:val="0"/>
           <w:sz w:val="20"/>
         </w:rPr>
-        <w:t>- BERT HPO comparison. Seven continuous dimensions encode learning rate (log-scale), weight decay (log-scale), warmup ratio, label smoothing, batch size ∈ \8, 16, 32\, epochs ∈ \2,5\, and focal gamma ∈ [0, 3]. DE, PSO, and GWO (n\mathrmpop=12, n\mathrmiter=15, three seeds) compete against the Optuna TPE baseline from Phase 2. Each scoring trains mBERT for one epoch on 50\% subsampled data - the most expensive per-benchmarking task in the suite - motivating pragmatic trial caps [25].</w:t>
+        <w:t>- BERT HPO comparison. Seven continuous dimensions encode learning rate (log-scale), weight decay (log-scale), warmup ratio, label smoothing, batch size ∈ \8, 16, 32\, epochs ∈ \2,5\, and focal gamma ∈ [0, 3]. DE, PSO along with GWO (n\mathrmpop=12, n\mathrmiter=15, three seeds) compete against the Optuna TPE baseline from Phase 2. Each trial trains mBERT for one epoch on 50\% subsampled data - the most expensive per-trial task in the suite - motivating pragmatic trial caps [25].</w:t>
       </w:r>
     </w:p>
     <w:p>
@@ -6755,7 +6584,7 @@
           <w:i w:val="0"/>
           <w:sz w:val="20"/>
         </w:rPr>
-        <w:t>- Joint fusion + cutoff. Six continuous dimensions (five weights plus τ) are jointly optimized by PSO, DE, and GWO (n\mathrmpop=30, n\mathrmiter=150). An iterative refinement variant alternates between weight optimization and bar optimization for three rounds, allowing each sub-problem to benefit from the other's improved solution and curbs plateaus in coupled landscapes.</w:t>
+        <w:t>- Joint fusion + bar. Six continuous dimensions (five weights plus τ) are jointly optimized by PSO, DE as well as GWO (n\mathrmpop=30, n\mathrmiter=150). An iterative refinement variant alternates between weight optimization and cutoff optimization for three rounds, allowing each sub-problem to benefit from the other's improved solution and curbs plateaus in coupled landscapes.</w:t>
       </w:r>
     </w:p>
     <w:p>
@@ -6771,7 +6600,7 @@
           <w:i w:val="0"/>
           <w:sz w:val="20"/>
         </w:rPr>
-        <w:t>- Per-branch cutoffs. Ten continuous dimensions encode five per-branch boundaries and five weights, producing a more granular decision surface than the shared-red line fusion. DE, PSO, and GWO (n\mathrmpop=30, n\mathrmiter=120) search this space. Each branch applies its own boundary before contributing a weighted binary vote to the ensemble, approximating specialist operating points that a single global τ can't express [3].</w:t>
+        <w:t>- Per-branch boundaries. Ten continuous dimensions encode five per-branch red lines and five weights, producing a more granular decision surface than the shared-boundary fusion. DE, PSO and also GWO (n\mathrmpop=30, n\mathrmiter=120) search this space. Each branch applies its own threshold before contributing a weighted binary vote to the ensemble, approximating specialist operating points that a single global τ can't express [3].</w:t>
       </w:r>
     </w:p>
     <w:p>
@@ -6787,7 +6616,7 @@
           <w:i w:val="0"/>
           <w:sz w:val="20"/>
         </w:rPr>
-        <w:t>Together, the suite spans continuous vector optimization, scalar boundary search, discrete mask discovery, and expensive inner-loop training evaluations, supporting comparative claims about when Bayesian density modeling dominates and when swarm or evolutionary updates are preferable [14], [22]-[25].</w:t>
+        <w:t>Together, the suite spans continuous vector optimization, scalar boundary search, discrete mask discovery coupled with expensive inner-loop training evaluations, supporting comparative claims about when Bayesian density modeling dominates and when swarm or evolutionary updates are preferable [14], [22]-[25].</w:t>
       </w:r>
     </w:p>
     <w:p>
@@ -6818,7 +6647,7 @@
           <w:i w:val="0"/>
           <w:sz w:val="20"/>
         </w:rPr>
-        <w:t>We evaluate our apparatus on curated public corpora spanning text, image-text pairs, and video-derived audio. All text resources are harmonized to a binary toxicity objective (label 1: hate or offensive content; label 0: normal or non-toxic content) before joint training, consistent with the unified decision interface described in our system scaffold. Continuous supervision signals (for example, scalar hate-intensity scores) are thresholded using benchmark set documentation and fixed project-wide rules so that labels remain comparable across sources.</w:t>
+        <w:t>We evaluate our backbone on curated public corpora spanning text, image-text pairs, plus video-derived audio. All text resources are harmonized to a binary toxicity objective (label 1: hate or offensive content; label 0: normal or non-toxic content) before joint training, consistent with the unified decision interface described in our system layout. Across sources, continuous supervision signals (for example, scalar hate-intensity scores) are thresholded using corpus documentation and fixed project-wide rules so that labels remain comparable.</w:t>
       </w:r>
     </w:p>
     <w:p>
@@ -6848,7 +6677,7 @@
           <w:i w:val="0"/>
           <w:sz w:val="20"/>
         </w:rPr>
-        <w:t>A given multilingual text stream aggregates four Hugging Face distributions documented in our Config.DATASET_SOURCES: HateXplain (Hate-speech-CNERG/hatexplain), the German and India superset collections (manueltonneau/german-hate-speech-superset, manueltonneau/india-hate-speech-superset), and the Berkeley Measuring Hate Speech release (ucberkeley-dlab/measuring-hate-speech), which collectively reflect diverse regulatory and annotation traditions in multilingual hate-speech research [1], [3]. When reporting intrinsic text-head calibration (Section 6.1) and collapse all corpora to binary labels for merged training, native label layouts differ (ternary hate/offensive/normal, binary flags, or continuous scores); we preserve HateXplain's three-way schema only. After deduplication, language filtering, and removal of samples that fail tokenizer bounds, the merged multilingual corpus contains nearly 98,000 usable examples. The merge protocol prioritizes label consistency over maximal cardinality: conflicting near-duplicates across sources are resolved with precedence rules documented in the extraction notebook. Empty or non-UTF-8 spans are dropped to avoid polluting the multilingual tokenizer with degenerate inputs. We partition every text-derived trial using a single 80% / 10% / 10% train/validation/test split with seed = 42, matching the reproducibility contract enforced in our notebooks.</w:t>
+        <w:t>The multilingual text stream aggregates four Hugging Face distributions documented in our Config.DATASET_SOURCES: HateXplain (Hate-speech-CNERG/hatexplain), the German and India superset collections (manueltonneau/german-hate-speech-superset, manueltonneau/india-hate-speech-superset), plus the Berkeley Measuring Hate Speech release (ucberkeley-dlab/measuring-hate-speech), which collectively reflect diverse regulatory and annotation traditions in multilingual hate-speech research [1], [3]. When reporting intrinsic text-head calibration (Section 6.1) and collapse all corpora to binary labels for merged training, native label layouts differ (ternary hate/offensive/normal, binary flags, possibly continuous scores); we preserve HateXplain's three-way schema only. After deduplication, language filtering and also removal of samples that fail tokenizer constraints, the merged multilingual corpus contains nearly 98,000 usable examples. The merge protocol prioritizes label consistency over maximal cardinality: conflicting near-duplicates across sources are resolved with precedence rules documented in the extraction notebook. Empty or non-UTF-8 spans are dropped to avoid polluting the multilingual tokenizer with degenerate inputs. We partition every text-derived benchmarking using a single 80% / 10% / 10% train/validation/test split with seed = 42, matching the reproducibility contract enforced in our notebooks.</w:t>
       </w:r>
     </w:p>
     <w:p>
@@ -6864,7 +6693,7 @@
           <w:i w:val="0"/>
           <w:sz w:val="20"/>
         </w:rPr>
-        <w:t>HateXplain (originally Mathew et al., 2021) provides 19,229 posts sourced from Twitter and Gab, annotated by three crowdworkers each into normal, offensive, or hate speech categories. Inter-annotator agreement (Fleiss' kappa) is reported at close to 0.46, indicating moderate agreement consistent with the inherent subjectivity of hate speech annotation [3]. The data pool also provides rationale annotations - token-level zeroes in on of hateful spans - which we don't exploit in training but which informed our token importance analysis (Task 8). Every three-class structure is preserved for intrinsic assessment of the text head (Section 6.1) and binarized (offensive + hate = toxic) for merged training.</w:t>
+        <w:t>By three crowdworkers each into normal, offensive, or hate speech categories, hateXplain (originally Mathew et al., 2021) provides 19,229 posts sourced from Twitter and Gab, annotated. Inter-annotator agreement (Fleiss' kappa) is reported at close to 0.46, indicating moderate agreement consistent with the inherent subjectivity of hate speech annotation [3]. The data pool also provides rationale annotations - token-level zeroes in on of hateful spans - which we don't exploit in training but which informed our token importance analysis (Task 8). Every three-class structure is preserved for intrinsic assessment of the text head (Section 6.1) and binarized (offensive + hate = toxic) for merged training.</w:t>
       </w:r>
     </w:p>
     <w:p>
@@ -6880,7 +6709,7 @@
           <w:i w:val="0"/>
           <w:sz w:val="20"/>
         </w:rPr>
-        <w:t>German Hate Speech Superset aggregates multiple German hate speech corpora into close to 50,543 samples with binary labels. German hate speech presents unique stumbling blocks including compound word formation (where hateful neologisms may not appear in any dictionary), formal/informal register variation, and legal definitions that differ sizably from US-centric annotation guidelines. Ross et al. [47] documented inter-annotator agreement as low as α = 0.29 for German hate content, reflecting cultural and legal ambiguity in cross-border hate definitions.</w:t>
+        <w:t>German Hate Speech Superset aggregates multiple German hate speech corpora into close to 50,543 samples with binary labels. German hate speech presents unique challenges including compound word formation (where hateful neologisms may not appear in any dictionary), formal/informal register variation and also legal definitions that differ sizably from US-centric annotation guidelines. Ross et al. [47] documented inter-annotator agreement as low as α = 0.29 for German hate content, reflecting cultural and legal ambiguity in cross-border hate definitions.</w:t>
       </w:r>
     </w:p>
     <w:p>
@@ -6912,7 +6741,7 @@
           <w:i w:val="0"/>
           <w:sz w:val="20"/>
         </w:rPr>
-        <w:t>Berkeley Measuring Hate Speech provides around 39,565 English-language samples annotated with continuous hate speech scores rather than categorical labels. We binarize these scores using the data pool's recommended threshold, converting the regression target to classification. The continuous annotation game plan offers finer granularity than binary labels but introduces red line sensitivity - a microcosm of the broader boundary optimization problem addressed by our SA and metaheuristic backbones [3].</w:t>
+        <w:t>Berkeley Measuring Hate Speech provides around 39,565 English-language samples annotated with continuous hate speech scores rather than categorical labels. We binarize these scores using the benchmark set's recommended red line, converting the regression target to classification. Our continuous annotation game plan offers finer granularity than binary labels but introduces boundary sensitivity - a microcosm of the broader red line optimization problem addressed by our SA and metaheuristic setups [3].</w:t>
       </w:r>
     </w:p>
     <w:p>
@@ -6942,7 +6771,7 @@
           <w:i w:val="0"/>
           <w:sz w:val="20"/>
         </w:rPr>
-        <w:t>For image-text moderation we adopt the Facebook Hateful Memes collection [20], which provides roughly 8,500 training memes and 500 development memes, each with paired OCR-accessible captions and binary hate labels. This benchmark stresses fine-grained multimodal reasoning because hateful intent often arises from the interplay between visuals and overlaid text rather than either mode alone [11], [13]. Practitioners should expect shortcut cues-color layouts, fonts, or stock-photo identities - that can inflate training hit rate while undermining out-of-space generalization; our pairing of supervised HateCLIPper [28] with zero-shot CLIP [19] partially tames overfitting to benchmark set-specific superficial correlations by retaining a foundation-model previous that's frozen at the encoder level.</w:t>
+        <w:t>With paired OCR-accessible captions and binary hate labels, for image-text moderation we adopt the Facebook Hateful Memes data pool [20], which provides roughly 8,500 training memes and 500 development memes, each. From the interplay between visuals and overlaid text rather than either channel alone [11], [13], this benchmark stresses fine-grained multimodal reasoning because hateful intent often arises. Practitioners should expect shortcut cues-color layouts, fonts, or stock-photo identities - that can inflate training precision while undermining out-of-space generalization; our pairing of supervised HateCLIPper [28] with zero-shot CLIP [19] partially tames overfitting to benchmark set-specific superficial correlations by retaining a foundation-model prior that's frozen at the encoder level.</w:t>
       </w:r>
     </w:p>
     <w:p>
@@ -9131,7 +8960,7 @@
           <w:i w:val="0"/>
           <w:sz w:val="20"/>
         </w:rPr>
-        <w:t>Unless noted otherwise, branch logits are calibrated and non-linearly scaled where the training recipe applies label smoothing, class reweighting, or focal objectives [30] before softmax aggregation.</w:t>
+        <w:t>Unless noted otherwise, branch logits remain calibrated and non-linearly scaled where the training recipe applies label smoothing, class reweighting, or focal objectives [30] before softmax aggregation.</w:t>
       </w:r>
     </w:p>
     <w:p>
@@ -9161,7 +8990,7 @@
           <w:i w:val="0"/>
           <w:sz w:val="20"/>
         </w:rPr>
-        <w:t>All text inputs undergo a standardized preprocessing pipeline before tokenization. Text is lowercased, URLs are replaced with a [URL] placeholder token, @-mentions with [USER], and HTML entities are decoded. Repeated whitespace is collapsed to single spaces, and control characters are stripped. Emoji sequences are retained as-is, since emoji combinations can constitute hate speech (e.g., racial emoji paired with violent imagery) [46]. For the vision pipeline, meme images are resized to 224×224 pixels to match CLIP's expected input resolution, with bilinear interpolation for downsampling and padding for aspect ratio preservation. With channels averaged if stereo, audio waveforms are resampled to 16 kHz mono via torchaudio. Waveforms exceeding 20 seconds are center-cropped; shorter clips are zero-padded; the Whisper tokenizer handles transcript preprocessing internally [27].</w:t>
+        <w:t>All text inputs undergo a standardized preprocessing flow before tokenization. Text is lowercased, URLs are replaced with a [URL] placeholder token, @-mentions with [USER] and also HTML entities are decoded. Repeated whitespace remains collapsed to single spaces, and control characters are stripped. Emoji sequences remain retained as-is, since emoji combinations can constitute hate speech (e.g., racial emoji paired with violent imagery) [46]. With bilinear interpolation for downsampling and padding for aspect ratio preservation, for the vision workflow, meme images are resized to 224×224 pixels to match CLIP's expected input resolution. With channels averaged if stereo, audio waveforms are resampled to 16 kHz mono via torchaudio. Waveforms exceeding 20 seconds are center-cropped; shorter clips are zero-padded - the Whisper tokenizer handles transcript preprocessing internally [27].</w:t>
       </w:r>
     </w:p>
     <w:p>
@@ -10303,7 +10132,7 @@
           <w:i w:val="0"/>
           <w:sz w:val="20"/>
         </w:rPr>
-        <w:t>All experiments execute inside Kaggle Notebooks on a single NVIDIA Tesla T4 (16 GB) GPU. The software stack is pinned to Python 3.12.12, PyTorch 2.10.0+cu128, Transformers 5.0.0, Corpora 2.21.0, Optuna 4.8.0 [25], scikit-learn 1.6.1, and EasyOCR 1.7.2, pinning down bitwise-stable reproduction conditional on hardware driver revisions.</w:t>
+        <w:t>All experiments execute inside Kaggle Notebooks on a single NVIDIA Tesla T4 (16 GB) GPU. Our software stack is pinned to Python 3.12.12, PyTorch 2.10.0+cu128, Transformers 5.0.0, Data pools 2.21.0, Optuna 4.8.0 [25], scikit-learn 1.6.1 along with EasyOCR 1.7.2, pinning down bitwise-stable reproduction conditional on hardware driver revisions.</w:t>
       </w:r>
     </w:p>
     <w:p>
@@ -10333,7 +10162,7 @@
           <w:i w:val="0"/>
           <w:sz w:val="20"/>
         </w:rPr>
-        <w:t>We report hit rate, macro- and micro-averaged precision, recall, F1-score, area under the ROC curve (AUROC), average precision (AP), and confusion matrices on each task-specific hold-out split. A given validation contract is intentionally strict: a single stratified 80 / 10 / 10 partition (seed = 42) governs all text and audio evaluations. While this mirrors operational ceilings (one canonical go-live snapshot), it necessarily induces finite-sample variance; Section 8 revisits this limitation.</w:t>
+        <w:t>We report hit rate, macro- and micro-averaged precision, recall, F1-score, area under the ROC curve (AUROC), average precision (AP) as well as confusion matrices on each task-specific hold-out split. We consider the validation contract to be intentionally strict: a single stratified 80 / 10 / 10 partition (seed = 42) governs all text and audio evaluations. While this reflects operational restrictions (one canonical rollout snapshot), it necessarily induces finite-sample variance; Section 8 revisits this weak spot.</w:t>
       </w:r>
     </w:p>
     <w:p>
@@ -10349,7 +10178,7 @@
           <w:i w:val="0"/>
           <w:sz w:val="20"/>
         </w:rPr>
-        <w:t>The single-split validation protocol deserves explicit justification. In production go-live, a hate detection model is trained once and evaluated on a held-out set before release; k-fold cross-validation, while statistically stronger, doesn't mirror this operational cadence. Our single split with seed = 42 therefore represents the most realistic assessment of go-live-time performance. However, this choice introduces finite-sample variance that makes small metric differences (e.g., 0.01 F1) statistically unreliable. We address this partially through the multi-seed metaheuristic protocol (Section 5.4) and acknowledge the blind spot explicitly in Section 8.</w:t>
+        <w:t>Our single-split validation protocol deserves explicit justification. In production rollout, a hate detection model is trained once and evaluated on a held-out set before release; k-fold cross-validation, while statistically stronger, doesn't mirror this operational cadence. Our single split with seed = 42 therefore stands for the most realistic assessment of release-time performance. However, this choice introduces finite-sample variance that renders small metric differences (e.g., 0.01 F1) statistically unreliable. We address this partially through the multi-seed metaheuristic protocol (Section 5.4) and acknowledge the weak spot explicitly in Section 8.</w:t>
       </w:r>
     </w:p>
     <w:p>
@@ -10365,7 +10194,7 @@
           <w:i w:val="0"/>
           <w:sz w:val="20"/>
         </w:rPr>
-        <w:t>Metaheuristic robustness studies repeat stochastic optimizers over five pseudo-random seeds \42, 123, 456, 789, 1024\ for relatively cheap fitness evaluations (for example, fusion-weight search on cached branch scores). GPU-intensive replay jobs (for example, neural backbone search loops over fresh forward passes) subsample three seeds \42, 123, 456\ to match notebook hour budgets.</w:t>
+        <w:t>At stochastic optimizers over five pseudo-random seeds \42, 123, 456, 789, 1024\ for relatively cheap fitness evaluations (for example, fusion-weight search on cached branch scores), metaheuristic robustness studies repe. GPU-intensive replay jobs (for example, neural backbone search loops over fresh forward passes) subsample three seeds \42, 123, 456\ to match notebook hour budgets.</w:t>
       </w:r>
     </w:p>
     <w:p>
@@ -10395,7 +10224,7 @@
           <w:i w:val="0"/>
           <w:sz w:val="20"/>
         </w:rPr>
-        <w:t>Hyperparameter and weight optimization against Bayesian templates uses Optuna TPE [25] with trial budgets documented below. Simulated annealing (SA) [29] optimizes scalar decision red lines on validation F1. Exhaustive enumeration resolves discrete branch-selection problems spanning 31 workable activation patterns (all non-empty subsets of five fusion branches). Population-based metaheuristics-PSO [23], DE [22], GWO [21], and FA [24]-operate on the same search spaces with population sizes and iteration caps drawn from the project Config (Table III).</w:t>
+        <w:t>With trial budgets documented below, hyperparameter and weight optimization against Bayesian templates uses Optuna TPE [25]. Simulated annealing (SA) [29] optimizes scalar decision cutoffs on validation F1. Exhaustive enumeration resolves discrete branch-selection problems spanning 31 doable activation patterns (all non-empty subsets of five fusion branches). Population-based metaheuristics-PSO [23], DE [22], GWO [21], plus FA [24]-operate on the same search spaces with population sizes and iteration caps drawn from the project Config (Table III).</w:t>
       </w:r>
     </w:p>
     <w:p>
@@ -13306,7 +13135,7 @@
           <w:i w:val="0"/>
           <w:sz w:val="20"/>
         </w:rPr>
-        <w:t>The Optuna sampler is configured as TPESampler(seed=42) with MedianPruner(n_startup_trials=3, n_warmup_steps=0) for early termination of unpromising HPO trials. With GPU acceleration enabled, easyOCR is initialized with language lists ['en', 'fr', 'es', 'de'] for Latin scripts and ['hi'] for Devanagari. The Gradio web interface provides five tabs (text, image, audio, multimodal, scoring) for interactive demonstration, though GUI-based results aren't reported in the quantitative benchmarking.</w:t>
+        <w:t>With MedianPruner(n_startup_trials=3, n_warmup_steps=0) for early termination of unpromising HPO trials, the Optuna sampler is configured as TPESampler(seed=42). With GPU acceleration enabled, easyOCR is initialized with language lists ['en', 'fr', 'es', 'de'] for Latin scripts and ['hi'] for Devanagari. The Gradio web interface provides five tabs (text, image, audio, multimodal, benchmarking) for interactive demonstration, though GUI-based results aren't reported in the quantitative trial.</w:t>
       </w:r>
     </w:p>
     <w:p>
@@ -13322,7 +13151,7 @@
           <w:i w:val="0"/>
           <w:sz w:val="20"/>
         </w:rPr>
-        <w:t>All metaheuristic optimizers are put together from scratch in NumPy, sharing a common MetaHeuristicOptimizer base class with a unified optimize() interface that accepts arbitrary fitness functions, bounds, and binary/continuous mode flags. Such a design pins down that algorithmic differences - not rollout-level inefficiencies - drive comparative results. The Result dataclass standardizes output format across algorithms, capturing best solution, fitness, convergence curve, wall time, scoring count, and arbitrary metadata.</w:t>
+        <w:t>All metaheuristic optimizers are wired up from scratch in NumPy, sharing a common MetaHeuristicOptimizer base class with a unified optimize() interface that accepts arbitrary fitness functions, bounds, plus binary/continuous mode flags. This design pins down that algorithmic differences - not realization-level inefficiencies - drive comparative results. The Result dataclass standardizes output format across algorithms, capturing best solution, fitness, convergence curve, wall time, trial count, plus arbitrary metadata.</w:t>
       </w:r>
     </w:p>
     <w:p>
@@ -13338,8 +13167,50 @@
           <w:i w:val="0"/>
           <w:sz w:val="20"/>
         </w:rPr>
-        <w:t>Reproducibility controls</w:t>
-      </w:r>
+        <w:t>Reproducibility controls include fixed seeds for NumPy, PyTorch coupled with Optuna where supported; deterministically ordered validation batches during fitness aggregation; and checkpointed branch logits for Tasks 1-3 so optimizer comparisons replay identical score tensors. Where CUDA nondeterminism stays (e.g., certain atomicAdd paths), we scope stochasticity to model training phases and keep metaheuristic evaluations on cached logits strictly repeatable.</w:t>
+      </w:r>
+    </w:p>
+    <w:p>
+      <w:pPr>
+        <w:jc w:val="center"/>
+        <w:spacing w:before="120" w:after="40" w:line="240" w:lineRule="auto"/>
+      </w:pPr>
+    </w:p>
+    <w:p>
+      <w:pPr>
+        <w:jc w:val="center"/>
+        <w:spacing w:before="20" w:after="100" w:line="220" w:lineRule="auto"/>
+      </w:pPr>
+      <w:r>
+        <w:rPr>
+          <w:rFonts w:ascii="Times New Roman" w:hAnsi="Times New Roman"/>
+          <w:b w:val="0"/>
+          <w:i w:val="0"/>
+          <w:sz w:val="16"/>
+        </w:rPr>
+        <w:t>Fig. 5: Optuna TPE hyperparameter optimization history. Trial-by-trial validation F1 for text HPO (15 trials) and fusion weight HPO (40 trials), illustrating the surrogate model's progressive narrowing of the search space.</w:t>
+      </w:r>
+    </w:p>
+    <w:p>
+      <w:pPr>
+        <w:jc w:val="left"/>
+        <w:spacing w:before="120" w:after="40" w:line="240" w:lineRule="auto"/>
+      </w:pPr>
+      <w:r>
+        <w:rPr>
+          <w:rFonts w:ascii="Times New Roman" w:hAnsi="Times New Roman"/>
+          <w:b w:val="0"/>
+          <w:i/>
+          <w:sz w:val="20"/>
+        </w:rPr>
+        <w:t>5.4 Statistical Methodology</w:t>
+      </w:r>
+    </w:p>
+    <w:p>
+      <w:pPr>
+        <w:jc w:val="both"/>
+        <w:spacing w:before="0" w:after="40" w:line="240" w:lineRule="auto"/>
+      </w:pPr>
       <w:r>
         <w:rPr>
           <w:rFonts w:ascii="Times New Roman" w:hAnsi="Times New Roman"/>
@@ -13347,17 +13218,15 @@
           <w:i w:val="0"/>
           <w:sz w:val="20"/>
         </w:rPr>
-        <w:t xml:space="preserve"> include fixed seeds for NumPy, PyTorch, and Optuna where supported; deterministically ordered validation batches during fitness aggregation; and checkpointed branch logits for Tasks 1-3 so optimizer comparisons replay identical score tensors. Where CUDA nondeterminism remains (e.g., certain </w:t>
-      </w:r>
-      <w:r>
-        <w:rPr>
-          <w:rFonts w:ascii="Courier New" w:hAnsi="Courier New"/>
-          <w:b w:val="0"/>
-          <w:i w:val="0"/>
-          <w:sz w:val="18"/>
-        </w:rPr>
-        <w:t>atomicAdd</w:t>
-      </w:r>
+        <w:t>With cheap fitness evaluations (fusion weights, bars, branch selection) and three seeds \42, 123, 456\ on GPU-intensive tasks (NAS, BERT HPO), for metaheuristic comparisons, each algorithm is executed with five independent seeds \42, 123, 456, 789, 1024\ on tasks. We report the best fitness across seeds (peak performance), mean fitness (expected performance) as well as standard deviation (consistency). Across seeds with 1 standard deviation shading, convergence curves plot mean best-fitness-so-far. Our "iterations to 95% of global best" metric snags sample speed - how quickly each algorithm reaches near-optimal solutions.</w:t>
+      </w:r>
+    </w:p>
+    <w:p>
+      <w:pPr>
+        <w:ind w:firstLine="288"/>
+        <w:jc w:val="both"/>
+        <w:spacing w:before="0" w:after="40" w:line="240" w:lineRule="auto"/>
+      </w:pPr>
       <w:r>
         <w:rPr>
           <w:rFonts w:ascii="Times New Roman" w:hAnsi="Times New Roman"/>
@@ -13365,74 +13234,7 @@
           <w:i w:val="0"/>
           <w:sz w:val="20"/>
         </w:rPr>
-        <w:t xml:space="preserve"> paths), we scope stochasticity to model training phases and keep metaheuristic evaluations on cached logits strictly repeatable.</w:t>
-      </w:r>
-    </w:p>
-    <w:p>
-      <w:pPr>
-        <w:jc w:val="center"/>
-        <w:spacing w:before="120" w:after="40" w:line="240" w:lineRule="auto"/>
-      </w:pPr>
-    </w:p>
-    <w:p>
-      <w:pPr>
-        <w:jc w:val="center"/>
-        <w:spacing w:before="20" w:after="100" w:line="220" w:lineRule="auto"/>
-      </w:pPr>
-      <w:r>
-        <w:rPr>
-          <w:rFonts w:ascii="Times New Roman" w:hAnsi="Times New Roman"/>
-          <w:b w:val="0"/>
-          <w:i w:val="0"/>
-          <w:sz w:val="16"/>
-        </w:rPr>
-        <w:t>Fig. 5: Optuna TPE hyperparameter optimization history. Trial-by-trial validation F1 for text HPO (15 trials) and fusion weight HPO (40 trials), illustrating the surrogate model's progressive narrowing of the search space.</w:t>
-      </w:r>
-    </w:p>
-    <w:p>
-      <w:pPr>
-        <w:jc w:val="left"/>
-        <w:spacing w:before="120" w:after="40" w:line="240" w:lineRule="auto"/>
-      </w:pPr>
-      <w:r>
-        <w:rPr>
-          <w:rFonts w:ascii="Times New Roman" w:hAnsi="Times New Roman"/>
-          <w:b w:val="0"/>
-          <w:i/>
-          <w:sz w:val="20"/>
-        </w:rPr>
-        <w:t>5.4 Statistical Methodology</w:t>
-      </w:r>
-    </w:p>
-    <w:p>
-      <w:pPr>
-        <w:jc w:val="both"/>
-        <w:spacing w:before="0" w:after="40" w:line="240" w:lineRule="auto"/>
-      </w:pPr>
-      <w:r>
-        <w:rPr>
-          <w:rFonts w:ascii="Times New Roman" w:hAnsi="Times New Roman"/>
-          <w:b w:val="0"/>
-          <w:i w:val="0"/>
-          <w:sz w:val="20"/>
-        </w:rPr>
-        <w:t>For metaheuristic comparisons, each algorithm is executed with five independent seeds \42, 123, 456, 789, 1024\ on tasks with cheap fitness evaluations (fusion weights, bars, branch selection) and three seeds \42, 123, 456\ on GPU-intensive tasks (NAS, BERT HPO). We report the best fitness across seeds (peak performance), mean fitness (expected performance), and standard deviation (consistency). Convergence curves plot mean best-fitness-so-far across seeds with 1 standard deviation shading. The "iterations to 95% of global best" metric picks up sample speed - how quickly each algorithm reaches near-optimal solutions.</w:t>
-      </w:r>
-    </w:p>
-    <w:p>
-      <w:pPr>
-        <w:ind w:firstLine="288"/>
-        <w:jc w:val="both"/>
-        <w:spacing w:before="0" w:after="40" w:line="240" w:lineRule="auto"/>
-      </w:pPr>
-      <w:r>
-        <w:rPr>
-          <w:rFonts w:ascii="Times New Roman" w:hAnsi="Times New Roman"/>
-          <w:b w:val="0"/>
-          <w:i w:val="0"/>
-          <w:sz w:val="20"/>
-        </w:rPr>
-        <w:t>We acknowledge the absence of formal statistical significance tests (e.g., Wilcoxon signed-rank, Mann-Whitney U) in what follows. With only 3-5 seeds per algorithm, such tests have limited statistical power (1 - β &lt; 0.5 for typical effect sizes). A more rigorous protocol would require 30+ independent runs per algorithm. Exceeds our compute budget for GPU-intensive tasks but is within reach for cheap assessment tasks. We flag this as a gap (Section 8) and a future work item. When p-values are underpowered, where useful, we also report effect sizes as the difference in mean best fitness normalized by the pooled standard deviation across seeds, giving readers a scale-free sense of separation even.</w:t>
+        <w:t>We acknowledge the absence of formal statistical significance tests (e.g., Wilcoxon signed-rank, Mann-Whitney U) in what follows. For typical effect sizes), with only 3-5 seeds per algorithm, such tests have limited statistical power (1 - β &lt; 0.5. A more rigorous protocol would require 30+ independent runs per algorithm. Exceeds our compute budget for GPU-intensive tasks but is within reach for cheap assessment tasks. We flag this as a gap (Section 8) and a future work item. When p-values are underpowered, where useful, we also report effect sizes as the difference in mean best fitness normalized by the pooled standard deviation across seeds, giving readers a scale-free sense of separation even.</w:t>
       </w:r>
     </w:p>
     <w:p>
@@ -14287,7 +14089,7 @@
           <w:i w:val="0"/>
           <w:sz w:val="20"/>
         </w:rPr>
-        <w:t>The entire flow - from raw collections to final benchmarking report - executes within a single 12-hour Kaggle GPU session.</w:t>
+        <w:t>Our entire flow - from raw data pools to final benchmarking report - executes within a single 12-hour Kaggle GPU session.</w:t>
       </w:r>
     </w:p>
     <w:p>
@@ -14339,7 +14141,7 @@
           <w:i w:val="0"/>
           <w:sz w:val="20"/>
         </w:rPr>
-        <w:t>This section synthesizes empirical outcomes from the multilingual text classifier, vision and meme pipelines, dual-stream audio stack, and late multimodal fusion layer, with particular attention to calibration effects, cross-lingual variability, mode-specific error modes, and the comparative behavior of Bayesian versus population-based optimizers on surfaces induced by cached branch logits. Where appropriate, we relate magnitudes to known data pool artifacts - annotation smoothing between offensive and hateful classes, meme-style compositional semantics, and user-generated audio degradation - so that headline figures are interpreted as conditional on our fixed 80/10/10 split and T4-limited training budget rather than as language-universal constants [2], [3], [4], [20].</w:t>
+        <w:t>This section synthesizes empirical outcomes from the multilingual text classifier, vision and meme pipelines, dual-stream audio stack as well as late multimodal fusion layer, with particular attention to calibration effects, cross-lingual variability, pathway-specific error modes, plus the comparative behavior of Bayesian versus population-based optimizers on surfaces induced by cached branch logits. Where appropriate, we relate magnitudes to known collection artifacts - annotation smoothing between offensive and hateful classes, meme-style compositional semantics, and user-generated audio degradation - so that headline figures remain interpreted as conditional on our fixed 80/10/10 split and T4-limited training budget rather than as language-universal constants [2], [3], [4], [20].</w:t>
       </w:r>
     </w:p>
     <w:p>
@@ -14369,7 +14171,7 @@
           <w:i w:val="0"/>
           <w:sz w:val="20"/>
         </w:rPr>
-        <w:t>Our multilingual BERT head lands 0.74 top-1 correctness and 0.68 macro-F1 on the HateXplain-style three-way trial, indicating residual confusion between offensive and hateful micro-classes - a known annotation artifact in crowd-sourced social text [4], [8]. When the head is flattened to binary toxicity (offensive or hate vs. normal) at the default score cutoff τ = 0.5, performance rises to F1 ≈ 0.78 with precision 0.75 and recall 0.82, reflecting class skew toward toxic prevalence in micro-blogging samples [2], [3]. Simulated annealing cutoff search improves discrimination by nudging τ toward the validation-optimal operating point, yielding F1 ≈ 0.80, precision 0.82, and recall 0.78-a Pareto-favorable recalibration that trades a small recall decrement for materially higher precision on launch-scarce false-alarm budgets. When rare classes drive product risk; we therefore report both three-way and binary summaries, with the latter aligned to moderation consoles that collapse categories for actioning, macro-F1, as a simple average over classes, remains informative for multi-way hate/offense separation but understates operational harm.</w:t>
+        <w:t>Our multilingual BERT head notches 0.74 top-1 precision and 0.68 macro-F1 on the HateXplain-style three-way scoring, indicating residual confusion between offensive and hateful micro-classes - a known annotation artifact in crowd-sourced social text [4], [8]. When the head remains flattened to binary toxicity (offensive or hate vs. normal) at the default score cutoff τ = 0.5, performance rises to F1 ≈ 0.78 with precision 0.75 and recall 0.82, reflecting class skew toward toxic prevalence in micro-blogging samples [2], [3]. Simulated annealing boundary search improves discrimination by nudging τ toward the validation-optimal operating point, yielding F1 ≈ 0.80, precision 0.82 along with recall 0.78-a Pareto-favorable recalibration that trades a small recall decrement for materially higher precision on go-live-scarce false-alarm budgets. When rare classes drive product risk; we therefore report both three-way and binary summaries, with the latter aligned to moderation consoles that collapse categories for actioning, macro-F1, as a simple average over classes, remains informative for multi-way hate/offense separation but understates operational harm.</w:t>
       </w:r>
     </w:p>
     <w:p>
@@ -14385,7 +14187,7 @@
           <w:i w:val="0"/>
           <w:sz w:val="20"/>
         </w:rPr>
-        <w:t>From a representation standpoint, multilingual BERT supplies shared subword units across English, German, and code-mixed Hindi-English, yet the empirical density of each language in pre-training is uneven [37]. That asymmetry predictably induces heterogeneous per-language calibration: high-resource English subsets benefit from richer contextual priors, whereas German and Romanized Hindi tokens occupy comparatively sparse neighborhoods in embedding space. Annotation norms compound the effect: German refugee-crisis corpora carries documented label instability at the offensive-hateful boundary [47], and Hindi-English social text introduces script mixing and transliteration patterns that fragment lexical evidence across token boundaries [46]. Such factors motivate reporting binary text performance not only on the merged trial pool but also on language-stratified slices, isolating whether gains ascribed to "multilingual fine-tuning" truly generalize or by and large track English-majority behavior.</w:t>
+        <w:t>From a representation standpoint, multilingual BERT supplies shared subword units across English, German, and code-mixed Hindi-English, yet the empirical density of each language in pre-training remains uneven [37]. That asymmetry predictably induces heterogeneous per-language calibration: high-resource English subsets benefit from richer contextual priors, whereas German and Romanized Hindi tokens occupy comparatively sparse neighborhoods in embedding space. Annotation norms compound the effect: German refugee-crisis corpora carries documented label instability at the offensive-hateful boundary [47], and Hindi-English social text introduces script mixing and transliteration patterns that fragment lexical evidence across token boundaries [46]. Several factors motivate reporting binary text performance not only on the merged scoring pool but also on language-stratified slices, isolating whether gains ascribed to "multilingual fine-tuning" truly generalize or by and large track English-majority behavior.</w:t>
       </w:r>
     </w:p>
     <w:p>
@@ -14987,7 +14789,7 @@
           <w:i w:val="0"/>
           <w:sz w:val="20"/>
         </w:rPr>
-        <w:t>To assess multilingual robustness, we evaluate the binary text head separately on each language subset of the test split. Results (Table V) reveal that performance is highest on English-dominant subsets (HateXplain and Berkeley). Pre-training data density provides strong contextual representations. German performance is lower, reflecting both the reduced pre-training coverage of German in multilingual BERT's vocabulary and the annotation ambiguity documented by Ross et al. [47]. Hindi-English code-mixed text presents the greatest pain point, with F1 close to four points below the English baseline, attributable to code-switching patterns that split semantic units across scripts and to Latin-script transliterations that are poorly aligned with mBERT's WordPiece inventory [37], [46].</w:t>
+        <w:t>To assess multilingual robustness, we evaluate the binary text head separately on each language subset of the test split. Results (Table V) reveal that performance is highest on English-dominant subsets (HateXplain and Berkeley). Pre-training data density provides strong contextual representations. German performance remains lower, reflecting both the reduced pre-training coverage of German in multilingual BERT's vocabulary and the annotation ambiguity documented by Ross et al. [47]. Hindi-English code-mixed text presents the greatest pain point, with F1 close to four points below the English baseline, attributable to code-switching patterns that split semantic units across scripts and to Latin-script transliterations that are poorly aligned with mBERT's WordPiece inventory [37], [46].</w:t>
       </w:r>
     </w:p>
     <w:p>
@@ -15608,7 +15410,7 @@
           <w:i w:val="0"/>
           <w:sz w:val="16"/>
         </w:rPr>
-        <w:t>Fig. 18: Per-language binary text classification performance with SA-tuned red line. English pulls off the highest F1 (0.82); Hindi-English code-mixed text shows the largest gap (F1 = 0.74), attributable to script mixing and transliteration headaches.</w:t>
+        <w:t>Fig. 18: Per-language binary text classification performance with SA-tuned red line. English pulls off the highest F1 (0.82); Hindi-English code-mixed text reveals the largest gap (F1 = 0.74), attributable to script mixing and transliteration headaches.</w:t>
       </w:r>
     </w:p>
     <w:p>
@@ -15640,7 +15442,7 @@
           <w:i w:val="0"/>
           <w:sz w:val="20"/>
         </w:rPr>
-        <w:t>Qualitatively, errors cluster around reclaimed slurs, sarcastic quotation, and meta-discourse about toxicity (e.g., reports or denials of hate), where surface n-grams resemble abuse absent speaker intent. Square-root dampened class weights and focal loss reduce the dominance of easy negatives but don't inject pragmatic world knowledge; hence high macro-F1 on three-way tasks should be read together with per-class precision curves when models inform automated actions [30].</w:t>
+        <w:t>Qualitatively, errors cluster around reclaimed slurs, sarcastic quotation, together with meta-discourse about toxicity (e.g., reports or denials of hate), where surface n-grams resemble abuse absent speaker intent. Square-root dampened class weights and focal loss reduce the dominance of easy negatives but don't inject pragmatic world knowledge; hence high macro-F1 on three-way tasks should be read together with per-class precision curves when models inform automated actions [30].</w:t>
       </w:r>
     </w:p>
     <w:p>
@@ -16138,7 +15940,7 @@
           <w:i w:val="0"/>
           <w:sz w:val="20"/>
         </w:rPr>
-        <w:t>Examining individual predictions reveals systematic patterns in vision flow errors. Zero-shot CLIP consistently fails on memes where the hateful interpretation requires cultural or contextual knowledge absent from CLIP's web-crawled pre-training (e.g., memes referencing specific political figures or regional slurs). HateCLIPper partially overcomes these gaps through fine-tuning on Hateful Memes examples but struggles with memes where the image is a benign photograph and all hateful content resides in overlaid text - a case better handled by the OCR-augmented text branch. By contrast, HateCLIPper correctly identifies hate in memes where the visual element (e.g., a dehumanizing comparison between a person and an animal) carries the primary hateful signal, and the text overlay is neutral or even misleading. Several cases bring out functional complementarity between frozen-caption-style supervision and task-specific adaptation [19], [28], [41].</w:t>
+        <w:t>Examining individual predictions reveals systematic patterns in vision flow errors. Zero-shot CLIP consistently fails on memes where the hateful interpretation calls for cultural or contextual knowledge absent from CLIP's web-crawled pre-training (e.g., memes referencing specific political figures or regional slurs). In overlaid text - a case better handled by the OCR-augmented text branch, hateCLIPper partially overcomes these gaps through fine-tuning on Hateful Memes examples but struggles with memes where the image is a benign photograph and all hateful content resides. By contrast, HateCLIPper correctly identifies hate in memes where the visual element (e.g., a dehumanizing comparison between a person and an animal) carries the primary hateful signal, and the text overlay is neutral or even misleading. Several cases bring out functional complementarity between frozen-caption-style supervision and task-specific adaptation [19], [28], [41].</w:t>
       </w:r>
     </w:p>
     <w:p>
@@ -16154,7 +15956,7 @@
           <w:i w:val="0"/>
           <w:sz w:val="20"/>
         </w:rPr>
-        <w:t>nearly 78% of Hateful Memes contain extractable text via EasyOCR, with a median approximate character error rate of 8% due to varied font styles, low resolution, and text over complex backgrounds. When OCR succeeds cleanly (character error rate below 5%), the text+vision fused F1 improves by close to 0.04 over vision-only, confirming that embedded text provides complementary signal. When OCR fails noticeably (character error rate above 20%, nearly 15% of memes), the injected noise slightly degrades fusion performance, motivating a confidence-gated tack analogous in spirit to transcript gating in the audio pathway: uncorrected strings shouldn't enter fusion with equal weight to digitally authored text.</w:t>
+        <w:t>nearly 78% of Hateful Memes contain extractable text via EasyOCR, with a median approximate character error rate of 8% due to varied font styles, low resolution, and text over complex backgrounds. When OCR succeeds cleanly (character error rate below 5%), the text+vision fused F1 improves by close to 0.04 over vision-only, confirming that embedded text provides complementary signal. When OCR fails noticeably (character error rate above 20%, nearly 15% of memes), the injected noise slightly degrades fusion performance, motivating a confidence-gated game plan analogous in spirit to transcript gating in the audio pathway: uncorrected strings shouldn't enter fusion with equal weight to digitally authored text.</w:t>
       </w:r>
     </w:p>
     <w:p>
@@ -16184,7 +15986,7 @@
           <w:i w:val="0"/>
           <w:sz w:val="20"/>
         </w:rPr>
-        <w:t>While the Wav2Vec 2.0 acoustic classifier alone lands F1 ≈ 0.56 (precision 0.60, recall 0.53), on the HateMM audio partition, transcript-conditioned text classification (Whisper + mBERT) attains F1 ≈ 0.58 (precision 0.55, recall 0.62). A calibrated union of both audio pathways - mirroring the dual-stream design advocated for noisy user-generated speech [26], [27]-raises F1 to ≈ 0.61, confirming that lexically transcribed toxicity and speaker-level affect carry partially decoupled evidence. Such magnitudes are necessarily more tentative than text-side figures because the annotated audio corpus is smaller and because label acquisition for video hate is costlier and noisier than for static posts [45].</w:t>
+        <w:t>While the Wav2Vec 2.0 acoustic classifier alone lands F1 ≈ 0.56 (precision 0.60, recall 0.53), on the HateMM audio partition, transcript-conditioned text classification (Whisper + mBERT) attains F1 ≈ 0.58 (precision 0.55, recall 0.62). At lexically transcribed toxicity and speaker-level affect carry partially decoupled evidence, a calibrated union of both audio pathways - mirroring the dual-stream design advocated for noisy user-generated speech [26], [27]-raises F1 to ≈ 0.61, confirming th. Such magnitudes are necessarily more tentative than text-side figures because the annotated audio corpus is smaller and because label acquisition for video hate is costlier and noisier than for static posts [45].</w:t>
       </w:r>
     </w:p>
     <w:p>
@@ -16200,7 +16002,7 @@
           <w:i w:val="0"/>
           <w:sz w:val="20"/>
         </w:rPr>
-        <w:t>On a manually verified subset of 50 HateMM samples, Whisper-small notches an estimated word error rate (WER) of around 22%-sizably higher than its benchmarked performance on clean read speech, reflecting noisy, overlapping-speaker, and background-music conditions typical of social media video. Crucially, transcription errors disproportionately affect hate-bearing words, which tend to be non-standard vocabulary (slurs, code-words) outside Whisper's training distribution. This partially explains why the acoustic branch (Wav2Vec2) sometimes beats the transcript branch on hate-specific measures: acoustic characteristics capture prosodic aggression markers (raised pitch, increased volume, aggressive rhythm) that don't depend on lexical precision [26].</w:t>
+        <w:t>On a manually verified subset of 50 HateMM samples, Whisper-small nets an estimated word error rate (WER) of around 22%-sizably higher than its benchmarked performance on clean read speech, reflecting noisy, overlapping-speaker coupled with background-music conditions typical of social media video. Crucially, transcription errors disproportionately affect hate-bearing words, which tend to be non-standard vocabulary (slurs, code-words) outside Whisper's training distribution. One such partially explains why the acoustic branch (Wav2Vec2) sometimes tops the transcript branch on hate-specific gauges: acoustic aspects capture prosodic aggression markers (raised pitch, increased volume, aggressive rhythm) that don't depend on lexical correctness [26].</w:t>
       </w:r>
     </w:p>
     <w:p>
@@ -16216,7 +16018,7 @@
           <w:i w:val="0"/>
           <w:sz w:val="20"/>
         </w:rPr>
-        <w:t>A given dual audio streams bears complementary error patterns. While the acoustic branch independently catches 61% of these, the transcript branch correctly identifies 73% of hateful samples that contain explicit slurs in the audio. However, for implicit hate conveyed through tone or context rather than explicit vocabulary, the acoustic branch reaches 42% detection compared to the transcript branch's 28%. The combined audio pathway recovers 81% of hateful samples, illustrating that lexical and prosodic evidence are partially decorrelated - a finding consistent with multimodal redundancy arguments for short-form video hate [45].</w:t>
+        <w:t>A given dual audio streams bears complementary error patterns. While the acoustic branch independently catches 61% of these, the transcript branch correctly identifies 73% of hateful samples that contain explicit slurs in the audio. However, for implicit hate conveyed through tone or context rather than explicit vocabulary, the acoustic branch reaches 42% detection compared to the transcript branch's 28%. The combined audio pathway recovers 81% of hateful samples, illustrating that lexical and prosodic evidence remain partially decorrelated - a finding consistent with multimodal redundancy arguments for short-form video hate [45].</w:t>
       </w:r>
     </w:p>
     <w:p>
@@ -16237,7 +16039,7 @@
           <w:i w:val="0"/>
           <w:sz w:val="16"/>
         </w:rPr>
-        <w:t>Fig. 7: F1 score by individual channel and fusion configurations. Text dominates as a unimodal branch; audio fusion provides the next-largest lift; supervised vision edges out zero-shot; and SA-optimized five-branch fusion nets the highest overall F1.</w:t>
+        <w:t>Fig. 7: F1 score by individual channel and fusion configurations. Text dominates as a unimodal branch; audio fusion offers the next-largest lift; supervised vision edges out zero-shot; and SA-optimized five-branch fusion nets the highest overall F1.</w:t>
       </w:r>
     </w:p>
     <w:p>
@@ -16267,7 +16069,7 @@
           <w:i w:val="0"/>
           <w:sz w:val="20"/>
         </w:rPr>
-        <w:t>Although vision remains valuable when textual cues are truncated, branch ablations on the capped development draw reveal a consistent ranking: text dominates, audio fusion delivers the next largest lift, and supervised vision beats zero-shot vision. Because it over-emphasizes weaker zero-shot scores, equal weighting across branches (0.20 each) degrades performance relative to heuristic or optimized allocations. Optuna-optimized continuous weights pulled off F1 ≈ 0.526 in the logged notebook session - below the hand-tuned preset - highlighting noisy validation surfaces for five-dimensional weight simplices. Post-hoc SA calibration on fused probabilities recovers F1 ≈ 0.674, bringing out that cutoff mismatch, not only weight mismatch, explains much real-world multimodal degradation. Our gap between Bayesian-inspired TPE and manual presets isn't an indictment of automatic search per se; rather, it signals that small validation shards induce high-variance estimates of fusion utility, an issue addressed more aggressively in Section 6.5 through population-based exploration and in Section 7 through ablations over branch ordering.</w:t>
+        <w:t>Although vision remains valuable when textual cues are truncated, branch ablations on the capped development draw reveal a consistent ranking: text dominates, audio fusion produces the next largest lift coupled with supervised vision bests zero-shot vision. Because it over-emphasizes weaker zero-shot scores, equal weighting across branches (0.20 each) degrades performance relative to heuristic or optimized allocations. Optuna-optimized continuous weights landed F1 ≈ 0.526 in the logged notebook session - below the hand-tuned preset - highlighting noisy validation surfaces for five-dimensional weight simplices. Post-hoc SA calibration on fused probabilities recovers F1 ≈ 0.674, bringing out that bar mismatch, not only weight mismatch, explains much real-world multimodal degradation. Our gap between Bayesian-inspired TPE and manual presets isn't an indictment of automatic search per se; rather, it signals that small validation shards induce high-variance estimates of fusion utility, an issue addressed more aggressively in Section 6.5 through population-based exploration and in Section 7 through ablations over branch ordering.</w:t>
       </w:r>
     </w:p>
     <w:p>
@@ -17534,7 +17336,7 @@
           <w:i w:val="0"/>
           <w:sz w:val="20"/>
         </w:rPr>
-        <w:t>Naive addition of all branches degrades performance when weaker branches (vision zero-shot) dilute stronger signals, according to the incremental analysis. Weight optimization partially repairs this effect, but probability calibration at the decision red line remains decisive: the SA-optimized boundary recovers and exceeds the text-only baseline, confirming that the optimization layer is essential for realizing the potential of multimodal fusion.</w:t>
+        <w:t>Naive addition of all branches degrades performance when weaker branches (vision zero-shot) dilute stronger signals, according to the incremental analysis. For realizing the potential of multimodal fusion, weight optimization partially repairs this effect, but probability calibration at the decision red line remains decisive: the SA-optimized boundary recovers and exceeds the text-only baseline, confirming that the optimization layer is essential.</w:t>
       </w:r>
     </w:p>
     <w:p>
@@ -17555,7 +17357,7 @@
           <w:i w:val="0"/>
           <w:sz w:val="16"/>
         </w:rPr>
-        <w:t>Fig. 4: Simulated annealing convergence for post-hoc cutoff optimization on fused multimodal probabilities. The cooling schedule progressively narrows the search, converging to the validation-optimal boundary.</w:t>
+        <w:t>Fig. 4: Simulated annealing convergence for post-hoc cutoff optimization on fused multimodal probabilities. Our cooling schedule progressively narrows the search, converging to the validation-optimal cutoff.</w:t>
       </w:r>
     </w:p>
     <w:p>
@@ -18523,7 +18325,7 @@
           <w:i w:val="0"/>
           <w:sz w:val="20"/>
         </w:rPr>
-        <w:t>The Optuna-optimized weights (F1 0.526) fall below the hand-tuned preset (F1 ≈ 0.62 on text-only within the fusion grid) because the five-dimensional weight simplex presents a noisy fitness surface when evaluated on only 500 development items. When evaluations are ordinal-correlated and high-variance, with 40 trials, the tree-structured Parzen estimator underlying TPE explores roughly 40 / 51.5 ≈ 3.6 configurations per effective dimension, insufficient for reliable density estimation. This is precisely the regime where population-based methods - maintaining on the order of 30 simultaneous candidates - provide an advantage through implicit regularization of the search distribution and resistance to premature concentration on spurious fitness spikes [22], [23], [25].</w:t>
+        <w:t>The Optuna-optimized weights (F1 0.526) fall below the hand-tuned preset (F1 ≈ 0.62 on text-only within the fusion grid) because the five-dimensional weight simplex presents a noisy fitness surface when evaluated on only 500 development items. When evaluations are ordinal-correlated and high-variance, with 40 trials, the tree-structured Parzen estimator underlying TPE probes roughly 40 / 51.5 ≈ 3.6 configurations per effective dimension, insufficient for reliable density estimation. Such a is precisely the regime where population-based methods - maintaining on the order of 30 simultaneous candidates - provide an advantage through implicit regularization of the search distribution and resistance to premature concentration on spurious fitness spikes [22], [23], [25].</w:t>
       </w:r>
     </w:p>
     <w:p>
@@ -18539,8 +18341,47 @@
           <w:i w:val="0"/>
           <w:sz w:val="20"/>
         </w:rPr>
-        <w:t>Fusion weights (five continuous dimensions, cheap replay):</w:t>
-      </w:r>
+        <w:t>Fusion weights (five continuous dimensions, cheap replay): DE [22] hits the highest observed validation F1 (≈ 0.541; mean 0.534, std 0.006), narrowly edging PSO [23] (best 0.536, mean 0.530, std 0.008) and GWO [21] (best 0.532, mean 0.525, std 0.010). At evolutionary perturbation maintains diversity in weight space where tree-structured priors may prematurely concentrate mass [14], [25], all three exceed the Optuna TPE snapshot (0.526), reaffirming th.</w:t>
+      </w:r>
+    </w:p>
+    <w:p>
+      <w:pPr>
+        <w:ind w:firstLine="288"/>
+        <w:jc w:val="both"/>
+        <w:spacing w:before="0" w:after="40" w:line="240" w:lineRule="auto"/>
+      </w:pPr>
+      <w:r>
+        <w:rPr>
+          <w:rFonts w:ascii="Times New Roman" w:hAnsi="Times New Roman"/>
+          <w:b/>
+          <w:i w:val="0"/>
+          <w:sz w:val="20"/>
+        </w:rPr>
+        <w:t>Red line optimization (single dimension): PSO, DE, GWO coupled with FA [24] each converge to τ ≈ 0.482, matching SA [29], differing chiefly in iteration counts (PSO ≈ 15, DE ≈ 20, GWO ≈ 25, FA ≈ 30). Our equivalence of optima corroborates unimodality along this slice while motivating faster swarm-based warm starts in iterative dashboards.</w:t>
+      </w:r>
+    </w:p>
+    <w:p>
+      <w:pPr>
+        <w:ind w:firstLine="288"/>
+        <w:jc w:val="both"/>
+        <w:spacing w:before="0" w:after="40" w:line="240" w:lineRule="auto"/>
+      </w:pPr>
+      <w:r>
+        <w:rPr>
+          <w:rFonts w:ascii="Times New Roman" w:hAnsi="Times New Roman"/>
+          <w:b/>
+          <w:i w:val="0"/>
+          <w:sz w:val="20"/>
+        </w:rPr>
+        <w:t>Branch selection (31 doable masks): Exhaustive search certifies the global optimum among tested combinations. GA, PSO, DE, plus GWO each rediscover the best three-active-branch pattern within 10-15 iterations, indicating low deceptive linkage between bitmask semantics and validation F1 for cached logits - an encouraging sign for future discrete-continuous hybrid training [14], [16].</w:t>
+      </w:r>
+    </w:p>
+    <w:p>
+      <w:pPr>
+        <w:ind w:firstLine="288"/>
+        <w:jc w:val="both"/>
+        <w:spacing w:before="0" w:after="40" w:line="240" w:lineRule="auto"/>
+      </w:pPr>
       <w:r>
         <w:rPr>
           <w:rFonts w:ascii="Times New Roman" w:hAnsi="Times New Roman"/>
@@ -18548,325 +18389,7 @@
           <w:i w:val="0"/>
           <w:sz w:val="20"/>
         </w:rPr>
-        <w:t xml:space="preserve"> </w:t>
-      </w:r>
-      <w:r>
-        <w:rPr>
-          <w:rFonts w:ascii="Times New Roman" w:hAnsi="Times New Roman"/>
-          <w:b/>
-          <w:i w:val="0"/>
-          <w:sz w:val="20"/>
-        </w:rPr>
-        <w:t>DE</w:t>
-      </w:r>
-      <w:r>
-        <w:rPr>
-          <w:rFonts w:ascii="Times New Roman" w:hAnsi="Times New Roman"/>
-          <w:b w:val="0"/>
-          <w:i w:val="0"/>
-          <w:sz w:val="20"/>
-        </w:rPr>
-        <w:t xml:space="preserve"> [22] attains the highest observed validation </w:t>
-      </w:r>
-      <w:r>
-        <w:rPr>
-          <w:rFonts w:ascii="Times New Roman" w:hAnsi="Times New Roman"/>
-          <w:b/>
-          <w:i w:val="0"/>
-          <w:sz w:val="20"/>
-        </w:rPr>
-        <w:t>F1</w:t>
-      </w:r>
-      <w:r>
-        <w:rPr>
-          <w:rFonts w:ascii="Times New Roman" w:hAnsi="Times New Roman"/>
-          <w:b w:val="0"/>
-          <w:i w:val="0"/>
-          <w:sz w:val="20"/>
-        </w:rPr>
-        <w:t xml:space="preserve"> (</w:t>
-      </w:r>
-      <w:r>
-        <w:rPr>
-          <w:rFonts w:ascii="Times New Roman" w:hAnsi="Times New Roman"/>
-          <w:b/>
-          <w:i w:val="0"/>
-          <w:sz w:val="20"/>
-        </w:rPr>
-        <w:t>≈ 0.541</w:t>
-      </w:r>
-      <w:r>
-        <w:rPr>
-          <w:rFonts w:ascii="Times New Roman" w:hAnsi="Times New Roman"/>
-          <w:b w:val="0"/>
-          <w:i w:val="0"/>
-          <w:sz w:val="20"/>
-        </w:rPr>
-        <w:t xml:space="preserve">; mean </w:t>
-      </w:r>
-      <w:r>
-        <w:rPr>
-          <w:rFonts w:ascii="Times New Roman" w:hAnsi="Times New Roman"/>
-          <w:b/>
-          <w:i w:val="0"/>
-          <w:sz w:val="20"/>
-        </w:rPr>
-        <w:t>0.534</w:t>
-      </w:r>
-      <w:r>
-        <w:rPr>
-          <w:rFonts w:ascii="Times New Roman" w:hAnsi="Times New Roman"/>
-          <w:b w:val="0"/>
-          <w:i w:val="0"/>
-          <w:sz w:val="20"/>
-        </w:rPr>
-        <w:t xml:space="preserve">, std </w:t>
-      </w:r>
-      <w:r>
-        <w:rPr>
-          <w:rFonts w:ascii="Times New Roman" w:hAnsi="Times New Roman"/>
-          <w:b/>
-          <w:i w:val="0"/>
-          <w:sz w:val="20"/>
-        </w:rPr>
-        <w:t>0.006</w:t>
-      </w:r>
-      <w:r>
-        <w:rPr>
-          <w:rFonts w:ascii="Times New Roman" w:hAnsi="Times New Roman"/>
-          <w:b w:val="0"/>
-          <w:i w:val="0"/>
-          <w:sz w:val="20"/>
-        </w:rPr>
-        <w:t xml:space="preserve">), narrowly edging </w:t>
-      </w:r>
-      <w:r>
-        <w:rPr>
-          <w:rFonts w:ascii="Times New Roman" w:hAnsi="Times New Roman"/>
-          <w:b/>
-          <w:i w:val="0"/>
-          <w:sz w:val="20"/>
-        </w:rPr>
-        <w:t>PSO</w:t>
-      </w:r>
-      <w:r>
-        <w:rPr>
-          <w:rFonts w:ascii="Times New Roman" w:hAnsi="Times New Roman"/>
-          <w:b w:val="0"/>
-          <w:i w:val="0"/>
-          <w:sz w:val="20"/>
-        </w:rPr>
-        <w:t xml:space="preserve"> [23] (</w:t>
-      </w:r>
-      <w:r>
-        <w:rPr>
-          <w:rFonts w:ascii="Times New Roman" w:hAnsi="Times New Roman"/>
-          <w:b/>
-          <w:i w:val="0"/>
-          <w:sz w:val="20"/>
-        </w:rPr>
-        <w:t>best 0.536</w:t>
-      </w:r>
-      <w:r>
-        <w:rPr>
-          <w:rFonts w:ascii="Times New Roman" w:hAnsi="Times New Roman"/>
-          <w:b w:val="0"/>
-          <w:i w:val="0"/>
-          <w:sz w:val="20"/>
-        </w:rPr>
-        <w:t xml:space="preserve">, mean </w:t>
-      </w:r>
-      <w:r>
-        <w:rPr>
-          <w:rFonts w:ascii="Times New Roman" w:hAnsi="Times New Roman"/>
-          <w:b/>
-          <w:i w:val="0"/>
-          <w:sz w:val="20"/>
-        </w:rPr>
-        <w:t>0.530</w:t>
-      </w:r>
-      <w:r>
-        <w:rPr>
-          <w:rFonts w:ascii="Times New Roman" w:hAnsi="Times New Roman"/>
-          <w:b w:val="0"/>
-          <w:i w:val="0"/>
-          <w:sz w:val="20"/>
-        </w:rPr>
-        <w:t xml:space="preserve">, std </w:t>
-      </w:r>
-      <w:r>
-        <w:rPr>
-          <w:rFonts w:ascii="Times New Roman" w:hAnsi="Times New Roman"/>
-          <w:b/>
-          <w:i w:val="0"/>
-          <w:sz w:val="20"/>
-        </w:rPr>
-        <w:t>0.008</w:t>
-      </w:r>
-      <w:r>
-        <w:rPr>
-          <w:rFonts w:ascii="Times New Roman" w:hAnsi="Times New Roman"/>
-          <w:b w:val="0"/>
-          <w:i w:val="0"/>
-          <w:sz w:val="20"/>
-        </w:rPr>
-        <w:t xml:space="preserve">) and </w:t>
-      </w:r>
-      <w:r>
-        <w:rPr>
-          <w:rFonts w:ascii="Times New Roman" w:hAnsi="Times New Roman"/>
-          <w:b/>
-          <w:i w:val="0"/>
-          <w:sz w:val="20"/>
-        </w:rPr>
-        <w:t>GWO</w:t>
-      </w:r>
-      <w:r>
-        <w:rPr>
-          <w:rFonts w:ascii="Times New Roman" w:hAnsi="Times New Roman"/>
-          <w:b w:val="0"/>
-          <w:i w:val="0"/>
-          <w:sz w:val="20"/>
-        </w:rPr>
-        <w:t xml:space="preserve"> [21] (</w:t>
-      </w:r>
-      <w:r>
-        <w:rPr>
-          <w:rFonts w:ascii="Times New Roman" w:hAnsi="Times New Roman"/>
-          <w:b/>
-          <w:i w:val="0"/>
-          <w:sz w:val="20"/>
-        </w:rPr>
-        <w:t>best 0.532</w:t>
-      </w:r>
-      <w:r>
-        <w:rPr>
-          <w:rFonts w:ascii="Times New Roman" w:hAnsi="Times New Roman"/>
-          <w:b w:val="0"/>
-          <w:i w:val="0"/>
-          <w:sz w:val="20"/>
-        </w:rPr>
-        <w:t xml:space="preserve">, mean </w:t>
-      </w:r>
-      <w:r>
-        <w:rPr>
-          <w:rFonts w:ascii="Times New Roman" w:hAnsi="Times New Roman"/>
-          <w:b/>
-          <w:i w:val="0"/>
-          <w:sz w:val="20"/>
-        </w:rPr>
-        <w:t>0.525</w:t>
-      </w:r>
-      <w:r>
-        <w:rPr>
-          <w:rFonts w:ascii="Times New Roman" w:hAnsi="Times New Roman"/>
-          <w:b w:val="0"/>
-          <w:i w:val="0"/>
-          <w:sz w:val="20"/>
-        </w:rPr>
-        <w:t xml:space="preserve">, std </w:t>
-      </w:r>
-      <w:r>
-        <w:rPr>
-          <w:rFonts w:ascii="Times New Roman" w:hAnsi="Times New Roman"/>
-          <w:b/>
-          <w:i w:val="0"/>
-          <w:sz w:val="20"/>
-        </w:rPr>
-        <w:t>0.010</w:t>
-      </w:r>
-      <w:r>
-        <w:rPr>
-          <w:rFonts w:ascii="Times New Roman" w:hAnsi="Times New Roman"/>
-          <w:b w:val="0"/>
-          <w:i w:val="0"/>
-          <w:sz w:val="20"/>
-        </w:rPr>
-        <w:t xml:space="preserve">). All three exceed the </w:t>
-      </w:r>
-      <w:r>
-        <w:rPr>
-          <w:rFonts w:ascii="Times New Roman" w:hAnsi="Times New Roman"/>
-          <w:b/>
-          <w:i w:val="0"/>
-          <w:sz w:val="20"/>
-        </w:rPr>
-        <w:t>Optuna TPE</w:t>
-      </w:r>
-      <w:r>
-        <w:rPr>
-          <w:rFonts w:ascii="Times New Roman" w:hAnsi="Times New Roman"/>
-          <w:b w:val="0"/>
-          <w:i w:val="0"/>
-          <w:sz w:val="20"/>
-        </w:rPr>
-        <w:t xml:space="preserve"> snapshot (</w:t>
-      </w:r>
-      <w:r>
-        <w:rPr>
-          <w:rFonts w:ascii="Times New Roman" w:hAnsi="Times New Roman"/>
-          <w:b/>
-          <w:i w:val="0"/>
-          <w:sz w:val="20"/>
-        </w:rPr>
-        <w:t>0.526</w:t>
-      </w:r>
-      <w:r>
-        <w:rPr>
-          <w:rFonts w:ascii="Times New Roman" w:hAnsi="Times New Roman"/>
-          <w:b w:val="0"/>
-          <w:i w:val="0"/>
-          <w:sz w:val="20"/>
-        </w:rPr>
-        <w:t>), reaffirming that evolutionary perturbation maintains diversity in weight space where tree-structured priors may prematurely concentrate mass [14], [25].</w:t>
-      </w:r>
-    </w:p>
-    <w:p>
-      <w:pPr>
-        <w:ind w:firstLine="288"/>
-        <w:jc w:val="both"/>
-        <w:spacing w:before="0" w:after="40" w:line="240" w:lineRule="auto"/>
-      </w:pPr>
-      <w:r>
-        <w:rPr>
-          <w:rFonts w:ascii="Times New Roman" w:hAnsi="Times New Roman"/>
-          <w:b/>
-          <w:i w:val="0"/>
-          <w:sz w:val="20"/>
-        </w:rPr>
-        <w:t>Boundary optimization (single dimension): PSO, DE, GWO, and FA [24] each converge to τ ≈ 0.482, matching SA [29], differing chiefly in iteration counts (PSO ≈ 15, DE ≈ 20, GWO ≈ 25, FA ≈ 30). While motivating faster swarm-based warm starts in iterative dashboards, the equivalence of optima corroborates unimodality along this slice.</w:t>
-      </w:r>
-    </w:p>
-    <w:p>
-      <w:pPr>
-        <w:ind w:firstLine="288"/>
-        <w:jc w:val="both"/>
-        <w:spacing w:before="0" w:after="40" w:line="240" w:lineRule="auto"/>
-      </w:pPr>
-      <w:r>
-        <w:rPr>
-          <w:rFonts w:ascii="Times New Roman" w:hAnsi="Times New Roman"/>
-          <w:b/>
-          <w:i w:val="0"/>
-          <w:sz w:val="20"/>
-        </w:rPr>
-        <w:t>Branch selection (31 workable masks): Exhaustive search certifies the global optimum among tested combinations. GA, PSO, DE, and GWO each rediscover the best three-active-branch pattern within 10-15 iterations, indicating low deceptive linkage between bitmask semantics and validation F1 for cached logits - an encouraging sign for future discrete-continuous hybrid training [14], [16].</w:t>
-      </w:r>
-    </w:p>
-    <w:p>
-      <w:pPr>
-        <w:ind w:firstLine="288"/>
-        <w:jc w:val="both"/>
-        <w:spacing w:before="0" w:after="40" w:line="240" w:lineRule="auto"/>
-      </w:pPr>
-      <w:r>
-        <w:rPr>
-          <w:rFonts w:ascii="Times New Roman" w:hAnsi="Times New Roman"/>
-          <w:b w:val="0"/>
-          <w:i w:val="0"/>
-          <w:sz w:val="20"/>
-        </w:rPr>
-        <w:t>When fitness aggregates F1, precision, and precision under a composite score, on the 144-dimensional binary head-selection problem, GA and GWO discover that close to 55-65% of attention heads can be masked without degrading binary F1 below the full-model baseline. The best head mask found by GA retains 78 of 144 heads (54%) while achieving a composite fitness of 0.71, compared to 0.73 for the full model - a modest 2.7% degradation in exchange for 46% structural sparsity, supporting the view that hate detection leans on on a dispersed rather than strictly localized subset of attentional channels [18], [38].</w:t>
+        <w:t>When fitness aggregates F1, precision, plus correctness under a composite score, on the 144-dimensional binary head-selection problem, GA and GWO discover that close to 55-65% of attention heads can be masked without degrading binary F1 below the full-model baseline. Our best head mask found by GA retains 78 of 144 heads (54%) while achieving a composite fitness of 0.71, compared to 0.73 for the full model - a modest 2.7% degradation in exchange for 46% structural sparsity, supporting the view that hate detection counts on on a dispersed rather than strictly localized subset of attentional channels [18], [38].</w:t>
       </w:r>
     </w:p>
     <w:p>
@@ -19702,7 +19225,7 @@
           <w:i w:val="0"/>
           <w:sz w:val="20"/>
         </w:rPr>
-        <w:t>Both GA and BPSO improve over the full-aspect LinearSVC baseline, confirming that TF-IDF aspect spaces contain hefty redundancy for hate detection. GA's tighter selection (41% of characteristics) suggests more aggressive pruning without quality loss.</w:t>
+        <w:t>Both GA and BPSO improve over the full-aspect LinearSVC baseline, confirming that TF-IDF aspect spaces contain hefty redundancy for hate detection. GA's tighter selection (41% of characteristics) hints more aggressive pruning without quality loss.</w:t>
       </w:r>
     </w:p>
     <w:p>
@@ -20548,7 +20071,7 @@
           <w:i w:val="0"/>
           <w:sz w:val="20"/>
         </w:rPr>
-        <w:t>DE and Optuna achieve comparable peak performance, but DE requires 12 × (1+15) = 192 evaluations across three seeds (64 per seed) versus Optuna's 15 trials for the logged comparison. The population-based angle parallelizes naturally on multi-GPU systems, whereas TPE is by its very nature sequential [25].</w:t>
+        <w:t>For the logged comparison, dE and Optuna achieve comparable peak performance, but DE requires 12 × (1+15) = 192 evaluations across three seeds (64 per seed) versus Optuna's 15 trials. The population-based angle parallelizes naturally on multi-GPU systems, whereas TPE is by its very nature sequential [25].</w:t>
       </w:r>
     </w:p>
     <w:p>
@@ -20974,7 +20497,7 @@
           <w:i w:val="0"/>
           <w:sz w:val="20"/>
         </w:rPr>
-        <w:t>Interpretation. DE's self-adaptive mutation scales explain its edge on continuous fusion simplices [22]. PSO remains competitive in low-dimensional settings [23], while GWO's leader hierarchy softens stagnation relative to canonical PSO variants [21]. FA's O(n2) attractor coupling is acceptable only for scalar cutoff tuning [24]. Crucially, no single metaheuristic universally dominates; instead, algorithm choice should track problem dimensionality, scoring cost, and noise level - precisely the axis along which we partitioned tasks in the build-out roadmap.</w:t>
+        <w:t>Interpretation. DE's self-adaptive mutation scales explain its edge on continuous fusion simplices [22]. PSO remains competitive in low-dimensional settings [23], while GWO's leader hierarchy softens stagnation relative to canonical PSO variants [21]. FA's O(n2) attractor coupling remains acceptable only for scalar cutoff tuning [24]. Crucially, no single metaheuristic universally dominates; instead, algorithm choice should track problem dimensionality, scoring cost along with noise level - precisely the axis along which we partitioned tasks in the realization roadmap.</w:t>
       </w:r>
     </w:p>
     <w:p>
@@ -21016,7 +20539,7 @@
           <w:i w:val="0"/>
           <w:sz w:val="16"/>
         </w:rPr>
-        <w:t>Fig. 8: Box plots of best fitness across five seeds for each metaheuristic on the fusion weight and red line tasks. DE bears the tightest interquartile range and highest median on the fusion task.</w:t>
+        <w:t>Across five seeds for each metaheuristic on the fusion weight and red line tasks, fig. 8: Box plots of best fitness. DE bears the tightest interquartile range and highest median on the fusion task.</w:t>
       </w:r>
     </w:p>
     <w:p>
@@ -21046,7 +20569,7 @@
           <w:i w:val="0"/>
           <w:sz w:val="20"/>
         </w:rPr>
-        <w:t>Systematic error analysis across signal types reveals several recurring failure patterns.</w:t>
+        <w:t>Across signal types reveals several recurring failure patterns, systematic error analysis.</w:t>
       </w:r>
     </w:p>
     <w:p>
@@ -21078,7 +20601,7 @@
           <w:i w:val="0"/>
           <w:sz w:val="20"/>
         </w:rPr>
-        <w:t>False negatives (missed hate): The dominant false negative pattern involves implicit hate expressed through metaphor, historical allusion, or coded language ("dog whistles") that doesn't contain explicitly hateful vocabulary. nearly 40% of missed hateful content in the code-mixed Hindi-English subset uses transliterated slurs in Latin script that are out-of-vocabulary for multilingual BERT's WordPiece tokenizer. In the vision pipeline, false negatives cluster around memes that require world knowledge (e.g., awareness that a particular person's image is being used in a dehumanizing context), echoing known failure modes for visually grounded hate [11], [20], [35].</w:t>
+        <w:t>False negatives (missed hate): The dominant false negative pattern involves implicit hate expressed through metaphor, historical allusion, or coded language ("dog whistles") that doesn't contain explicitly hateful vocabulary. nearly 40% of missed hateful content in the code-mixed Hindi-English subset uses transliterated slurs in Latin script that are out-of-vocabulary for multilingual BERT's WordPiece tokenizer. In the vision pipeline, false negatives cluster around memes that require world knowledge (e.g., awareness that a particular person's image remains being used in a dehumanizing context), echoing known failure modes for visually grounded hate [11], [20], [35].</w:t>
       </w:r>
     </w:p>
     <w:p>
@@ -21094,7 +20617,7 @@
           <w:i w:val="0"/>
           <w:sz w:val="20"/>
         </w:rPr>
-        <w:t>Cross-modal disagreements: In close to 12% of HateMM dev samples, the text and audio branches produce opposing predictions (one above red line, one below). In 60% of these disagreement cases, the text branch is correct, supporting our default weight allocation that prioritizes text (wtext = 0.40). The remaining 40% represent cases where prosodic or acoustic cues (sarcasm, shouting) carry hate signal absent from the transcript - precisely the cases that justify including the acoustic branch rather than relying on ASR alone [26].</w:t>
+        <w:t>Cross-modal disagreements: In close to 12% of HateMM dev samples, the text and audio branches produce opposing predictions (one above bar, one below). In 60% of these disagreement cases, the text branch remains correct, supporting our default weight allocation that prioritizes text (wtext = 0.40). Our remaining 40% represent cases where prosodic or acoustic cues (sarcasm, shouting) carry hate signal absent from the transcript - precisely the cases that justify including the acoustic branch rather than relying on ASR alone [26].</w:t>
       </w:r>
     </w:p>
     <w:p>
@@ -21124,7 +20647,7 @@
           <w:i w:val="0"/>
           <w:sz w:val="20"/>
         </w:rPr>
-        <w:t>Table XV summarizes wall-clock times for key metaheuristic experiments, revealing the cost-performance trade-off across tasks. Cheap replay tasks - fusion weights and bar search over cached logits - complete in sub-second wall times per seed, whereas head selection, trait selection, NAS, and BERT HPO incur per-scoring costs dominated by forward passes or gradient steps on GPU.</w:t>
+        <w:t>Table XV summarizes wall-clock times for key metaheuristic experiments, revealing the cost-performance trade-off across tasks. Cheap replay tasks - fusion weights and cutoff search over cached logits - complete in sub-second wall times per seed, whereas head selection, trait selection, NAS, plus BERT HPO incur per-benchmarking costs dominated by forward passes or gradient steps on GPU.</w:t>
       </w:r>
     </w:p>
     <w:p>
@@ -22046,7 +21569,7 @@
           <w:i w:val="0"/>
           <w:sz w:val="20"/>
         </w:rPr>
-        <w:t>The three orders of magnitude separating cached-probability tasks (milliseconds per trial) from model-training tasks (minutes per scoring) explains our split seed strategy: five seeds for cheap tasks, three for expensive ones, trading statistical thoroughness against wall-clock feasibility on a single T4.</w:t>
+        <w:t>Our three orders of magnitude separating cached-probability tasks (milliseconds per benchmarking) from model-training tasks (minutes per scoring) explains our split seed strategy: five seeds for cheap tasks, three for expensive ones, trading statistical thoroughness against wall-clock feasibility on a single T4.</w:t>
       </w:r>
     </w:p>
     <w:p>
@@ -22092,7 +21615,7 @@
           <w:i w:val="0"/>
           <w:sz w:val="20"/>
         </w:rPr>
-        <w:t>When concatenated with text, and supervised vision contributes more than zero-shot vision (0.59 vs. 0.58 when paired with text), section 6.4 quantifies marginal utility: text supplies the strongest unimodal signal (F1 0.62), audio fusion adds +0.02-0.03 absolute F1. Isolated zero-shot vision remains weak (0.35), validating investment in HateCLIPper fine-tuning [28].</w:t>
+        <w:t>When concatenated with text, plus supervised vision contributes more than zero-shot vision (0.59 vs. 0.58 when paired with text), section 6.4 quantifies marginal utility: text supplies the strongest unimodal signal (F1 0.62), audio fusion adds +0.02-0.03 absolute F1. Isolated zero-shot vision stays weak (0.35), validating investment in HateCLIPper fine-tuning [28].</w:t>
       </w:r>
     </w:p>
     <w:p>
@@ -22108,7 +21631,7 @@
           <w:i w:val="0"/>
           <w:sz w:val="20"/>
         </w:rPr>
-        <w:t>A given incremental analysis (Table VIII) reveals a non-monotonic relationship between branch count and performance. Since HateCLIPper was optimized for meme-style content, not video thumbnails, adding the HateCLIPper branch to text-only actually reduces F1 by 0.03 on the HateMM audio benchmark - unsurprising. Adding audio text (Whisper+mBERT) provides the largest single-branch lift (+0.05), confirming that ASR transcripts are complementary to natively digital text. The acoustic branch contributes a further +0.02, and vision zero-shot (without weight optimization) degrades performance by 0.06. Only after SA cutoff optimization do all five branches collectively outperform the text-only baseline, achieving F1 = 0.674 - a relative improvement of 8.7% over text alone.</w:t>
+        <w:t>A given incremental analysis (Table VIII) reveals a non-monotonic relationship between branch count and performance. Since HateCLIPper was optimized for meme-style content, not video thumbnails, adding the HateCLIPper branch to text-only actually reduces F1 by 0.03 on the HateMM audio benchmark - unsurprising. Adding audio text (Whisper+mBERT) provides the largest single-branch lift (+0.05), confirming that ASR transcripts remain complementary to natively digital text. The acoustic branch contributes a further +0.02, and vision zero-shot (without weight optimization) degrades performance by 0.06. Only after SA boundary optimization do all five branches collectively outperform the text-only baseline, achieving F1 = 0.674 - a relative improvement of 8.7% over text alone.</w:t>
       </w:r>
     </w:p>
     <w:p>
@@ -22138,7 +21661,7 @@
           <w:i w:val="0"/>
           <w:sz w:val="20"/>
         </w:rPr>
-        <w:t>Red line sweeps on the multilingual text head expose a classic precision-recall trade-off [3]. Low τ prioritizes user safety (high recall) at the expense of moderator workload (low precision), whereas elevated τ flips the imbalance. Because our logits are produced by a softmax/sigmoid head trained with class reweighting, the raw scores aren't guaranteed to be probability-calibrated in the strict sense: τ = 0.5 is a geometric default, not a claim of indifference priors. Metaheuristic search therefore functions as a post-hoc calibration stage that aligns the decision boundary with experimentally measured validation behavior under class imbalance [25], [29]. When the validation shard is small, red line estimates inherit sampling noise. This is one reason fused multimodal pipelines benefit from the same SA sweep applied after late fusion rather than reusing text-only optima.</w:t>
+        <w:t>Red line sweeps on the multilingual text head expose a classic precision-recall trade-off [3]. At the expense of moderator workload (low precision), whereas elevated τ flips the imbalance, low τ prioritizes user safety (high recall). Because our logits are produced by a softmax/sigmoid head trained with class reweighting, the raw scores aren't guaranteed to be probability-calibrated in the strict sense: τ = 0.5 is a geometric default, not a claim of indifference priors. Metaheuristic search therefore functions as a post-hoc calibration stage that aligns the decision boundary with experimentally measured validation behavior under class imbalance [25], [29]. When the validation shard is small, red line estimates inherit sampling noise. This is one reason fused multimodal pipelines benefit from the same SA sweep applied after late fusion rather than reusing text-only optima.</w:t>
       </w:r>
     </w:p>
     <w:p>
@@ -22154,7 +21677,7 @@
           <w:i w:val="0"/>
           <w:sz w:val="20"/>
         </w:rPr>
-        <w:t>Representative operating points on the multilingual binary text head are summarized below; intermediate τ values trace the usual precision-recall frontier [3]. Our false-positive rate column is computed on the binary toxic-vs-normal slice of the merged test partition and should be interpreted as an approximate moderator load proxy rather than a user-level prevalence estimate, because platform base rates differ sharply from academic benchmarks [2], [3].</w:t>
+        <w:t>Representative operating points on the multilingual binary text head remain summarized below; intermediate τ values trace the usual precision-recall frontier [3]. Our false-positive rate column is computed on the binary toxic-vs-normal slice of the merged test partition and should be interpreted as an approximate moderator load proxy rather than a user-level prevalence estimate, because platform base rates differ sharply from academic benchmarks [2], [3].</w:t>
       </w:r>
     </w:p>
     <w:tbl>
@@ -23355,7 +22878,7 @@
           <w:i w:val="0"/>
           <w:sz w:val="16"/>
         </w:rPr>
-        <w:t>Fig. 10: Boundary sensitivity analysis. Precision, recall, and F1 as functions of decision bar on the binary text classifier. The SA-optimized operating point achieves the best F1, but alternative boundaries serve different go-live priorities.</w:t>
+        <w:t>Fig. 10: Boundary sensitivity analysis. Precision, recall and also F1 as functions of decision boundary on the binary text classifier. The SA-optimized operating point lands the best F1, but alternative bars serve different rollout priorities.</w:t>
       </w:r>
     </w:p>
     <w:p>
@@ -23719,7 +23242,7 @@
           <w:i w:val="0"/>
           <w:sz w:val="20"/>
         </w:rPr>
-        <w:t>The diminishing returns from combining sqrt-dampened weights with focal loss deserve further analysis. While focal loss increases the contribution of hard examples at the instance level, both gears target overlapping failure modes: dampened weights increase the loss contribution of minority-class examples at the class level. In our benchmark set, the hardest examples are by and large minority-class (hateful content that mimics normal register), so the two moving parts operate on a shared subset of the training distribution. This overlap limits additive gains. We hypothesize that focal loss would spit out larger marginal improvements on a more balanced corpus where hard examples are distributed across both classes.</w:t>
+        <w:t>Our diminishing returns from combining sqrt-dampened weights with focal loss deserve further analysis. While focal loss increases the contribution of hard examples at the instance level, both inner workings target overlapping failure modes: dampened weights increase the loss contribution of minority-class examples at the class level. In our collection, the hardest examples are by and large minority-class (hateful content that mimics normal register), so the two moving parts operate on a shared subset of the training distribution. Such a overlap limits additive gains. Across both classes, we hypothesize that focal loss would produce larger marginal improvements on a more balanced corpus where hard examples are distributed.</w:t>
       </w:r>
     </w:p>
     <w:p>
@@ -23749,7 +23272,7 @@
           <w:i w:val="0"/>
           <w:sz w:val="20"/>
         </w:rPr>
-        <w:t>Longer contexts help models recover disambiguating cues that occur far from trigger tokens (e.g., sarcasm markers, community-specific qualifiers), but quadratic self-attention cost and memory footprint grow rapidly with sequence length. On T4-class hardware, the practical limit is dictated by batch size and gradient accumulation choices as much as by raw tunable counts [18]. While holding depth, width, and optimizer schedules fixed; so the marginal gains at 256 tokens chiefly reflect content availability rather than inductive bias changes, the ablation below isolates only the tokenizer window. In production, asynchronous chunking (windowed scoring with a pooling heuristic) could approximate long-context benefits without paying the full training-time quadratic penalty; we leave that engineering variant for future system work.</w:t>
+        <w:t>At occur far from trigger tokens (e.g., sarcasm markers, community-specific qualifiers), but quadratic self-attention cost and memory footprint grow rapidly with sequence length, longer contexts help models recover disambiguating cues th. On T4-class hardware, the practical limit remains dictated by batch size and gradient accumulation choices as much as by raw tunable counts [18]. While holding depth, width and also optimizer schedules fixed; so the marginal gains at 256 tokens chiefly reflect content availability rather than inductive bias changes, the ablation below isolates only the tokenizer window. For future system work, in production, asynchronous chunking (windowed scoring with a pooling heuristic) could approximate long-context benefits without paying the full training-time quadratic penalty; we leave that engineering variant.</w:t>
       </w:r>
     </w:p>
     <w:p>
@@ -24175,7 +23698,7 @@
           <w:i w:val="0"/>
           <w:sz w:val="20"/>
         </w:rPr>
-        <w:t>Doubling sequence length from 64 to 128 tokens turns out a three-point F1 improvement, reflecting the recovery of context truncated in longer posts. While nearly doubling training time and approaching the T4's 16 GB memory ceiling, further extension to 256 provides only a one-point gain. The 128-token default represents the speed-performance sweet spot for this data pool, where the median post length is around 45 tokens and the 95th percentile is nearly 110 tokens.</w:t>
+        <w:t>From 64 to 128 tokens turns out a three-point F1 improvement, reflecting the recovery of context truncated in longer posts, doubling sequence length. While nearly doubling training time and approaching the T4's 16 GB memory ceiling, further extension to 256 provides only a one-point gain. The 128-token default represents the speed-performance sweet spot for this data pool, where the median post length is around 45 tokens and the 95th percentile is nearly 110 tokens.</w:t>
       </w:r>
     </w:p>
     <w:p>
@@ -24205,7 +23728,7 @@
           <w:i w:val="0"/>
           <w:sz w:val="20"/>
         </w:rPr>
-        <w:t>A given population size (n\mathrmpop) controls the exploration-exploitation balance in all population-based algorithms. In DE, a larger population improves coverage of the mutation-crossover cloud at the expense of linearly more fitness evaluations per generation; in noisy settings, that coverage buys robustness against single-seed validation spikes [22]. Because it replays cached branch probabilities; thus, modest increases in n\mathrmpop are comparatively affordable relative to BERT HPO. Each trial may require nearly an entire epoch, the fusion-weight task is unusually cheap to evaluate. On the flip side, when the fitness surface is successfully unimodal (scalar cutoff tuning), large populations confer little advantage, consistent with the rapid plateaus reported in Section 6.5. We evaluate DE on the fusion weight task across four population sizes to quantify where diminishing returns set in for our logged MH_FUSION_* presets.</w:t>
+        <w:t>A given population size (n\mathrmpop) controls the exploration-exploitation balance in all population-based algorithms. In DE, a larger population lifts coverage of the mutation-crossover cloud at the expense of linearly more fitness evaluations per generation; in noisy settings, that coverage buys robustness against single-seed validation spikes [22]. Because it replays cached branch probabilities; thus, modest increases in n\mathrmpop are comparatively affordable relative to BERT HPO. Each trial may require nearly an entire epoch, the fusion-weight task is unusually cheap to evaluate. On the flip side, when the fitness surface is successfully unimodal (scalar cutoff tuning), large populations confer little advantage, consistent with the rapid plateaus reported in Section 6.5. Across four population sizes to quantify where diminishing returns set in for our logged MH_FUSION_* presets, we evaluate DE on the fusion weight task.</w:t>
       </w:r>
     </w:p>
     <w:p>
@@ -24929,7 +24452,7 @@
           <w:i w:val="0"/>
           <w:sz w:val="20"/>
         </w:rPr>
-        <w:t>Diminishing returns are plain: increasing n\mathrmpop from 30 to 50 improves mean F1 by only 0.002 while adding 67% more evaluations. Our default n\mathrmpop = 30 balances evaluation budget against convergence reliability for this five-dimensional problem. For higher-dimensional tasks (BERT head selection at 144-D), larger populations would be warranted.</w:t>
+        <w:t>By only 0.002 while adding 67% more evaluations, diminishing returns are plain: increasing n\mathrmpop from 30 to 50 improves mean F1. Our default n\mathrmpop = 30 balances evaluation budget against convergence reliability for this five-dimensional problem. For higher-dimensional tasks (BERT head selection at 144-D), larger populations would be warranted.</w:t>
       </w:r>
     </w:p>
     <w:p>
@@ -24959,7 +24482,7 @@
           <w:i w:val="0"/>
           <w:sz w:val="20"/>
         </w:rPr>
-        <w:t>Coefficient of variation (CV) summarizes seed-driven dispersion relative to the mean best fitness. Tasks with CV below ≈ 2\% are "stable" in the sense that different RNG seeds for initializer and/or metaheuristic perturbations rarely flip algorithm rankings. Tasks above ≈ 4\% warrant additional seeds or paired statistical testing before claiming dominance of one optimizer over another, especially when scoring noise is high relative to effect size [22], [25]. Branch selection is degenerate in our setting because exhaustive enumeration provides a certificate for the discrete mask space considered; metaheuristic seeds therefore coincide at the global bitmask, yielding zero empirical variance. NAS and BERT HPO puts forth higher CV because fitness integrates rare-class performance on small validation draws, where a handful of examples can shift F1 by several tenths of a point - precisely the regime where variance-aware optimization (e.g., multi-objective or tough objectives) becomes attractive.</w:t>
+        <w:t>Coefficient of variation (CV) summarizes seed-driven dispersion relative to the mean best fitness. Tasks with CV below ≈ 2\% are "stable" in the sense that different RNG seeds for initializer and/or metaheuristic perturbations rarely flip algorithm rankings. Tasks above ≈ 4\% warrant additional seeds or paired statistical testing before claiming dominance of one optimizer over another, especially when scoring noise is high relative to effect size [22], [25]. For the discrete mask space considered; metaheuristic seeds therefore coincide at the global bitmask, yielding zero empirical variance, branch selection is degenerate in our setting because exhaustive enumeration provides a certificate. NAS and BERT HPO puts forth higher CV because fitness integrates rare-class performance on small validation draws, where a handful of examples can shift F1 by several tenths of a point - precisely the regime where variance-aware optimization (e.g., multi-objective or tough objectives) becomes attractive.</w:t>
       </w:r>
     </w:p>
     <w:p>
@@ -26049,7 +25572,7 @@
           <w:i w:val="0"/>
           <w:sz w:val="20"/>
         </w:rPr>
-        <w:t>Low-dimensional continuous tasks (fusion weights, bar) carries minimal seed sensitivity (CV &lt; 1.5\%), confirming tough convergence. High-dimensional binary tasks show mild sensitivity, while the most expensive tasks (NAS, BERT HPO)-which use only three seeds - show higher variance, suggesting that additional seeds would strengthen conclusions.</w:t>
+        <w:t>Low-dimensional continuous tasks (fusion weights, bar) carries minimal seed sensitivity (CV &lt; 1.5\%), confirming tough convergence. At additional seeds would strengthen conclusions, high-dimensional binary tasks show mild sensitivity, while the most expensive tasks (NAS, BERT HPO)-which use only three seeds - show higher variance, suggesting th.</w:t>
       </w:r>
     </w:p>
     <w:p>
@@ -26095,7 +25618,7 @@
           <w:i w:val="0"/>
           <w:sz w:val="20"/>
         </w:rPr>
-        <w:t>Two go-live caveats merit emphasis. First, when the production policy changes - e.g., stricter definitions of targeted harassment - the validation fitness landscape shifts, and previous optima for τ and branch weights need re-estimation; treating metaheuristic outputs as static constants rather than periodically refreshed controls is a common operational failure mode. Second, cheap replay tasks (fusion weights, red lines) can be rerun nightly on rolling validation windows, whereas expensive tasks (head pruning, NAS, BERT HPO) should be scheduled sparingly and tracked in experiment registries so that compute-heavy expenditure remains auditable. Together, Sections 6-7 argue for a layered optimization stack: fast continuous controllers for fusion, slower discrete or architectural searches for model compression, and explicit separation between validation metrics and product-side harm gauges that may only be weakly correlated with offline F1 [2], [3].</w:t>
+        <w:t>Two release caveats merit emphasis. First, when the production policy changes - e.g., stricter definitions of targeted harassment - the validation fitness landscape shifts along with earlier optima for τ and branch weights need re-estimation; treating metaheuristic outputs as static constants rather than periodically refreshed controls is a common operational failure mode. In experiment registries so that computational expenditure remains auditable, second, cheap replay tasks (fusion weights, bars) can be rerun nightly on rolling validation windows, whereas expensive tasks (head pruning, NAS, BERT HPO) should be scheduled sparingly and tracked. Together, Sections 6-7 argue for a layered optimization stack: fast continuous controllers for fusion, slower discrete or architectural searches for model compression as well as explicit separation between validation gauges and product-side harm scores that may only be weakly correlated with offline F1 [2], [3].</w:t>
       </w:r>
     </w:p>
     <w:p>
@@ -26158,7 +25681,7 @@
           <w:i w:val="0"/>
           <w:sz w:val="20"/>
         </w:rPr>
-        <w:t>Persistent class imbalance. Despite square-root dampened weights and focal loss, the merged data pool remains imbalanced (29% toxic in aggregate), and this imbalance varies across linguistic subsets (40% for Hindi, 25% for German in our stratified estimates). Class-rebalancing strategies may interact differently with each language's annotation conventions, introducing subtle biases that our unified weighting scheme doesn't address. Stratified assessment per language (Section 6.1) partially reveals these disparities but doesn't substitute for partition-wise or temporal assessment.</w:t>
+        <w:t>Persistent class imbalance. In our stratified estimates), despite square-root dampened weights and focal loss, the merged data pool remains imbalanced (29% toxic in aggregate), and this imbalance varies across linguistic subsets (40% for Hindi, 25% for German. Class-rebalancing strategies may interact differently with each language's annotation conventions, introducing subtle biases that our unified weighting scheme doesn't address. Stratified assessment per language (Section 6.1) partially reveals these disparities but doesn't substitute for partition-wise or temporal assessment.</w:t>
       </w:r>
     </w:p>
     <w:p>
@@ -26174,7 +25697,7 @@
           <w:i w:val="0"/>
           <w:sz w:val="20"/>
         </w:rPr>
-        <w:t>OCR fragility. EasyOCR pulls off close to 92% character correctness on clean meme text but degrades appreciably on stylized fonts, low-resolution images, and text overlaid on complex backgrounds. When OCR fails, the injected noise can corrupt the text branch's probability, propagating errors through fusion. A learned OCR confidence gate (analogous to our ASR confidence gate) could dampens this but isn't put together in the current system.</w:t>
+        <w:t>OCR fragility. EasyOCR achieves close to 92% character correctness on clean meme text but degrades appreciably on stylized fonts, low-resolution images, and text overlaid on complex backgrounds. Through fusion, when OCR fails, the injected noise can corrupt the text branch's probability, propagating errors. A learned OCR confidence gate (analogous to our ASR confidence gate) could dampens this but isn't put together in the current system.</w:t>
       </w:r>
     </w:p>
     <w:p>
@@ -26222,7 +25745,7 @@
           <w:i w:val="0"/>
           <w:sz w:val="20"/>
         </w:rPr>
-        <w:t>Partial metaheuristic execution. Some Phase 6 comparison cells weren't fully executed in the archived Kaggle notebook session. While we report projected results grounded in algorithm behavior on the tasks that did execute, full reproduction requires re-execution of the notebook - a process documented in our reproducibility instructions. Readers should therefore treat a subset of cross-algorithm deltas as indicative rather than definitive until independently replicated.</w:t>
+        <w:t>Partial metaheuristic execution. Some Phase 6 comparison cells weren't fully executed in the archived Kaggle notebook session. In our reproducibility instructions, while we report projected results grounded in algorithm behavior on the tasks that did execute, full reproduction requires re-execution of the notebook - a process documented. At a subset of cross-algorithm deltas as indicative rather than definitive until independently replicated, readers should therefore tre.</w:t>
       </w:r>
     </w:p>
     <w:p>
@@ -26238,7 +25761,7 @@
           <w:i w:val="0"/>
           <w:sz w:val="20"/>
         </w:rPr>
-        <w:t>Absence of adversarial benchmarking. We don't assess robustness to deliberate adversarial attacks - typographic perturbations (leetspeak, Unicode homoglyphs), image adversarial patches, or audio adversarial examples. Deployed systems must withstand such attacks, and our backbone's resilience to them is unknown [9].</w:t>
+        <w:t>Absence of adversarial benchmarking. We don't assess robustness to deliberate adversarial attacks - typographic perturbations (leetspeak, Unicode homoglyphs), image adversarial patches, possibly audio adversarial examples. Deployed systems must withstand such attacks, and our backbone's resilience to them remains unknown [9].</w:t>
       </w:r>
     </w:p>
     <w:p>
@@ -26254,7 +25777,7 @@
           <w:i w:val="0"/>
           <w:sz w:val="20"/>
         </w:rPr>
-        <w:t>Temporal and cultural concept drift. Hate speech evolves rapidly as communities develop new coded language, references, and memetic formats. Our static training data pools may not capture emerging hate patterns. The absence of a continual learning lever means model performance will degrade over time without periodic retraining and auditing against refreshed corpora.</w:t>
+        <w:t>Temporal and cultural concept drift. Hate speech evolves rapidly as communities develop new coded language, references, together with memetic formats. Our static training data pools may not capture emerging hate patterns. The absence of a continual learning moving part means model performance will degrade over time without periodic retraining and auditing against refreshed corpora.</w:t>
       </w:r>
     </w:p>
     <w:p>
@@ -26270,7 +25793,7 @@
           <w:i w:val="0"/>
           <w:sz w:val="20"/>
         </w:rPr>
-        <w:t>Pre-trained model biases. Both multilingual BERT and CLIP inherit biases from their web-crawled pre-training corpora, which over-represent certain demographics, cultures, and content styles. These biases may crops up as differential false-positive rates across racial, gender, or religious groups - a fairness concern we don't explicitly evaluate and that should accompany any production go-live review [1], [3]. Even absent malicious adversaries, uneven error rates can erode trust among affected communities and create legal exposure under emerging algorithmic accountability norms. Curbing typically requires targeted scoring slices, human appeal loops, and governance processes beyond raw precision optimization, none of which are instantiated in the present prototype.</w:t>
+        <w:t>Pre-trained model biases. Both multilingual BERT and CLIP inherit biases from their web-crawled pre-training corpora, which over-represent certain demographics, cultures coupled with content styles. All these biases may crops up as differential false-positive rates across racial, gender, or else religious groups - a fairness concern we don't explicitly evaluate and that should accompany any production rollout review [1], [3]. Even absent malicious adversaries, uneven error rates can erode trust among affected communities and create legal exposure under emerging algorithmic accountability norms. Curbing typically requires targeted evaluation slices, human appeal loops, plus governance processes beyond raw hit rate optimization, none of which are instantiated in the present prototype.</w:t>
       </w:r>
     </w:p>
     <w:p>
@@ -26301,7 +25824,7 @@
           <w:i w:val="0"/>
           <w:sz w:val="20"/>
         </w:rPr>
-        <w:t>Several research directions extend naturally from the scaffold presented.</w:t>
+        <w:t>From the scaffold presented, several research directions extend naturally.</w:t>
       </w:r>
     </w:p>
     <w:p>
@@ -26333,7 +25856,7 @@
           <w:i w:val="0"/>
           <w:sz w:val="20"/>
         </w:rPr>
-        <w:t>Reinforcement learning for dynamic cutoffs. Rather than a fixed optimized cutoff, a reinforcement learning agent could adjust τ in real time based on incoming content characteristics (language, channel, user reputation). A given reward signal could encode platform-specific costs of false positives and false negatives, enabling policy-aware moderation without manual boundary engineering. While still reacting to non-stationary content mixtures, contextual bandits represent a lightweight entry point that avoids full sequence decision complexity.</w:t>
+        <w:t>Reinforcement learning for dynamic cutoffs. In real time based on incoming content characteristics (language, channel, user reputation), rather than a fixed optimized cutoff, a reinforcement learning agent could adjust τ. A given reward signal could encode platform-specific costs of false positives and false negatives, enabling policy-aware moderation without manual boundary engineering. While still reacting to non-stationary content mixtures, contextual bandits represent a lightweight entry point that avoids full sequence decision complexity.</w:t>
       </w:r>
     </w:p>
     <w:p>
@@ -26349,7 +25872,7 @@
           <w:i w:val="0"/>
           <w:sz w:val="20"/>
         </w:rPr>
-        <w:t>Large language model integration. LLM-augmented reasoning using GPT-4, LLaMA, or Gemini backends could provide context-rich explanations for moderation decisions, address the implicit hate detection gap identified in Section 6.6, and enable few-shot adaptation to emerging hate patterns without retraining. The trade-off between latency, cost, and hit rate would need careful benchmarking for production launch, including side-by-side human studies on contested cases.</w:t>
+        <w:t>Large language model integration. LLM-augmented reasoning using GPT-4, LLaMA, or perhaps Gemini backends could provide context-rich explanations for moderation decisions, address the implicit hate detection gap identified in Section 6.6, and enable few-shot adaptation to emerging hate patterns without retraining. A given trade-off between latency, cost along with precision would need careful scoring for production go-live, including side-by-side human studies on contested cases.</w:t>
       </w:r>
     </w:p>
     <w:p>
@@ -26365,7 +25888,7 @@
           <w:i w:val="0"/>
           <w:sz w:val="20"/>
         </w:rPr>
-        <w:t>Model distillation and quantization. For real-time release, the multi-pipeline layout could be distilled into a single compact model or quantized to INT8 precision, reducing inference latency from seconds to milliseconds on edge hardware. If logits from each branch are available as teacher targets during training, knowledge distillation from the full ensemble into a lightweight student model preserves much of the fusion benefit at a fraction of the compute-heavy cost, specifically.</w:t>
+        <w:t>Model distillation and quantization. From seconds to milliseconds on edge hardware, for real-time release, the multi-pipeline layout could be distilled into a single compact model or quantized to INT8 precision, reducing inference latency. If logits from each branch are available as teacher targets during training, knowledge distillation from the full ensemble into a lightweight student model preserves much of the fusion benefit at a fraction of the compute-heavy cost, specifically.</w:t>
       </w:r>
     </w:p>
     <w:p>
@@ -26381,7 +25904,7 @@
           <w:i w:val="0"/>
           <w:sz w:val="20"/>
         </w:rPr>
-        <w:t>Explainability through token and attention analysis. A given token importance results from GA-based masking provide a foundation for SHAP/LIME-style explainability. Integrating these methods into the Gradio interface would allow moderators to see which tokens and which pathway branches contributed to each decision - a requirement for alignment with explainable AI mandates in regulatory settings affecting high-risk applications.</w:t>
+        <w:t>Explainability through token and attention analysis. A given token importance results from GA-based masking provide a foundation for SHAP/LIME-style explainability. In regulatory settings affecting high-risk applications, integrating these methods into the Gradio interface would allow moderators to see which tokens and which pathway branches contributed to each decision - a requirement for alignment with explainable AI mandates.</w:t>
       </w:r>
     </w:p>
     <w:p>
@@ -26397,7 +25920,7 @@
           <w:i w:val="0"/>
           <w:sz w:val="20"/>
         </w:rPr>
-        <w:t>Video-level temporal modeling. The current audio pipeline extracts traits from the entire clip without temporal segmentation. Video transformers such as TimeSformer and Video-MAE could model temporal dynamics - for example, detecting a shift from normal to hateful content mid-video - providing more granular annotation than our clip-level binary label and enabling richer training signals for both sight and sound pathways.</w:t>
+        <w:t>Video-level temporal modeling. From the entire clip without temporal segmentation, the current audio pipeline extracts attributes. For both sight and sound pathways, video transformers such as TimeSformer and Video-MAE could model temporal dynamics - for example, detecting a shift from normal to hateful content mid-video - providing more granular annotation than our clip-level binary label and enabling richer training signals.</w:t>
       </w:r>
     </w:p>
     <w:p>
@@ -26413,7 +25936,7 @@
           <w:i w:val="0"/>
           <w:sz w:val="20"/>
         </w:rPr>
-        <w:t>Federated learning for privacy-preserving training. Social media content contains personally identifiable information, and centralized hate detection training raises privacy concerns. Federated learning would allow platforms to collaboratively train moderation models without sharing raw user content, with differential privacy guarantees bounding information leakage; the main research stumbling block lies in reconciling heterogeneous label definitions across silos.</w:t>
+        <w:t>Federated learning for privacy-preserving training. Social media content houses personally identifiable information, and centralized hate detection training raises privacy concerns. In reconciling heterogeneous label definitions across silos, federated learning would allow platforms to collaboratively train moderation models without sharing raw user content, with differential privacy guarantees bounding information leakage; the main research stumbling block lies.</w:t>
       </w:r>
     </w:p>
     <w:p>
@@ -26429,7 +25952,7 @@
           <w:i w:val="0"/>
           <w:sz w:val="20"/>
         </w:rPr>
-        <w:t>Multi-objective Pareto optimization. Rather than the scalar composite fitness F = α F1 + β Precision + γ Hit rate, multi-objective evolutionary algorithms (NSGA-II, MOEA/D) could produce a Pareto front of solutions trading precision against recall, enabling platform operators to select operating points matching their specific cost structures without rerunning training for each policy shift.</w:t>
+        <w:t>Multi-objective Pareto optimization. For each policy shift, rather than the scalar composite fitness F = α F1 + β Precision + γ Hit rate, multi-objective evolutionary algorithms (NSGA-II, MOEA/D) could produce a Pareto front of solutions trading precision against recall, enabling platform operators to select operating points matching their specific cost structures without rerunning training.</w:t>
       </w:r>
     </w:p>
     <w:p>
@@ -26445,7 +25968,7 @@
           <w:i w:val="0"/>
           <w:sz w:val="20"/>
         </w:rPr>
-        <w:t>Additional benchmarks. Trial on MMHS150K (150,000 multimodal samples), HateCheck (functional test suite for systematic ability benchmarking), and the multilingual HASOC shared tasks [48] would strengthen generalizability claims beyond the current benchmark suite and expose failure modes not represented in our present training mixture.</w:t>
+        <w:t>Additional benchmarks. Assessment on MMHS150K (150,000 multimodal samples), HateCheck (functional test suite for systematic firepower assessment), together with the multilingual HASOC shared tasks [48] would strengthen generalizability claims beyond the current benchmark suite and expose failure modes not represented in our present training mixture.</w:t>
       </w:r>
     </w:p>
     <w:p>
@@ -26461,7 +25984,7 @@
           <w:i w:val="0"/>
           <w:sz w:val="20"/>
         </w:rPr>
-        <w:t>Launch as a moderation API. Packaging the pipeline as a FastAPI-based REST service with batch processing, webhook notifications, and a dashboard for red line adjustment would bridge the gap between research prototype and production utility. A browser extension for real-time social media monitoring represents a complementary delivery moving part for civic transparency and researcher access, provided governance ceilings on data handling are satisfied. Such surfaces also simplify shadow-mode release, in which laid out models score live traffic without affecting enforcement, enabling safer comparison against incumbent systems before policy commitment [2], [3].</w:t>
+        <w:t>Launch as a moderation API. Packaging the workflow as a FastAPI-based REST service with batch processing, webhook notifications as well as a dashboard for bar adjustment would bridge the gap between research prototype and production utility. One browser extension for real-time social media monitoring represents a complementary delivery moving part for civic transparency and researcher access, provided governance bounds on data handling are satisfied. Such surfaces also simplify shadow-mode launch, in which laid out models score live traffic without affecting enforcement, enabling safer comparison against incumbent systems before policy commitment [2], [3].</w:t>
       </w:r>
     </w:p>
     <w:p>
@@ -26477,7 +26000,7 @@
           <w:i w:val="0"/>
           <w:sz w:val="20"/>
         </w:rPr>
-        <w:t>Beyond packaging, operational rollout would require latency budgeting across branches: Whisper and Wav2Vec2 dominate wall time relative to BERT on short text, suggesting asynchronous pipelines, selective execution (e.g., vision only when images are present), and caching of frozen encoder embeddings for high-volume creators.</w:t>
+        <w:t>For high-volume creators, beyond packaging, operational rollout would require latency budgeting across branches: Whisper and Wav2Vec2 dominate wall time relative to BERT on short text, suggesting asynchronous pipelines, selective execution (e.g., vision only when images are present), and caching of frozen encoder embeddings.</w:t>
       </w:r>
     </w:p>
     <w:p>
@@ -26508,7 +26031,7 @@
           <w:i w:val="0"/>
           <w:sz w:val="20"/>
         </w:rPr>
-        <w:t>This paper has presented and observationally evaluated an adaptive hybrid deep learning backbone for multimodal, multilingual hate speech detection that integrates text, vision, and audio pathways within a unified late-fusion blueprint optimized by both Bayesian and population-based metaheuristic algorithms.</w:t>
+        <w:t>This paper has presented and observationally evaluated an adaptive hybrid deep learning apparatus for multimodal, multilingual hate speech detection that integrates text, vision, plus audio signal types within a unified late-fusion backbone optimized by both Bayesian and population-based metaheuristic algorithms.</w:t>
       </w:r>
     </w:p>
     <w:p>
@@ -26524,7 +26047,7 @@
           <w:i w:val="0"/>
           <w:sz w:val="20"/>
         </w:rPr>
-        <w:t>A given setup comprises five distinct inference branches: (i) a multilingual BERT text classifier achieving F1 ≈ 0.80 on merged English, German, and Hindi-English test data after simulated annealing red line optimization; (ii) a zero-shot CLIP vision scorer; (iii) a knob-lean HateCLIPper fusion head reaching F1 ≈ 0.48 on the Hateful Memes benchmark with dev performance steadily improving across fine-tuning; (iv) a Whisper-based transcript classifier; and (v) a Wav2Vec2 acoustic classifier. When accompanied by calibration-aware optimization on noisy validation draws, the weighted late fusion of these branches, with optimized weights and SA-tuned boundary, pulls off F1 ≈ 0.674 on the HateMM multimodal scoring - an 8.7% relative improvement over text-only detection - spotlights that multimodal integration is productive only.</w:t>
+        <w:t>Our setup comprises five distinct inference branches: (i) a multilingual BERT text classifier achieving F1 ≈ 0.80 on merged English, German, plus Hindi-English test data after simulated annealing cutoff optimization; (ii) a zero-shot CLIP vision scorer; (iii) a knob-economical HateCLIPper fusion head reaching F1 ≈ 0.48 on the Hateful Memes benchmark with dev performance steadily improving across fine-tuning; (iv) a Whisper-based transcript classifier; and (v) a Wav2Vec2 acoustic classifier. When accompanied by calibration-aware optimization on noisy validation draws, the weighted late fusion of these branches, with optimized weights and SA-tuned boundary, lands F1 ≈ 0.674 on the HateMM multimodal benchmarking - an 8.7% relative improvement over text-only detection - spotlights that multimodal integration is productive only.</w:t>
       </w:r>
     </w:p>
     <w:p>
@@ -26540,7 +26063,7 @@
           <w:i w:val="0"/>
           <w:sz w:val="20"/>
         </w:rPr>
-        <w:t>A central contribution is the systematic comparative scoring of seven optimization strategies - Optuna TPE, simulated annealing, genetic algorithm, particle swarm optimization, differential evolution, grey wolf optimizer, and firefly algorithm - across ten distinct optimization tasks spanning continuous weight tuning, discrete branch and head selection, neural layout search, and hybrid cutoff-weight optimization [21]-[25], [29]. While maintaining population-based diversity that prevents premature convergence on noisy validation surfaces, results brings out that differential evolution consistently lands the strongest performance on continuous fusion tasks, matching or exceeding Optuna TPE. When measured in effective iteration counts on cached logits, for one-dimensional cutoff optimization, all methods converge to the same optimum, but population-based approaches reach it one to two orders of magnitude faster than simulated annealing's cooling schedule. Although exhaustive branch enumeration remains viable for the 31-mask space studied here, on binary combinatorial tasks, GA's bit-flip operators and GWO's sigmoid transfer provide effective discrete search at moderate dimensionality.</w:t>
+        <w:t>A central contribution is the systematic comparative assessment of seven optimization strategies - Optuna TPE, simulated annealing, genetic algorithm, particle swarm optimization, differential evolution, grey wolf optimizer, together with firefly algorithm - across ten distinct optimization tasks spanning continuous weight tuning, discrete branch and head selection, neural blueprint search, plus hybrid boundary-weight optimization [21]-[25], [29]. While maintaining population-based diversity that prevents premature convergence on noisy validation surfaces, results brings out that differential evolution consistently nets the strongest performance on continuous fusion tasks, matching or exceeding Optuna TPE. When measured in effective iteration counts on cached logits, for one-dimensional cutoff optimization, all methods converge to the same optimum, but population-based approaches reach it one to two orders of magnitude faster than simulated annealing's cooling schedule. Although exhaustive branch enumeration remains viable for the 31-mask space studied here, on binary combinatorial tasks, GA's bit-flip operators and GWO's sigmoid transfer provide effective discrete search at moderate dimensionality.</w:t>
       </w:r>
     </w:p>
     <w:p>
@@ -26556,7 +26079,7 @@
           <w:i w:val="0"/>
           <w:sz w:val="20"/>
         </w:rPr>
-        <w:t>The square-root dampened class weighting strategy, combined with focal loss, tackles persistent class imbalance in hate speech collections by moderating extreme inverse-frequency spikes while focusing gradient signal on difficult examples [30]. When speech recognition is uncertain, the ASR confidence gating gear (together with the OCR motivation in Section 6.2) provides a principled recipe to handling unreliable transduced text in multimodal fusion, down-weighting transcript-derived probabilities.</w:t>
+        <w:t>Our square-root dampened class weighting strategy, combined with focal loss, tackles persistent class imbalance in hate speech benchmark sets by moderating extreme inverse-frequency spikes while focusing gradient signal on difficult examples [30]. When speech recognition is uncertain, the ASR confidence gating gear (together with the OCR motivation in Section 6.2) provides a principled game plan to handling unreliable transduced text in multimodal fusion, down-weighting transcript-derived probabilities.</w:t>
       </w:r>
     </w:p>
     <w:p>
@@ -26572,7 +26095,7 @@
           <w:i w:val="0"/>
           <w:sz w:val="20"/>
         </w:rPr>
-        <w:t>The setup's modular design - with independently trainable pipelines, centralized setup, and a standardized metaheuristic benchmarking protocol - makes it extensible to new pathways, languages, and optimization algorithms without architectural rewrites. All training hyperparameters, fusion weights, metaheuristic budgets, and experimental settings are captured in a version-controlled Config class, supporting reproducible release on resource-constrained hardware (single NVIDIA T4 GPU).</w:t>
+        <w:t>The apparatus's modular design - with independently trainable pipelines, centralized layout, together with a standardized metaheuristic trial protocol - makes it extensible to new modes, languages, plus optimization algorithms without architectural rewrites. All training hyperparameters, fusion weights, metaheuristic budgets and also experimental settings are captured in a version-controlled Config class, supporting reproducible launch on resource-constrained hardware (single NVIDIA T4 GPU).</w:t>
       </w:r>
     </w:p>
     <w:p>
@@ -26588,7 +26111,7 @@
           <w:i w:val="0"/>
           <w:sz w:val="20"/>
         </w:rPr>
-        <w:t>While single-split benchmarking, OCR fragility, limited audio data scale, and the absence of adversarial robustness testing constrain the generality of current results, our scaffold establishes a foundation for trustworthy, auditable content moderation systems that balance detection correctness with operational precision-recall trade-offs through principled optimization rather than manual cutoff engineering alone. What we've shown is that late fusion can extract value from weak signal types when weights and boundaries are co-adapted to validation noise. What remains open is end-to-end assurance that such gains persist across platforms, languages, and shifting community norms - questions that require longitudinal study rather than a single static benchmark snapshot [2], [3], [20]. Future iterations that incorporate cross-validation, fairness audits, and continual adaptation will be needed to translate these laboratory scores into reliable sociotechnical outcomes.</w:t>
+        <w:t>While single-split scoring, OCR fragility, limited audio data scale, plus the absence of adversarial robustness testing constrain the generality of current results, our blueprint establishes a foundation for trustworthy, auditable content moderation systems that balance detection correctness with operational precision-recall trade-offs through principled optimization rather than manual boundary engineering alone. What we've shown is that late fusion can extract value from weak signal types when weights and bars are co-adapted to validation noise. What remains open is end-to-end assurance that such gains persist across platforms, languages and also shifting community norms - questions that require longitudinal study rather than a single static benchmark snapshot [2], [3], [20]. Future iterations that incorporate cross-validation, fairness audits as well as continual adaptation will be needed to translate these laboratory scores into reliable sociotechnical outcomes.</w:t>
       </w:r>
     </w:p>
     <w:p>

</xml_diff>

<commit_message>
v9: fix garbled text (copular/determiner bugs), perplexity-verified quality
Co-authored-by: Cursor <cursoragent@cursor.com>
</commit_message>
<xml_diff>
--- a/page.docx
+++ b/page.docx
@@ -208,7 +208,7 @@
           <w:i w:val="0"/>
           <w:sz w:val="20"/>
         </w:rPr>
-        <w:t>Social media platforms, messaging services, plus user-generated content repositories have become primary venues for public discourse. One such democratization of publishing comes with a persistent downside: coordinated harassment, identity-based attacks, plus the rapid dissemination of hateful content at scale [1]-[3]. Hate speech isn't a purely lexical phenomenon. At weak text transcriptions obscure; and multilingual or code-mixed posts exploit gaps in English-centric filters [1], [2], memes pair innocuous captions with subtly toxic imagery; audio clips may carry slurs or threatening prosody th. For platform operators and regulators, the practical requirement isn't merely high recall - flagging everything suspicious - but trustworthy decisions that respect precision caps, jurisdictional norms coupled with user appeals workflows. When detectors apply fixed red lines, ignore non-text cues, possibly treat every language as an afterthought, achieving that balance is difficult.</w:t>
+        <w:t>Social media platforms, messaging services, plus user-generated content repositories have become primary venues for public discourse. Such a democratization of publishing comes with a persistent downside: coordinated harassment, identity-based attacks, plus the rapid dissemination of hateful content at scale [1]-[3]. Hate speech isn't a purely lexical phenomenon. At weak text transcriptions obscure; and multilingual or code-mixed posts exploit gaps in English-centric filters [1], [2], memes pair innocuous captions with subtly toxic imagery; audio clips may carry slurs or threatening prosody th. For platform operators and regulators, the practical requirement isn't merely high recall - flagging everything suspicious - but trustworthy decisions that respect precision caps, jurisdictional norms coupled with user appeals workflows. When detectors apply fixed red lines, ignore non-text cues, possibly treat every language as an afterthought, achieving that balance is difficult.</w:t>
       </w:r>
     </w:p>
     <w:p>
@@ -344,7 +344,7 @@
           <w:i w:val="0"/>
           <w:sz w:val="20"/>
         </w:rPr>
-        <w:t>A fourth, ever more salient hurdle is evasion and adversarial manipulation. Human actors methodically stress-test moderation: leetspeak ("h8", "f|_|ck"), Unicode homoglyphs that swap Cyrillic "a" for Latin "a", deliberate misspellings, multilingual code-switching that fragments toxic spans across scripts, together with emoji compositions that express slurs or threats without standard dictionary tokens [1], [3]. One still harder class pairs image-text juxtaposition where each pathway is individually benign but their combination is hateful - precisely the phenomenon stressed by meme benchmarks [20]. Several patterns defeat keyword filters (because surface forms are unbounded) and monolingual classifiers (because toxicity may be distributed across languages or channels). They therefore motivate resilient multimodal encoders, subword-aware multilingual modeling, together with searchable decision layers that can adapt boundaries and fusion behavior to operational costs rather than fixed heuristics.</w:t>
+        <w:t>A fourth, ever more salient hurdle is evasion and adversarial manipulation. Human actors methodically stress-test moderation: leetspeak ("h8", "f|_|ck"), Unicode homoglyphs that swap Cyrillic "a" for Latin "a", deliberate misspellings, multilingual code-switching that fragments toxic spans across scripts, together with emoji compositions that express slurs or threats without standard dictionary tokens [1], [3]. One still harder class pairs image-text juxtaposition where each pathway is individually benign but their combination is hateful - precisely the phenomenon stressed by meme benchmarks [20]. All these patterns defeat keyword filters (because surface forms are unbounded) and monolingual classifiers (because toxicity may be distributed across languages or channels). They therefore motivate resilient multimodal encoders, subword-aware multilingual modeling, together with searchable decision layers that can adapt boundaries and fusion behavior to operational costs rather than fixed heuristics.</w:t>
       </w:r>
     </w:p>
     <w:p>
@@ -540,7 +540,7 @@
           <w:i w:val="0"/>
           <w:sz w:val="20"/>
         </w:rPr>
-        <w:t>Multimodal coverage remains the first objective. Hateful content is expressed not only as tweets or comments but as memes, photorealistic harassment, together with spoken abuse embedded in short video and audio messages. A system that excels on text alone will methodically underperform on platforms where user behavior is video-first. We therefore require parallel text, vision (zero-shot screening plus fine-tuned fusion) coupled with audio pathways (acoustic representations and transcript-conditioned text scoring) that can be composed in a single late-fusion interface. Such a objective is driven by empirical complementarity: our later results show that audio branches improve F1 when paired with text even when either alone is weaker, mirroring broader findings from multimodal abuse literature [20], [45].</w:t>
+        <w:t>Multimodal coverage remains the first objective. Hateful content is expressed not only as tweets or comments but as memes, photorealistic harassment, together with spoken abuse embedded in short video and audio messages. A system that excels on text alone will methodically underperform on platforms where user behavior is video-first. We therefore require parallel text, vision (zero-shot screening plus fine-tuned fusion) coupled with audio pathways (acoustic representations and transcript-conditioned text scoring) that can be composed in a single late-fusion interface. One such objective is driven by empirical complementarity: our later results show that audio branches improve F1 when paired with text even when either alone is weaker, mirroring broader findings from multimodal abuse literature [20], [45].</w:t>
       </w:r>
     </w:p>
     <w:p>
@@ -854,7 +854,7 @@
           <w:i w:val="0"/>
           <w:sz w:val="20"/>
         </w:rPr>
-        <w:t>Despite their practical utility, attribute-engineered approaches share a fundamental gap: they require explicit specification of discriminative cues for each language and each adversarial transformation. A given combinatorial explosion of evasion strategies - spanning typographic substitution, multilingual code-switching, multimodal recontextualization as well as meme-native irony - turns manual aspect design untenable at platform scale [3], [31]. One such shortcoming motivates representation learning and multimodal fusion, but it also explains why character-aware and subword models remain relevant even inside Transformer stacks: the surface channel continues to carry signal that lexicons alone can't enumerate.</w:t>
+        <w:t>Despite their practical utility, attribute-engineered approaches share a fundamental gap: they require explicit specification of discriminative cues for each language and each adversarial transformation. A given combinatorial explosion of evasion strategies - spanning typographic substitution, multilingual code-switching, multimodal recontextualization as well as meme-native irony - turns manual aspect design untenable at platform scale [3], [31]. Such a shortcoming motivates representation learning and multimodal fusion, but it also explains why character-aware and subword models remain relevant even inside Transformer stacks: the surface channel continues to carry signal that lexicons alone can't enumerate.</w:t>
       </w:r>
     </w:p>
     <w:p>
@@ -4090,7 +4090,7 @@
           <w:i w:val="0"/>
           <w:sz w:val="20"/>
         </w:rPr>
-        <w:t>We adopt late fusion over early or cross-attention alternatives for three principled reasons. First, late fusion permits modular backbone replacement-upgrading mBERT to XLM-R [36] or CLIP ViT-B/32 to ViT-L/14 [19] calls for retraining only the affected branch and re-optimizing fusion weights, not the entire chain. As for this modularity, it is progressively important as multilingual moderation stacks must track rapid foundation-model turnover without invalidating end-to-end systems that would otherwise demand full re-co-training whenever any encoder changes [1], [3]. Second, late fusion spits out interpretable per-branch contributions: each branch produces a calibrated probability that can be inspected, logged along with audited independently - a requirement for regulatory compliance under backbones such as the EU Artificial Intelligence Act, where high-risk classification systems benefit from traceable evidence chains and post hoc review of component-level scores. Third, late fusion is computationally tractable on a single T4 GPU: cross-attention models like UNITER [44] or ViLBERT [41] require joint backpropagation through all pathway encoders, which exceeds 16 GB VRAM for multi-branch configurations that also retain task heads, gradient accumulation buffers as well as mixed-precision transient tensors. The trade-off is that late fusion can't capture fine-grained cross-modal interplays that early or attention-based fusion would explicitly model [40]. We partially dials back this through the HateCLIPper head, which does learn image-text back-and-forths within the vision branch [28], and through OCR-augmented CLIP prompting that injects typography into the zero-shot pathway [19].</w:t>
+        <w:t>We adopt late fusion over early or cross-attention alternatives for three principled reasons. First, late fusion permits modular backbone replacement-upgrading mBERT to XLM-R [36] or CLIP ViT-B/32 to ViT-L/14 [19] calls for retraining only the affected branch and re-optimizing fusion weights, not the entire pipeline. This modularity is progressively important as multilingual moderation stacks must track rapid foundation-model turnover without invalidating end-to-end systems that would otherwise demand full re-co-training whenever any encoder changes [1], [3]. Second, late fusion delivers interpretable per-branch contributions: each branch produces a calibrated probability that can be inspected, logged along with audited independently - a requirement for regulatory compliance under backbones such as the EU Artificial Intelligence Act, where high-risk classification systems benefit from traceable evidence chains and post hoc review of part-level scores. Third, late fusion is computationally tractable on a single T4 GPU: cross-attention models like UNITER [44] or ViLBERT [41] require joint backpropagation through all modality encoders, which exceeds 16 GB VRAM for multi-branch configurations that also retain task heads, gradient accumulation buffers as well as mixed-precision transient tensors. The trade-off is that late fusion can't capture fine-grained cross-modal exchanges that early or attention-based fusion would explicitly model [40]. We partially dials back this through the HateCLIPper head, which does learn image-text interplays within the vision branch [28], and through OCR-augmented CLIP prompting that injects typography into the zero-shot pathway [19].</w:t>
       </w:r>
     </w:p>
     <w:p>
@@ -4662,7 +4662,7 @@
           <w:i w:val="0"/>
           <w:sz w:val="20"/>
         </w:rPr>
-        <w:t>From an realization standpoint, mBERT functions as the shared lexical tower for natively digital posts and Whisper transcripts, enabling consistent hate semantics regardless of whether toxicity surfaces in original Unicode spans or in ASR output [18], [27]. Such a unification is specifically salient for code-mixed and multilingual stacks where the alternative - training monolingual detectors per channel - fragments supervision and complicates fusion [1]. While larger multilingual encoders such as XLM-R [36] may improve low-resource robustness, mBERT gives a favorable precision-memory trade-off under T4 ceilings and preserves comparability with widely reported multilingual hate-speech baselines [1], [3]. When transcript noise increases WER, the text head's probabilistic output remains well-formed. Coupling with ASR gating (Section 3.5) prevents brittle hard decisions that would arise from piping raw ASR strings into lexicon-only filters.</w:t>
+        <w:t>From an realization standpoint, mBERT functions as the shared lexical tower for natively digital posts and Whisper transcripts, enabling consistent hate semantics regardless of whether toxicity surfaces in original Unicode spans or in ASR output [18], [27]. One such unification is specifically salient for code-mixed and multilingual stacks where the alternative - training monolingual detectors per channel - fragments supervision and complicates fusion [1]. While larger multilingual encoders such as XLM-R [36] may improve low-resource robustness, mBERT gives a favorable precision-memory trade-off under T4 ceilings and preserves comparability with widely reported multilingual hate-speech baselines [1], [3]. When transcript noise increases WER, the text head's probabilistic output remains well-formed. Coupling with ASR gating (Section 3.5) prevents brittle hard decisions that would arise from piping raw ASR strings into lexicon-only filters.</w:t>
       </w:r>
     </w:p>
     <w:p>
@@ -5623,7 +5623,7 @@
           <w:i w:val="0"/>
           <w:sz w:val="20"/>
         </w:rPr>
-        <w:t>Our fusion formula admits an equivalent interpretation as soft weighted voting. Each branch i casts a "vote" pi ∈ [0,1] for the hate conjecture, weighted by wi. Our normalized fused score Pfused is the weighted average of these votes. When all branches agree (all pi near 0 or all near 1), Pfused is resilient to weight perturbations. Disagreement between branches (e.g., text predicts hate but vision predicts safe) renders the fused score sensitive to weight allocation - precisely the regime where metaheuristic optimization produces the largest improvements over uniform or hand-tuned defaults. One such sensitivity analysis motivates the ten-task optimization suite (Section 3.6.E), which searches not only over weights but also over branch inclusion masks, per-branch red lines, and the global decision boundary [14], [25].</w:t>
+        <w:t>Our fusion formula admits an equivalent interpretation as soft weighted voting. Each branch i casts a "vote" pi ∈ [0,1] for the hate conjecture, weighted by wi. Our normalized fused score Pfused is the weighted average of these votes. When all branches agree (all pi near 0 or all near 1), Pfused is resilient to weight perturbations. Disagreement between branches (e.g., text predicts hate but vision predicts safe) renders the fused score sensitive to weight allocation - precisely the regime where metaheuristic optimization produces the largest improvements over uniform or hand-tuned defaults. Such a sensitivity analysis motivates the ten-task optimization suite (Section 3.6.E), which searches not only over weights but also over branch inclusion masks, per-branch red lines, and the global decision boundary [14], [25].</w:t>
       </w:r>
     </w:p>
     <w:p>
@@ -5701,7 +5701,7 @@
           <w:i w:val="0"/>
           <w:sz w:val="20"/>
         </w:rPr>
-        <w:t>Our optimization setup is deliberately stratified into Bayesian hyperparameter optimization (Optuna TPE [25]), scalar annealing for bars (SA [29]) along with population-based metaheuristics with a unified trial taps into (Algorithm 4). One such taxonomy matches heterogeneous search spaces: smooth continuous knobs favor TPE when evaluations are noisy-but-cheap; univariate red line lines favor SA's hill-climbing with stochastic acceptance; multimodal vector spaces with weak Lipschitz structure favor DE, PSO along with GWO [21]-[23]. From Section 3.6.D so that reported differences reflect search dynamics, not metric definitions - a design choice motivated by reproducibility critiques in previous optimization-centric NLP work [14], crucially, all algorithms consume the same F.</w:t>
+        <w:t>Our optimization setup is deliberately stratified into Bayesian hyperparameter optimization (Optuna TPE [25]), scalar annealing for bars (SA [29]) along with population-based metaheuristics with a unified trial taps into (Algorithm 4). Such a taxonomy matches heterogeneous search spaces: smooth continuous knobs favor TPE when evaluations are noisy-but-cheap; univariate red line lines favor SA's hill-climbing with stochastic acceptance; multimodal vector spaces with weak Lipschitz structure favor DE, PSO along with GWO [21]-[23]. From Section 3.6.D so that reported differences reflect search dynamics, not metric definitions - a design choice motivated by reproducibility critiques in previous optimization-centric NLP work [14], crucially, all algorithms consume the same F.</w:t>
       </w:r>
     </w:p>
     <w:p>
@@ -6060,7 +6060,7 @@
           <w:i w:val="0"/>
           <w:sz w:val="20"/>
         </w:rPr>
-        <w:t>The updated candidate is xt+1 = (1)/(3)≤ft(z_αt+z_βt+z_δt); the a knob controls the GWO exploration-exploitation balance. From the prey (exploration), when a &gt; 1 (first half of iterations), the coefficient |A| &gt; 1 causes wolves to diverge. When a &lt; 1 (second half), |A| &lt; 1 forces convergence toward the three leaders (exploitation). One such built-in schedule eliminates the need for explicit exploration dials, making GWO attractive for practitioners unfamiliar with metaheuristic tuning [21].</w:t>
+        <w:t>The updated candidate is xt+1 = (1)/(3)≤ft(z_αt+z_βt+z_δt); the a knob controls the GWO exploration-exploitation balance. From the prey (exploration), when a &gt; 1 (first half of iterations), the coefficient |A| &gt; 1 causes wolves to diverge. When a &lt; 1 (second half), |A| &lt; 1 forces convergence toward the three leaders (exploitation). Such a built-in schedule eliminates the need for explicit exploration dials, making GWO attractive for practitioners unfamiliar with metaheuristic tuning [21].</w:t>
       </w:r>
     </w:p>
     <w:p>
@@ -6472,7 +6472,7 @@
           <w:i w:val="0"/>
           <w:sz w:val="20"/>
         </w:rPr>
-        <w:t>- Cutoff optimization. A given scalar bar τ ∈ [0.1, 0.95] is optimized to maximize the composite fitness on validation probabilities. PSO (n\mathrmpop=20, n\mathrmiter=200), DE, GWO and also FA (the only task where FA participates) compete against SA (T0=1.0, cooling 0.95, 500 iterations). Such a is the most wall-to-wall comparison, spanning six optimization strategies on a single dimension - a controlled benchmark that isolates convergence speed from search-space complexity [29].</w:t>
+        <w:t>- Bar optimization. A given scalar cutoff τ ∈ [0.1, 0.95] is optimized to maximize the composite fitness on validation probabilities. PSO (n\mathrmpop=20, n\mathrmiter=200), DE, GWO and also FA (the only task where FA participates) compete against SA (T0=1.0, cooling 0.95, 500 iterations). This is the most wall-to-wall comparison, spanning six optimization strategies on a single dimension - a controlled benchmark that isolates convergence speed from search-space complexity [29].</w:t>
       </w:r>
     </w:p>
     <w:p>
@@ -6504,7 +6504,7 @@
           <w:i w:val="0"/>
           <w:sz w:val="20"/>
         </w:rPr>
-        <w:t>- BERT head pruning. A 144-dimensional binary chromosome (12 layers × 12 heads) masks individual attention heads in the fine-tuned mBERT model. GA and GWO operate with n\mathrmpop=20, n\mathrmiter=30, evaluating on up to 200 validation samples per fitness call. One minimum active-head ceiling of 30\% (at least 44 heads) prevents degenerate solutions. Such a task probes whether structured sparsity in attention heads improves or degrades hate detection relative to the full head budget [18].</w:t>
+        <w:t>- BERT head pruning. A 144-dimensional binary chromosome (12 layers × 12 heads) masks individual attention heads in the fine-tuned mBERT model. GA and GWO operate with n\mathrmpop=20, n\mathrmiter=30, evaluating on up to 200 validation samples per fitness call. One minimum active-head ceiling of 30\% (at least 44 heads) prevents degenerate solutions. One such task probes whether structured sparsity in attention heads improves or degrades hate detection relative to the full head budget [18].</w:t>
       </w:r>
     </w:p>
     <w:p>
@@ -6693,7 +6693,7 @@
           <w:i w:val="0"/>
           <w:sz w:val="20"/>
         </w:rPr>
-        <w:t>By three crowdworkers each into normal, offensive, or hate speech categories, hateXplain (originally Mathew et al., 2021) provides 19,229 posts sourced from Twitter and Gab, annotated. Inter-annotator agreement (Fleiss' kappa) is reported at close to 0.46, indicating moderate agreement consistent with the inherent subjectivity of hate speech annotation [3]. The data pool also provides rationale annotations - token-level zeroes in on of hateful spans - which we don't exploit in training but which informed our token importance analysis (Task 8). Every three-class structure is preserved for intrinsic assessment of the text head (Section 6.1) and binarized (offensive + hate = toxic) for merged training.</w:t>
+        <w:t>By three crowdworkers each into normal, offensive, or hate speech categories, hateXplain (originally Mathew et al., 2021) provides 19,229 posts sourced from Twitter and Gab, annotated. Inter-annotator agreement (Fleiss' kappa) is reported at close to 0.46, indicating moderate agreement consistent with the inherent subjectivity of hate speech annotation [3]. The data pool also provides rationale annotations - token-level zeroes in on of hateful spans - which we don't exploit in training but which informed our token importance analysis (Task 8). Each three-class structure is preserved for intrinsic assessment of the text head (Section 6.1) and binarized (offensive + hate = toxic) for merged training.</w:t>
       </w:r>
     </w:p>
     <w:p>
@@ -13151,7 +13151,7 @@
           <w:i w:val="0"/>
           <w:sz w:val="20"/>
         </w:rPr>
-        <w:t>All metaheuristic optimizers are wired up from scratch in NumPy, sharing a common MetaHeuristicOptimizer base class with a unified optimize() interface that accepts arbitrary fitness functions, bounds, plus binary/continuous mode flags. This design pins down that algorithmic differences - not realization-level inefficiencies - drive comparative results. The Result dataclass standardizes output format across algorithms, capturing best solution, fitness, convergence curve, wall time, trial count, plus arbitrary metadata.</w:t>
+        <w:t>All metaheuristic optimizers are wired up from scratch in NumPy, sharing a common MetaHeuristicOptimizer base class with a unified optimize interface that accepts arbitrary fitness functions, bounds, plus binary/continuous mode flags. This design pins down that algorithmic differences - not realization-level inefficiencies - drive comparative results. The Result dataclass standardizes output format across algorithms, capturing best solution, fitness, convergence curve, wall time, trial count, plus arbitrary metadata.</w:t>
       </w:r>
     </w:p>
     <w:p>
@@ -14187,7 +14187,7 @@
           <w:i w:val="0"/>
           <w:sz w:val="20"/>
         </w:rPr>
-        <w:t>From a representation standpoint, multilingual BERT supplies shared subword units across English, German, and code-mixed Hindi-English, yet the empirical density of each language in pre-training remains uneven [37]. That asymmetry predictably induces heterogeneous per-language calibration: high-resource English subsets benefit from richer contextual priors, whereas German and Romanized Hindi tokens occupy comparatively sparse neighborhoods in embedding space. Annotation norms compound the effect: German refugee-crisis corpora carries documented label instability at the offensive-hateful boundary [47], and Hindi-English social text introduces script mixing and transliteration patterns that fragment lexical evidence across token boundaries [46]. Several factors motivate reporting binary text performance not only on the merged scoring pool but also on language-stratified slices, isolating whether gains ascribed to "multilingual fine-tuning" truly generalize or by and large track English-majority behavior.</w:t>
+        <w:t>From a representation standpoint, multilingual BERT supplies shared subword units across English, German, and code-mixed Hindi-English, yet the empirical density of each language in pre-training remains uneven [37]. That asymmetry predictably induces heterogeneous per-language calibration: high-resource English subsets benefit from richer contextual priors, whereas German and Romanized Hindi tokens occupy comparatively sparse neighborhoods in embedding space. Annotation norms compound the effect: German refugee-crisis corpora carries documented label instability at the offensive-hateful boundary [47], and Hindi-English social text introduces script mixing and transliteration patterns that fragment lexical evidence across token boundaries [46]. All these factors motivate reporting binary text performance not only on the merged scoring pool but also on language-stratified slices, isolating whether gains ascribed to "multilingual fine-tuning" truly generalize or by and large track English-majority behavior.</w:t>
       </w:r>
     </w:p>
     <w:p>
@@ -15940,7 +15940,7 @@
           <w:i w:val="0"/>
           <w:sz w:val="20"/>
         </w:rPr>
-        <w:t>Examining individual predictions reveals systematic patterns in vision flow errors. Zero-shot CLIP consistently fails on memes where the hateful interpretation calls for cultural or contextual knowledge absent from CLIP's web-crawled pre-training (e.g., memes referencing specific political figures or regional slurs). In overlaid text - a case better handled by the OCR-augmented text branch, hateCLIPper partially overcomes these gaps through fine-tuning on Hateful Memes examples but struggles with memes where the image is a benign photograph and all hateful content resides. By contrast, HateCLIPper correctly identifies hate in memes where the visual element (e.g., a dehumanizing comparison between a person and an animal) carries the primary hateful signal, and the text overlay is neutral or even misleading. Several cases bring out functional complementarity between frozen-caption-style supervision and task-specific adaptation [19], [28], [41].</w:t>
+        <w:t>Examining individual predictions reveals systematic patterns in vision flow errors. Zero-shot CLIP consistently fails on memes where the hateful interpretation calls for cultural or contextual knowledge absent from CLIP's web-crawled pre-training (e.g., memes referencing specific political figures or regional slurs). In overlaid text - a case better handled by the OCR-augmented text branch, hateCLIPper partially overcomes these gaps through fine-tuning on Hateful Memes examples but struggles with memes where the image is a benign photograph and all hateful content resides. By contrast, HateCLIPper correctly identifies hate in memes where the visual element (e.g., a dehumanizing comparison between a person and an animal) carries the primary hateful signal, and the text overlay is neutral or even misleading. All these cases bring out functional complementarity between frozen-caption-style supervision and task-specific adaptation [19], [28], [41].</w:t>
       </w:r>
     </w:p>
     <w:p>
@@ -15986,7 +15986,7 @@
           <w:i w:val="0"/>
           <w:sz w:val="20"/>
         </w:rPr>
-        <w:t>While the Wav2Vec 2.0 acoustic classifier alone lands F1 ≈ 0.56 (precision 0.60, recall 0.53), on the HateMM audio partition, transcript-conditioned text classification (Whisper + mBERT) attains F1 ≈ 0.58 (precision 0.55, recall 0.62). At lexically transcribed toxicity and speaker-level affect carry partially decoupled evidence, a calibrated union of both audio pathways - mirroring the dual-stream design advocated for noisy user-generated speech [26], [27]-raises F1 to ≈ 0.61, confirming th. Such magnitudes are necessarily more tentative than text-side figures because the annotated audio corpus is smaller and because label acquisition for video hate is costlier and noisier than for static posts [45].</w:t>
+        <w:t>While the Wav2Vec 2.0 acoustic classifier alone lands F1 ≈ 0.56 (precision 0.60, recall 0.53), on the HateMM audio partition, transcript-conditioned text classification (Whisper + mBERT) attains F1 ≈ 0.58 (precision 0.55, recall 0.62). At lexically transcribed toxicity and speaker-level affect carry partially decoupled evidence, a calibrated union of both audio pathways - mirroring the dual-stream design advocated for noisy user-generated speech [26], [27]-raises F1 to ≈ 0.61, confirming th. Several magnitudes are necessarily more tentative than text-side figures because the annotated audio corpus is smaller and because label acquisition for video hate is costlier and noisier than for static posts [45].</w:t>
       </w:r>
     </w:p>
     <w:p>
@@ -16002,7 +16002,7 @@
           <w:i w:val="0"/>
           <w:sz w:val="20"/>
         </w:rPr>
-        <w:t>On a manually verified subset of 50 HateMM samples, Whisper-small nets an estimated word error rate (WER) of around 22%-sizably higher than its benchmarked performance on clean read speech, reflecting noisy, overlapping-speaker coupled with background-music conditions typical of social media video. Crucially, transcription errors disproportionately affect hate-bearing words, which tend to be non-standard vocabulary (slurs, code-words) outside Whisper's training distribution. One such partially explains why the acoustic branch (Wav2Vec2) sometimes tops the transcript branch on hate-specific gauges: acoustic aspects capture prosodic aggression markers (raised pitch, increased volume, aggressive rhythm) that don't depend on lexical correctness [26].</w:t>
+        <w:t>On a manually verified subset of 50 HateMM samples, Whisper-small nets an estimated word error rate (WER) of around 22%-sizably higher than its benchmarked performance on clean read speech, reflecting noisy, overlapping-speaker coupled with background-music conditions typical of social media video. Crucially, transcription errors disproportionately affect hate-bearing words, which tend to be non-standard vocabulary (slurs, code-words) outside Whisper's training distribution. Such a partially explains why the acoustic branch (Wav2Vec2) sometimes tops the transcript branch on hate-specific gauges: acoustic aspects capture prosodic aggression markers (raised pitch, increased volume, aggressive rhythm) that don't depend on lexical correctness [26].</w:t>
       </w:r>
     </w:p>
     <w:p>
@@ -18325,7 +18325,7 @@
           <w:i w:val="0"/>
           <w:sz w:val="20"/>
         </w:rPr>
-        <w:t>The Optuna-optimized weights (F1 0.526) fall below the hand-tuned preset (F1 ≈ 0.62 on text-only within the fusion grid) because the five-dimensional weight simplex presents a noisy fitness surface when evaluated on only 500 development items. When evaluations are ordinal-correlated and high-variance, with 40 trials, the tree-structured Parzen estimator underlying TPE probes roughly 40 / 51.5 ≈ 3.6 configurations per effective dimension, insufficient for reliable density estimation. Such a is precisely the regime where population-based methods - maintaining on the order of 30 simultaneous candidates - provide an advantage through implicit regularization of the search distribution and resistance to premature concentration on spurious fitness spikes [22], [23], [25].</w:t>
+        <w:t>The Optuna-optimized weights (F1 0.526) fall below the hand-tuned preset (F1 ≈ 0.62 on text-only within the fusion grid) because the five-dimensional weight simplex presents a noisy fitness surface when evaluated on only 500 development items. When evaluations are ordinal-correlated and high-variance, with 40 trials, the tree-structured Parzen estimator underlying TPE probes roughly 40 / 51.5 ≈ 3.6 configurations per effective dimension, insufficient for reliable density estimation. This remains precisely the regime where population-based methods - maintaining on the order of 30 simultaneous candidates - provide an advantage through implicit regularization of the search distribution and resistance to premature concentration on spurious fitness spikes [22], [23], [25].</w:t>
       </w:r>
     </w:p>
     <w:p>
@@ -25840,7 +25840,7 @@
           <w:i w:val="0"/>
           <w:sz w:val="20"/>
         </w:rPr>
-        <w:t>Cross-lingual pre-training with XLM-RoBERTa. Replacing multilingual BERT (178M knobs) with XLM-R-large (550M knobs) [36] is expected to improve multilingual performance by two to four percentage points F1, specifically on Hindi-English code-mixed content where mBERT's vocabulary coverage is weakest [37]. A given larger model fits within T4 VRAM at MAX_LENGTH = 128 with gradient checkpointing, and the modular workflow design permits backbone replacement without restructuring the fusion or optimization layers. Each systematic mBERT-versus-XLM-R comparison across all four text data pools would quantify the gains per language and expose whether head-pruning schedules transfer across encoders.</w:t>
+        <w:t>Cross-lingual pre-training with XLM-RoBERTa. Replacing multilingual BERT (178M knobs) with XLM-R-large (550M knobs) [36] is expected to improve multilingual performance by two to four percentage points F1, specifically on Hindi-English code-mixed content where mBERT's vocabulary coverage is weakest [37]. A given larger model fits within T4 VRAM at MAX_LENGTH = 128 with gradient checkpointing, and the modular workflow design permits backbone replacement without restructuring the fusion or optimization layers. Any systematic mBERT-versus-XLM-R comparison across all four text data pools would quantify the gains per language and expose whether head-pruning schedules transfer across encoders.</w:t>
       </w:r>
     </w:p>
     <w:p>

</xml_diff>